<commit_message>
More writing and DEB section done
</commit_message>
<xml_diff>
--- a/docs/ms.docx
+++ b/docs/ms.docx
@@ -603,13 +603,13 @@
       </w:r>
     </w:p>
     <w:bookmarkEnd w:id="24"/>
-    <w:bookmarkStart w:id="25" w:name="Xa94c9dea5ca370ac54e92cadec28ec1ba151523"/>
+    <w:bookmarkStart w:id="25" w:name="X4209415c0137b038f4a3ce52e60f7db062b8bff"/>
     <w:p>
       <w:pPr>
         <w:pStyle w:val="Heading1"/>
       </w:pPr>
       <w:r>
-        <w:t xml:space="preserve">Biophysics to the rescue: predicting community wide</w:t>
+        <w:t xml:space="preserve">Models for predicting community wide</w:t>
       </w:r>
       <w:r>
         <w:t xml:space="preserve"> </w:t>
@@ -625,7 +625,7 @@
         <w:t xml:space="preserve"> </w:t>
       </w:r>
       <w:r>
-        <w:t xml:space="preserve">to extreme heat</w:t>
+        <w:t xml:space="preserve">to extreme heat: Biophysics to the rescue!</w:t>
       </w:r>
     </w:p>
     <w:p>
@@ -997,7 +997,16 @@
         <w:t xml:space="preserve">[16,24]</w:t>
       </w:r>
       <w:r>
-        <w:t xml:space="preserve">. DEB models consider organism as a thermodynamic system (adhering to energy-mass balance) across the whole life cycle from egg to adult. DEB models can translate short-term variation in factors, such as temperature, toxins (e.g., toxicants,</w:t>
+        <w:t xml:space="preserve">. DEB models consider organism as a thermodynamic system (adhering to energy-mass balance) capturing the exchange of food, water, respiratory gases and metabolic waste from egg to adult</w:t>
+      </w:r>
+      <w:r>
+        <w:t xml:space="preserve"> </w:t>
+      </w:r>
+      <w:r>
+        <w:t xml:space="preserve">[20]</w:t>
+      </w:r>
+      <w:r>
+        <w:t xml:space="preserve">. DEB models can translate short-term variation in factors, such as temperature, toxins (e.g., toxicants,</w:t>
       </w:r>
       <w:r>
         <w:t xml:space="preserve"> </w:t>
@@ -1027,13 +1036,22 @@
         <w:t xml:space="preserve">[17,20]</w:t>
       </w:r>
       <w:r>
-        <w:t xml:space="preserve">. DEB theory combined with biophysical models also allow the full water budget to be computed to account for heat stress impacts of a hydric nature, and computes obligate heat production of metabolism to feed back to the calculation of body temperature. Perhaps most importantly, DEB theory is computing the life cycle trajectory and so can account for the effects of timing of heat wave impacts relative to life stage. While DEB models are parameter rich, key parameters have been estimated for &gt; 1000 species already</w:t>
-      </w:r>
-      <w:r>
-        <w:t xml:space="preserve"> </w:t>
-      </w:r>
-      <w:r>
-        <w:t xml:space="preserve">[28]</w:t>
+        <w:t xml:space="preserve">. DEB theory, combined with biophysical models more generally, also allow the full water budget to be computed to account for heat stress impacts of a hydric nature, and computes obligate heat production of metabolism to feed back to the calculation of body temperature</w:t>
+      </w:r>
+      <w:r>
+        <w:t xml:space="preserve"> </w:t>
+      </w:r>
+      <w:r>
+        <w:t xml:space="preserve">[20]</w:t>
+      </w:r>
+      <w:r>
+        <w:t xml:space="preserve">. Perhaps most importantly, DEB theory is computing the life cycle trajectory and so can account for the effects of timing of heat wave impacts relative to life stage. Applied to multi-species assemblages, DEB models can capture how different species life-cycles are impacted by heat and interact to predict how traits such as birth, age at maturity, reproductive events, energy flow and lifespan vary across species. While DEB models are parameter rich, key parameters have been estimated for &gt; 3000 species already</w:t>
+      </w:r>
+      <w:r>
+        <w:t xml:space="preserve"> </w:t>
+      </w:r>
+      <w:r>
+        <w:t xml:space="preserve">[28,29]</w:t>
       </w:r>
       <w:r>
         <w:t xml:space="preserve">. New analytical approaches using phylogenetic imputation methods can be used to predict DEB parameters for over 1.3 million species providing immense opportunities to model how heat will affect life-cycles of multi-species assemblages (see https://deb.bolding-bruggeman.com,</w:t>
@@ -1042,18 +1060,60 @@
         <w:t xml:space="preserve"> </w:t>
       </w:r>
       <w:r>
-        <w:t xml:space="preserve">[29]</w:t>
-      </w:r>
-      <w:r>
-        <w:t xml:space="preserve">).</w:t>
-      </w:r>
-    </w:p>
-    <w:p>
-      <w:pPr>
-        <w:pStyle w:val="BodyText"/>
-      </w:pPr>
-      <w:r>
-        <w:t xml:space="preserve">are mechanistic and adhere to the thermodynamic principle of energy-mass balance.</w:t>
+        <w:t xml:space="preserve">[30]</w:t>
+      </w:r>
+      <w:r>
+        <w:t xml:space="preserve">). In addition, software packages such as</w:t>
+      </w:r>
+      <w:r>
+        <w:t xml:space="preserve"> </w:t>
+      </w:r>
+      <w:r>
+        <w:rPr>
+          <w:i/>
+          <w:iCs/>
+        </w:rPr>
+        <w:t xml:space="preserve">NicheMapR</w:t>
+      </w:r>
+      <w:r>
+        <w:t xml:space="preserve"> </w:t>
+      </w:r>
+      <w:r>
+        <w:t xml:space="preserve">[31,32]</w:t>
+      </w:r>
+      <w:r>
+        <w:t xml:space="preserve"> </w:t>
+      </w:r>
+      <w:r>
+        <w:t xml:space="preserve">allow for simulations of life-cycles using parameters for diverse species. From these models key outputs on organisms such as body mass and size, reproductive success and events, along with survival can be used to parameterise vital rates needed for population and community models.</w:t>
+      </w:r>
+    </w:p>
+    <w:bookmarkEnd w:id="27"/>
+    <w:bookmarkStart w:id="28" w:name="Xbdb3df2871e98d114a1e4e74a52caa28253dc0c"/>
+    <w:p>
+      <w:pPr>
+        <w:pStyle w:val="Heading1"/>
+      </w:pPr>
+      <w:r>
+        <w:t xml:space="preserve">Mechanistic approaches that</w:t>
+      </w:r>
+      <w:r>
+        <w:t xml:space="preserve"> </w:t>
+      </w:r>
+      <w:r>
+        <w:t xml:space="preserve">‘</w:t>
+      </w:r>
+      <w:r>
+        <w:t xml:space="preserve">speak</w:t>
+      </w:r>
+      <w:r>
+        <w:t xml:space="preserve">’</w:t>
+      </w:r>
+      <w:r>
+        <w:t xml:space="preserve"> </w:t>
+      </w:r>
+      <w:r>
+        <w:t xml:space="preserve">to population and community ecology under extreme heat (Margie)</w:t>
       </w:r>
     </w:p>
     <w:p>
@@ -1065,7 +1125,7 @@
         </w:numPr>
       </w:pPr>
       <w:r>
-        <w:t xml:space="preserve">Combining TLS with biophysical and dynamic energy budget models.</w:t>
+        <w:t xml:space="preserve">How can we link mechanistic physiological models with population and community ecology theory?</w:t>
       </w:r>
     </w:p>
     <w:p>
@@ -1077,83 +1137,273 @@
         </w:numPr>
       </w:pPr>
       <w:r>
-        <w:t xml:space="preserve">Introduce biophysical and dynamic energy budget models</w:t>
+        <w:t xml:space="preserve">Introducing population and network models to link outputs from DEB (survival, reproduction, abundance) to population growth.</w:t>
       </w:r>
     </w:p>
     <w:p>
       <w:pPr>
         <w:pStyle w:val="Compact"/>
         <w:numPr>
-          <w:ilvl w:val="1"/>
+          <w:ilvl w:val="0"/>
+          <w:numId w:val="1004"/>
+        </w:numPr>
+      </w:pPr>
+      <w:r>
+        <w:t xml:space="preserve">How people are analysing communities with network theory. Some important papers</w:t>
+      </w:r>
+      <w:r>
+        <w:t xml:space="preserve"> </w:t>
+      </w:r>
+      <w:r>
+        <w:t xml:space="preserve">[33]</w:t>
+      </w:r>
+      <w:r>
+        <w:t xml:space="preserve"> </w:t>
+      </w:r>
+      <w:r>
+        <w:t xml:space="preserve">[34]</w:t>
+      </w:r>
+      <w:r>
+        <w:t xml:space="preserve"> </w:t>
+      </w:r>
+      <w:r>
+        <w:t xml:space="preserve">[35]</w:t>
+      </w:r>
+      <w:r>
+        <w:t xml:space="preserve"> </w:t>
+      </w:r>
+      <w:r>
+        <w:t xml:space="preserve">[36]</w:t>
+      </w:r>
+      <w:r>
+        <w:t xml:space="preserve"> </w:t>
+      </w:r>
+      <w:r>
+        <w:t xml:space="preserve">[37]</w:t>
+      </w:r>
+      <w:r>
+        <w:t xml:space="preserve"> </w:t>
+      </w:r>
+      <w:r>
+        <w:t xml:space="preserve">[38]</w:t>
+      </w:r>
+      <w:r>
+        <w:t xml:space="preserve"> </w:t>
+      </w:r>
+      <w:r>
+        <w:t xml:space="preserve">[39]</w:t>
+      </w:r>
+      <w:r>
+        <w:t xml:space="preserve"> </w:t>
+      </w:r>
+      <w:r>
+        <w:t xml:space="preserve">Should also look at this book</w:t>
+      </w:r>
+      <w:r>
+        <w:t xml:space="preserve"> </w:t>
+      </w:r>
+      <w:r>
+        <w:t xml:space="preserve">[40]</w:t>
+      </w:r>
+    </w:p>
+    <w:p>
+      <w:pPr>
+        <w:pStyle w:val="Compact"/>
+        <w:numPr>
+          <w:ilvl w:val="0"/>
+          <w:numId w:val="1004"/>
+        </w:numPr>
+      </w:pPr>
+      <w:r>
+        <w:t xml:space="preserve">How can we capture interactions among species within the community to predict how heat stress will affect community structure?</w:t>
+      </w:r>
+    </w:p>
+    <w:p>
+      <w:pPr>
+        <w:pStyle w:val="Compact"/>
+        <w:numPr>
+          <w:ilvl w:val="0"/>
+          <w:numId w:val="1004"/>
+        </w:numPr>
+      </w:pPr>
+      <w:r>
+        <w:t xml:space="preserve">Figure 2: demonstrating how TLS, biophysical and DEB models can be used to predict heat stress impacts on plants and animals, growth, reproduction, survival. (Dan, Margie)</w:t>
+      </w:r>
+    </w:p>
+    <w:p>
+      <w:pPr>
+        <w:pStyle w:val="Compact"/>
+        <w:numPr>
+          <w:ilvl w:val="0"/>
+          <w:numId w:val="1004"/>
+        </w:numPr>
+      </w:pPr>
+      <w:r>
+        <w:t xml:space="preserve">Also this is a cool paper</w:t>
+      </w:r>
+      <w:r>
+        <w:t xml:space="preserve"> </w:t>
+      </w:r>
+      <w:r>
+        <w:t xml:space="preserve">[41]</w:t>
+      </w:r>
+      <w:r>
+        <w:t xml:space="preserve"> </w:t>
+      </w:r>
+      <w:r>
+        <w:t xml:space="preserve">on carnivores diets by DNA sequencing fecal data</w:t>
+      </w:r>
+      <w:r>
+        <w:t xml:space="preserve"> </w:t>
+      </w:r>
+      <w:r>
+        <w:t xml:space="preserve">-The other way to model interactions us using foundational community ecology/ species abundance models see</w:t>
+      </w:r>
+      <w:r>
+        <w:t xml:space="preserve"> </w:t>
+      </w:r>
+      <w:r>
+        <w:t xml:space="preserve">[42]</w:t>
+      </w:r>
+      <w:r>
+        <w:t xml:space="preserve">. We can here model the actual abundance of a given species and it would seem more flexible to incorporate thermal tolerance infor into these models.</w:t>
+      </w:r>
+    </w:p>
+    <w:p>
+      <w:pPr>
+        <w:pStyle w:val="Compact"/>
+        <w:numPr>
+          <w:ilvl w:val="0"/>
+          <w:numId w:val="1004"/>
+        </w:numPr>
+      </w:pPr>
+      <w:r>
+        <w:t xml:space="preserve">have a close look at</w:t>
+      </w:r>
+      <w:r>
+        <w:t xml:space="preserve"> </w:t>
+      </w:r>
+      <w:r>
+        <w:t xml:space="preserve">[43]</w:t>
+      </w:r>
+      <w:r>
+        <w:t xml:space="preserve"> </w:t>
+      </w:r>
+      <w:r>
+        <w:t xml:space="preserve">and</w:t>
+      </w:r>
+      <w:r>
+        <w:t xml:space="preserve"> </w:t>
+      </w:r>
+      <w:r>
+        <w:t xml:space="preserve">[44]</w:t>
+      </w:r>
+      <w:r>
+        <w:t xml:space="preserve">, limitations</w:t>
+      </w:r>
+      <w:r>
+        <w:t xml:space="preserve"> </w:t>
+      </w:r>
+      <w:r>
+        <w:t xml:space="preserve">[45]</w:t>
+      </w:r>
+      <w:r>
+        <w:t xml:space="preserve"> </w:t>
+      </w:r>
+      <w:r>
+        <w:t xml:space="preserve">[46]</w:t>
+      </w:r>
+    </w:p>
+    <w:bookmarkEnd w:id="28"/>
+    <w:bookmarkStart w:id="34" w:name="Xe7540e51cb84d29e47d083817996607ca5f8009"/>
+    <w:p>
+      <w:pPr>
+        <w:pStyle w:val="Heading1"/>
+      </w:pPr>
+      <w:r>
+        <w:t xml:space="preserve">Incorporating context-dependent environmental feedback to evaluate resilience to extreme heat (Brajesh, Brendan, James, Everyone else who wants to contribute)</w:t>
+      </w:r>
+    </w:p>
+    <w:p>
+      <w:pPr>
+        <w:pStyle w:val="Compact"/>
+        <w:numPr>
+          <w:ilvl w:val="0"/>
           <w:numId w:val="1005"/>
         </w:numPr>
       </w:pPr>
       <w:r>
-        <w:t xml:space="preserve">Biophysical models are used to predict how temperature affects the energy balance of an organism</w:t>
+        <w:t xml:space="preserve">Goal of this section is to briefly focus on the BIOLOGY that will shift thermal exposure and sensitivity in plants and animals.</w:t>
       </w:r>
     </w:p>
     <w:p>
       <w:pPr>
         <w:pStyle w:val="Compact"/>
         <w:numPr>
-          <w:ilvl w:val="1"/>
+          <w:ilvl w:val="0"/>
           <w:numId w:val="1005"/>
         </w:numPr>
       </w:pPr>
       <w:r>
-        <w:t xml:space="preserve">DEB models are used to predict how temperature affects the energy budget of an organism</w:t>
+        <w:t xml:space="preserve">I</w:t>
+      </w:r>
+      <w:r>
+        <w:t xml:space="preserve"> </w:t>
+      </w:r>
+      <w:r>
+        <w:rPr>
+          <w:b/>
+          <w:bCs/>
+        </w:rPr>
+        <w:t xml:space="preserve">just</w:t>
+      </w:r>
+      <w:r>
+        <w:t xml:space="preserve"> </w:t>
+      </w:r>
+      <w:r>
+        <w:t xml:space="preserve">found this important paper for which a lot can be gleaned upon. Many of the important things we have been discussing are discussed in here:</w:t>
+      </w:r>
+      <w:r>
+        <w:t xml:space="preserve"> </w:t>
+      </w:r>
+      <w:r>
+        <w:t xml:space="preserve">[23]</w:t>
+      </w:r>
+      <w:r>
+        <w:t xml:space="preserve">, so we should be careful to make our narrative distinct. The limitation of this study is it lacks the focus on modelling frameworks, so I think us distinguishing how we link these concepts back into the model would be quite novel and distinguish ourselves from them..</w:t>
       </w:r>
     </w:p>
     <w:p>
       <w:pPr>
         <w:pStyle w:val="Compact"/>
         <w:numPr>
-          <w:ilvl w:val="1"/>
+          <w:ilvl w:val="0"/>
           <w:numId w:val="1005"/>
         </w:numPr>
       </w:pPr>
       <w:r>
-        <w:t xml:space="preserve">Both models can be used to predict how temperature affects the growth, reproduction and survival of an organism</w:t>
+        <w:t xml:space="preserve">Then, we overlay briefly how we might capture that in the modelling framework we setup above. For example, you all write the biology and we then need to think about how we can adjust models to capture these nuances.</w:t>
       </w:r>
     </w:p>
     <w:p>
       <w:pPr>
         <w:pStyle w:val="Compact"/>
         <w:numPr>
-          <w:ilvl w:val="1"/>
+          <w:ilvl w:val="0"/>
           <w:numId w:val="1005"/>
         </w:numPr>
       </w:pPr>
       <w:r>
-        <w:t xml:space="preserve">Combining these models with TLS can help predict how temperature affects the survival and reproduction of a focal species in a community</w:t>
-      </w:r>
-    </w:p>
-    <w:bookmarkEnd w:id="27"/>
-    <w:bookmarkStart w:id="28" w:name="Xbdb3df2871e98d114a1e4e74a52caa28253dc0c"/>
-    <w:p>
-      <w:pPr>
-        <w:pStyle w:val="Heading1"/>
-      </w:pPr>
-      <w:r>
-        <w:t xml:space="preserve">Mechanistic approaches that</w:t>
-      </w:r>
-      <w:r>
-        <w:t xml:space="preserve"> </w:t>
-      </w:r>
-      <w:r>
-        <w:t xml:space="preserve">‘</w:t>
-      </w:r>
-      <w:r>
-        <w:t xml:space="preserve">speak</w:t>
-      </w:r>
-      <w:r>
-        <w:t xml:space="preserve">’</w:t>
-      </w:r>
-      <w:r>
-        <w:t xml:space="preserve"> </w:t>
-      </w:r>
-      <w:r>
-        <w:t xml:space="preserve">to population and community ecology under extreme heat (Margie)</w:t>
+        <w:t xml:space="preserve">If uncertain about adding a sentence to the link to the models above, that’s ok, Dan, Mike, Margie and Belinda can add.</w:t>
+      </w:r>
+    </w:p>
+    <w:bookmarkStart w:id="29" w:name="X1b136e3eae891c477bc728d2597e572ca649eaa"/>
+    <w:p>
+      <w:pPr>
+        <w:pStyle w:val="Heading3"/>
+      </w:pPr>
+      <w:r>
+        <w:t xml:space="preserve">Microbial communities can impact thermal sensitivity in plants and animals (Brajesh)</w:t>
       </w:r>
     </w:p>
     <w:p>
@@ -1165,296 +1415,6 @@
         </w:numPr>
       </w:pPr>
       <w:r>
-        <w:t xml:space="preserve">How can we link mechanistic physiological models with population and community ecology theory?</w:t>
-      </w:r>
-    </w:p>
-    <w:p>
-      <w:pPr>
-        <w:pStyle w:val="Compact"/>
-        <w:numPr>
-          <w:ilvl w:val="0"/>
-          <w:numId w:val="1006"/>
-        </w:numPr>
-      </w:pPr>
-      <w:r>
-        <w:t xml:space="preserve">Introducing population and network models to link outputs from DEB (survival, reproduction, abundance) to population growth.</w:t>
-      </w:r>
-    </w:p>
-    <w:p>
-      <w:pPr>
-        <w:pStyle w:val="Compact"/>
-        <w:numPr>
-          <w:ilvl w:val="0"/>
-          <w:numId w:val="1006"/>
-        </w:numPr>
-      </w:pPr>
-      <w:r>
-        <w:t xml:space="preserve">How people are analysing communities with network theory. Some important papers</w:t>
-      </w:r>
-      <w:r>
-        <w:t xml:space="preserve"> </w:t>
-      </w:r>
-      <w:r>
-        <w:t xml:space="preserve">[30]</w:t>
-      </w:r>
-      <w:r>
-        <w:t xml:space="preserve"> </w:t>
-      </w:r>
-      <w:r>
-        <w:t xml:space="preserve">[31]</w:t>
-      </w:r>
-      <w:r>
-        <w:t xml:space="preserve"> </w:t>
-      </w:r>
-      <w:r>
-        <w:t xml:space="preserve">[32]</w:t>
-      </w:r>
-      <w:r>
-        <w:t xml:space="preserve"> </w:t>
-      </w:r>
-      <w:r>
-        <w:t xml:space="preserve">[33]</w:t>
-      </w:r>
-      <w:r>
-        <w:t xml:space="preserve"> </w:t>
-      </w:r>
-      <w:r>
-        <w:t xml:space="preserve">[34]</w:t>
-      </w:r>
-      <w:r>
-        <w:t xml:space="preserve"> </w:t>
-      </w:r>
-      <w:r>
-        <w:t xml:space="preserve">[35]</w:t>
-      </w:r>
-      <w:r>
-        <w:t xml:space="preserve"> </w:t>
-      </w:r>
-      <w:r>
-        <w:t xml:space="preserve">[36]</w:t>
-      </w:r>
-      <w:r>
-        <w:t xml:space="preserve"> </w:t>
-      </w:r>
-      <w:r>
-        <w:t xml:space="preserve">Should also look at this book</w:t>
-      </w:r>
-      <w:r>
-        <w:t xml:space="preserve"> </w:t>
-      </w:r>
-      <w:r>
-        <w:t xml:space="preserve">[37]</w:t>
-      </w:r>
-    </w:p>
-    <w:p>
-      <w:pPr>
-        <w:pStyle w:val="Compact"/>
-        <w:numPr>
-          <w:ilvl w:val="0"/>
-          <w:numId w:val="1006"/>
-        </w:numPr>
-      </w:pPr>
-      <w:r>
-        <w:t xml:space="preserve">How can we capture interactions among species within the community to predict how heat stress will affect community structure?</w:t>
-      </w:r>
-    </w:p>
-    <w:p>
-      <w:pPr>
-        <w:pStyle w:val="Compact"/>
-        <w:numPr>
-          <w:ilvl w:val="0"/>
-          <w:numId w:val="1006"/>
-        </w:numPr>
-      </w:pPr>
-      <w:r>
-        <w:t xml:space="preserve">Figure 2: demonstrating how TLS, biophysical and DEB models can be used to predict heat stress impacts on plants and animals, growth, reproduction, survival. (Dan, Margie)</w:t>
-      </w:r>
-    </w:p>
-    <w:p>
-      <w:pPr>
-        <w:pStyle w:val="Compact"/>
-        <w:numPr>
-          <w:ilvl w:val="0"/>
-          <w:numId w:val="1006"/>
-        </w:numPr>
-      </w:pPr>
-      <w:r>
-        <w:t xml:space="preserve">Also this is a cool paper</w:t>
-      </w:r>
-      <w:r>
-        <w:t xml:space="preserve"> </w:t>
-      </w:r>
-      <w:r>
-        <w:t xml:space="preserve">[38]</w:t>
-      </w:r>
-      <w:r>
-        <w:t xml:space="preserve"> </w:t>
-      </w:r>
-      <w:r>
-        <w:t xml:space="preserve">on carnivores diets by DNA sequencing fecal data</w:t>
-      </w:r>
-      <w:r>
-        <w:t xml:space="preserve"> </w:t>
-      </w:r>
-      <w:r>
-        <w:t xml:space="preserve">-The other way to model interactions us using foundational community ecology/ species abundance models see</w:t>
-      </w:r>
-      <w:r>
-        <w:t xml:space="preserve"> </w:t>
-      </w:r>
-      <w:r>
-        <w:t xml:space="preserve">[39]</w:t>
-      </w:r>
-      <w:r>
-        <w:t xml:space="preserve">. We can here model the actual abundance of a given species and it would seem more flexible to incorporate thermal tolerance infor into these models.</w:t>
-      </w:r>
-    </w:p>
-    <w:p>
-      <w:pPr>
-        <w:pStyle w:val="Compact"/>
-        <w:numPr>
-          <w:ilvl w:val="0"/>
-          <w:numId w:val="1006"/>
-        </w:numPr>
-      </w:pPr>
-      <w:r>
-        <w:t xml:space="preserve">have a close look at</w:t>
-      </w:r>
-      <w:r>
-        <w:t xml:space="preserve"> </w:t>
-      </w:r>
-      <w:r>
-        <w:t xml:space="preserve">[40]</w:t>
-      </w:r>
-      <w:r>
-        <w:t xml:space="preserve"> </w:t>
-      </w:r>
-      <w:r>
-        <w:t xml:space="preserve">and</w:t>
-      </w:r>
-      <w:r>
-        <w:t xml:space="preserve"> </w:t>
-      </w:r>
-      <w:r>
-        <w:t xml:space="preserve">[41]</w:t>
-      </w:r>
-      <w:r>
-        <w:t xml:space="preserve">, limitations</w:t>
-      </w:r>
-      <w:r>
-        <w:t xml:space="preserve"> </w:t>
-      </w:r>
-      <w:r>
-        <w:t xml:space="preserve">[42]</w:t>
-      </w:r>
-      <w:r>
-        <w:t xml:space="preserve"> </w:t>
-      </w:r>
-      <w:r>
-        <w:t xml:space="preserve">[43]</w:t>
-      </w:r>
-    </w:p>
-    <w:bookmarkEnd w:id="28"/>
-    <w:bookmarkStart w:id="34" w:name="Xe7540e51cb84d29e47d083817996607ca5f8009"/>
-    <w:p>
-      <w:pPr>
-        <w:pStyle w:val="Heading1"/>
-      </w:pPr>
-      <w:r>
-        <w:t xml:space="preserve">Incorporating context-dependent environmental feedback to evaluate resilience to extreme heat (Brajesh, Brendan, James, Everyone else who wants to contribute)</w:t>
-      </w:r>
-    </w:p>
-    <w:p>
-      <w:pPr>
-        <w:pStyle w:val="Compact"/>
-        <w:numPr>
-          <w:ilvl w:val="0"/>
-          <w:numId w:val="1007"/>
-        </w:numPr>
-      </w:pPr>
-      <w:r>
-        <w:t xml:space="preserve">Goal of this section is to briefly focus on the BIOLOGY that will shift thermal exposure and sensitivity in plants and animals.</w:t>
-      </w:r>
-    </w:p>
-    <w:p>
-      <w:pPr>
-        <w:pStyle w:val="Compact"/>
-        <w:numPr>
-          <w:ilvl w:val="0"/>
-          <w:numId w:val="1007"/>
-        </w:numPr>
-      </w:pPr>
-      <w:r>
-        <w:t xml:space="preserve">I</w:t>
-      </w:r>
-      <w:r>
-        <w:t xml:space="preserve"> </w:t>
-      </w:r>
-      <w:r>
-        <w:rPr>
-          <w:b/>
-          <w:bCs/>
-        </w:rPr>
-        <w:t xml:space="preserve">just</w:t>
-      </w:r>
-      <w:r>
-        <w:t xml:space="preserve"> </w:t>
-      </w:r>
-      <w:r>
-        <w:t xml:space="preserve">found this important paper for which a lot can be gleaned upon. Many of the important things we have been discussing are discussed in here:</w:t>
-      </w:r>
-      <w:r>
-        <w:t xml:space="preserve"> </w:t>
-      </w:r>
-      <w:r>
-        <w:t xml:space="preserve">[23]</w:t>
-      </w:r>
-      <w:r>
-        <w:t xml:space="preserve">, so we should be careful to make our narrative distinct. The limitation of this study is it lacks the focus on modelling frameworks, so I think us distinguishing how we link these concepts back into the model would be quite novel and distinguish ourselves from them..</w:t>
-      </w:r>
-    </w:p>
-    <w:p>
-      <w:pPr>
-        <w:pStyle w:val="Compact"/>
-        <w:numPr>
-          <w:ilvl w:val="0"/>
-          <w:numId w:val="1007"/>
-        </w:numPr>
-      </w:pPr>
-      <w:r>
-        <w:t xml:space="preserve">Then, we overlay briefly how we might capture that in the modelling framework we setup above. For example, you all write the biology and we then need to think about how we can adjust models to capture these nuances.</w:t>
-      </w:r>
-    </w:p>
-    <w:p>
-      <w:pPr>
-        <w:pStyle w:val="Compact"/>
-        <w:numPr>
-          <w:ilvl w:val="0"/>
-          <w:numId w:val="1007"/>
-        </w:numPr>
-      </w:pPr>
-      <w:r>
-        <w:t xml:space="preserve">If uncertain about adding a sentence to the link to the models above, that’s ok, Dan, Mike, Margie and Belinda can add.</w:t>
-      </w:r>
-    </w:p>
-    <w:bookmarkStart w:id="29" w:name="X1b136e3eae891c477bc728d2597e572ca649eaa"/>
-    <w:p>
-      <w:pPr>
-        <w:pStyle w:val="Heading3"/>
-      </w:pPr>
-      <w:r>
-        <w:t xml:space="preserve">Microbial communities can impact thermal sensitivity in plants and animals (Brajesh)</w:t>
-      </w:r>
-    </w:p>
-    <w:p>
-      <w:pPr>
-        <w:pStyle w:val="Compact"/>
-        <w:numPr>
-          <w:ilvl w:val="0"/>
-          <w:numId w:val="1008"/>
-        </w:numPr>
-      </w:pPr>
-      <w:r>
         <w:t xml:space="preserve">Here’s some text of a cool example I had written up. Feel free to use Braj or shift completely if you’d like.</w:t>
       </w:r>
       <w:r>
@@ -1477,7 +1437,7 @@
         <w:t xml:space="preserve"> </w:t>
       </w:r>
       <w:r>
-        <w:t xml:space="preserve">[44]</w:t>
+        <w:t xml:space="preserve">[47]</w:t>
       </w:r>
       <w:r>
         <w:t xml:space="preserve"> </w:t>
@@ -1560,7 +1520,7 @@
         <w:pStyle w:val="Compact"/>
         <w:numPr>
           <w:ilvl w:val="0"/>
-          <w:numId w:val="1008"/>
+          <w:numId w:val="1006"/>
         </w:numPr>
       </w:pPr>
       <w:r>
@@ -1570,7 +1530,7 @@
         <w:t xml:space="preserve"> </w:t>
       </w:r>
       <w:r>
-        <w:t xml:space="preserve">[45]</w:t>
+        <w:t xml:space="preserve">[48]</w:t>
       </w:r>
       <w:r>
         <w:t xml:space="preserve">. The paper provides a framework for modelling soil plant interactions</w:t>
@@ -1587,7 +1547,7 @@
         <w:t xml:space="preserve"> </w:t>
       </w:r>
       <w:r>
-        <w:t xml:space="preserve">[46]</w:t>
+        <w:t xml:space="preserve">[49]</w:t>
       </w:r>
       <w:r>
         <w:t xml:space="preserve">, which is thought to be associated with transcriptional buffering of hosts by the natural microbiome</w:t>
@@ -1596,7 +1556,7 @@
         <w:t xml:space="preserve"> </w:t>
       </w:r>
       <w:r>
-        <w:t xml:space="preserve">[47]</w:t>
+        <w:t xml:space="preserve">[50]</w:t>
       </w:r>
       <w:r>
         <w:t xml:space="preserve">. Specific gut bacteria may provide a protective effect on their host.</w:t>
@@ -1637,7 +1597,7 @@
         <w:t xml:space="preserve"> </w:t>
       </w:r>
       <w:r>
-        <w:t xml:space="preserve">[48]</w:t>
+        <w:t xml:space="preserve">[51]</w:t>
       </w:r>
       <w:r>
         <w:t xml:space="preserve">. Moreover, this protective effect can influence the ability of the host to evolve further resistance to the heat shock and harboured more bacteria</w:t>
@@ -1646,7 +1606,7 @@
         <w:t xml:space="preserve"> </w:t>
       </w:r>
       <w:r>
-        <w:t xml:space="preserve">[49]</w:t>
+        <w:t xml:space="preserve">[52]</w:t>
       </w:r>
       <w:r>
         <w:t xml:space="preserve">. Even microbes that are normally parasitic on their hosts can generate benefits to them under stressful conditions. In the mussel</w:t>
@@ -1668,7 +1628,7 @@
         <w:t xml:space="preserve"> </w:t>
       </w:r>
       <w:r>
-        <w:t xml:space="preserve">[50]</w:t>
+        <w:t xml:space="preserve">[53]</w:t>
       </w:r>
       <w:r>
         <w:t xml:space="preserve">, On the other hand, many endosymbionts including those providing host benefits appear particularly sensitive to heat</w:t>
@@ -1677,7 +1637,7 @@
         <w:t xml:space="preserve"> </w:t>
       </w:r>
       <w:r>
-        <w:t xml:space="preserve">[51]</w:t>
+        <w:t xml:space="preserve">[54]</w:t>
       </w:r>
       <w:r>
         <w:t xml:space="preserve">. The density of</w:t>
@@ -1718,7 +1678,7 @@
         <w:t xml:space="preserve"> </w:t>
       </w:r>
       <w:r>
-        <w:t xml:space="preserve">[52]</w:t>
+        <w:t xml:space="preserve">[55]</w:t>
       </w:r>
       <w:r>
         <w:t xml:space="preserve">. Nevertheless, the heat tolerance of pea aphids can be sharply increased through a mutation in a heat shock protein encoded by</w:t>
@@ -1737,7 +1697,7 @@
         <w:t xml:space="preserve"> </w:t>
       </w:r>
       <w:r>
-        <w:t xml:space="preserve">[53]</w:t>
+        <w:t xml:space="preserve">[56]</w:t>
       </w:r>
       <w:r>
         <w:t xml:space="preserve">.</w:t>
@@ -1768,7 +1728,7 @@
         <w:pStyle w:val="Compact"/>
         <w:numPr>
           <w:ilvl w:val="0"/>
-          <w:numId w:val="1009"/>
+          <w:numId w:val="1007"/>
         </w:numPr>
       </w:pPr>
       <w:r>
@@ -1794,7 +1754,7 @@
         <w:t xml:space="preserve"> </w:t>
       </w:r>
       <w:r>
-        <w:t xml:space="preserve">[54]</w:t>
+        <w:t xml:space="preserve">[57]</w:t>
       </w:r>
       <w:r>
         <w:t xml:space="preserve"> </w:t>
@@ -1837,7 +1797,7 @@
         <w:t xml:space="preserve"> </w:t>
       </w:r>
       <w:r>
-        <w:t xml:space="preserve">[54]</w:t>
+        <w:t xml:space="preserve">[57]</w:t>
       </w:r>
       <w:r>
         <w:t xml:space="preserve"> </w:t>
@@ -1867,7 +1827,7 @@
         <w:t xml:space="preserve"> </w:t>
       </w:r>
       <w:r>
-        <w:t xml:space="preserve">[55]</w:t>
+        <w:t xml:space="preserve">[58]</w:t>
       </w:r>
       <w:r>
         <w:t xml:space="preserve">. Connects heat tolerance to population matrix models. And, shows acclimation responses (heat hardening).</w:t>
@@ -1911,7 +1871,7 @@
         <w:pStyle w:val="Compact"/>
         <w:numPr>
           <w:ilvl w:val="0"/>
-          <w:numId w:val="1010"/>
+          <w:numId w:val="1008"/>
         </w:numPr>
       </w:pPr>
       <w:r>
@@ -1923,7 +1883,7 @@
         <w:pStyle w:val="Compact"/>
         <w:numPr>
           <w:ilvl w:val="0"/>
-          <w:numId w:val="1010"/>
+          <w:numId w:val="1008"/>
         </w:numPr>
       </w:pPr>
       <w:r>
@@ -1951,7 +1911,7 @@
         <w:pStyle w:val="Compact"/>
         <w:numPr>
           <w:ilvl w:val="1"/>
-          <w:numId w:val="1011"/>
+          <w:numId w:val="1009"/>
         </w:numPr>
       </w:pPr>
       <w:r>
@@ -1963,7 +1923,7 @@
         <w:pStyle w:val="Compact"/>
         <w:numPr>
           <w:ilvl w:val="1"/>
-          <w:numId w:val="1011"/>
+          <w:numId w:val="1009"/>
         </w:numPr>
       </w:pPr>
       <w:r>
@@ -1975,7 +1935,7 @@
         <w:pStyle w:val="Compact"/>
         <w:numPr>
           <w:ilvl w:val="0"/>
-          <w:numId w:val="1010"/>
+          <w:numId w:val="1008"/>
         </w:numPr>
       </w:pPr>
       <w:r>
@@ -1987,7 +1947,7 @@
         <w:pStyle w:val="Compact"/>
         <w:numPr>
           <w:ilvl w:val="1"/>
-          <w:numId w:val="1012"/>
+          <w:numId w:val="1010"/>
         </w:numPr>
       </w:pPr>
       <w:r>
@@ -2006,7 +1966,7 @@
         <w:pStyle w:val="Compact"/>
         <w:numPr>
           <w:ilvl w:val="0"/>
-          <w:numId w:val="1010"/>
+          <w:numId w:val="1008"/>
         </w:numPr>
       </w:pPr>
       <w:r>
@@ -2018,7 +1978,7 @@
         <w:pStyle w:val="Compact"/>
         <w:numPr>
           <w:ilvl w:val="0"/>
-          <w:numId w:val="1010"/>
+          <w:numId w:val="1008"/>
         </w:numPr>
       </w:pPr>
       <w:r>
@@ -2039,7 +1999,7 @@
         <w:pStyle w:val="Compact"/>
         <w:numPr>
           <w:ilvl w:val="0"/>
-          <w:numId w:val="1013"/>
+          <w:numId w:val="1011"/>
         </w:numPr>
       </w:pPr>
       <w:r>
@@ -2051,7 +2011,7 @@
         <w:pStyle w:val="Compact"/>
         <w:numPr>
           <w:ilvl w:val="0"/>
-          <w:numId w:val="1013"/>
+          <w:numId w:val="1011"/>
         </w:numPr>
       </w:pPr>
       <w:r>
@@ -2063,7 +2023,7 @@
         <w:pStyle w:val="Compact"/>
         <w:numPr>
           <w:ilvl w:val="0"/>
-          <w:numId w:val="1013"/>
+          <w:numId w:val="1011"/>
         </w:numPr>
       </w:pPr>
       <w:r>
@@ -2075,7 +2035,7 @@
         <w:pStyle w:val="Compact"/>
         <w:numPr>
           <w:ilvl w:val="0"/>
-          <w:numId w:val="1013"/>
+          <w:numId w:val="1011"/>
         </w:numPr>
       </w:pPr>
       <w:r>
@@ -2087,7 +2047,7 @@
         <w:pStyle w:val="Compact"/>
         <w:numPr>
           <w:ilvl w:val="0"/>
-          <w:numId w:val="1013"/>
+          <w:numId w:val="1011"/>
         </w:numPr>
       </w:pPr>
       <w:r>
@@ -2099,7 +2059,7 @@
         <w:pStyle w:val="Compact"/>
         <w:numPr>
           <w:ilvl w:val="0"/>
-          <w:numId w:val="1013"/>
+          <w:numId w:val="1011"/>
         </w:numPr>
       </w:pPr>
       <w:r>
@@ -2187,7 +2147,7 @@
         <w:t xml:space="preserve"> </w:t>
       </w:r>
       <w:r>
-        <w:t xml:space="preserve">[56]</w:t>
+        <w:t xml:space="preserve">[59]</w:t>
       </w:r>
       <w:r>
         <w:t xml:space="preserve"> </w:t>
@@ -2215,7 +2175,7 @@
     </w:p>
     <w:bookmarkEnd w:id="41"/>
     <w:bookmarkEnd w:id="42"/>
-    <w:bookmarkStart w:id="100" w:name="references"/>
+    <w:bookmarkStart w:id="103" w:name="references"/>
     <w:p>
       <w:pPr>
         <w:pStyle w:val="Heading1"/>
@@ -2224,7 +2184,7 @@
         <w:t xml:space="preserve">References</w:t>
       </w:r>
     </w:p>
-    <w:bookmarkStart w:id="99" w:name="refs"/>
+    <w:bookmarkStart w:id="102" w:name="refs"/>
     <w:bookmarkStart w:id="43" w:name="ref-Barriopedro2023"/>
     <w:p>
       <w:pPr>
@@ -3550,7 +3510,7 @@
       </w:r>
     </w:p>
     <w:bookmarkEnd w:id="70"/>
-    <w:bookmarkStart w:id="71" w:name="ref-Bruggeman2009"/>
+    <w:bookmarkStart w:id="71" w:name="ref-Kooijman2021"/>
     <w:p>
       <w:pPr>
         <w:pStyle w:val="Bibliography"/>
@@ -3565,6 +3525,57 @@
         <w:t xml:space="preserve">	</w:t>
       </w:r>
       <w:r>
+        <w:t xml:space="preserve">Kooijman, S.A.L.M.</w:t>
+      </w:r>
+      <w:r>
+        <w:t xml:space="preserve"> </w:t>
+      </w:r>
+      <w:r>
+        <w:rPr>
+          <w:i/>
+          <w:iCs/>
+        </w:rPr>
+        <w:t xml:space="preserve">et al.</w:t>
+      </w:r>
+      <w:r>
+        <w:t xml:space="preserve"> </w:t>
+      </w:r>
+      <w:r>
+        <w:t xml:space="preserve">(2021) Multidimensional scaling for animal traits in the context of dynamic energy budget theory.</w:t>
+      </w:r>
+      <w:r>
+        <w:t xml:space="preserve"> </w:t>
+      </w:r>
+      <w:r>
+        <w:rPr>
+          <w:i/>
+          <w:iCs/>
+        </w:rPr>
+        <w:t xml:space="preserve">Conserv. Physiol.</w:t>
+      </w:r>
+      <w:r>
+        <w:t xml:space="preserve"> </w:t>
+      </w:r>
+      <w:r>
+        <w:t xml:space="preserve">9, coab086</w:t>
+      </w:r>
+    </w:p>
+    <w:bookmarkEnd w:id="71"/>
+    <w:bookmarkStart w:id="72" w:name="ref-Bruggeman2009"/>
+    <w:p>
+      <w:pPr>
+        <w:pStyle w:val="Bibliography"/>
+      </w:pPr>
+      <w:r>
+        <w:t xml:space="preserve">30.</w:t>
+      </w:r>
+      <w:r>
+        <w:t xml:space="preserve"> </w:t>
+      </w:r>
+      <w:r>
+        <w:t xml:space="preserve">	</w:t>
+      </w:r>
+      <w:r>
         <w:t xml:space="preserve">Bruggeman, J.</w:t>
       </w:r>
       <w:r>
@@ -3609,14 +3620,14 @@
         <w:t xml:space="preserve">37, W179–W184</w:t>
       </w:r>
     </w:p>
-    <w:bookmarkEnd w:id="71"/>
-    <w:bookmarkStart w:id="72" w:name="ref-Delmas2019"/>
+    <w:bookmarkEnd w:id="72"/>
+    <w:bookmarkStart w:id="73" w:name="ref-Kearney2017"/>
     <w:p>
       <w:pPr>
         <w:pStyle w:val="Bibliography"/>
       </w:pPr>
       <w:r>
-        <w:t xml:space="preserve">30.</w:t>
+        <w:t xml:space="preserve">31.</w:t>
       </w:r>
       <w:r>
         <w:t xml:space="preserve"> </w:t>
@@ -3625,6 +3636,124 @@
         <w:t xml:space="preserve">	</w:t>
       </w:r>
       <w:r>
+        <w:t xml:space="preserve">Kearney, M.R. and Porter, W.P. (2017)</w:t>
+      </w:r>
+      <w:r>
+        <w:t xml:space="preserve"> </w:t>
+      </w:r>
+      <w:r>
+        <w:t xml:space="preserve">NicheMapR</w:t>
+      </w:r>
+      <w:r>
+        <w:t xml:space="preserve"> </w:t>
+      </w:r>
+      <w:r>
+        <w:t xml:space="preserve">– an</w:t>
+      </w:r>
+      <w:r>
+        <w:t xml:space="preserve"> </w:t>
+      </w:r>
+      <w:r>
+        <w:t xml:space="preserve">R</w:t>
+      </w:r>
+      <w:r>
+        <w:t xml:space="preserve"> </w:t>
+      </w:r>
+      <w:r>
+        <w:t xml:space="preserve">package for biophysical modelling: The microclimate model.</w:t>
+      </w:r>
+      <w:r>
+        <w:t xml:space="preserve"> </w:t>
+      </w:r>
+      <w:r>
+        <w:rPr>
+          <w:i/>
+          <w:iCs/>
+        </w:rPr>
+        <w:t xml:space="preserve">Ecography (Cop.)</w:t>
+      </w:r>
+      <w:r>
+        <w:t xml:space="preserve"> </w:t>
+      </w:r>
+      <w:r>
+        <w:t xml:space="preserve">40, 664–674</w:t>
+      </w:r>
+    </w:p>
+    <w:bookmarkEnd w:id="73"/>
+    <w:bookmarkStart w:id="74" w:name="ref-Kearney2020a"/>
+    <w:p>
+      <w:pPr>
+        <w:pStyle w:val="Bibliography"/>
+      </w:pPr>
+      <w:r>
+        <w:t xml:space="preserve">32.</w:t>
+      </w:r>
+      <w:r>
+        <w:t xml:space="preserve"> </w:t>
+      </w:r>
+      <w:r>
+        <w:t xml:space="preserve">	</w:t>
+      </w:r>
+      <w:r>
+        <w:t xml:space="preserve">Kearney, M.R. and Porter, W.P. (2020)</w:t>
+      </w:r>
+      <w:r>
+        <w:t xml:space="preserve"> </w:t>
+      </w:r>
+      <w:r>
+        <w:t xml:space="preserve">NicheMapR</w:t>
+      </w:r>
+      <w:r>
+        <w:t xml:space="preserve"> </w:t>
+      </w:r>
+      <w:r>
+        <w:t xml:space="preserve">– an</w:t>
+      </w:r>
+      <w:r>
+        <w:t xml:space="preserve"> </w:t>
+      </w:r>
+      <w:r>
+        <w:t xml:space="preserve">R</w:t>
+      </w:r>
+      <w:r>
+        <w:t xml:space="preserve"> </w:t>
+      </w:r>
+      <w:r>
+        <w:t xml:space="preserve">package for biophysical modelling: The ectotherm and dynamic energy budget models.</w:t>
+      </w:r>
+      <w:r>
+        <w:t xml:space="preserve"> </w:t>
+      </w:r>
+      <w:r>
+        <w:rPr>
+          <w:i/>
+          <w:iCs/>
+        </w:rPr>
+        <w:t xml:space="preserve">Ecography (Cop.)</w:t>
+      </w:r>
+      <w:r>
+        <w:t xml:space="preserve"> </w:t>
+      </w:r>
+      <w:r>
+        <w:t xml:space="preserve">43, 85–96</w:t>
+      </w:r>
+    </w:p>
+    <w:bookmarkEnd w:id="74"/>
+    <w:bookmarkStart w:id="75" w:name="ref-Delmas2019"/>
+    <w:p>
+      <w:pPr>
+        <w:pStyle w:val="Bibliography"/>
+      </w:pPr>
+      <w:r>
+        <w:t xml:space="preserve">33.</w:t>
+      </w:r>
+      <w:r>
+        <w:t xml:space="preserve"> </w:t>
+      </w:r>
+      <w:r>
+        <w:t xml:space="preserve">	</w:t>
+      </w:r>
+      <w:r>
         <w:t xml:space="preserve">Delmas, E.</w:t>
       </w:r>
       <w:r>
@@ -3660,14 +3789,14 @@
         <w:t xml:space="preserve">94, 16–36</w:t>
       </w:r>
     </w:p>
-    <w:bookmarkEnd w:id="72"/>
-    <w:bookmarkStart w:id="73" w:name="ref-Godoy2019"/>
+    <w:bookmarkEnd w:id="75"/>
+    <w:bookmarkStart w:id="76" w:name="ref-Godoy2019"/>
     <w:p>
       <w:pPr>
         <w:pStyle w:val="Bibliography"/>
       </w:pPr>
       <w:r>
-        <w:t xml:space="preserve">31.</w:t>
+        <w:t xml:space="preserve">34.</w:t>
       </w:r>
       <w:r>
         <w:t xml:space="preserve"> </w:t>
@@ -3695,14 +3824,14 @@
         <w:t xml:space="preserve">33, 1190–1201</w:t>
       </w:r>
     </w:p>
-    <w:bookmarkEnd w:id="73"/>
-    <w:bookmarkStart w:id="74" w:name="ref-Poisot2021"/>
+    <w:bookmarkEnd w:id="76"/>
+    <w:bookmarkStart w:id="77" w:name="ref-Poisot2021"/>
     <w:p>
       <w:pPr>
         <w:pStyle w:val="Bibliography"/>
       </w:pPr>
       <w:r>
-        <w:t xml:space="preserve">32.</w:t>
+        <w:t xml:space="preserve">35.</w:t>
       </w:r>
       <w:r>
         <w:t xml:space="preserve"> </w:t>
@@ -3746,14 +3875,14 @@
         <w:t xml:space="preserve">48, 1552–1563</w:t>
       </w:r>
     </w:p>
-    <w:bookmarkEnd w:id="74"/>
-    <w:bookmarkStart w:id="75" w:name="ref-Hui2019"/>
+    <w:bookmarkEnd w:id="77"/>
+    <w:bookmarkStart w:id="78" w:name="ref-Hui2019"/>
     <w:p>
       <w:pPr>
         <w:pStyle w:val="Bibliography"/>
       </w:pPr>
       <w:r>
-        <w:t xml:space="preserve">33.</w:t>
+        <w:t xml:space="preserve">36.</w:t>
       </w:r>
       <w:r>
         <w:t xml:space="preserve"> </w:t>
@@ -3781,14 +3910,14 @@
         <w:t xml:space="preserve">34, 121–131</w:t>
       </w:r>
     </w:p>
-    <w:bookmarkEnd w:id="75"/>
-    <w:bookmarkStart w:id="76" w:name="ref-Gomez2023"/>
+    <w:bookmarkEnd w:id="78"/>
+    <w:bookmarkStart w:id="79" w:name="ref-Gomez2023"/>
     <w:p>
       <w:pPr>
         <w:pStyle w:val="Bibliography"/>
       </w:pPr>
       <w:r>
-        <w:t xml:space="preserve">34.</w:t>
+        <w:t xml:space="preserve">37.</w:t>
       </w:r>
       <w:r>
         <w:t xml:space="preserve"> </w:t>
@@ -3832,14 +3961,14 @@
         <w:t xml:space="preserve">26, S47–S61</w:t>
       </w:r>
     </w:p>
-    <w:bookmarkEnd w:id="76"/>
-    <w:bookmarkStart w:id="77" w:name="ref-Lytle2023"/>
+    <w:bookmarkEnd w:id="79"/>
+    <w:bookmarkStart w:id="80" w:name="ref-Lytle2023"/>
     <w:p>
       <w:pPr>
         <w:pStyle w:val="Bibliography"/>
       </w:pPr>
       <w:r>
-        <w:t xml:space="preserve">35.</w:t>
+        <w:t xml:space="preserve">38.</w:t>
       </w:r>
       <w:r>
         <w:t xml:space="preserve"> </w:t>
@@ -3867,14 +3996,14 @@
         <w:t xml:space="preserve">2, 26</w:t>
       </w:r>
     </w:p>
-    <w:bookmarkEnd w:id="77"/>
-    <w:bookmarkStart w:id="78" w:name="ref-Petsopoulos2021"/>
+    <w:bookmarkEnd w:id="80"/>
+    <w:bookmarkStart w:id="81" w:name="ref-Petsopoulos2021"/>
     <w:p>
       <w:pPr>
         <w:pStyle w:val="Bibliography"/>
       </w:pPr>
       <w:r>
-        <w:t xml:space="preserve">36.</w:t>
+        <w:t xml:space="preserve">39.</w:t>
       </w:r>
       <w:r>
         <w:t xml:space="preserve"> </w:t>
@@ -3912,14 +4041,14 @@
         <w:t xml:space="preserve">Ecol. Entomol.</w:t>
       </w:r>
     </w:p>
-    <w:bookmarkEnd w:id="78"/>
-    <w:bookmarkStart w:id="79" w:name="ref-Dale2021"/>
+    <w:bookmarkEnd w:id="81"/>
+    <w:bookmarkStart w:id="82" w:name="ref-Dale2021"/>
     <w:p>
       <w:pPr>
         <w:pStyle w:val="Bibliography"/>
       </w:pPr>
       <w:r>
-        <w:t xml:space="preserve">37.</w:t>
+        <w:t xml:space="preserve">40.</w:t>
       </w:r>
       <w:r>
         <w:t xml:space="preserve"> </w:t>
@@ -3944,14 +4073,14 @@
         <w:t xml:space="preserve">, Cambridge University Press</w:t>
       </w:r>
     </w:p>
-    <w:bookmarkEnd w:id="79"/>
-    <w:bookmarkStart w:id="80" w:name="ref-Lu2023"/>
+    <w:bookmarkEnd w:id="82"/>
+    <w:bookmarkStart w:id="83" w:name="ref-Lu2023"/>
     <w:p>
       <w:pPr>
         <w:pStyle w:val="Bibliography"/>
       </w:pPr>
       <w:r>
-        <w:t xml:space="preserve">38.</w:t>
+        <w:t xml:space="preserve">41.</w:t>
       </w:r>
       <w:r>
         <w:t xml:space="preserve"> </w:t>
@@ -3995,14 +4124,14 @@
         <w:t xml:space="preserve">33, 647–659</w:t>
       </w:r>
     </w:p>
-    <w:bookmarkEnd w:id="80"/>
-    <w:bookmarkStart w:id="81" w:name="ref-Carrara2015"/>
+    <w:bookmarkEnd w:id="83"/>
+    <w:bookmarkStart w:id="84" w:name="ref-Carrara2015"/>
     <w:p>
       <w:pPr>
         <w:pStyle w:val="Bibliography"/>
       </w:pPr>
       <w:r>
-        <w:t xml:space="preserve">39.</w:t>
+        <w:t xml:space="preserve">42.</w:t>
       </w:r>
       <w:r>
         <w:t xml:space="preserve"> </w:t>
@@ -4046,14 +4175,14 @@
         <w:t xml:space="preserve">6, 895–906</w:t>
       </w:r>
     </w:p>
-    <w:bookmarkEnd w:id="81"/>
-    <w:bookmarkStart w:id="82" w:name="ref-Vitali2022"/>
+    <w:bookmarkEnd w:id="84"/>
+    <w:bookmarkStart w:id="85" w:name="ref-Vitali2022"/>
     <w:p>
       <w:pPr>
         <w:pStyle w:val="Bibliography"/>
       </w:pPr>
       <w:r>
-        <w:t xml:space="preserve">40.</w:t>
+        <w:t xml:space="preserve">43.</w:t>
       </w:r>
       <w:r>
         <w:t xml:space="preserve"> </w:t>
@@ -4097,14 +4226,14 @@
         <w:t xml:space="preserve">103, e03547</w:t>
       </w:r>
     </w:p>
-    <w:bookmarkEnd w:id="82"/>
-    <w:bookmarkStart w:id="83" w:name="ref-Riva2023"/>
+    <w:bookmarkEnd w:id="85"/>
+    <w:bookmarkStart w:id="86" w:name="ref-Riva2023"/>
     <w:p>
       <w:pPr>
         <w:pStyle w:val="Bibliography"/>
       </w:pPr>
       <w:r>
-        <w:t xml:space="preserve">41.</w:t>
+        <w:t xml:space="preserve">44.</w:t>
       </w:r>
       <w:r>
         <w:t xml:space="preserve"> </w:t>
@@ -4148,14 +4277,14 @@
         <w:t xml:space="preserve">9, eabq4207</w:t>
       </w:r>
     </w:p>
-    <w:bookmarkEnd w:id="83"/>
-    <w:bookmarkStart w:id="84" w:name="ref-Terry2020"/>
+    <w:bookmarkEnd w:id="86"/>
+    <w:bookmarkStart w:id="87" w:name="ref-Terry2020"/>
     <w:p>
       <w:pPr>
         <w:pStyle w:val="Bibliography"/>
       </w:pPr>
       <w:r>
-        <w:t xml:space="preserve">42.</w:t>
+        <w:t xml:space="preserve">45.</w:t>
       </w:r>
       <w:r>
         <w:t xml:space="preserve"> </w:t>
@@ -4183,14 +4312,14 @@
         <w:t xml:space="preserve">101, e03047</w:t>
       </w:r>
     </w:p>
-    <w:bookmarkEnd w:id="84"/>
-    <w:bookmarkStart w:id="85" w:name="ref-Weiss-Lehman2022"/>
+    <w:bookmarkEnd w:id="87"/>
+    <w:bookmarkStart w:id="88" w:name="ref-Weiss-Lehman2022"/>
     <w:p>
       <w:pPr>
         <w:pStyle w:val="Bibliography"/>
       </w:pPr>
       <w:r>
-        <w:t xml:space="preserve">43.</w:t>
+        <w:t xml:space="preserve">46.</w:t>
       </w:r>
       <w:r>
         <w:t xml:space="preserve"> </w:t>
@@ -4234,14 +4363,14 @@
         <w:t xml:space="preserve">25, 1263–1276</w:t>
       </w:r>
     </w:p>
-    <w:bookmarkEnd w:id="85"/>
-    <w:bookmarkStart w:id="86" w:name="ref-Marquez2007"/>
+    <w:bookmarkEnd w:id="88"/>
+    <w:bookmarkStart w:id="89" w:name="ref-Marquez2007"/>
     <w:p>
       <w:pPr>
         <w:pStyle w:val="Bibliography"/>
       </w:pPr>
       <w:r>
-        <w:t xml:space="preserve">44.</w:t>
+        <w:t xml:space="preserve">47.</w:t>
       </w:r>
       <w:r>
         <w:t xml:space="preserve"> </w:t>
@@ -4285,14 +4414,14 @@
         <w:t xml:space="preserve">315, 513–515</w:t>
       </w:r>
     </w:p>
-    <w:bookmarkEnd w:id="86"/>
-    <w:bookmarkStart w:id="87" w:name="ref-Zou2024"/>
+    <w:bookmarkEnd w:id="89"/>
+    <w:bookmarkStart w:id="90" w:name="ref-Zou2024"/>
     <w:p>
       <w:pPr>
         <w:pStyle w:val="Bibliography"/>
       </w:pPr>
       <w:r>
-        <w:t xml:space="preserve">45.</w:t>
+        <w:t xml:space="preserve">48.</w:t>
       </w:r>
       <w:r>
         <w:t xml:space="preserve"> </w:t>
@@ -4336,14 +4465,14 @@
         <w:t xml:space="preserve">27, e14432</w:t>
       </w:r>
     </w:p>
-    <w:bookmarkEnd w:id="87"/>
-    <w:bookmarkStart w:id="88" w:name="ref-Fontaine2022"/>
+    <w:bookmarkEnd w:id="90"/>
+    <w:bookmarkStart w:id="91" w:name="ref-Fontaine2022"/>
     <w:p>
       <w:pPr>
         <w:pStyle w:val="Bibliography"/>
       </w:pPr>
       <w:r>
-        <w:t xml:space="preserve">46.</w:t>
+        <w:t xml:space="preserve">49.</w:t>
       </w:r>
       <w:r>
         <w:t xml:space="preserve"> </w:t>
@@ -4387,14 +4516,14 @@
         <w:t xml:space="preserve">6, 405–417</w:t>
       </w:r>
     </w:p>
-    <w:bookmarkEnd w:id="88"/>
-    <w:bookmarkStart w:id="89" w:name="ref-Fontaine2023"/>
+    <w:bookmarkEnd w:id="91"/>
+    <w:bookmarkStart w:id="92" w:name="ref-Fontaine2023"/>
     <w:p>
       <w:pPr>
         <w:pStyle w:val="Bibliography"/>
       </w:pPr>
       <w:r>
-        <w:t xml:space="preserve">47.</w:t>
+        <w:t xml:space="preserve">50.</w:t>
       </w:r>
       <w:r>
         <w:t xml:space="preserve"> </w:t>
@@ -4422,14 +4551,14 @@
         <w:t xml:space="preserve">226, jeb245191</w:t>
       </w:r>
     </w:p>
-    <w:bookmarkEnd w:id="89"/>
-    <w:bookmarkStart w:id="90" w:name="ref-Hoang2019"/>
+    <w:bookmarkEnd w:id="92"/>
+    <w:bookmarkStart w:id="93" w:name="ref-Hoang2019"/>
     <w:p>
       <w:pPr>
         <w:pStyle w:val="Bibliography"/>
       </w:pPr>
       <w:r>
-        <w:t xml:space="preserve">48.</w:t>
+        <w:t xml:space="preserve">51.</w:t>
       </w:r>
       <w:r>
         <w:t xml:space="preserve"> </w:t>
@@ -4473,14 +4602,14 @@
         <w:t xml:space="preserve">9, 3491–3499</w:t>
       </w:r>
     </w:p>
-    <w:bookmarkEnd w:id="90"/>
-    <w:bookmarkStart w:id="91" w:name="ref-Gehman2019"/>
+    <w:bookmarkEnd w:id="93"/>
+    <w:bookmarkStart w:id="94" w:name="ref-Gehman2019"/>
     <w:p>
       <w:pPr>
         <w:pStyle w:val="Bibliography"/>
       </w:pPr>
       <w:r>
-        <w:t xml:space="preserve">49.</w:t>
+        <w:t xml:space="preserve">52.</w:t>
       </w:r>
       <w:r>
         <w:t xml:space="preserve"> </w:t>
@@ -4508,14 +4637,14 @@
         <w:t xml:space="preserve">10, e02683</w:t>
       </w:r>
     </w:p>
-    <w:bookmarkEnd w:id="91"/>
-    <w:bookmarkStart w:id="92" w:name="ref-Hoang2021"/>
+    <w:bookmarkEnd w:id="94"/>
+    <w:bookmarkStart w:id="95" w:name="ref-Hoang2021"/>
     <w:p>
       <w:pPr>
         <w:pStyle w:val="Bibliography"/>
       </w:pPr>
       <w:r>
-        <w:t xml:space="preserve">50.</w:t>
+        <w:t xml:space="preserve">53.</w:t>
       </w:r>
       <w:r>
         <w:t xml:space="preserve"> </w:t>
@@ -4559,14 +4688,14 @@
         <w:t xml:space="preserve">5, 118–129</w:t>
       </w:r>
     </w:p>
-    <w:bookmarkEnd w:id="92"/>
-    <w:bookmarkStart w:id="93" w:name="ref-Corbin2016"/>
+    <w:bookmarkEnd w:id="95"/>
+    <w:bookmarkStart w:id="96" w:name="ref-Corbin2016"/>
     <w:p>
       <w:pPr>
         <w:pStyle w:val="Bibliography"/>
       </w:pPr>
       <w:r>
-        <w:t xml:space="preserve">51.</w:t>
+        <w:t xml:space="preserve">54.</w:t>
       </w:r>
       <w:r>
         <w:t xml:space="preserve"> </w:t>
@@ -4610,14 +4739,14 @@
         <w:t xml:space="preserve">118, 10–20</w:t>
       </w:r>
     </w:p>
-    <w:bookmarkEnd w:id="93"/>
-    <w:bookmarkStart w:id="94" w:name="ref-Zhang2019"/>
+    <w:bookmarkEnd w:id="96"/>
+    <w:bookmarkStart w:id="97" w:name="ref-Zhang2019"/>
     <w:p>
       <w:pPr>
         <w:pStyle w:val="Bibliography"/>
       </w:pPr>
       <w:r>
-        <w:t xml:space="preserve">52.</w:t>
+        <w:t xml:space="preserve">55.</w:t>
       </w:r>
       <w:r>
         <w:t xml:space="preserve"> </w:t>
@@ -4661,14 +4790,14 @@
         <w:t xml:space="preserve">116, 24712–24718</w:t>
       </w:r>
     </w:p>
-    <w:bookmarkEnd w:id="94"/>
-    <w:bookmarkStart w:id="95" w:name="ref-Dunbar2007"/>
+    <w:bookmarkEnd w:id="97"/>
+    <w:bookmarkStart w:id="98" w:name="ref-Dunbar2007"/>
     <w:p>
       <w:pPr>
         <w:pStyle w:val="Bibliography"/>
       </w:pPr>
       <w:r>
-        <w:t xml:space="preserve">53.</w:t>
+        <w:t xml:space="preserve">56.</w:t>
       </w:r>
       <w:r>
         <w:t xml:space="preserve"> </w:t>
@@ -4712,14 +4841,14 @@
         <w:t xml:space="preserve">5, e96</w:t>
       </w:r>
     </w:p>
-    <w:bookmarkEnd w:id="95"/>
-    <w:bookmarkStart w:id="96" w:name="ref-Li2023"/>
+    <w:bookmarkEnd w:id="98"/>
+    <w:bookmarkStart w:id="99" w:name="ref-Li2023"/>
     <w:p>
       <w:pPr>
         <w:pStyle w:val="Bibliography"/>
       </w:pPr>
       <w:r>
-        <w:t xml:space="preserve">54.</w:t>
+        <w:t xml:space="preserve">57.</w:t>
       </w:r>
       <w:r>
         <w:t xml:space="preserve"> </w:t>
@@ -4763,14 +4892,14 @@
         <w:t xml:space="preserve">114, 103583</w:t>
       </w:r>
     </w:p>
-    <w:bookmarkEnd w:id="96"/>
-    <w:bookmarkStart w:id="97" w:name="ref-Zhu2024"/>
+    <w:bookmarkEnd w:id="99"/>
+    <w:bookmarkStart w:id="100" w:name="ref-Zhu2024"/>
     <w:p>
       <w:pPr>
         <w:pStyle w:val="Bibliography"/>
       </w:pPr>
       <w:r>
-        <w:t xml:space="preserve">55.</w:t>
+        <w:t xml:space="preserve">58.</w:t>
       </w:r>
       <w:r>
         <w:t xml:space="preserve"> </w:t>
@@ -4814,14 +4943,14 @@
         <w:t xml:space="preserve">39, 165–180</w:t>
       </w:r>
     </w:p>
-    <w:bookmarkEnd w:id="97"/>
-    <w:bookmarkStart w:id="98" w:name="ref-Kearney2009a"/>
+    <w:bookmarkEnd w:id="100"/>
+    <w:bookmarkStart w:id="101" w:name="ref-Kearney2009a"/>
     <w:p>
       <w:pPr>
         <w:pStyle w:val="Bibliography"/>
       </w:pPr>
       <w:r>
-        <w:t xml:space="preserve">56.</w:t>
+        <w:t xml:space="preserve">59.</w:t>
       </w:r>
       <w:r>
         <w:t xml:space="preserve"> </w:t>
@@ -4865,9 +4994,9 @@
         <w:t xml:space="preserve">23, 528–538</w:t>
       </w:r>
     </w:p>
-    <w:bookmarkEnd w:id="98"/>
-    <w:bookmarkEnd w:id="99"/>
-    <w:bookmarkEnd w:id="100"/>
+    <w:bookmarkEnd w:id="101"/>
+    <w:bookmarkEnd w:id="102"/>
+    <w:bookmarkEnd w:id="103"/>
     <w:sectPr>
       <w:pgSz w:h="15840" w:w="12240"/>
       <w:pgMar w:bottom="851" w:footer="720" w:gutter="0" w:header="720" w:left="851" w:right="851" w:top="851"/>
@@ -5942,12 +6071,6 @@
     <w:abstractNumId w:val="991"/>
   </w:num>
   <w:num w:numId="1011">
-    <w:abstractNumId w:val="991"/>
-  </w:num>
-  <w:num w:numId="1012">
-    <w:abstractNumId w:val="991"/>
-  </w:num>
-  <w:num w:numId="1013">
     <w:abstractNumId w:val="991"/>
   </w:num>
 </w:numbering>

</xml_diff>

<commit_message>
Fixed refa nd re-render
</commit_message>
<xml_diff>
--- a/docs/ms.docx
+++ b/docs/ms.docx
@@ -1469,6 +1469,30 @@
     </w:p>
     <w:p>
       <w:pPr>
+        <w:pStyle w:val="FirstParagraph"/>
+      </w:pPr>
+      <w:r>
+        <w:t xml:space="preserve">In the plant community and coexistence literature, the maintenance of community-level plant diversity is typically modelled using individual fitness models to parameterise population growth models. The most common Individual-based performance models used for this purpose in plants are the Ricker (Ricker, 1954) and Beverton-Holt (Beverton and Holt, 1957) models. Both of these models assume that species interactions are competitive in nature but the Ricker model allows interaction outcomes to be positive as well as negative, as long as the net outcome of interactions are negative. This is an important feature as ecological theory tells us that facilitative interactions between species, in which one or both species benefit from the presence of the other, are more common under stressful, or harsh, environments (Bertness and Callaway 1994). In thinking about thermal extremes, it is likely that species experience a switch from amenable to unamenable (or harsh) conditions, making it likely that interaction outcomes may flip signs (Bimler et al. 2018).</w:t>
+      </w:r>
+    </w:p>
+    <w:p>
+      <w:pPr>
+        <w:pStyle w:val="BodyText"/>
+      </w:pPr>
+      <w:r>
+        <w:t xml:space="preserve">Based on modern coexistence theory, we can calculate the mutual invasibility of two populations while interacting with each other to determine if each pair of species in a community can persist indefinitely. This approach typically does not work for predicting whole community diversity, but the tools developed to test for coexistence are well suited to exploring how to link biophysical models with population growth models to advance out ability to predict how extreme thermal events will impact species in the long-term within a community context.</w:t>
+      </w:r>
+    </w:p>
+    <w:p>
+      <w:pPr>
+        <w:pStyle w:val="BodyText"/>
+      </w:pPr>
+      <w:r>
+        <w:t xml:space="preserve">Recent efforts to increase the biological realism of coexistence models have focused on exploring ways to add environmental variation into these models. Basic coexistence models are parameterised using average fitness estimates for an average environment. Approaches for integrating demographic and environmental variation into these models are emerging (Bimler et al. 2018, Bowler et al. 2022). The calculation of technical coexistence is not necessary for these models to help us understand the impacts extreme heat will have on individual species within a community context. Understanding how population growth will be impacted by the biophysical and physiological consequences of extreme heat events are conceptually easy to add to Ricker and Beverton-Holt population growth models, with new Bayesian frameworks (Bowler et al. 2022) also allowing us to calculate probabilities of population growth and coexistence of population experiencing these conditions. The simplest approach to this is to modify the vital rate functions used in these models to compare population growth predictions for species that have and have not been exposed to extreme heat during core life history stages. Physiological models can be used to estimate changes to fitness resulting from an extreme heat event. We can then model the difference in population growth rates for populations that have and have not experienced those events. We can increase complexity by following Bimler et al. 2018’s approach to measuring the effects of environmental gradients on the outcomes of pairwise species interactions and the calculation of species fitness and niche differences. We could use this same technique in combination with biophysical models to estimate the consequences of localized extreme heat of different local extremes on species interactions with each other and the carry-on effects these interactions have on species fitness within local communities. Taking this a step forward, new methods are now available for calculation interaction networks based on interaction outcomes calculated using Ricker or Beverton-Holt population growth models. Thus we could take these pairwise models of population growth and create whole community networks to assess how heatwaves will alter the structure of community network structures and stability in addition to pairwise interactions (Bimler et al 2023). The limitation of these methods is that they are data hungry, but even this can be handled by emerging approaches for reducing model complexity without losing model power (Weiss-Lehman 2022).</w:t>
+      </w:r>
+    </w:p>
+    <w:p>
+      <w:pPr>
         <w:pStyle w:val="Compact"/>
         <w:numPr>
           <w:ilvl w:val="0"/>
@@ -2054,6 +2078,81 @@
         <w:t xml:space="preserve">.</w:t>
       </w:r>
     </w:p>
+    <w:p>
+      <w:pPr>
+        <w:pStyle w:val="BodyText"/>
+      </w:pPr>
+      <w:r>
+        <w:t xml:space="preserve">Interaction between plants and microorganisms such as plant growth-promoting rhizobacteria (PGPR), arbuscular mycorrhizal fungi (AMF), and bacterial or fungal endophytes regulate growth and defense, including improved heat tolerance in plants</w:t>
+      </w:r>
+      <w:r>
+        <w:t xml:space="preserve"> </w:t>
+      </w:r>
+      <w:r>
+        <w:t xml:space="preserve">[57,58]</w:t>
+      </w:r>
+      <w:r>
+        <w:t xml:space="preserve">. These interactions are usually achieved by stimulating the production of essential phytohormones, secondary metabolites, organic acids, and amino acids that helps the plant to mitigate heat stress</w:t>
+      </w:r>
+      <w:r>
+        <w:t xml:space="preserve"> </w:t>
+      </w:r>
+      <w:r>
+        <w:t xml:space="preserve">[59,60]</w:t>
+      </w:r>
+      <w:r>
+        <w:t xml:space="preserve">. Under the current global climate change scenarios, each degree Celsius increase in global mean temperature is estimated to reduce the global yield of wheat by 6.0% and soybean (Glycine max) by 3.1%</w:t>
+      </w:r>
+      <w:r>
+        <w:t xml:space="preserve"> </w:t>
+      </w:r>
+      <w:r>
+        <w:t xml:space="preserve">[61]</w:t>
+      </w:r>
+      <w:r>
+        <w:t xml:space="preserve">. For instance, bread wheat (</w:t>
+      </w:r>
+      <w:r>
+        <w:rPr>
+          <w:i/>
+          <w:iCs/>
+        </w:rPr>
+        <w:t xml:space="preserve">Triticum aestivum</w:t>
+      </w:r>
+      <w:r>
+        <w:t xml:space="preserve">) has an optimum temperature of 22°C, but temperatures above that range impair cellular processes, with adverse effects on development and reproductive of plants, leading to senescence and yield loss</w:t>
+      </w:r>
+      <w:r>
+        <w:t xml:space="preserve"> </w:t>
+      </w:r>
+      <w:r>
+        <w:t xml:space="preserve">[62,63]</w:t>
+      </w:r>
+      <w:r>
+        <w:t xml:space="preserve">. The complexity of plant-microbe interaction under heat stress means that enormous efforts are required to decipher the interaction networks at molecular, tissue, and organism levels. These cannot be fully understood without the advanced bioinformatics tools and models of Artificial Intelligence/Machine Learning (AI/ML) in the new era of AI for all aspects of sciences. There are excellent AI/ML models developed for plants</w:t>
+      </w:r>
+      <w:r>
+        <w:t xml:space="preserve"> </w:t>
+      </w:r>
+      <w:r>
+        <w:t xml:space="preserve">[64,65]</w:t>
+      </w:r>
+      <w:r>
+        <w:t xml:space="preserve"> </w:t>
+      </w:r>
+      <w:r>
+        <w:t xml:space="preserve">and microorganism</w:t>
+      </w:r>
+      <w:r>
+        <w:t xml:space="preserve"> </w:t>
+      </w:r>
+      <w:r>
+        <w:t xml:space="preserve">[66]</w:t>
+      </w:r>
+      <w:r>
+        <w:t xml:space="preserve">. However, comprehensive models with high prediction powers for plant microbe interactions are still lacking, which hampers our understanding of the heat tolerance in plants and microorganisms.</w:t>
+      </w:r>
+    </w:p>
     <w:bookmarkEnd w:id="29"/>
     <w:bookmarkStart w:id="30" w:name="X24738ef4513767bb724ce8804ac017259eaf2ee"/>
     <w:p>
@@ -2105,7 +2204,7 @@
         <w:t xml:space="preserve"> </w:t>
       </w:r>
       <w:r>
-        <w:t xml:space="preserve">[57]</w:t>
+        <w:t xml:space="preserve">[67]</w:t>
       </w:r>
       <w:r>
         <w:t xml:space="preserve"> </w:t>
@@ -2148,7 +2247,7 @@
         <w:t xml:space="preserve"> </w:t>
       </w:r>
       <w:r>
-        <w:t xml:space="preserve">[57]</w:t>
+        <w:t xml:space="preserve">[67]</w:t>
       </w:r>
       <w:r>
         <w:t xml:space="preserve"> </w:t>
@@ -2178,7 +2277,7 @@
         <w:t xml:space="preserve"> </w:t>
       </w:r>
       <w:r>
-        <w:t xml:space="preserve">[58]</w:t>
+        <w:t xml:space="preserve">[68]</w:t>
       </w:r>
       <w:r>
         <w:t xml:space="preserve">. Connects heat tolerance to population matrix models. And, shows acclimation responses (heat hardening).</w:t>
@@ -2498,7 +2597,7 @@
         <w:t xml:space="preserve"> </w:t>
       </w:r>
       <w:r>
-        <w:t xml:space="preserve">[59]</w:t>
+        <w:t xml:space="preserve">[69]</w:t>
       </w:r>
       <w:r>
         <w:t xml:space="preserve"> </w:t>
@@ -2526,7 +2625,7 @@
     </w:p>
     <w:bookmarkEnd w:id="41"/>
     <w:bookmarkEnd w:id="42"/>
-    <w:bookmarkStart w:id="103" w:name="references"/>
+    <w:bookmarkStart w:id="113" w:name="references"/>
     <w:p>
       <w:pPr>
         <w:pStyle w:val="Heading1"/>
@@ -2535,7 +2634,7 @@
         <w:t xml:space="preserve">References</w:t>
       </w:r>
     </w:p>
-    <w:bookmarkStart w:id="102" w:name="refs"/>
+    <w:bookmarkStart w:id="112" w:name="refs"/>
     <w:bookmarkStart w:id="43" w:name="ref-Barriopedro2023"/>
     <w:p>
       <w:pPr>
@@ -5193,7 +5292,7 @@
       </w:r>
     </w:p>
     <w:bookmarkEnd w:id="98"/>
-    <w:bookmarkStart w:id="99" w:name="ref-Li2023"/>
+    <w:bookmarkStart w:id="99" w:name="ref-Chouhan2023"/>
     <w:p>
       <w:pPr>
         <w:pStyle w:val="Bibliography"/>
@@ -5208,6 +5307,491 @@
         <w:t xml:space="preserve">	</w:t>
       </w:r>
       <w:r>
+        <w:t xml:space="preserve">Chouhan, D.</w:t>
+      </w:r>
+      <w:r>
+        <w:t xml:space="preserve"> </w:t>
+      </w:r>
+      <w:r>
+        <w:rPr>
+          <w:i/>
+          <w:iCs/>
+        </w:rPr>
+        <w:t xml:space="preserve">et al.</w:t>
+      </w:r>
+      <w:r>
+        <w:t xml:space="preserve"> </w:t>
+      </w:r>
+      <w:r>
+        <w:t xml:space="preserve">(2023) Plant-microbe interaction and their role in mitigation of heat stress. In</w:t>
+      </w:r>
+      <w:r>
+        <w:t xml:space="preserve"> </w:t>
+      </w:r>
+      <w:r>
+        <w:rPr>
+          <w:i/>
+          <w:iCs/>
+        </w:rPr>
+        <w:t xml:space="preserve">Rhizosphere biology</w:t>
+      </w:r>
+      <w:r>
+        <w:t xml:space="preserve">, pp. 127–147, Springer Nature Singapore</w:t>
+      </w:r>
+    </w:p>
+    <w:bookmarkEnd w:id="99"/>
+    <w:bookmarkStart w:id="100" w:name="ref-Liu2025"/>
+    <w:p>
+      <w:pPr>
+        <w:pStyle w:val="Bibliography"/>
+      </w:pPr>
+      <w:r>
+        <w:t xml:space="preserve">58.</w:t>
+      </w:r>
+      <w:r>
+        <w:t xml:space="preserve"> </w:t>
+      </w:r>
+      <w:r>
+        <w:t xml:space="preserve">	</w:t>
+      </w:r>
+      <w:r>
+        <w:t xml:space="preserve">Liu, Y.</w:t>
+      </w:r>
+      <w:r>
+        <w:t xml:space="preserve"> </w:t>
+      </w:r>
+      <w:r>
+        <w:rPr>
+          <w:i/>
+          <w:iCs/>
+        </w:rPr>
+        <w:t xml:space="preserve">et al.</w:t>
+      </w:r>
+      <w:r>
+        <w:t xml:space="preserve"> </w:t>
+      </w:r>
+      <w:r>
+        <w:t xml:space="preserve">(2025) Beneficial microorganisms: Regulating growth and defense for plant welfare.</w:t>
+      </w:r>
+      <w:r>
+        <w:t xml:space="preserve"> </w:t>
+      </w:r>
+      <w:r>
+        <w:rPr>
+          <w:i/>
+          <w:iCs/>
+        </w:rPr>
+        <w:t xml:space="preserve">Plant Biotechnol. J.</w:t>
+      </w:r>
+      <w:r>
+        <w:t xml:space="preserve"> </w:t>
+      </w:r>
+      <w:r>
+        <w:t xml:space="preserve">23, 986–998</w:t>
+      </w:r>
+    </w:p>
+    <w:bookmarkEnd w:id="100"/>
+    <w:bookmarkStart w:id="101" w:name="ref-Huang2019"/>
+    <w:p>
+      <w:pPr>
+        <w:pStyle w:val="Bibliography"/>
+      </w:pPr>
+      <w:r>
+        <w:t xml:space="preserve">59.</w:t>
+      </w:r>
+      <w:r>
+        <w:t xml:space="preserve"> </w:t>
+      </w:r>
+      <w:r>
+        <w:t xml:space="preserve">	</w:t>
+      </w:r>
+      <w:r>
+        <w:t xml:space="preserve">Huang, A.C.</w:t>
+      </w:r>
+      <w:r>
+        <w:t xml:space="preserve"> </w:t>
+      </w:r>
+      <w:r>
+        <w:rPr>
+          <w:i/>
+          <w:iCs/>
+        </w:rPr>
+        <w:t xml:space="preserve">et al.</w:t>
+      </w:r>
+      <w:r>
+        <w:t xml:space="preserve"> </w:t>
+      </w:r>
+      <w:r>
+        <w:t xml:space="preserve">(2019) A specialized metabolic network selectively modulates arabidopsis root microbiota.</w:t>
+      </w:r>
+      <w:r>
+        <w:t xml:space="preserve"> </w:t>
+      </w:r>
+      <w:r>
+        <w:rPr>
+          <w:i/>
+          <w:iCs/>
+        </w:rPr>
+        <w:t xml:space="preserve">Science</w:t>
+      </w:r>
+      <w:r>
+        <w:t xml:space="preserve"> </w:t>
+      </w:r>
+      <w:r>
+        <w:t xml:space="preserve">364, eaau6389</w:t>
+      </w:r>
+    </w:p>
+    <w:bookmarkEnd w:id="101"/>
+    <w:bookmarkStart w:id="102" w:name="ref-Dastogeer2022"/>
+    <w:p>
+      <w:pPr>
+        <w:pStyle w:val="Bibliography"/>
+      </w:pPr>
+      <w:r>
+        <w:t xml:space="preserve">60.</w:t>
+      </w:r>
+      <w:r>
+        <w:t xml:space="preserve"> </w:t>
+      </w:r>
+      <w:r>
+        <w:t xml:space="preserve">	</w:t>
+      </w:r>
+      <w:r>
+        <w:t xml:space="preserve">Dastogeer, K.M.G.</w:t>
+      </w:r>
+      <w:r>
+        <w:t xml:space="preserve"> </w:t>
+      </w:r>
+      <w:r>
+        <w:rPr>
+          <w:i/>
+          <w:iCs/>
+        </w:rPr>
+        <w:t xml:space="preserve">et al.</w:t>
+      </w:r>
+      <w:r>
+        <w:t xml:space="preserve"> </w:t>
+      </w:r>
+      <w:r>
+        <w:t xml:space="preserve">(2022) Microbe-mediated thermotolerance in plants and pertinent mechanisms- a meta-analysis and review.</w:t>
+      </w:r>
+      <w:r>
+        <w:t xml:space="preserve"> </w:t>
+      </w:r>
+      <w:r>
+        <w:rPr>
+          <w:i/>
+          <w:iCs/>
+        </w:rPr>
+        <w:t xml:space="preserve">Front. Microbiol.</w:t>
+      </w:r>
+      <w:r>
+        <w:t xml:space="preserve"> </w:t>
+      </w:r>
+      <w:r>
+        <w:t xml:space="preserve">13, 833566</w:t>
+      </w:r>
+    </w:p>
+    <w:bookmarkEnd w:id="102"/>
+    <w:bookmarkStart w:id="103" w:name="ref-Shekhawat2022"/>
+    <w:p>
+      <w:pPr>
+        <w:pStyle w:val="Bibliography"/>
+      </w:pPr>
+      <w:r>
+        <w:t xml:space="preserve">61.</w:t>
+      </w:r>
+      <w:r>
+        <w:t xml:space="preserve"> </w:t>
+      </w:r>
+      <w:r>
+        <w:t xml:space="preserve">	</w:t>
+      </w:r>
+      <w:r>
+        <w:t xml:space="preserve">Shekhawat, K.</w:t>
+      </w:r>
+      <w:r>
+        <w:t xml:space="preserve"> </w:t>
+      </w:r>
+      <w:r>
+        <w:rPr>
+          <w:i/>
+          <w:iCs/>
+        </w:rPr>
+        <w:t xml:space="preserve">et al.</w:t>
+      </w:r>
+      <w:r>
+        <w:t xml:space="preserve"> </w:t>
+      </w:r>
+      <w:r>
+        <w:t xml:space="preserve">(2022) Beat the heat: Plant- and microbe-mediated strategies for crop thermotolerance.</w:t>
+      </w:r>
+      <w:r>
+        <w:t xml:space="preserve"> </w:t>
+      </w:r>
+      <w:r>
+        <w:rPr>
+          <w:i/>
+          <w:iCs/>
+        </w:rPr>
+        <w:t xml:space="preserve">Trends Plant Sci.</w:t>
+      </w:r>
+      <w:r>
+        <w:t xml:space="preserve"> </w:t>
+      </w:r>
+      <w:r>
+        <w:t xml:space="preserve">27, 802–813</w:t>
+      </w:r>
+    </w:p>
+    <w:bookmarkEnd w:id="103"/>
+    <w:bookmarkStart w:id="104" w:name="ref-Lobell2012"/>
+    <w:p>
+      <w:pPr>
+        <w:pStyle w:val="Bibliography"/>
+      </w:pPr>
+      <w:r>
+        <w:t xml:space="preserve">62.</w:t>
+      </w:r>
+      <w:r>
+        <w:t xml:space="preserve"> </w:t>
+      </w:r>
+      <w:r>
+        <w:t xml:space="preserve">	</w:t>
+      </w:r>
+      <w:r>
+        <w:t xml:space="preserve">Lobell, D.B.</w:t>
+      </w:r>
+      <w:r>
+        <w:t xml:space="preserve"> </w:t>
+      </w:r>
+      <w:r>
+        <w:rPr>
+          <w:i/>
+          <w:iCs/>
+        </w:rPr>
+        <w:t xml:space="preserve">et al.</w:t>
+      </w:r>
+      <w:r>
+        <w:t xml:space="preserve"> </w:t>
+      </w:r>
+      <w:r>
+        <w:t xml:space="preserve">(2012) Extreme heat effects on wheat senescence in india.</w:t>
+      </w:r>
+      <w:r>
+        <w:t xml:space="preserve"> </w:t>
+      </w:r>
+      <w:r>
+        <w:rPr>
+          <w:i/>
+          <w:iCs/>
+        </w:rPr>
+        <w:t xml:space="preserve">Nat. Clim. Chang.</w:t>
+      </w:r>
+      <w:r>
+        <w:t xml:space="preserve"> </w:t>
+      </w:r>
+      <w:r>
+        <w:t xml:space="preserve">2, 186–189</w:t>
+      </w:r>
+    </w:p>
+    <w:bookmarkEnd w:id="104"/>
+    <w:bookmarkStart w:id="105" w:name="ref-Farooq2011"/>
+    <w:p>
+      <w:pPr>
+        <w:pStyle w:val="Bibliography"/>
+      </w:pPr>
+      <w:r>
+        <w:t xml:space="preserve">63.</w:t>
+      </w:r>
+      <w:r>
+        <w:t xml:space="preserve"> </w:t>
+      </w:r>
+      <w:r>
+        <w:t xml:space="preserve">	</w:t>
+      </w:r>
+      <w:r>
+        <w:t xml:space="preserve">Farooq, M.</w:t>
+      </w:r>
+      <w:r>
+        <w:t xml:space="preserve"> </w:t>
+      </w:r>
+      <w:r>
+        <w:rPr>
+          <w:i/>
+          <w:iCs/>
+        </w:rPr>
+        <w:t xml:space="preserve">et al.</w:t>
+      </w:r>
+      <w:r>
+        <w:t xml:space="preserve"> </w:t>
+      </w:r>
+      <w:r>
+        <w:t xml:space="preserve">(2011) Heat stress in wheat during reproductive and grain-filling phases.</w:t>
+      </w:r>
+      <w:r>
+        <w:t xml:space="preserve"> </w:t>
+      </w:r>
+      <w:r>
+        <w:rPr>
+          <w:i/>
+          <w:iCs/>
+        </w:rPr>
+        <w:t xml:space="preserve">CRC Crit. Rev. Plant Sci.</w:t>
+      </w:r>
+      <w:r>
+        <w:t xml:space="preserve"> </w:t>
+      </w:r>
+      <w:r>
+        <w:t xml:space="preserve">30, 491–507</w:t>
+      </w:r>
+    </w:p>
+    <w:bookmarkEnd w:id="105"/>
+    <w:bookmarkStart w:id="106" w:name="ref-He2025"/>
+    <w:p>
+      <w:pPr>
+        <w:pStyle w:val="Bibliography"/>
+      </w:pPr>
+      <w:r>
+        <w:t xml:space="preserve">64.</w:t>
+      </w:r>
+      <w:r>
+        <w:t xml:space="preserve"> </w:t>
+      </w:r>
+      <w:r>
+        <w:t xml:space="preserve">	</w:t>
+      </w:r>
+      <w:r>
+        <w:t xml:space="preserve">J. He and K. Ning and A. Naznin and Y. Wang and C. Chen and Y. Zuo and M. Zhou and C.Li and R. Varshney and Z.H. Chen (2025) Technological advances on imaging and modelling of leaf structural traits: A review on heat stress in wheat.</w:t>
+      </w:r>
+      <w:r>
+        <w:t xml:space="preserve"> </w:t>
+      </w:r>
+      <w:r>
+        <w:rPr>
+          <w:i/>
+          <w:iCs/>
+        </w:rPr>
+        <w:t xml:space="preserve">Journal of Experimental Botany (in press)</w:t>
+      </w:r>
+    </w:p>
+    <w:bookmarkEnd w:id="106"/>
+    <w:bookmarkStart w:id="107" w:name="ref-Zhang2021"/>
+    <w:p>
+      <w:pPr>
+        <w:pStyle w:val="Bibliography"/>
+      </w:pPr>
+      <w:r>
+        <w:t xml:space="preserve">65.</w:t>
+      </w:r>
+      <w:r>
+        <w:t xml:space="preserve"> </w:t>
+      </w:r>
+      <w:r>
+        <w:t xml:space="preserve">	</w:t>
+      </w:r>
+      <w:r>
+        <w:t xml:space="preserve">Zhang, P.</w:t>
+      </w:r>
+      <w:r>
+        <w:t xml:space="preserve"> </w:t>
+      </w:r>
+      <w:r>
+        <w:rPr>
+          <w:i/>
+          <w:iCs/>
+        </w:rPr>
+        <w:t xml:space="preserve">et al.</w:t>
+      </w:r>
+      <w:r>
+        <w:t xml:space="preserve"> </w:t>
+      </w:r>
+      <w:r>
+        <w:t xml:space="preserve">(2021) Nanotechnology and artificial intelligence to enable sustainable and precision agriculture.</w:t>
+      </w:r>
+      <w:r>
+        <w:t xml:space="preserve"> </w:t>
+      </w:r>
+      <w:r>
+        <w:rPr>
+          <w:i/>
+          <w:iCs/>
+        </w:rPr>
+        <w:t xml:space="preserve">Nat. Plants</w:t>
+      </w:r>
+      <w:r>
+        <w:t xml:space="preserve"> </w:t>
+      </w:r>
+      <w:r>
+        <w:t xml:space="preserve">7, 864–876</w:t>
+      </w:r>
+    </w:p>
+    <w:bookmarkEnd w:id="107"/>
+    <w:bookmarkStart w:id="108" w:name="ref-Zhang2023a"/>
+    <w:p>
+      <w:pPr>
+        <w:pStyle w:val="Bibliography"/>
+      </w:pPr>
+      <w:r>
+        <w:t xml:space="preserve">66.</w:t>
+      </w:r>
+      <w:r>
+        <w:t xml:space="preserve"> </w:t>
+      </w:r>
+      <w:r>
+        <w:t xml:space="preserve">	</w:t>
+      </w:r>
+      <w:r>
+        <w:t xml:space="preserve">Zhang, J.</w:t>
+      </w:r>
+      <w:r>
+        <w:t xml:space="preserve"> </w:t>
+      </w:r>
+      <w:r>
+        <w:rPr>
+          <w:i/>
+          <w:iCs/>
+        </w:rPr>
+        <w:t xml:space="preserve">et al.</w:t>
+      </w:r>
+      <w:r>
+        <w:t xml:space="preserve"> </w:t>
+      </w:r>
+      <w:r>
+        <w:t xml:space="preserve">(2023) Applications of artificial neural networks in microorganism image analysis: A comprehensive review from conventional multilayer perceptron to popular convolutional neural network and potential visual transformer.</w:t>
+      </w:r>
+      <w:r>
+        <w:t xml:space="preserve"> </w:t>
+      </w:r>
+      <w:r>
+        <w:rPr>
+          <w:i/>
+          <w:iCs/>
+        </w:rPr>
+        <w:t xml:space="preserve">Artif. Intell. Rev.</w:t>
+      </w:r>
+      <w:r>
+        <w:t xml:space="preserve"> </w:t>
+      </w:r>
+      <w:r>
+        <w:t xml:space="preserve">56, 1013–1070</w:t>
+      </w:r>
+    </w:p>
+    <w:bookmarkEnd w:id="108"/>
+    <w:bookmarkStart w:id="109" w:name="ref-Li2023"/>
+    <w:p>
+      <w:pPr>
+        <w:pStyle w:val="Bibliography"/>
+      </w:pPr>
+      <w:r>
+        <w:t xml:space="preserve">67.</w:t>
+      </w:r>
+      <w:r>
+        <w:t xml:space="preserve"> </w:t>
+      </w:r>
+      <w:r>
+        <w:t xml:space="preserve">	</w:t>
+      </w:r>
+      <w:r>
         <w:t xml:space="preserve">Li, Y.-J.</w:t>
       </w:r>
       <w:r>
@@ -5243,14 +5827,14 @@
         <w:t xml:space="preserve">114, 103583</w:t>
       </w:r>
     </w:p>
-    <w:bookmarkEnd w:id="99"/>
-    <w:bookmarkStart w:id="100" w:name="ref-Zhu2024"/>
+    <w:bookmarkEnd w:id="109"/>
+    <w:bookmarkStart w:id="110" w:name="ref-Zhu2024"/>
     <w:p>
       <w:pPr>
         <w:pStyle w:val="Bibliography"/>
       </w:pPr>
       <w:r>
-        <w:t xml:space="preserve">58.</w:t>
+        <w:t xml:space="preserve">68.</w:t>
       </w:r>
       <w:r>
         <w:t xml:space="preserve"> </w:t>
@@ -5294,14 +5878,14 @@
         <w:t xml:space="preserve">39, 165–180</w:t>
       </w:r>
     </w:p>
-    <w:bookmarkEnd w:id="100"/>
-    <w:bookmarkStart w:id="101" w:name="ref-Kearney2009a"/>
+    <w:bookmarkEnd w:id="110"/>
+    <w:bookmarkStart w:id="111" w:name="ref-Kearney2009a"/>
     <w:p>
       <w:pPr>
         <w:pStyle w:val="Bibliography"/>
       </w:pPr>
       <w:r>
-        <w:t xml:space="preserve">59.</w:t>
+        <w:t xml:space="preserve">69.</w:t>
       </w:r>
       <w:r>
         <w:t xml:space="preserve"> </w:t>
@@ -5345,9 +5929,9 @@
         <w:t xml:space="preserve">23, 528–538</w:t>
       </w:r>
     </w:p>
-    <w:bookmarkEnd w:id="101"/>
-    <w:bookmarkEnd w:id="102"/>
-    <w:bookmarkEnd w:id="103"/>
+    <w:bookmarkEnd w:id="111"/>
+    <w:bookmarkEnd w:id="112"/>
+    <w:bookmarkEnd w:id="113"/>
     <w:sectPr>
       <w:pgSz w:h="15840" w:w="12240"/>
       <w:pgMar w:bottom="851" w:footer="720" w:gutter="0" w:header="720" w:left="851" w:right="851" w:top="851"/>

</xml_diff>

<commit_message>
Writing to update more about TLS outputs and how it can capture damage accumulation
</commit_message>
<xml_diff>
--- a/docs/ms.docx
+++ b/docs/ms.docx
@@ -648,7 +648,7 @@
       </w:r>
     </w:p>
     <w:bookmarkEnd w:id="22"/>
-    <w:bookmarkStart w:id="23" w:name="Xd22b977f88f0add426f49399196084251b1e16e"/>
+    <w:bookmarkStart w:id="24" w:name="Xd22b977f88f0add426f49399196084251b1e16e"/>
     <w:p>
       <w:pPr>
         <w:pStyle w:val="Heading1"/>
@@ -887,7 +887,15 @@
         <w:t xml:space="preserve"> </w:t>
       </w:r>
       <w:r>
-        <w:t xml:space="preserve">highlighting the potential generality of the TLS framework. Thermal load sensitivity models explicitly acknowledge that thermal sensitivity depends on the relative accumulation of damage to cellular and sub-cellular systems that compromise physiological function. Without periods of recovery, where damage can be repaired, organisms accumulate damage over time that reduces growth, survival and reproduction. The concept of damage/repair is critically important for understanding how heat waves affect organisms because such a mechanism can result in lagged responses to heat stress – a common feature of extreme heat events</w:t>
+        <w:t xml:space="preserve">highlighting the potential generality of the TLS framework. Thermal load sensitivity models explicitly acknowledge that thermal sensitivity depends on the relative accumulation of damage to cellular and sub-cellular systems that compromise physiological function. Without periods of recovery, where damage can be repaired, organisms accumulate damage over time that reduces growth, survival and reproduction.</w:t>
+      </w:r>
+    </w:p>
+    <w:p>
+      <w:pPr>
+        <w:pStyle w:val="BodyText"/>
+      </w:pPr>
+      <w:r>
+        <w:t xml:space="preserve">The concept of damage/repair is critically important for understanding how heat waves affect organisms because such a mechanism can result in lagged responses to heat stress – a common feature of extreme heat events</w:t>
       </w:r>
       <w:r>
         <w:t xml:space="preserve"> </w:t>
@@ -896,11 +904,496 @@
         <w:t xml:space="preserve">[26]</w:t>
       </w:r>
       <w:r>
-        <w:t xml:space="preserve">. In addition, modelling the intricate balance between damage and repair for a suite of different species can help identify susceptible species, life stages and tissues that are most at risk from extreme heat events which allow for more accurate predictions of the varying sensitivity of species across a community.</w:t>
-      </w:r>
-    </w:p>
-    <w:bookmarkEnd w:id="23"/>
-    <w:bookmarkStart w:id="24" w:name="X709d9ec1b3c8fb9d05ea9ded451dca156568e07"/>
+        <w:t xml:space="preserve">. Once a thermal tolerance landscape for a particular endpoint has been quantified, the thermal sensitivity (i.e., the slope</w:t>
+      </w:r>
+      <w:r>
+        <w:t xml:space="preserve"> </w:t>
+      </w:r>
+      <m:oMath>
+        <m:r>
+          <m:t>z</m:t>
+        </m:r>
+      </m:oMath>
+      <w:r>
+        <w:t xml:space="preserve">, Figure 1) can be used to predict the accumulation of damage during stressful temperatures experienced in nature</w:t>
+      </w:r>
+      <w:r>
+        <w:t xml:space="preserve"> </w:t>
+      </w:r>
+      <w:r>
+        <w:t xml:space="preserve">[11,12,24]</w:t>
+      </w:r>
+      <w:r>
+        <w:t xml:space="preserve">. A number of approaches can be used to capture the accumulation of damage</w:t>
+      </w:r>
+      <w:r>
+        <w:t xml:space="preserve"> </w:t>
+      </w:r>
+      <w:r>
+        <w:t xml:space="preserve">[11,12,24]</w:t>
+      </w:r>
+      <w:r>
+        <w:t xml:space="preserve">, but a simplistic way can be computed following Ørsted</w:t>
+      </w:r>
+      <w:r>
+        <w:t xml:space="preserve"> </w:t>
+      </w:r>
+      <w:r>
+        <w:rPr>
+          <w:i/>
+          <w:iCs/>
+        </w:rPr>
+        <w:t xml:space="preserve">et al.</w:t>
+      </w:r>
+      <w:r>
+        <w:t xml:space="preserve"> </w:t>
+      </w:r>
+      <w:r>
+        <w:t xml:space="preserve">[12]</w:t>
+      </w:r>
+      <w:r>
+        <w:t xml:space="preserve">:</w:t>
+      </w:r>
+    </w:p>
+    <w:p>
+      <w:pPr>
+        <w:pStyle w:val="BodyText"/>
+      </w:pPr>
+      <w:bookmarkStart w:id="23" w:name="eq-hi"/>
+      <m:oMathPara>
+        <m:oMathParaPr>
+          <m:jc m:val="center"/>
+        </m:oMathParaPr>
+        <m:oMath>
+          <m:r>
+            <m:t>H</m:t>
+          </m:r>
+          <m:r>
+            <m:t>I</m:t>
+          </m:r>
+          <m:r>
+            <m:rPr>
+              <m:sty m:val="p"/>
+            </m:rPr>
+            <m:t>=</m:t>
+          </m:r>
+          <m:nary>
+            <m:naryPr>
+              <m:chr m:val="∑"/>
+              <m:limLoc m:val="undOvr"/>
+              <m:subHide m:val="off"/>
+              <m:supHide m:val="off"/>
+            </m:naryPr>
+            <m:sub>
+              <m:r>
+                <m:t>i</m:t>
+              </m:r>
+              <m:r>
+                <m:rPr>
+                  <m:sty m:val="p"/>
+                </m:rPr>
+                <m:t>=</m:t>
+              </m:r>
+              <m:r>
+                <m:t>1</m:t>
+              </m:r>
+            </m:sub>
+            <m:sup>
+              <m:sSub>
+                <m:e>
+                  <m:r>
+                    <m:t>T</m:t>
+                  </m:r>
+                </m:e>
+                <m:sub>
+                  <m:r>
+                    <m:t>e</m:t>
+                  </m:r>
+                </m:sub>
+              </m:sSub>
+              <m:r>
+                <m:rPr>
+                  <m:sty m:val="p"/>
+                </m:rPr>
+                <m:t>&gt;</m:t>
+              </m:r>
+              <m:sSub>
+                <m:e>
+                  <m:r>
+                    <m:t>T</m:t>
+                  </m:r>
+                </m:e>
+                <m:sub>
+                  <m:r>
+                    <m:t>c</m:t>
+                  </m:r>
+                </m:sub>
+              </m:sSub>
+            </m:sup>
+            <m:e>
+              <m:f>
+                <m:fPr>
+                  <m:type m:val="bar"/>
+                </m:fPr>
+                <m:num>
+                  <m:r>
+                    <m:t>100</m:t>
+                  </m:r>
+                  <m:r>
+                    <m:rPr>
+                      <m:sty m:val="p"/>
+                    </m:rPr>
+                    <m:t>⋅</m:t>
+                  </m:r>
+                  <m:d>
+                    <m:dPr>
+                      <m:begChr m:val="("/>
+                      <m:endChr m:val=")"/>
+                      <m:sepChr m:val=""/>
+                      <m:grow/>
+                    </m:dPr>
+                    <m:e>
+                      <m:sSub>
+                        <m:e>
+                          <m:r>
+                            <m:t>t</m:t>
+                          </m:r>
+                        </m:e>
+                        <m:sub>
+                          <m:r>
+                            <m:t>i</m:t>
+                          </m:r>
+                          <m:r>
+                            <m:rPr>
+                              <m:sty m:val="p"/>
+                            </m:rPr>
+                            <m:t>+</m:t>
+                          </m:r>
+                          <m:r>
+                            <m:t>1</m:t>
+                          </m:r>
+                        </m:sub>
+                      </m:sSub>
+                      <m:r>
+                        <m:rPr>
+                          <m:sty m:val="p"/>
+                        </m:rPr>
+                        <m:t>−</m:t>
+                      </m:r>
+                      <m:sSub>
+                        <m:e>
+                          <m:r>
+                            <m:t>t</m:t>
+                          </m:r>
+                        </m:e>
+                        <m:sub>
+                          <m:r>
+                            <m:t>i</m:t>
+                          </m:r>
+                        </m:sub>
+                      </m:sSub>
+                    </m:e>
+                  </m:d>
+                </m:num>
+                <m:den>
+                  <m:sSup>
+                    <m:e>
+                      <m:r>
+                        <m:t>10</m:t>
+                      </m:r>
+                    </m:e>
+                    <m:sup>
+                      <m:d>
+                        <m:dPr>
+                          <m:begChr m:val="("/>
+                          <m:endChr m:val=")"/>
+                          <m:sepChr m:val=""/>
+                          <m:grow/>
+                        </m:dPr>
+                        <m:e>
+                          <m:r>
+                            <m:rPr>
+                              <m:sty m:val="p"/>
+                            </m:rPr>
+                            <m:t>−</m:t>
+                          </m:r>
+                          <m:f>
+                            <m:fPr>
+                              <m:type m:val="bar"/>
+                            </m:fPr>
+                            <m:num>
+                              <m:r>
+                                <m:t>1</m:t>
+                              </m:r>
+                            </m:num>
+                            <m:den>
+                              <m:r>
+                                <m:t>z</m:t>
+                              </m:r>
+                            </m:den>
+                          </m:f>
+                          <m:r>
+                            <m:rPr>
+                              <m:sty m:val="p"/>
+                            </m:rPr>
+                            <m:t>⋅</m:t>
+                          </m:r>
+                          <m:r>
+                            <m:t>m</m:t>
+                          </m:r>
+                          <m:r>
+                            <m:t>a</m:t>
+                          </m:r>
+                          <m:r>
+                            <m:t>x</m:t>
+                          </m:r>
+                          <m:d>
+                            <m:dPr>
+                              <m:begChr m:val="("/>
+                              <m:endChr m:val=")"/>
+                              <m:sepChr m:val=""/>
+                              <m:grow/>
+                            </m:dPr>
+                            <m:e>
+                              <m:sSub>
+                                <m:e>
+                                  <m:r>
+                                    <m:t>T</m:t>
+                                  </m:r>
+                                </m:e>
+                                <m:sub>
+                                  <m:r>
+                                    <m:t>i</m:t>
+                                  </m:r>
+                                </m:sub>
+                              </m:sSub>
+                              <m:r>
+                                <m:rPr>
+                                  <m:sty m:val="p"/>
+                                </m:rPr>
+                                <m:t>;</m:t>
+                              </m:r>
+                              <m:sSub>
+                                <m:e>
+                                  <m:r>
+                                    <m:t>T</m:t>
+                                  </m:r>
+                                </m:e>
+                                <m:sub>
+                                  <m:r>
+                                    <m:t>i</m:t>
+                                  </m:r>
+                                  <m:r>
+                                    <m:rPr>
+                                      <m:sty m:val="p"/>
+                                    </m:rPr>
+                                    <m:t>+</m:t>
+                                  </m:r>
+                                  <m:r>
+                                    <m:t>1</m:t>
+                                  </m:r>
+                                </m:sub>
+                              </m:sSub>
+                            </m:e>
+                          </m:d>
+                          <m:r>
+                            <m:rPr>
+                              <m:sty m:val="p"/>
+                            </m:rPr>
+                            <m:t>+</m:t>
+                          </m:r>
+                          <m:r>
+                            <m:t>α</m:t>
+                          </m:r>
+                        </m:e>
+                      </m:d>
+                    </m:sup>
+                  </m:sSup>
+                </m:den>
+              </m:f>
+            </m:e>
+          </m:nary>
+          <m:r>
+            <m:t>  </m:t>
+          </m:r>
+          <m:d>
+            <m:dPr>
+              <m:begChr m:val="("/>
+              <m:endChr m:val=")"/>
+              <m:sepChr m:val=""/>
+              <m:grow/>
+            </m:dPr>
+            <m:e>
+              <m:r>
+                <m:t>1</m:t>
+              </m:r>
+            </m:e>
+          </m:d>
+        </m:oMath>
+      </m:oMathPara>
+      <w:bookmarkEnd w:id="23"/>
+    </w:p>
+    <w:p>
+      <w:pPr>
+        <w:pStyle w:val="FirstParagraph"/>
+      </w:pPr>
+      <w:hyperlink w:anchor="eq-hi">
+        <w:r>
+          <w:rPr>
+            <w:rStyle w:val="Hyperlink"/>
+          </w:rPr>
+          <w:t xml:space="preserve">Equation 1</w:t>
+        </w:r>
+      </w:hyperlink>
+      <w:r>
+        <w:t xml:space="preserve"> </w:t>
+      </w:r>
+      <w:r>
+        <w:t xml:space="preserve">summaries heat injures (HI) sustained across time,</w:t>
+      </w:r>
+      <w:r>
+        <w:t xml:space="preserve"> </w:t>
+      </w:r>
+      <m:oMath>
+        <m:r>
+          <m:t>t</m:t>
+        </m:r>
+      </m:oMath>
+      <w:r>
+        <w:t xml:space="preserve">, during heat stress events (i.e., when body temperatures are greater than the critical temperatures,</w:t>
+      </w:r>
+      <w:r>
+        <w:t xml:space="preserve"> </w:t>
+      </w:r>
+      <m:oMath>
+        <m:sSub>
+          <m:e>
+            <m:r>
+              <m:t>T</m:t>
+            </m:r>
+          </m:e>
+          <m:sub>
+            <m:r>
+              <m:t>e</m:t>
+            </m:r>
+          </m:sub>
+        </m:sSub>
+        <m:r>
+          <m:rPr>
+            <m:sty m:val="p"/>
+          </m:rPr>
+          <m:t>&gt;</m:t>
+        </m:r>
+        <m:sSub>
+          <m:e>
+            <m:r>
+              <m:t>T</m:t>
+            </m:r>
+          </m:e>
+          <m:sub>
+            <m:r>
+              <m:t>c</m:t>
+            </m:r>
+          </m:sub>
+        </m:sSub>
+      </m:oMath>
+      <w:r>
+        <w:t xml:space="preserve">) using information about the maximum temperature,</w:t>
+      </w:r>
+      <w:r>
+        <w:t xml:space="preserve"> </w:t>
+      </w:r>
+      <m:oMath>
+        <m:r>
+          <m:t>T</m:t>
+        </m:r>
+      </m:oMath>
+      <w:r>
+        <w:t xml:space="preserve">, experienced between time point</w:t>
+      </w:r>
+      <w:r>
+        <w:t xml:space="preserve"> </w:t>
+      </w:r>
+      <m:oMath>
+        <m:sSub>
+          <m:e>
+            <m:r>
+              <m:t>t</m:t>
+            </m:r>
+          </m:e>
+          <m:sub>
+            <m:r>
+              <m:t>i</m:t>
+            </m:r>
+          </m:sub>
+        </m:sSub>
+      </m:oMath>
+      <w:r>
+        <w:t xml:space="preserve"> </w:t>
+      </w:r>
+      <w:r>
+        <w:t xml:space="preserve">and</w:t>
+      </w:r>
+      <w:r>
+        <w:t xml:space="preserve"> </w:t>
+      </w:r>
+      <m:oMath>
+        <m:sSub>
+          <m:e>
+            <m:r>
+              <m:t>t</m:t>
+            </m:r>
+          </m:e>
+          <m:sub>
+            <m:r>
+              <m:t>i</m:t>
+            </m:r>
+            <m:r>
+              <m:rPr>
+                <m:sty m:val="p"/>
+              </m:rPr>
+              <m:t>+</m:t>
+            </m:r>
+            <m:r>
+              <m:t>1</m:t>
+            </m:r>
+          </m:sub>
+        </m:sSub>
+      </m:oMath>
+      <w:r>
+        <w:t xml:space="preserve"> </w:t>
+      </w:r>
+      <w:r>
+        <w:t xml:space="preserve">and the thermal sensitivity (i.e.,</w:t>
+      </w:r>
+      <w:r>
+        <w:t xml:space="preserve"> </w:t>
+      </w:r>
+      <m:oMath>
+        <m:r>
+          <m:t>z</m:t>
+        </m:r>
+      </m:oMath>
+      <w:r>
+        <w:t xml:space="preserve"> </w:t>
+      </w:r>
+      <w:r>
+        <w:t xml:space="preserve">and</w:t>
+      </w:r>
+      <w:r>
+        <w:t xml:space="preserve"> </w:t>
+      </w:r>
+      <m:oMath>
+        <m:r>
+          <m:t>α</m:t>
+        </m:r>
+      </m:oMath>
+      <w:r>
+        <w:t xml:space="preserve">). Once an organism reaches a given threshold is the point when the endpoint has been reached. While the process of repair can be integrated within these models and decoupled from damage the measure of thermal sensitivity already captures some aspects of the repair process. In addition, modelling the intricate balance between damage and repair for a suite of different species can help identify susceptible species, life stages and tissues that are most at risk from extreme heat events which allow for more accurate predictions of the varying sensitivity of species across a community.</w:t>
+      </w:r>
+    </w:p>
+    <w:bookmarkEnd w:id="24"/>
+    <w:bookmarkStart w:id="25" w:name="X709d9ec1b3c8fb9d05ea9ded451dca156568e07"/>
     <w:p>
       <w:pPr>
         <w:pStyle w:val="Heading1"/>
@@ -1151,8 +1644,8 @@
         <w:t xml:space="preserve">. However, comprehensive models with high prediction powers for plant microbe interactions are still lacking, which hampers our understanding of the heat tolerance in plants and microorganisms.</w:t>
       </w:r>
     </w:p>
-    <w:bookmarkEnd w:id="24"/>
-    <w:bookmarkStart w:id="25" w:name="Xf7a8b061298c769a249e4cfc121bdb94e09ce12"/>
+    <w:bookmarkEnd w:id="25"/>
+    <w:bookmarkStart w:id="26" w:name="Xf7a8b061298c769a249e4cfc121bdb94e09ce12"/>
     <w:p>
       <w:pPr>
         <w:pStyle w:val="Heading1"/>
@@ -1266,8 +1759,8 @@
         <w:t xml:space="preserve">allow for simulations of life-cycles using parameters for diverse species. From these models key outputs on organisms such as body mass and size, reproductive success and events, along with survival can be used to parameterise vital rates needed for population and community models.</w:t>
       </w:r>
     </w:p>
-    <w:bookmarkEnd w:id="25"/>
-    <w:bookmarkStart w:id="26" w:name="Xbdb3df2871e98d114a1e4e74a52caa28253dc0c"/>
+    <w:bookmarkEnd w:id="26"/>
+    <w:bookmarkStart w:id="27" w:name="Xbdb3df2871e98d114a1e4e74a52caa28253dc0c"/>
     <w:p>
       <w:pPr>
         <w:pStyle w:val="Heading1"/>
@@ -1610,8 +2103,8 @@
         <w:t xml:space="preserve">[72]</w:t>
       </w:r>
     </w:p>
-    <w:bookmarkEnd w:id="26"/>
-    <w:bookmarkStart w:id="32" w:name="Xe7540e51cb84d29e47d083817996607ca5f8009"/>
+    <w:bookmarkEnd w:id="27"/>
+    <w:bookmarkStart w:id="33" w:name="Xe7540e51cb84d29e47d083817996607ca5f8009"/>
     <w:p>
       <w:pPr>
         <w:pStyle w:val="Heading1"/>
@@ -1693,7 +2186,7 @@
         <w:t xml:space="preserve">If uncertain about adding a sentence to the link to the models above, that’s ok, Dan, Mike, Margie and Belinda can add.</w:t>
       </w:r>
     </w:p>
-    <w:bookmarkStart w:id="27" w:name="X1b136e3eae891c477bc728d2597e572ca649eaa"/>
+    <w:bookmarkStart w:id="28" w:name="X1b136e3eae891c477bc728d2597e572ca649eaa"/>
     <w:p>
       <w:pPr>
         <w:pStyle w:val="Heading3"/>
@@ -1832,8 +2325,8 @@
         <w:t xml:space="preserve">. The paper provides a framework for modelling soil plant interactions</w:t>
       </w:r>
     </w:p>
-    <w:bookmarkEnd w:id="27"/>
-    <w:bookmarkStart w:id="28" w:name="X24738ef4513767bb724ce8804ac017259eaf2ee"/>
+    <w:bookmarkEnd w:id="28"/>
+    <w:bookmarkStart w:id="29" w:name="X24738ef4513767bb724ce8804ac017259eaf2ee"/>
     <w:p>
       <w:pPr>
         <w:pStyle w:val="Heading3"/>
@@ -1842,8 +2335,8 @@
         <w:t xml:space="preserve">Water availability can impact thermal sensitivity of plants and animals (Brendan)</w:t>
       </w:r>
     </w:p>
-    <w:bookmarkEnd w:id="28"/>
-    <w:bookmarkStart w:id="29" w:name="X1934a01dca617640c62902cb6b54ad742133dfc"/>
+    <w:bookmarkEnd w:id="29"/>
+    <w:bookmarkStart w:id="30" w:name="X1934a01dca617640c62902cb6b54ad742133dfc"/>
     <w:p>
       <w:pPr>
         <w:pStyle w:val="Heading3"/>
@@ -1935,8 +2428,8 @@
         <w:t xml:space="preserve">also found that different life-stages were affected differently by heat stress, with adults being more thermally tolerant than early developmental stages emphasising the need for models to capture such variation. However, such findings do not incorporate acclimation to heat stress or different microhabitat choice by the different species, which are both likely to be important for predicting the impacts of heat stress on community structure. It also ignores how interspecific interactions between competing aphid species will also likely mediate species abundance. It would be worth while integrating thermal tolerance landscapes with ecological models that capture interspecific interactions to better predict how heat stress will affect community structure.</w:t>
       </w:r>
     </w:p>
-    <w:bookmarkEnd w:id="29"/>
-    <w:bookmarkStart w:id="30" w:name="Xdbc91e02dcd505372e716f3d2147fb46ffba4bf"/>
+    <w:bookmarkEnd w:id="30"/>
+    <w:bookmarkStart w:id="31" w:name="Xdbc91e02dcd505372e716f3d2147fb46ffba4bf"/>
     <w:p>
       <w:pPr>
         <w:pStyle w:val="Heading3"/>
@@ -1962,8 +2455,8 @@
         <w:t xml:space="preserve">. Connects heat tolerance to population matrix models. And, shows acclimation responses (heat hardening).</w:t>
       </w:r>
     </w:p>
-    <w:bookmarkEnd w:id="30"/>
-    <w:bookmarkStart w:id="31" w:name="X1f820984f57b727edc20965138ee13069f96c01"/>
+    <w:bookmarkEnd w:id="31"/>
+    <w:bookmarkStart w:id="32" w:name="X1f820984f57b727edc20965138ee13069f96c01"/>
     <w:p>
       <w:pPr>
         <w:pStyle w:val="Heading3"/>
@@ -1972,9 +2465,9 @@
         <w:t xml:space="preserve">Phenology and activity pattern shifts mediating interactions (James?)</w:t>
       </w:r>
     </w:p>
-    <w:bookmarkEnd w:id="31"/>
     <w:bookmarkEnd w:id="32"/>
-    <w:bookmarkStart w:id="33" w:name="Xf9650dc0ea0b351fc010b34968d2cf3bde51c90"/>
+    <w:bookmarkEnd w:id="33"/>
+    <w:bookmarkStart w:id="34" w:name="Xf9650dc0ea0b351fc010b34968d2cf3bde51c90"/>
     <w:p>
       <w:pPr>
         <w:pStyle w:val="Heading1"/>
@@ -2156,8 +2649,8 @@
         <w:t xml:space="preserve">.</w:t>
       </w:r>
     </w:p>
-    <w:bookmarkEnd w:id="33"/>
-    <w:bookmarkStart w:id="34" w:name="X42ca7aa69937316dee7b1e100d4320aa777518f"/>
+    <w:bookmarkEnd w:id="34"/>
+    <w:bookmarkStart w:id="35" w:name="X42ca7aa69937316dee7b1e100d4320aa777518f"/>
     <w:p>
       <w:pPr>
         <w:pStyle w:val="Heading1"/>
@@ -2297,8 +2790,8 @@
         <w:t xml:space="preserve">Conservation (Adrienne?)</w:t>
       </w:r>
     </w:p>
-    <w:bookmarkEnd w:id="34"/>
-    <w:bookmarkStart w:id="40" w:name="X78b08fde953bb9dcb9bb22555137d822070b4a9"/>
+    <w:bookmarkEnd w:id="35"/>
+    <w:bookmarkStart w:id="41" w:name="X78b08fde953bb9dcb9bb22555137d822070b4a9"/>
     <w:p>
       <w:pPr>
         <w:pStyle w:val="Heading1"/>
@@ -2307,7 +2800,7 @@
         <w:t xml:space="preserve">Future directions: modelling challenges, gaps and possible solutions</w:t>
       </w:r>
     </w:p>
-    <w:bookmarkStart w:id="35" w:name="Xfdf6778d6c1a7f88e581fd361ab93058637952f"/>
+    <w:bookmarkStart w:id="36" w:name="Xfdf6778d6c1a7f88e581fd361ab93058637952f"/>
     <w:p>
       <w:pPr>
         <w:pStyle w:val="Heading4"/>
@@ -2323,8 +2816,8 @@
         <w:t xml:space="preserve">: (Mike) Requires lots of information on a given species to model life-cycles, challenges in applying stage-structured populations (metamorphosis) others….Solutions?</w:t>
       </w:r>
     </w:p>
-    <w:bookmarkEnd w:id="35"/>
-    <w:bookmarkStart w:id="36" w:name="X31af800422944976d7563c55da852b974856f47"/>
+    <w:bookmarkEnd w:id="36"/>
+    <w:bookmarkStart w:id="37" w:name="X31af800422944976d7563c55da852b974856f47"/>
     <w:p>
       <w:pPr>
         <w:pStyle w:val="Heading4"/>
@@ -2340,8 +2833,8 @@
         <w:t xml:space="preserve">: We need to understand the genomic, cellular and physiological processes that confer greater thermal tolerance and help prepare organisms for future heat stress events.</w:t>
       </w:r>
     </w:p>
-    <w:bookmarkEnd w:id="36"/>
-    <w:bookmarkStart w:id="37" w:name="Xbb6a1781224964eec5409b3879f03550788dea1"/>
+    <w:bookmarkEnd w:id="37"/>
+    <w:bookmarkStart w:id="38" w:name="Xbb6a1781224964eec5409b3879f03550788dea1"/>
     <w:p>
       <w:pPr>
         <w:pStyle w:val="Heading4"/>
@@ -2357,21 +2850,14 @@
         <w:t xml:space="preserve">: Animals behave. We need to model that. How do changes in behaviour impact interactions with other species and the environment. How might this impact plant productivity (Mike, Dan, DEB models)</w:t>
       </w:r>
     </w:p>
-    <w:bookmarkEnd w:id="37"/>
-    <w:bookmarkStart w:id="38" w:name="Xebf598c8d62402443261428456b1d908a4618f8"/>
+    <w:bookmarkEnd w:id="38"/>
+    <w:bookmarkStart w:id="39" w:name="X3ed7603d16b77139cf6e8da2c2d8afebe91fdfa"/>
     <w:p>
       <w:pPr>
         <w:pStyle w:val="Heading4"/>
       </w:pPr>
       <w:r>
-        <w:rPr>
-          <w:i/>
-          <w:iCs/>
-        </w:rPr>
-        <w:t xml:space="preserve">Evolutionary dynamics leading to changes in thermal sensitivity and exposure</w:t>
-      </w:r>
-      <w:r>
-        <w:t xml:space="preserve">: We need to understand how thermal sensitivity and exposure will evolve in response to climate change. Probably could cite</w:t>
+        <w:t xml:space="preserve">Evolutionary dynamics leading to changes in thermal sensitivity and exposure: But we need heritability (not often known) and selection intensity (good idea of what’s driving selection) We need to understand how thermal sensitivity and exposure will evolve in response to climate change. Probably could cite</w:t>
       </w:r>
       <w:r>
         <w:t xml:space="preserve"> </w:t>
@@ -2386,8 +2872,8 @@
         <w:t xml:space="preserve">(Ary)</w:t>
       </w:r>
     </w:p>
-    <w:bookmarkEnd w:id="38"/>
-    <w:bookmarkStart w:id="39" w:name="Xf716fb10002f9360210b8203424711763374548"/>
+    <w:bookmarkEnd w:id="39"/>
+    <w:bookmarkStart w:id="40" w:name="Xf716fb10002f9360210b8203424711763374548"/>
     <w:p>
       <w:pPr>
         <w:pStyle w:val="Heading4"/>
@@ -2403,9 +2889,9 @@
         <w:t xml:space="preserve">: We need to understand the trade-offs between thermal tolerance and other traits such as growth rate, reproduction, and competitive ability. It is fine to confer greater thermal tolerance resistance but if this comes at a cost to reproduction, growth or biomass accumulation, then it may not be beneficial. (Dani, James, Brendan)</w:t>
       </w:r>
     </w:p>
-    <w:bookmarkEnd w:id="39"/>
     <w:bookmarkEnd w:id="40"/>
-    <w:bookmarkStart w:id="132" w:name="references"/>
+    <w:bookmarkEnd w:id="41"/>
+    <w:bookmarkStart w:id="133" w:name="references"/>
     <w:p>
       <w:pPr>
         <w:pStyle w:val="Heading1"/>
@@ -2414,8 +2900,8 @@
         <w:t xml:space="preserve">References</w:t>
       </w:r>
     </w:p>
-    <w:bookmarkStart w:id="131" w:name="refs"/>
-    <w:bookmarkStart w:id="41" w:name="ref-Barriopedro2023"/>
+    <w:bookmarkStart w:id="132" w:name="refs"/>
+    <w:bookmarkStart w:id="42" w:name="ref-Barriopedro2023"/>
     <w:p>
       <w:pPr>
         <w:pStyle w:val="Bibliography"/>
@@ -2465,8 +2951,8 @@
         <w:t xml:space="preserve">61, e2022RG000780</w:t>
       </w:r>
     </w:p>
-    <w:bookmarkEnd w:id="41"/>
-    <w:bookmarkStart w:id="42" w:name="ref-Aglas-Leitner2024"/>
+    <w:bookmarkEnd w:id="42"/>
+    <w:bookmarkStart w:id="43" w:name="ref-Aglas-Leitner2024"/>
     <w:p>
       <w:pPr>
         <w:pStyle w:val="Bibliography"/>
@@ -2513,8 +2999,8 @@
         <w:t xml:space="preserve">, Copernicus Meetings</w:t>
       </w:r>
     </w:p>
-    <w:bookmarkEnd w:id="42"/>
-    <w:bookmarkStart w:id="43" w:name="ref-Reichstein2007"/>
+    <w:bookmarkEnd w:id="43"/>
+    <w:bookmarkStart w:id="44" w:name="ref-Reichstein2007"/>
     <w:p>
       <w:pPr>
         <w:pStyle w:val="Bibliography"/>
@@ -2564,8 +3050,8 @@
         <w:t xml:space="preserve">13, 634–651</w:t>
       </w:r>
     </w:p>
-    <w:bookmarkEnd w:id="43"/>
-    <w:bookmarkStart w:id="44" w:name="ref-Margalef-Marrase2020"/>
+    <w:bookmarkEnd w:id="44"/>
+    <w:bookmarkStart w:id="45" w:name="ref-Margalef-Marrase2020"/>
     <w:p>
       <w:pPr>
         <w:pStyle w:val="Bibliography"/>
@@ -2615,8 +3101,8 @@
         <w:t xml:space="preserve">26, 3134–3146</w:t>
       </w:r>
     </w:p>
-    <w:bookmarkEnd w:id="44"/>
-    <w:bookmarkStart w:id="45" w:name="ref-Kazenel2024"/>
+    <w:bookmarkEnd w:id="45"/>
+    <w:bookmarkStart w:id="46" w:name="ref-Kazenel2024"/>
     <w:p>
       <w:pPr>
         <w:pStyle w:val="Bibliography"/>
@@ -2660,8 +3146,8 @@
         <w:t xml:space="preserve">Nature</w:t>
       </w:r>
     </w:p>
-    <w:bookmarkEnd w:id="45"/>
-    <w:bookmarkStart w:id="46" w:name="ref-Zhao2017"/>
+    <w:bookmarkEnd w:id="46"/>
+    <w:bookmarkStart w:id="47" w:name="ref-Zhao2017"/>
     <w:p>
       <w:pPr>
         <w:pStyle w:val="Bibliography"/>
@@ -2711,8 +3197,8 @@
         <w:t xml:space="preserve">114, 9326–9331</w:t>
       </w:r>
     </w:p>
-    <w:bookmarkEnd w:id="46"/>
-    <w:bookmarkStart w:id="47" w:name="ref-Tito2018"/>
+    <w:bookmarkEnd w:id="47"/>
+    <w:bookmarkStart w:id="48" w:name="ref-Tito2018"/>
     <w:p>
       <w:pPr>
         <w:pStyle w:val="Bibliography"/>
@@ -2762,8 +3248,8 @@
         <w:t xml:space="preserve">24, e592–e602</w:t>
       </w:r>
     </w:p>
-    <w:bookmarkEnd w:id="47"/>
-    <w:bookmarkStart w:id="48" w:name="ref-Bastos2014"/>
+    <w:bookmarkEnd w:id="48"/>
+    <w:bookmarkStart w:id="49" w:name="ref-Bastos2014"/>
     <w:p>
       <w:pPr>
         <w:pStyle w:val="Bibliography"/>
@@ -2813,8 +3299,8 @@
         <w:t xml:space="preserve">11, 3421–3435</w:t>
       </w:r>
     </w:p>
-    <w:bookmarkEnd w:id="48"/>
-    <w:bookmarkStart w:id="49" w:name="ref-Hesketh2023"/>
+    <w:bookmarkEnd w:id="49"/>
+    <w:bookmarkStart w:id="50" w:name="ref-Hesketh2023"/>
     <w:p>
       <w:pPr>
         <w:pStyle w:val="Bibliography"/>
@@ -2848,8 +3334,8 @@
         <w:t xml:space="preserve">29, 165–178</w:t>
       </w:r>
     </w:p>
-    <w:bookmarkEnd w:id="49"/>
-    <w:bookmarkStart w:id="50" w:name="ref-Martinez2023"/>
+    <w:bookmarkEnd w:id="50"/>
+    <w:bookmarkStart w:id="51" w:name="ref-Martinez2023"/>
     <w:p>
       <w:pPr>
         <w:pStyle w:val="Bibliography"/>
@@ -2893,8 +3379,8 @@
         <w:t xml:space="preserve">J. Appl. Entomol.</w:t>
       </w:r>
     </w:p>
-    <w:bookmarkEnd w:id="50"/>
-    <w:bookmarkStart w:id="51" w:name="ref-Rezende2020"/>
+    <w:bookmarkEnd w:id="51"/>
+    <w:bookmarkStart w:id="52" w:name="ref-Rezende2020"/>
     <w:p>
       <w:pPr>
         <w:pStyle w:val="Bibliography"/>
@@ -2944,8 +3430,8 @@
         <w:t xml:space="preserve">369, 1242–1245</w:t>
       </w:r>
     </w:p>
-    <w:bookmarkEnd w:id="51"/>
-    <w:bookmarkStart w:id="52" w:name="ref-Orsted2024"/>
+    <w:bookmarkEnd w:id="52"/>
+    <w:bookmarkStart w:id="53" w:name="ref-Orsted2024"/>
     <w:p>
       <w:pPr>
         <w:pStyle w:val="Bibliography"/>
@@ -2995,8 +3481,8 @@
         <w:t xml:space="preserve">27, e14421</w:t>
       </w:r>
     </w:p>
-    <w:bookmarkEnd w:id="52"/>
-    <w:bookmarkStart w:id="53" w:name="ref-Lopez-Goldar2024"/>
+    <w:bookmarkEnd w:id="53"/>
+    <w:bookmarkStart w:id="54" w:name="ref-Lopez-Goldar2024"/>
     <w:p>
       <w:pPr>
         <w:pStyle w:val="Bibliography"/>
@@ -3040,8 +3526,8 @@
         <w:t xml:space="preserve">Plant Cell Environ.</w:t>
       </w:r>
     </w:p>
-    <w:bookmarkEnd w:id="53"/>
-    <w:bookmarkStart w:id="54" w:name="ref-Huynh2024"/>
+    <w:bookmarkEnd w:id="54"/>
+    <w:bookmarkStart w:id="55" w:name="ref-Huynh2024"/>
     <w:p>
       <w:pPr>
         <w:pStyle w:val="Bibliography"/>
@@ -3091,8 +3577,8 @@
         <w:t xml:space="preserve">14, e70096</w:t>
       </w:r>
     </w:p>
-    <w:bookmarkEnd w:id="54"/>
-    <w:bookmarkStart w:id="55" w:name="ref-Trivedi2022"/>
+    <w:bookmarkEnd w:id="55"/>
+    <w:bookmarkStart w:id="56" w:name="ref-Trivedi2022"/>
     <w:p>
       <w:pPr>
         <w:pStyle w:val="Bibliography"/>
@@ -3142,8 +3628,8 @@
         <w:t xml:space="preserve">234, 1951–1959</w:t>
       </w:r>
     </w:p>
-    <w:bookmarkEnd w:id="55"/>
-    <w:bookmarkStart w:id="56" w:name="ref-Kooijman2010"/>
+    <w:bookmarkEnd w:id="56"/>
+    <w:bookmarkStart w:id="57" w:name="ref-Kooijman2010"/>
     <w:p>
       <w:pPr>
         <w:pStyle w:val="Bibliography"/>
@@ -3174,8 +3660,8 @@
         <w:t xml:space="preserve">, Cambridge university press</w:t>
       </w:r>
     </w:p>
-    <w:bookmarkEnd w:id="56"/>
-    <w:bookmarkStart w:id="57" w:name="ref-Kearney2009b"/>
+    <w:bookmarkEnd w:id="57"/>
+    <w:bookmarkStart w:id="58" w:name="ref-Kearney2009b"/>
     <w:p>
       <w:pPr>
         <w:pStyle w:val="Bibliography"/>
@@ -3209,8 +3695,8 @@
         <w:t xml:space="preserve">12, 334–350</w:t>
       </w:r>
     </w:p>
-    <w:bookmarkEnd w:id="57"/>
-    <w:bookmarkStart w:id="58" w:name="ref-Jusup2024"/>
+    <w:bookmarkEnd w:id="58"/>
+    <w:bookmarkStart w:id="59" w:name="ref-Jusup2024"/>
     <w:p>
       <w:pPr>
         <w:pStyle w:val="Bibliography"/>
@@ -3238,8 +3724,8 @@
         <w:t xml:space="preserve">arXiv preprint arXiv:2408. 13998</w:t>
       </w:r>
     </w:p>
-    <w:bookmarkEnd w:id="58"/>
-    <w:bookmarkStart w:id="59" w:name="ref-Kearney2024"/>
+    <w:bookmarkEnd w:id="59"/>
+    <w:bookmarkStart w:id="60" w:name="ref-Kearney2024"/>
     <w:p>
       <w:pPr>
         <w:pStyle w:val="Bibliography"/>
@@ -3282,8 +3768,8 @@
         <w:t xml:space="preserve">15, 1516–1531</w:t>
       </w:r>
     </w:p>
-    <w:bookmarkEnd w:id="59"/>
-    <w:bookmarkStart w:id="60" w:name="ref-Briscoe2023"/>
+    <w:bookmarkEnd w:id="60"/>
+    <w:bookmarkStart w:id="61" w:name="ref-Briscoe2023"/>
     <w:p>
       <w:pPr>
         <w:pStyle w:val="Bibliography"/>
@@ -3333,8 +3819,8 @@
         <w:t xml:space="preserve">29, 1451–1470</w:t>
       </w:r>
     </w:p>
-    <w:bookmarkEnd w:id="60"/>
-    <w:bookmarkStart w:id="61" w:name="ref-Rezende2014"/>
+    <w:bookmarkEnd w:id="61"/>
+    <w:bookmarkStart w:id="62" w:name="ref-Rezende2014"/>
     <w:p>
       <w:pPr>
         <w:pStyle w:val="Bibliography"/>
@@ -3384,8 +3870,8 @@
         <w:t xml:space="preserve">28, 799–809</w:t>
       </w:r>
     </w:p>
-    <w:bookmarkEnd w:id="61"/>
-    <w:bookmarkStart w:id="62" w:name="ref-Bimler2018"/>
+    <w:bookmarkEnd w:id="62"/>
+    <w:bookmarkStart w:id="63" w:name="ref-Bimler2018"/>
     <w:p>
       <w:pPr>
         <w:pStyle w:val="Bibliography"/>
@@ -3435,8 +3921,8 @@
         <w:t xml:space="preserve">106, 1839–1852</w:t>
       </w:r>
     </w:p>
-    <w:bookmarkEnd w:id="62"/>
-    <w:bookmarkStart w:id="63" w:name="ref-Bowler2022"/>
+    <w:bookmarkEnd w:id="63"/>
+    <w:bookmarkStart w:id="64" w:name="ref-Bowler2022"/>
     <w:p>
       <w:pPr>
         <w:pStyle w:val="Bibliography"/>
@@ -3486,8 +3972,8 @@
         <w:t xml:space="preserve">25, 1618–1628</w:t>
       </w:r>
     </w:p>
-    <w:bookmarkEnd w:id="63"/>
-    <w:bookmarkStart w:id="64" w:name="ref-Orsted2022"/>
+    <w:bookmarkEnd w:id="64"/>
+    <w:bookmarkStart w:id="65" w:name="ref-Orsted2022"/>
     <w:p>
       <w:pPr>
         <w:pStyle w:val="Bibliography"/>
@@ -3549,8 +4035,8 @@
         <w:t xml:space="preserve">225, jeb244514</w:t>
       </w:r>
     </w:p>
-    <w:bookmarkEnd w:id="64"/>
-    <w:bookmarkStart w:id="65" w:name="ref-Faber2024"/>
+    <w:bookmarkEnd w:id="65"/>
+    <w:bookmarkStart w:id="66" w:name="ref-Faber2024"/>
     <w:p>
       <w:pPr>
         <w:pStyle w:val="Bibliography"/>
@@ -3600,8 +4086,8 @@
         <w:t xml:space="preserve">75, 3467–3482</w:t>
       </w:r>
     </w:p>
-    <w:bookmarkEnd w:id="65"/>
-    <w:bookmarkStart w:id="66" w:name="ref-Martinez-De_Leon2024"/>
+    <w:bookmarkEnd w:id="66"/>
+    <w:bookmarkStart w:id="67" w:name="ref-Martinez-De_Leon2024"/>
     <w:p>
       <w:pPr>
         <w:pStyle w:val="Bibliography"/>
@@ -3629,8 +4115,8 @@
         <w:t xml:space="preserve">Trends Ecol. Evol.</w:t>
       </w:r>
     </w:p>
-    <w:bookmarkEnd w:id="66"/>
-    <w:bookmarkStart w:id="67" w:name="ref-Fontaine2022"/>
+    <w:bookmarkEnd w:id="67"/>
+    <w:bookmarkStart w:id="68" w:name="ref-Fontaine2022"/>
     <w:p>
       <w:pPr>
         <w:pStyle w:val="Bibliography"/>
@@ -3680,8 +4166,8 @@
         <w:t xml:space="preserve">6, 405–417</w:t>
       </w:r>
     </w:p>
-    <w:bookmarkEnd w:id="67"/>
-    <w:bookmarkStart w:id="68" w:name="ref-Fontaine2023"/>
+    <w:bookmarkEnd w:id="68"/>
+    <w:bookmarkStart w:id="69" w:name="ref-Fontaine2023"/>
     <w:p>
       <w:pPr>
         <w:pStyle w:val="Bibliography"/>
@@ -3715,8 +4201,8 @@
         <w:t xml:space="preserve">226, jeb245191</w:t>
       </w:r>
     </w:p>
-    <w:bookmarkEnd w:id="68"/>
-    <w:bookmarkStart w:id="69" w:name="ref-Hoang2019"/>
+    <w:bookmarkEnd w:id="69"/>
+    <w:bookmarkStart w:id="70" w:name="ref-Hoang2019"/>
     <w:p>
       <w:pPr>
         <w:pStyle w:val="Bibliography"/>
@@ -3766,8 +4252,8 @@
         <w:t xml:space="preserve">9, 3491–3499</w:t>
       </w:r>
     </w:p>
-    <w:bookmarkEnd w:id="69"/>
-    <w:bookmarkStart w:id="70" w:name="ref-Gehman2019"/>
+    <w:bookmarkEnd w:id="70"/>
+    <w:bookmarkStart w:id="71" w:name="ref-Gehman2019"/>
     <w:p>
       <w:pPr>
         <w:pStyle w:val="Bibliography"/>
@@ -3801,8 +4287,8 @@
         <w:t xml:space="preserve">10, e02683</w:t>
       </w:r>
     </w:p>
-    <w:bookmarkEnd w:id="70"/>
-    <w:bookmarkStart w:id="71" w:name="ref-Hoang2021"/>
+    <w:bookmarkEnd w:id="71"/>
+    <w:bookmarkStart w:id="72" w:name="ref-Hoang2021"/>
     <w:p>
       <w:pPr>
         <w:pStyle w:val="Bibliography"/>
@@ -3852,8 +4338,8 @@
         <w:t xml:space="preserve">5, 118–129</w:t>
       </w:r>
     </w:p>
-    <w:bookmarkEnd w:id="71"/>
-    <w:bookmarkStart w:id="72" w:name="ref-Corbin2016"/>
+    <w:bookmarkEnd w:id="72"/>
+    <w:bookmarkStart w:id="73" w:name="ref-Corbin2016"/>
     <w:p>
       <w:pPr>
         <w:pStyle w:val="Bibliography"/>
@@ -3903,8 +4389,8 @@
         <w:t xml:space="preserve">118, 10–20</w:t>
       </w:r>
     </w:p>
-    <w:bookmarkEnd w:id="72"/>
-    <w:bookmarkStart w:id="73" w:name="ref-Zhang2019"/>
+    <w:bookmarkEnd w:id="73"/>
+    <w:bookmarkStart w:id="74" w:name="ref-Zhang2019"/>
     <w:p>
       <w:pPr>
         <w:pStyle w:val="Bibliography"/>
@@ -3954,8 +4440,8 @@
         <w:t xml:space="preserve">116, 24712–24718</w:t>
       </w:r>
     </w:p>
-    <w:bookmarkEnd w:id="73"/>
-    <w:bookmarkStart w:id="74" w:name="ref-Dunbar2007"/>
+    <w:bookmarkEnd w:id="74"/>
+    <w:bookmarkStart w:id="75" w:name="ref-Dunbar2007"/>
     <w:p>
       <w:pPr>
         <w:pStyle w:val="Bibliography"/>
@@ -4005,8 +4491,8 @@
         <w:t xml:space="preserve">5, e96</w:t>
       </w:r>
     </w:p>
-    <w:bookmarkEnd w:id="74"/>
-    <w:bookmarkStart w:id="75" w:name="ref-Chouhan2023"/>
+    <w:bookmarkEnd w:id="75"/>
+    <w:bookmarkStart w:id="76" w:name="ref-Chouhan2023"/>
     <w:p>
       <w:pPr>
         <w:pStyle w:val="Bibliography"/>
@@ -4053,8 +4539,8 @@
         <w:t xml:space="preserve">, pp. 127–147, Springer Nature Singapore</w:t>
       </w:r>
     </w:p>
-    <w:bookmarkEnd w:id="75"/>
-    <w:bookmarkStart w:id="76" w:name="ref-Liu2025"/>
+    <w:bookmarkEnd w:id="76"/>
+    <w:bookmarkStart w:id="77" w:name="ref-Liu2025"/>
     <w:p>
       <w:pPr>
         <w:pStyle w:val="Bibliography"/>
@@ -4104,8 +4590,8 @@
         <w:t xml:space="preserve">23, 986–998</w:t>
       </w:r>
     </w:p>
-    <w:bookmarkEnd w:id="76"/>
-    <w:bookmarkStart w:id="77" w:name="ref-Marquez2007"/>
+    <w:bookmarkEnd w:id="77"/>
+    <w:bookmarkStart w:id="78" w:name="ref-Marquez2007"/>
     <w:p>
       <w:pPr>
         <w:pStyle w:val="Bibliography"/>
@@ -4155,8 +4641,8 @@
         <w:t xml:space="preserve">315, 513–515</w:t>
       </w:r>
     </w:p>
-    <w:bookmarkEnd w:id="77"/>
-    <w:bookmarkStart w:id="78" w:name="ref-Huang2019"/>
+    <w:bookmarkEnd w:id="78"/>
+    <w:bookmarkStart w:id="79" w:name="ref-Huang2019"/>
     <w:p>
       <w:pPr>
         <w:pStyle w:val="Bibliography"/>
@@ -4206,8 +4692,8 @@
         <w:t xml:space="preserve">364, eaau6389</w:t>
       </w:r>
     </w:p>
-    <w:bookmarkEnd w:id="78"/>
-    <w:bookmarkStart w:id="79" w:name="ref-Dastogeer2022"/>
+    <w:bookmarkEnd w:id="79"/>
+    <w:bookmarkStart w:id="80" w:name="ref-Dastogeer2022"/>
     <w:p>
       <w:pPr>
         <w:pStyle w:val="Bibliography"/>
@@ -4257,8 +4743,8 @@
         <w:t xml:space="preserve">13, 833566</w:t>
       </w:r>
     </w:p>
-    <w:bookmarkEnd w:id="79"/>
-    <w:bookmarkStart w:id="80" w:name="ref-Shekhawat2022"/>
+    <w:bookmarkEnd w:id="80"/>
+    <w:bookmarkStart w:id="81" w:name="ref-Shekhawat2022"/>
     <w:p>
       <w:pPr>
         <w:pStyle w:val="Bibliography"/>
@@ -4308,8 +4794,8 @@
         <w:t xml:space="preserve">27, 802–813</w:t>
       </w:r>
     </w:p>
-    <w:bookmarkEnd w:id="80"/>
-    <w:bookmarkStart w:id="81" w:name="ref-Lobell2012"/>
+    <w:bookmarkEnd w:id="81"/>
+    <w:bookmarkStart w:id="82" w:name="ref-Lobell2012"/>
     <w:p>
       <w:pPr>
         <w:pStyle w:val="Bibliography"/>
@@ -4359,8 +4845,8 @@
         <w:t xml:space="preserve">2, 186–189</w:t>
       </w:r>
     </w:p>
-    <w:bookmarkEnd w:id="81"/>
-    <w:bookmarkStart w:id="82" w:name="ref-Farooq2011"/>
+    <w:bookmarkEnd w:id="82"/>
+    <w:bookmarkStart w:id="83" w:name="ref-Farooq2011"/>
     <w:p>
       <w:pPr>
         <w:pStyle w:val="Bibliography"/>
@@ -4410,8 +4896,8 @@
         <w:t xml:space="preserve">30, 491–507</w:t>
       </w:r>
     </w:p>
-    <w:bookmarkEnd w:id="82"/>
-    <w:bookmarkStart w:id="83" w:name="ref-He2025"/>
+    <w:bookmarkEnd w:id="83"/>
+    <w:bookmarkStart w:id="84" w:name="ref-He2025"/>
     <w:p>
       <w:pPr>
         <w:pStyle w:val="Bibliography"/>
@@ -4455,8 +4941,8 @@
         <w:t xml:space="preserve">Journal of Experimental Botany (in press)</w:t>
       </w:r>
     </w:p>
-    <w:bookmarkEnd w:id="83"/>
-    <w:bookmarkStart w:id="84" w:name="ref-Zhang2021"/>
+    <w:bookmarkEnd w:id="84"/>
+    <w:bookmarkStart w:id="85" w:name="ref-Zhang2021"/>
     <w:p>
       <w:pPr>
         <w:pStyle w:val="Bibliography"/>
@@ -4506,8 +4992,8 @@
         <w:t xml:space="preserve">7, 864–876</w:t>
       </w:r>
     </w:p>
-    <w:bookmarkEnd w:id="84"/>
-    <w:bookmarkStart w:id="85" w:name="ref-Zhang2023a"/>
+    <w:bookmarkEnd w:id="85"/>
+    <w:bookmarkStart w:id="86" w:name="ref-Zhang2023a"/>
     <w:p>
       <w:pPr>
         <w:pStyle w:val="Bibliography"/>
@@ -4557,8 +5043,8 @@
         <w:t xml:space="preserve">56, 1013–1070</w:t>
       </w:r>
     </w:p>
-    <w:bookmarkEnd w:id="85"/>
-    <w:bookmarkStart w:id="86" w:name="ref-Nisbet2000"/>
+    <w:bookmarkEnd w:id="86"/>
+    <w:bookmarkStart w:id="87" w:name="ref-Nisbet2000"/>
     <w:p>
       <w:pPr>
         <w:pStyle w:val="Bibliography"/>
@@ -4608,8 +5094,8 @@
         <w:t xml:space="preserve">69, 913–926</w:t>
       </w:r>
     </w:p>
-    <w:bookmarkEnd w:id="86"/>
-    <w:bookmarkStart w:id="87" w:name="ref-Jager2020"/>
+    <w:bookmarkEnd w:id="87"/>
+    <w:bookmarkStart w:id="88" w:name="ref-Jager2020"/>
     <w:p>
       <w:pPr>
         <w:pStyle w:val="Bibliography"/>
@@ -4655,8 +5141,8 @@
         <w:t xml:space="preserve">416, 108904</w:t>
       </w:r>
     </w:p>
-    <w:bookmarkEnd w:id="87"/>
-    <w:bookmarkStart w:id="88" w:name="ref-Haberle2025"/>
+    <w:bookmarkEnd w:id="88"/>
+    <w:bookmarkStart w:id="89" w:name="ref-Haberle2025"/>
     <w:p>
       <w:pPr>
         <w:pStyle w:val="Bibliography"/>
@@ -4706,8 +5192,8 @@
         <w:t xml:space="preserve">958, 177664</w:t>
       </w:r>
     </w:p>
-    <w:bookmarkEnd w:id="88"/>
-    <w:bookmarkStart w:id="89" w:name="ref-Kearney2013"/>
+    <w:bookmarkEnd w:id="89"/>
+    <w:bookmarkStart w:id="90" w:name="ref-Kearney2013"/>
     <w:p>
       <w:pPr>
         <w:pStyle w:val="Bibliography"/>
@@ -4757,8 +5243,8 @@
         <w:t xml:space="preserve">27, 950–966</w:t>
       </w:r>
     </w:p>
-    <w:bookmarkEnd w:id="89"/>
-    <w:bookmarkStart w:id="90" w:name="ref-Kearney2010"/>
+    <w:bookmarkEnd w:id="90"/>
+    <w:bookmarkStart w:id="91" w:name="ref-Kearney2010"/>
     <w:p>
       <w:pPr>
         <w:pStyle w:val="Bibliography"/>
@@ -4808,8 +5294,8 @@
         <w:t xml:space="preserve">365, 3469–3483</w:t>
       </w:r>
     </w:p>
-    <w:bookmarkEnd w:id="90"/>
-    <w:bookmarkStart w:id="91" w:name="ref-Marques2018"/>
+    <w:bookmarkEnd w:id="91"/>
+    <w:bookmarkStart w:id="92" w:name="ref-Marques2018"/>
     <w:p>
       <w:pPr>
         <w:pStyle w:val="Bibliography"/>
@@ -4871,8 +5357,8 @@
         <w:t xml:space="preserve">14, e1006100</w:t>
       </w:r>
     </w:p>
-    <w:bookmarkEnd w:id="91"/>
-    <w:bookmarkStart w:id="92" w:name="ref-Kooijman2021"/>
+    <w:bookmarkEnd w:id="92"/>
+    <w:bookmarkStart w:id="93" w:name="ref-Kooijman2021"/>
     <w:p>
       <w:pPr>
         <w:pStyle w:val="Bibliography"/>
@@ -4922,8 +5408,8 @@
         <w:t xml:space="preserve">9, coab086</w:t>
       </w:r>
     </w:p>
-    <w:bookmarkEnd w:id="92"/>
-    <w:bookmarkStart w:id="93" w:name="ref-Bruggeman2009"/>
+    <w:bookmarkEnd w:id="93"/>
+    <w:bookmarkStart w:id="94" w:name="ref-Bruggeman2009"/>
     <w:p>
       <w:pPr>
         <w:pStyle w:val="Bibliography"/>
@@ -4982,8 +5468,8 @@
         <w:t xml:space="preserve">37, W179–W184</w:t>
       </w:r>
     </w:p>
-    <w:bookmarkEnd w:id="93"/>
-    <w:bookmarkStart w:id="94" w:name="ref-Kearney2017"/>
+    <w:bookmarkEnd w:id="94"/>
+    <w:bookmarkStart w:id="95" w:name="ref-Kearney2017"/>
     <w:p>
       <w:pPr>
         <w:pStyle w:val="Bibliography"/>
@@ -5041,8 +5527,8 @@
         <w:t xml:space="preserve">40, 664–674</w:t>
       </w:r>
     </w:p>
-    <w:bookmarkEnd w:id="94"/>
-    <w:bookmarkStart w:id="95" w:name="ref-Kearney2020a"/>
+    <w:bookmarkEnd w:id="95"/>
+    <w:bookmarkStart w:id="96" w:name="ref-Kearney2020a"/>
     <w:p>
       <w:pPr>
         <w:pStyle w:val="Bibliography"/>
@@ -5100,8 +5586,8 @@
         <w:t xml:space="preserve">43, 85–96</w:t>
       </w:r>
     </w:p>
-    <w:bookmarkEnd w:id="95"/>
-    <w:bookmarkStart w:id="96" w:name="ref-Ricker1954a"/>
+    <w:bookmarkEnd w:id="96"/>
+    <w:bookmarkStart w:id="97" w:name="ref-Ricker1954a"/>
     <w:p>
       <w:pPr>
         <w:pStyle w:val="Bibliography"/>
@@ -5135,8 +5621,8 @@
         <w:t xml:space="preserve">11, 559–623</w:t>
       </w:r>
     </w:p>
-    <w:bookmarkEnd w:id="96"/>
-    <w:bookmarkStart w:id="97" w:name="ref-Beverton2012"/>
+    <w:bookmarkEnd w:id="97"/>
+    <w:bookmarkStart w:id="98" w:name="ref-Beverton2012"/>
     <w:p>
       <w:pPr>
         <w:pStyle w:val="Bibliography"/>
@@ -5167,8 +5653,8 @@
         <w:t xml:space="preserve">, Springer</w:t>
       </w:r>
     </w:p>
-    <w:bookmarkEnd w:id="97"/>
-    <w:bookmarkStart w:id="98" w:name="ref-Bertness1994"/>
+    <w:bookmarkEnd w:id="98"/>
+    <w:bookmarkStart w:id="99" w:name="ref-Bertness1994"/>
     <w:p>
       <w:pPr>
         <w:pStyle w:val="Bibliography"/>
@@ -5202,8 +5688,8 @@
         <w:t xml:space="preserve">9, 191–193</w:t>
       </w:r>
     </w:p>
-    <w:bookmarkEnd w:id="98"/>
-    <w:bookmarkStart w:id="99" w:name="ref-Weiss-Lehman2022"/>
+    <w:bookmarkEnd w:id="99"/>
+    <w:bookmarkStart w:id="100" w:name="ref-Weiss-Lehman2022"/>
     <w:p>
       <w:pPr>
         <w:pStyle w:val="Bibliography"/>
@@ -5253,8 +5739,8 @@
         <w:t xml:space="preserve">25, 1263–1276</w:t>
       </w:r>
     </w:p>
-    <w:bookmarkEnd w:id="99"/>
-    <w:bookmarkStart w:id="100" w:name="ref-Delmas2019"/>
+    <w:bookmarkEnd w:id="100"/>
+    <w:bookmarkStart w:id="101" w:name="ref-Delmas2019"/>
     <w:p>
       <w:pPr>
         <w:pStyle w:val="Bibliography"/>
@@ -5304,8 +5790,8 @@
         <w:t xml:space="preserve">94, 16–36</w:t>
       </w:r>
     </w:p>
-    <w:bookmarkEnd w:id="100"/>
-    <w:bookmarkStart w:id="101" w:name="ref-Godoy2019"/>
+    <w:bookmarkEnd w:id="101"/>
+    <w:bookmarkStart w:id="102" w:name="ref-Godoy2019"/>
     <w:p>
       <w:pPr>
         <w:pStyle w:val="Bibliography"/>
@@ -5339,8 +5825,8 @@
         <w:t xml:space="preserve">33, 1190–1201</w:t>
       </w:r>
     </w:p>
-    <w:bookmarkEnd w:id="101"/>
-    <w:bookmarkStart w:id="102" w:name="ref-Poisot2021"/>
+    <w:bookmarkEnd w:id="102"/>
+    <w:bookmarkStart w:id="103" w:name="ref-Poisot2021"/>
     <w:p>
       <w:pPr>
         <w:pStyle w:val="Bibliography"/>
@@ -5390,8 +5876,8 @@
         <w:t xml:space="preserve">48, 1552–1563</w:t>
       </w:r>
     </w:p>
-    <w:bookmarkEnd w:id="102"/>
-    <w:bookmarkStart w:id="103" w:name="ref-Hui2019"/>
+    <w:bookmarkEnd w:id="103"/>
+    <w:bookmarkStart w:id="104" w:name="ref-Hui2019"/>
     <w:p>
       <w:pPr>
         <w:pStyle w:val="Bibliography"/>
@@ -5425,8 +5911,8 @@
         <w:t xml:space="preserve">34, 121–131</w:t>
       </w:r>
     </w:p>
-    <w:bookmarkEnd w:id="103"/>
-    <w:bookmarkStart w:id="104" w:name="ref-Gomez2023"/>
+    <w:bookmarkEnd w:id="104"/>
+    <w:bookmarkStart w:id="105" w:name="ref-Gomez2023"/>
     <w:p>
       <w:pPr>
         <w:pStyle w:val="Bibliography"/>
@@ -5476,8 +5962,8 @@
         <w:t xml:space="preserve">26, S47–S61</w:t>
       </w:r>
     </w:p>
-    <w:bookmarkEnd w:id="104"/>
-    <w:bookmarkStart w:id="105" w:name="ref-Lytle2023"/>
+    <w:bookmarkEnd w:id="105"/>
+    <w:bookmarkStart w:id="106" w:name="ref-Lytle2023"/>
     <w:p>
       <w:pPr>
         <w:pStyle w:val="Bibliography"/>
@@ -5511,8 +5997,8 @@
         <w:t xml:space="preserve">2, 26</w:t>
       </w:r>
     </w:p>
-    <w:bookmarkEnd w:id="105"/>
-    <w:bookmarkStart w:id="106" w:name="ref-Petsopoulos2021"/>
+    <w:bookmarkEnd w:id="106"/>
+    <w:bookmarkStart w:id="107" w:name="ref-Petsopoulos2021"/>
     <w:p>
       <w:pPr>
         <w:pStyle w:val="Bibliography"/>
@@ -5556,8 +6042,8 @@
         <w:t xml:space="preserve">Ecol. Entomol.</w:t>
       </w:r>
     </w:p>
-    <w:bookmarkEnd w:id="106"/>
-    <w:bookmarkStart w:id="107" w:name="ref-Dale2021"/>
+    <w:bookmarkEnd w:id="107"/>
+    <w:bookmarkStart w:id="108" w:name="ref-Dale2021"/>
     <w:p>
       <w:pPr>
         <w:pStyle w:val="Bibliography"/>
@@ -5588,8 +6074,8 @@
         <w:t xml:space="preserve">, Cambridge University Press</w:t>
       </w:r>
     </w:p>
-    <w:bookmarkEnd w:id="107"/>
-    <w:bookmarkStart w:id="108" w:name="ref-Lu2023"/>
+    <w:bookmarkEnd w:id="108"/>
+    <w:bookmarkStart w:id="109" w:name="ref-Lu2023"/>
     <w:p>
       <w:pPr>
         <w:pStyle w:val="Bibliography"/>
@@ -5639,8 +6125,8 @@
         <w:t xml:space="preserve">33, 647–659</w:t>
       </w:r>
     </w:p>
-    <w:bookmarkEnd w:id="108"/>
-    <w:bookmarkStart w:id="109" w:name="ref-Carrara2015"/>
+    <w:bookmarkEnd w:id="109"/>
+    <w:bookmarkStart w:id="110" w:name="ref-Carrara2015"/>
     <w:p>
       <w:pPr>
         <w:pStyle w:val="Bibliography"/>
@@ -5690,8 +6176,8 @@
         <w:t xml:space="preserve">6, 895–906</w:t>
       </w:r>
     </w:p>
-    <w:bookmarkEnd w:id="109"/>
-    <w:bookmarkStart w:id="110" w:name="ref-Vitali2022"/>
+    <w:bookmarkEnd w:id="110"/>
+    <w:bookmarkStart w:id="111" w:name="ref-Vitali2022"/>
     <w:p>
       <w:pPr>
         <w:pStyle w:val="Bibliography"/>
@@ -5741,8 +6227,8 @@
         <w:t xml:space="preserve">103, e03547</w:t>
       </w:r>
     </w:p>
-    <w:bookmarkEnd w:id="110"/>
-    <w:bookmarkStart w:id="111" w:name="ref-Riva2023"/>
+    <w:bookmarkEnd w:id="111"/>
+    <w:bookmarkStart w:id="112" w:name="ref-Riva2023"/>
     <w:p>
       <w:pPr>
         <w:pStyle w:val="Bibliography"/>
@@ -5792,8 +6278,8 @@
         <w:t xml:space="preserve">9, eabq4207</w:t>
       </w:r>
     </w:p>
-    <w:bookmarkEnd w:id="111"/>
-    <w:bookmarkStart w:id="112" w:name="ref-Terry2020"/>
+    <w:bookmarkEnd w:id="112"/>
+    <w:bookmarkStart w:id="113" w:name="ref-Terry2020"/>
     <w:p>
       <w:pPr>
         <w:pStyle w:val="Bibliography"/>
@@ -5827,8 +6313,8 @@
         <w:t xml:space="preserve">101, e03047</w:t>
       </w:r>
     </w:p>
-    <w:bookmarkEnd w:id="112"/>
-    <w:bookmarkStart w:id="113" w:name="ref-Zou2024"/>
+    <w:bookmarkEnd w:id="113"/>
+    <w:bookmarkStart w:id="114" w:name="ref-Zou2024"/>
     <w:p>
       <w:pPr>
         <w:pStyle w:val="Bibliography"/>
@@ -5878,8 +6364,8 @@
         <w:t xml:space="preserve">27, e14432</w:t>
       </w:r>
     </w:p>
-    <w:bookmarkEnd w:id="113"/>
-    <w:bookmarkStart w:id="114" w:name="ref-Li2023"/>
+    <w:bookmarkEnd w:id="114"/>
+    <w:bookmarkStart w:id="115" w:name="ref-Li2023"/>
     <w:p>
       <w:pPr>
         <w:pStyle w:val="Bibliography"/>
@@ -5929,8 +6415,8 @@
         <w:t xml:space="preserve">114, 103583</w:t>
       </w:r>
     </w:p>
-    <w:bookmarkEnd w:id="114"/>
-    <w:bookmarkStart w:id="115" w:name="ref-Zhu2024"/>
+    <w:bookmarkEnd w:id="115"/>
+    <w:bookmarkStart w:id="116" w:name="ref-Zhu2024"/>
     <w:p>
       <w:pPr>
         <w:pStyle w:val="Bibliography"/>
@@ -5980,8 +6466,8 @@
         <w:t xml:space="preserve">39, 165–180</w:t>
       </w:r>
     </w:p>
-    <w:bookmarkEnd w:id="115"/>
-    <w:bookmarkStart w:id="116" w:name="ref-Assessment_undated-fv"/>
+    <w:bookmarkEnd w:id="116"/>
+    <w:bookmarkStart w:id="117" w:name="ref-Assessment_undated-fv"/>
     <w:p>
       <w:pPr>
         <w:pStyle w:val="Bibliography"/>
@@ -5999,8 +6485,8 @@
         <w:t xml:space="preserve">Assessment, M.E. (2005) Opportunities and challenges for business and industryunioviedo.es</w:t>
       </w:r>
     </w:p>
-    <w:bookmarkEnd w:id="116"/>
-    <w:bookmarkStart w:id="117" w:name="ref-Dandy2019"/>
+    <w:bookmarkEnd w:id="117"/>
+    <w:bookmarkStart w:id="118" w:name="ref-Dandy2019"/>
     <w:p>
       <w:pPr>
         <w:pStyle w:val="Bibliography"/>
@@ -6050,8 +6536,8 @@
         <w:t xml:space="preserve">19, 615–620</w:t>
       </w:r>
     </w:p>
-    <w:bookmarkEnd w:id="117"/>
-    <w:bookmarkStart w:id="118" w:name="ref-Price2014"/>
+    <w:bookmarkEnd w:id="118"/>
+    <w:bookmarkStart w:id="119" w:name="ref-Price2014"/>
     <w:p>
       <w:pPr>
         <w:pStyle w:val="Bibliography"/>
@@ -6085,8 +6571,8 @@
         <w:t xml:space="preserve">34, 65–78</w:t>
       </w:r>
     </w:p>
-    <w:bookmarkEnd w:id="118"/>
-    <w:bookmarkStart w:id="119" w:name="ref-Leviston2018"/>
+    <w:bookmarkEnd w:id="119"/>
+    <w:bookmarkStart w:id="120" w:name="ref-Leviston2018"/>
     <w:p>
       <w:pPr>
         <w:pStyle w:val="Bibliography"/>
@@ -6136,8 +6622,8 @@
         <w:t xml:space="preserve">93, 658–668</w:t>
       </w:r>
     </w:p>
-    <w:bookmarkEnd w:id="119"/>
-    <w:bookmarkStart w:id="120" w:name="ref-Bai2016"/>
+    <w:bookmarkEnd w:id="120"/>
+    <w:bookmarkStart w:id="121" w:name="ref-Bai2016"/>
     <w:p>
       <w:pPr>
         <w:pStyle w:val="Bibliography"/>
@@ -6187,8 +6673,8 @@
         <w:t xml:space="preserve">23, 69–78</w:t>
       </w:r>
     </w:p>
-    <w:bookmarkEnd w:id="120"/>
-    <w:bookmarkStart w:id="121" w:name="ref-Grimm2008"/>
+    <w:bookmarkEnd w:id="121"/>
+    <w:bookmarkStart w:id="122" w:name="ref-Grimm2008"/>
     <w:p>
       <w:pPr>
         <w:pStyle w:val="Bibliography"/>
@@ -6238,8 +6724,8 @@
         <w:t xml:space="preserve">319, 756–760</w:t>
       </w:r>
     </w:p>
-    <w:bookmarkEnd w:id="121"/>
-    <w:bookmarkStart w:id="122" w:name="ref-Hendricks2022"/>
+    <w:bookmarkEnd w:id="122"/>
+    <w:bookmarkStart w:id="123" w:name="ref-Hendricks2022"/>
     <w:p>
       <w:pPr>
         <w:pStyle w:val="Bibliography"/>
@@ -6289,8 +6775,8 @@
         <w:t xml:space="preserve">105, 5893–5908</w:t>
       </w:r>
     </w:p>
-    <w:bookmarkEnd w:id="122"/>
-    <w:bookmarkStart w:id="123" w:name="ref-Sutanto2020"/>
+    <w:bookmarkEnd w:id="123"/>
+    <w:bookmarkStart w:id="124" w:name="ref-Sutanto2020"/>
     <w:p>
       <w:pPr>
         <w:pStyle w:val="Bibliography"/>
@@ -6340,8 +6826,8 @@
         <w:t xml:space="preserve">134, 105276</w:t>
       </w:r>
     </w:p>
-    <w:bookmarkEnd w:id="123"/>
-    <w:bookmarkStart w:id="124" w:name="ref-Liu2007"/>
+    <w:bookmarkEnd w:id="124"/>
+    <w:bookmarkStart w:id="125" w:name="ref-Liu2007"/>
     <w:p>
       <w:pPr>
         <w:pStyle w:val="Bibliography"/>
@@ -6391,8 +6877,8 @@
         <w:t xml:space="preserve">36, 639–649</w:t>
       </w:r>
     </w:p>
-    <w:bookmarkEnd w:id="124"/>
-    <w:bookmarkStart w:id="125" w:name="ref-Black2011"/>
+    <w:bookmarkEnd w:id="125"/>
+    <w:bookmarkStart w:id="126" w:name="ref-Black2011"/>
     <w:p>
       <w:pPr>
         <w:pStyle w:val="Bibliography"/>
@@ -6442,8 +6928,8 @@
         <w:t xml:space="preserve">21, S3–S11</w:t>
       </w:r>
     </w:p>
-    <w:bookmarkEnd w:id="125"/>
-    <w:bookmarkStart w:id="126" w:name="ref-Neil_Adger1999"/>
+    <w:bookmarkEnd w:id="126"/>
+    <w:bookmarkStart w:id="127" w:name="ref-Neil_Adger1999"/>
     <w:p>
       <w:pPr>
         <w:pStyle w:val="Bibliography"/>
@@ -6477,8 +6963,8 @@
         <w:t xml:space="preserve">27, 249–269</w:t>
       </w:r>
     </w:p>
-    <w:bookmarkEnd w:id="126"/>
-    <w:bookmarkStart w:id="127" w:name="ref-Folke2016"/>
+    <w:bookmarkEnd w:id="127"/>
+    <w:bookmarkStart w:id="128" w:name="ref-Folke2016"/>
     <w:p>
       <w:pPr>
         <w:pStyle w:val="Bibliography"/>
@@ -6528,8 +7014,8 @@
         <w:t xml:space="preserve">21</w:t>
       </w:r>
     </w:p>
-    <w:bookmarkEnd w:id="127"/>
-    <w:bookmarkStart w:id="128" w:name="ref-Schluter2012"/>
+    <w:bookmarkEnd w:id="128"/>
+    <w:bookmarkStart w:id="129" w:name="ref-Schluter2012"/>
     <w:p>
       <w:pPr>
         <w:pStyle w:val="Bibliography"/>
@@ -6579,8 +7065,8 @@
         <w:t xml:space="preserve">25, 219–272</w:t>
       </w:r>
     </w:p>
-    <w:bookmarkEnd w:id="128"/>
-    <w:bookmarkStart w:id="129" w:name="ref-Wise2014"/>
+    <w:bookmarkEnd w:id="129"/>
+    <w:bookmarkStart w:id="130" w:name="ref-Wise2014"/>
     <w:p>
       <w:pPr>
         <w:pStyle w:val="Bibliography"/>
@@ -6630,8 +7116,8 @@
         <w:t xml:space="preserve">28, 325–336</w:t>
       </w:r>
     </w:p>
-    <w:bookmarkEnd w:id="129"/>
-    <w:bookmarkStart w:id="130" w:name="ref-Kearney2009a"/>
+    <w:bookmarkEnd w:id="130"/>
+    <w:bookmarkStart w:id="131" w:name="ref-Kearney2009a"/>
     <w:p>
       <w:pPr>
         <w:pStyle w:val="Bibliography"/>
@@ -6681,9 +7167,9 @@
         <w:t xml:space="preserve">23, 528–538</w:t>
       </w:r>
     </w:p>
-    <w:bookmarkEnd w:id="130"/>
     <w:bookmarkEnd w:id="131"/>
     <w:bookmarkEnd w:id="132"/>
+    <w:bookmarkEnd w:id="133"/>
     <w:sectPr>
       <w:pgSz w:h="15840" w:w="12240"/>
       <w:pgMar w:bottom="851" w:footer="720" w:gutter="0" w:header="720" w:left="851" w:right="851" w:top="851"/>

</xml_diff>

<commit_message>
Remove exstension and update refs in SES
</commit_message>
<xml_diff>
--- a/docs/ms.docx
+++ b/docs/ms.docx
@@ -598,7 +598,7 @@
           <w:b/>
           <w:bCs/>
         </w:rPr>
-        <w:t xml:space="preserve">?@fig-fig1</w:t>
+        <w:t xml:space="preserve">?@fig-sys</w:t>
       </w:r>
       <w:r>
         <w:t xml:space="preserve"> </w:t>
@@ -626,7 +626,7 @@
           <w:b/>
           <w:bCs/>
         </w:rPr>
-        <w:t xml:space="preserve">?@fig-fig1</w:t>
+        <w:t xml:space="preserve">?@fig-sys</w:t>
       </w:r>
       <w:r>
         <w:t xml:space="preserve"> </w:t>
@@ -2908,17 +2908,7 @@
               <w:t xml:space="preserve"> </w:t>
             </w:r>
             <w:r>
-              <w:t xml:space="preserve">[</w:t>
-            </w:r>
-            <w:r>
-              <w:rPr>
-                <w:b/>
-                <w:bCs/>
-              </w:rPr>
-              <w:t xml:space="preserve">delgado2022routledge?</w:t>
-            </w:r>
-            <w:r>
-              <w:t xml:space="preserve">]</w:t>
+              <w:t xml:space="preserve">[98]</w:t>
             </w:r>
             <w:r>
               <w:t xml:space="preserve">. Process-based approaches are critical to understanding how emergent social-ecological phenomena develop</w:t>
@@ -2927,17 +2917,7 @@
               <w:t xml:space="preserve"> </w:t>
             </w:r>
             <w:r>
-              <w:t xml:space="preserve">[</w:t>
-            </w:r>
-            <w:r>
-              <w:rPr>
-                <w:b/>
-                <w:bCs/>
-              </w:rPr>
-              <w:t xml:space="preserve">brown2021can?</w:t>
-            </w:r>
-            <w:r>
-              <w:t xml:space="preserve">]</w:t>
+              <w:t xml:space="preserve">[99]</w:t>
             </w:r>
             <w:r>
               <w:t xml:space="preserve">, such as tipping points, traps or other dynamics. Constructing process-based dynamical models requires knowledge and data about: the biophysical processes, which could be provided by the models from the previous sections; social processes, which could be developed from a combination of behavioural theory and empirical data; and interactions between them in the system of interest. Since obtaining all these data can be challenging, social-ecological modelling is often performed in an exploratory mode</w:t>
@@ -2946,17 +2926,7 @@
               <w:t xml:space="preserve"> </w:t>
             </w:r>
             <w:r>
-              <w:t xml:space="preserve">[</w:t>
-            </w:r>
-            <w:r>
-              <w:rPr>
-                <w:b/>
-                <w:bCs/>
-              </w:rPr>
-              <w:t xml:space="preserve">kwakkel2013exploratory?</w:t>
-            </w:r>
-            <w:r>
-              <w:t xml:space="preserve">]</w:t>
+              <w:t xml:space="preserve">[100]</w:t>
             </w:r>
             <w:r>
               <w:t xml:space="preserve"> </w:t>
@@ -3232,7 +3202,7 @@
         <w:t xml:space="preserve"> </w:t>
       </w:r>
       <w:r>
-        <w:t xml:space="preserve">[98]</w:t>
+        <w:t xml:space="preserve">[101]</w:t>
       </w:r>
       <w:r>
         <w:t xml:space="preserve"> </w:t>
@@ -3288,7 +3258,7 @@
       </w:r>
     </w:p>
     <w:bookmarkEnd w:id="42"/>
-    <w:bookmarkStart w:id="142" w:name="references"/>
+    <w:bookmarkStart w:id="145" w:name="references"/>
     <w:p>
       <w:pPr>
         <w:pStyle w:val="Heading1"/>
@@ -3297,7 +3267,7 @@
         <w:t xml:space="preserve">References</w:t>
       </w:r>
     </w:p>
-    <w:bookmarkStart w:id="141" w:name="refs"/>
+    <w:bookmarkStart w:id="144" w:name="refs"/>
     <w:bookmarkStart w:id="43" w:name="ref-Barriopedro2023"/>
     <w:p>
       <w:pPr>
@@ -7858,7 +7828,7 @@
       </w:r>
     </w:p>
     <w:bookmarkEnd w:id="139"/>
-    <w:bookmarkStart w:id="140" w:name="ref-Kearney2009a"/>
+    <w:bookmarkStart w:id="140" w:name="ref-Biggs2021"/>
     <w:p>
       <w:pPr>
         <w:pStyle w:val="Bibliography"/>
@@ -7873,6 +7843,124 @@
         <w:t xml:space="preserve">	</w:t>
       </w:r>
       <w:r>
+        <w:t xml:space="preserve">Biggs, R.</w:t>
+      </w:r>
+      <w:r>
+        <w:t xml:space="preserve"> </w:t>
+      </w:r>
+      <w:r>
+        <w:rPr>
+          <w:i/>
+          <w:iCs/>
+        </w:rPr>
+        <w:t xml:space="preserve">et al.</w:t>
+      </w:r>
+      <w:r>
+        <w:t xml:space="preserve"> </w:t>
+      </w:r>
+      <w:r>
+        <w:t xml:space="preserve">(2021)</w:t>
+      </w:r>
+      <w:r>
+        <w:t xml:space="preserve"> </w:t>
+      </w:r>
+      <w:r>
+        <w:rPr>
+          <w:i/>
+          <w:iCs/>
+        </w:rPr>
+        <w:t xml:space="preserve">The routledge handbook of research methods for social-ecological systems</w:t>
+      </w:r>
+      <w:r>
+        <w:t xml:space="preserve">, Taylor &amp; Francis</w:t>
+      </w:r>
+    </w:p>
+    <w:bookmarkEnd w:id="140"/>
+    <w:bookmarkStart w:id="141" w:name="ref-Brown2021"/>
+    <w:p>
+      <w:pPr>
+        <w:pStyle w:val="Bibliography"/>
+      </w:pPr>
+      <w:r>
+        <w:t xml:space="preserve">99.</w:t>
+      </w:r>
+      <w:r>
+        <w:t xml:space="preserve"> </w:t>
+      </w:r>
+      <w:r>
+        <w:t xml:space="preserve">	</w:t>
+      </w:r>
+      <w:r>
+        <w:t xml:space="preserve">Brown, C. and Rounsevell, M. (2021) How can social–ecological system models simulate the emergence of social–ecological crises?</w:t>
+      </w:r>
+      <w:r>
+        <w:t xml:space="preserve"> </w:t>
+      </w:r>
+      <w:r>
+        <w:rPr>
+          <w:i/>
+          <w:iCs/>
+        </w:rPr>
+        <w:t xml:space="preserve">People Nat. (Hoboken)</w:t>
+      </w:r>
+      <w:r>
+        <w:t xml:space="preserve"> </w:t>
+      </w:r>
+      <w:r>
+        <w:t xml:space="preserve">3, 88–103</w:t>
+      </w:r>
+    </w:p>
+    <w:bookmarkEnd w:id="141"/>
+    <w:bookmarkStart w:id="142" w:name="ref-Kwakkel2013"/>
+    <w:p>
+      <w:pPr>
+        <w:pStyle w:val="Bibliography"/>
+      </w:pPr>
+      <w:r>
+        <w:t xml:space="preserve">100.</w:t>
+      </w:r>
+      <w:r>
+        <w:t xml:space="preserve"> </w:t>
+      </w:r>
+      <w:r>
+        <w:t xml:space="preserve">	</w:t>
+      </w:r>
+      <w:r>
+        <w:t xml:space="preserve">Kwakkel, J.H. and Pruyt, E. (2013) Exploratory modeling and analysis, an approach for model-based foresight under deep uncertainty.</w:t>
+      </w:r>
+      <w:r>
+        <w:t xml:space="preserve"> </w:t>
+      </w:r>
+      <w:r>
+        <w:rPr>
+          <w:i/>
+          <w:iCs/>
+        </w:rPr>
+        <w:t xml:space="preserve">Technol. Forecast. Soc. Change</w:t>
+      </w:r>
+      <w:r>
+        <w:t xml:space="preserve"> </w:t>
+      </w:r>
+      <w:r>
+        <w:t xml:space="preserve">80, 419–431</w:t>
+      </w:r>
+    </w:p>
+    <w:bookmarkEnd w:id="142"/>
+    <w:bookmarkStart w:id="143" w:name="ref-Kearney2009a"/>
+    <w:p>
+      <w:pPr>
+        <w:pStyle w:val="Bibliography"/>
+      </w:pPr>
+      <w:r>
+        <w:t xml:space="preserve">101.</w:t>
+      </w:r>
+      <w:r>
+        <w:t xml:space="preserve"> </w:t>
+      </w:r>
+      <w:r>
+        <w:t xml:space="preserve">	</w:t>
+      </w:r>
+      <w:r>
         <w:t xml:space="preserve">Kearney, M.</w:t>
       </w:r>
       <w:r>
@@ -7908,9 +7996,9 @@
         <w:t xml:space="preserve">23, 528–538</w:t>
       </w:r>
     </w:p>
-    <w:bookmarkEnd w:id="140"/>
-    <w:bookmarkEnd w:id="141"/>
-    <w:bookmarkEnd w:id="142"/>
+    <w:bookmarkEnd w:id="143"/>
+    <w:bookmarkEnd w:id="144"/>
+    <w:bookmarkEnd w:id="145"/>
     <w:sectPr>
       <w:pgSz w:h="15840" w:w="12240"/>
       <w:pgMar w:bottom="851" w:footer="720" w:gutter="0" w:header="720" w:left="851" w:right="851" w:top="851"/>

</xml_diff>

<commit_message>
getting some more details in on examples for acclimation and evolution
</commit_message>
<xml_diff>
--- a/docs/ms.docx
+++ b/docs/ms.docx
@@ -2184,7 +2184,16 @@
         <w:t xml:space="preserve">[80]</w:t>
       </w:r>
       <w:r>
-        <w:t xml:space="preserve">. Plasticity can be captured by mapping trait development to the environment. In contrast, evolutionary change that considers genetic correlation between traits (i.e., constraints) can be predcited using the multivariate breeders equation:</w:t>
+        <w:t xml:space="preserve">. Plasticity can be captured by mapping trait development to the environment. In contrast, evolutionary change that considers genetic correlation between traits (i.e., constraints) can be predcited using the multivariate breeders equation</w:t>
+      </w:r>
+      <w:r>
+        <w:t xml:space="preserve"> </w:t>
+      </w:r>
+      <w:r>
+        <w:t xml:space="preserve">[81]</w:t>
+      </w:r>
+      <w:r>
+        <w:t xml:space="preserve">:</w:t>
       </w:r>
     </w:p>
     <w:p>
@@ -2207,7 +2216,6 @@
             <m:e>
               <m:r>
                 <m:rPr>
-                  <m:nor/>
                   <m:sty m:val="b"/>
                 </m:rPr>
                 <m:t>z</m:t>
@@ -2222,7 +2230,6 @@
           </m:r>
           <m:r>
             <m:rPr>
-              <m:nor/>
               <m:sty m:val="b"/>
             </m:rPr>
             <m:t>G</m:t>
@@ -2234,6 +2241,9 @@
             <m:t>⋅</m:t>
           </m:r>
           <m:r>
+            <m:rPr>
+              <m:sty m:val="b"/>
+            </m:rPr>
             <m:t>β</m:t>
           </m:r>
           <m:r>
@@ -2277,7 +2287,6 @@
           <m:e>
             <m:r>
               <m:rPr>
-                <m:nor/>
                 <m:sty m:val="b"/>
               </m:rPr>
               <m:t>z</m:t>
@@ -2297,7 +2306,6 @@
       <m:oMath>
         <m:r>
           <m:rPr>
-            <m:nor/>
             <m:sty m:val="b"/>
           </m:rPr>
           <m:t>G</m:t>
@@ -2314,6 +2322,9 @@
       </w:r>
       <m:oMath>
         <m:r>
+          <m:rPr>
+            <m:sty m:val="b"/>
+          </m:rPr>
           <m:t>β</m:t>
         </m:r>
       </m:oMath>
@@ -2321,7 +2332,99 @@
         <w:t xml:space="preserve"> </w:t>
       </w:r>
       <w:r>
-        <w:t xml:space="preserve">is the vector of standardised selection gradients.</w:t>
+        <w:t xml:space="preserve">is the vector of standardised selection gradients that regress each trait on relative fitness (i.e.,</w:t>
+      </w:r>
+      <w:r>
+        <w:t xml:space="preserve"> </w:t>
+      </w:r>
+      <m:oMath>
+        <m:r>
+          <m:rPr>
+            <m:sty m:val="b"/>
+          </m:rPr>
+          <m:t>ω</m:t>
+        </m:r>
+        <m:r>
+          <m:rPr>
+            <m:sty m:val="p"/>
+          </m:rPr>
+          <m:t>=</m:t>
+        </m:r>
+        <m:r>
+          <m:rPr>
+            <m:sty m:val="b"/>
+          </m:rPr>
+          <m:t>α</m:t>
+        </m:r>
+        <m:r>
+          <m:rPr>
+            <m:sty m:val="p"/>
+          </m:rPr>
+          <m:t>+</m:t>
+        </m:r>
+        <m:sSup>
+          <m:e>
+            <m:r>
+              <m:rPr>
+                <m:sty m:val="b"/>
+              </m:rPr>
+              <m:t>β</m:t>
+            </m:r>
+          </m:e>
+          <m:sup>
+            <m:r>
+              <m:rPr>
+                <m:sty m:val="b"/>
+              </m:rPr>
+              <m:t>T</m:t>
+            </m:r>
+          </m:sup>
+        </m:sSup>
+        <m:r>
+          <m:rPr>
+            <m:sty m:val="p"/>
+          </m:rPr>
+          <m:t>⋅</m:t>
+        </m:r>
+        <m:r>
+          <m:rPr>
+            <m:sty m:val="b"/>
+          </m:rPr>
+          <m:t>z</m:t>
+        </m:r>
+        <m:r>
+          <m:rPr>
+            <m:sty m:val="p"/>
+          </m:rPr>
+          <m:t>+</m:t>
+        </m:r>
+        <m:r>
+          <m:rPr>
+            <m:sty m:val="b"/>
+          </m:rPr>
+          <m:t>e</m:t>
+        </m:r>
+      </m:oMath>
+      <w:r>
+        <w:t xml:space="preserve">;</w:t>
+      </w:r>
+      <w:r>
+        <w:t xml:space="preserve"> </w:t>
+      </w:r>
+      <w:r>
+        <w:t xml:space="preserve">[82]</w:t>
+      </w:r>
+      <w:r>
+        <w:t xml:space="preserve">). While the multivariate breeders equation can be applied, and is versatile, it will likely only be useful for predicting short term evolutonary responses</w:t>
+      </w:r>
+      <w:r>
+        <w:t xml:space="preserve"> </w:t>
+      </w:r>
+      <w:r>
+        <w:t xml:space="preserve">[82]</w:t>
+      </w:r>
+      <w:r>
+        <w:t xml:space="preserve">.</w:t>
       </w:r>
     </w:p>
     <w:bookmarkEnd w:id="33"/>
@@ -2540,7 +2643,7 @@
         <w:t xml:space="preserve"> </w:t>
       </w:r>
       <w:r>
-        <w:t xml:space="preserve">[81]</w:t>
+        <w:t xml:space="preserve">[83]</w:t>
       </w:r>
       <w:r>
         <w:t xml:space="preserve">. The paper provides a framework for modelling soil plant interactions</w:t>
@@ -2597,7 +2700,7 @@
         <w:t xml:space="preserve"> </w:t>
       </w:r>
       <w:r>
-        <w:t xml:space="preserve">[82]</w:t>
+        <w:t xml:space="preserve">[84]</w:t>
       </w:r>
       <w:r>
         <w:t xml:space="preserve"> </w:t>
@@ -2640,7 +2743,7 @@
         <w:t xml:space="preserve"> </w:t>
       </w:r>
       <w:r>
-        <w:t xml:space="preserve">[82]</w:t>
+        <w:t xml:space="preserve">[84]</w:t>
       </w:r>
       <w:r>
         <w:t xml:space="preserve"> </w:t>
@@ -2670,7 +2773,7 @@
         <w:t xml:space="preserve"> </w:t>
       </w:r>
       <w:r>
-        <w:t xml:space="preserve">[83]</w:t>
+        <w:t xml:space="preserve">[85]</w:t>
       </w:r>
       <w:r>
         <w:t xml:space="preserve">. Connects heat tolerance to population matrix models. And, shows acclimation responses (heat hardening).</w:t>
@@ -2738,7 +2841,7 @@
               <w:t xml:space="preserve"> </w:t>
             </w:r>
             <w:r>
-              <w:t xml:space="preserve">[84]</w:t>
+              <w:t xml:space="preserve">[86]</w:t>
             </w:r>
             <w:r>
               <w:t xml:space="preserve">. For example, loss of output from production ecosystems will have substantial economic consequences for the local area. Degradation of natural ecosystems may affect their regulating services, such as flood mitigation, affecting nearby areas. Impacts on cultural services may be severe for communities that are closely connected to a landscape.</w:t>
@@ -2755,7 +2858,7 @@
               <w:t xml:space="preserve"> </w:t>
             </w:r>
             <w:r>
-              <w:t xml:space="preserve">[85]</w:t>
+              <w:t xml:space="preserve">[87]</w:t>
             </w:r>
             <w:r>
               <w:t xml:space="preserve">. Thermal stressors may even influence producers’ psychological beliefs about their level of control over land management, and perceived resources available for management practices</w:t>
@@ -2764,7 +2867,7 @@
               <w:t xml:space="preserve"> </w:t>
             </w:r>
             <w:r>
-              <w:t xml:space="preserve">[86]</w:t>
+              <w:t xml:space="preserve">[88]</w:t>
             </w:r>
             <w:r>
               <w:t xml:space="preserve">. Thermal risks to ecosystems may also precipitate declines in individual wellbeing, and these consequences may accrue differently across regions and across peoples</w:t>
@@ -2773,7 +2876,7 @@
               <w:t xml:space="preserve"> </w:t>
             </w:r>
             <w:r>
-              <w:t xml:space="preserve">[87]</w:t>
+              <w:t xml:space="preserve">[89]</w:t>
             </w:r>
             <w:r>
               <w:t xml:space="preserve">, and compound or accelerate the prior responses. Many of these impacts and responses, however, are poorly understood.</w:t>
@@ -2790,7 +2893,7 @@
               <w:t xml:space="preserve"> </w:t>
             </w:r>
             <w:r>
-              <w:t xml:space="preserve">[88,89]</w:t>
+              <w:t xml:space="preserve">[90,91]</w:t>
             </w:r>
             <w:r>
               <w:t xml:space="preserve">. On the other hand, adapting thermal risks in upper stream producers may also be influenced by the perception and behaviour of downstream consumers</w:t>
@@ -2799,7 +2902,7 @@
               <w:t xml:space="preserve"> </w:t>
             </w:r>
             <w:r>
-              <w:t xml:space="preserve">[90]</w:t>
+              <w:t xml:space="preserve">[92]</w:t>
             </w:r>
             <w:r>
               <w:t xml:space="preserve">. The cascading</w:t>
@@ -2808,7 +2911,7 @@
               <w:t xml:space="preserve"> </w:t>
             </w:r>
             <w:r>
-              <w:t xml:space="preserve">[91]</w:t>
+              <w:t xml:space="preserve">[93]</w:t>
             </w:r>
             <w:r>
               <w:t xml:space="preserve"> </w:t>
@@ -2820,7 +2923,7 @@
               <w:t xml:space="preserve"> </w:t>
             </w:r>
             <w:r>
-              <w:t xml:space="preserve">[92]</w:t>
+              <w:t xml:space="preserve">[94]</w:t>
             </w:r>
             <w:r>
               <w:t xml:space="preserve"> </w:t>
@@ -2832,7 +2935,7 @@
               <w:t xml:space="preserve"> </w:t>
             </w:r>
             <w:r>
-              <w:t xml:space="preserve">[93]</w:t>
+              <w:t xml:space="preserve">[95]</w:t>
             </w:r>
             <w:r>
               <w:t xml:space="preserve">. These external pressures will interact with a system that is already constraint by multiple stressors, including direct impacts imposed by extreme heat and other aspects of clime change- to maintaining its normal functionality and the health and wellbeing of its citizens. If sufficiently widespread, economic and political destabilisation may occur as already observed in other parts of the world</w:t>
@@ -2841,7 +2944,7 @@
               <w:t xml:space="preserve"> </w:t>
             </w:r>
             <w:r>
-              <w:t xml:space="preserve">[94]</w:t>
+              <w:t xml:space="preserve">[96]</w:t>
             </w:r>
             <w:r>
               <w:t xml:space="preserve">, which could in turn affect the management of the original ecosystems.</w:t>
@@ -2858,7 +2961,7 @@
               <w:t xml:space="preserve"> </w:t>
             </w:r>
             <w:r>
-              <w:t xml:space="preserve">[95]</w:t>
+              <w:t xml:space="preserve">[97]</w:t>
             </w:r>
             <w:r>
               <w:t xml:space="preserve">. Social-ecological models aim to capture the social systems, natural systems and their interactions</w:t>
@@ -2867,7 +2970,7 @@
               <w:t xml:space="preserve"> </w:t>
             </w:r>
             <w:r>
-              <w:t xml:space="preserve">[96]</w:t>
+              <w:t xml:space="preserve">[98]</w:t>
             </w:r>
             <w:r>
               <w:t xml:space="preserve">. Such models can display non-trivial emergent behaviour resulting from complex interactions within the social-ecological systems. For example, responding to decreased productivity from thermal stress by farming more intensively could lead to a maladaptation or</w:t>
@@ -2888,7 +2991,7 @@
               <w:t xml:space="preserve"> </w:t>
             </w:r>
             <w:r>
-              <w:t xml:space="preserve">[97]</w:t>
+              <w:t xml:space="preserve">[99]</w:t>
             </w:r>
             <w:r>
               <w:t xml:space="preserve">.</w:t>
@@ -2908,7 +3011,7 @@
               <w:t xml:space="preserve"> </w:t>
             </w:r>
             <w:r>
-              <w:t xml:space="preserve">[98]</w:t>
+              <w:t xml:space="preserve">[100]</w:t>
             </w:r>
             <w:r>
               <w:t xml:space="preserve">. Process-based approaches are critical to understanding how emergent social-ecological phenomena develop</w:t>
@@ -2917,7 +3020,7 @@
               <w:t xml:space="preserve"> </w:t>
             </w:r>
             <w:r>
-              <w:t xml:space="preserve">[99]</w:t>
+              <w:t xml:space="preserve">[101]</w:t>
             </w:r>
             <w:r>
               <w:t xml:space="preserve">, such as tipping points, traps or other dynamics. Constructing process-based dynamical models requires knowledge and data about: the biophysical processes, which could be provided by the models from the previous sections; social processes, which could be developed from a combination of behavioural theory and empirical data; and interactions between them in the system of interest. Since obtaining all these data can be challenging, social-ecological modelling is often performed in an exploratory mode</w:t>
@@ -2926,7 +3029,7 @@
               <w:t xml:space="preserve"> </w:t>
             </w:r>
             <w:r>
-              <w:t xml:space="preserve">[100]</w:t>
+              <w:t xml:space="preserve">[102]</w:t>
             </w:r>
             <w:r>
               <w:t xml:space="preserve"> </w:t>
@@ -3074,14 +3177,55 @@
         <w:t xml:space="preserve">Conservation (Adrienne?)</w:t>
       </w:r>
     </w:p>
+    <w:tbl>
+      <w:tblPr>
+        <w:tblStyle w:val="Table"/>
+        <w:tblLook w:firstRow="0" w:lastRow="0" w:firstColumn="0" w:lastColumn="0" w:noHBand="0" w:noVBand="0" w:val="0000"/>
+        <w:tblBorders>
+          <w:left w:val="single" w:sz="24" w:space="0" w:color="0758E5"/>
+        </w:tblBorders>
+        <w:tblCellMar>
+          <w:left w:w="0" w:type="dxa"/>
+          <w:right w:w="0" w:type="dxa"/>
+        </w:tblCellMar>
+        <w:tblInd w:w="164" w:type="dxa"/>
+      </w:tblPr>
+      <w:tr>
+        <w:trPr>
+          <w:cantSplit/>
+        </w:trPr>
+        <w:tc>
+          <w:tcPr>
+            <w:tcMar>
+              <w:left w:w="144" w:type="dxa"/>
+            </w:tcMar>
+          </w:tcPr>
+          <w:p>
+            <w:pPr>
+              <w:pStyle w:val="FirstParagraph"/>
+            </w:pPr>
+            <w:pPr>
+              <w:spacing w:before="16" w:after="64"/>
+            </w:pPr>
+            <w:r>
+              <w:rPr>
+                <w:b/>
+                <w:bCs/>
+              </w:rPr>
+              <w:t xml:space="preserve">Outstanding Questions</w:t>
+            </w:r>
+          </w:p>
+        </w:tc>
+      </w:tr>
+    </w:tbl>
     <w:bookmarkEnd w:id="40"/>
-    <w:bookmarkStart w:id="42" w:name="X78b08fde953bb9dcb9bb22555137d822070b4a9"/>
+    <w:bookmarkStart w:id="42" w:name="concluding-remarks"/>
     <w:p>
       <w:pPr>
         <w:pStyle w:val="Heading1"/>
       </w:pPr>
       <w:r>
-        <w:t xml:space="preserve">Future directions: modelling challenges, gaps and possible solutions</w:t>
+        <w:t xml:space="preserve">Concluding Remarks</w:t>
       </w:r>
     </w:p>
     <w:p>
@@ -3105,7 +3249,20 @@
         </w:r>
       </w:hyperlink>
       <w:r>
-        <w:t xml:space="preserve">). While our case studies are necessarily hypothetical in nature they move us one step closer to implementing these models in real-world systems. However, there are still many challenges and gaps in our understanding of the impacts of extreme heat on organisms and communities that need to be addressed, which we outline below:</w:t>
+        <w:t xml:space="preserve">). While our case studies are necessarily hypothetical in nature they move us one step closer to implementing these models in real-world systems. However, there are still many challenges and gaps (see</w:t>
+      </w:r>
+      <w:r>
+        <w:t xml:space="preserve"> </w:t>
+      </w:r>
+      <w:r>
+        <w:rPr>
+          <w:b/>
+          <w:bCs/>
+        </w:rPr>
+        <w:t xml:space="preserve">Outstanding Questions</w:t>
+      </w:r>
+      <w:r>
+        <w:t xml:space="preserve">) in our understanding of the impacts of extreme heat on organisms and communities that need to be addressed, which we outline below:</w:t>
       </w:r>
     </w:p>
     <w:p>
@@ -3202,7 +3359,7 @@
         <w:t xml:space="preserve"> </w:t>
       </w:r>
       <w:r>
-        <w:t xml:space="preserve">[101]</w:t>
+        <w:t xml:space="preserve">[103]</w:t>
       </w:r>
       <w:r>
         <w:t xml:space="preserve"> </w:t>
@@ -3254,11 +3411,11 @@
         <w:pStyle w:val="FirstParagraph"/>
       </w:pPr>
       <w:r>
-        <w:t xml:space="preserve">Developing a systems modelling framework will require collaboration between different research fields, including biophysics, physiology, ecology and evolutionary biology. By working collaboratively, we can develop a more calculated understanding of the impacts that extreme heat will have on plants and animals, populations, and communities along with how to mitigate these impacts to preserve socio-ecological systems now and into the future.</w:t>
+        <w:t xml:space="preserve">Developing a systems modelling framework will require collaboration between different research fields, including biophysics, physiology, ecology and evolutionary biology. By working collaboratively, we can develop a more calculated understanding of the impacts that extreme heat will have on organisms, populations, and communities along with how to mitigate these impacts to preserve diverse systems now and into the future.</w:t>
       </w:r>
     </w:p>
     <w:bookmarkEnd w:id="42"/>
-    <w:bookmarkStart w:id="145" w:name="references"/>
+    <w:bookmarkStart w:id="147" w:name="references"/>
     <w:p>
       <w:pPr>
         <w:pStyle w:val="Heading1"/>
@@ -3267,7 +3424,7 @@
         <w:t xml:space="preserve">References</w:t>
       </w:r>
     </w:p>
-    <w:bookmarkStart w:id="144" w:name="refs"/>
+    <w:bookmarkStart w:id="146" w:name="refs"/>
     <w:bookmarkStart w:id="43" w:name="ref-Barriopedro2023"/>
     <w:p>
       <w:pPr>
@@ -7025,7 +7182,7 @@
       </w:r>
     </w:p>
     <w:bookmarkEnd w:id="122"/>
-    <w:bookmarkStart w:id="123" w:name="ref-Zou2024"/>
+    <w:bookmarkStart w:id="123" w:name="ref-Lande1979"/>
     <w:p>
       <w:pPr>
         <w:pStyle w:val="Bibliography"/>
@@ -7040,6 +7197,73 @@
         <w:t xml:space="preserve">	</w:t>
       </w:r>
       <w:r>
+        <w:t xml:space="preserve">Lande, R. (1979) Quantitative genetic analysis of multivariate evolution, applied to brain:body size allometry.</w:t>
+      </w:r>
+      <w:r>
+        <w:t xml:space="preserve"> </w:t>
+      </w:r>
+      <w:r>
+        <w:rPr>
+          <w:i/>
+          <w:iCs/>
+        </w:rPr>
+        <w:t xml:space="preserve">Evolution</w:t>
+      </w:r>
+      <w:r>
+        <w:t xml:space="preserve"> </w:t>
+      </w:r>
+      <w:r>
+        <w:t xml:space="preserve">33</w:t>
+      </w:r>
+    </w:p>
+    <w:bookmarkEnd w:id="123"/>
+    <w:bookmarkStart w:id="124" w:name="ref-Walsh2018"/>
+    <w:p>
+      <w:pPr>
+        <w:pStyle w:val="Bibliography"/>
+      </w:pPr>
+      <w:r>
+        <w:t xml:space="preserve">82.</w:t>
+      </w:r>
+      <w:r>
+        <w:t xml:space="preserve"> </w:t>
+      </w:r>
+      <w:r>
+        <w:t xml:space="preserve">	</w:t>
+      </w:r>
+      <w:r>
+        <w:t xml:space="preserve">Walsh, B. and Lynch, M. (2018)</w:t>
+      </w:r>
+      <w:r>
+        <w:t xml:space="preserve"> </w:t>
+      </w:r>
+      <w:r>
+        <w:rPr>
+          <w:i/>
+          <w:iCs/>
+        </w:rPr>
+        <w:t xml:space="preserve">Evolution and selection of quantitative traits</w:t>
+      </w:r>
+      <w:r>
+        <w:t xml:space="preserve">, Oxford University Press</w:t>
+      </w:r>
+    </w:p>
+    <w:bookmarkEnd w:id="124"/>
+    <w:bookmarkStart w:id="125" w:name="ref-Zou2024"/>
+    <w:p>
+      <w:pPr>
+        <w:pStyle w:val="Bibliography"/>
+      </w:pPr>
+      <w:r>
+        <w:t xml:space="preserve">83.</w:t>
+      </w:r>
+      <w:r>
+        <w:t xml:space="preserve"> </w:t>
+      </w:r>
+      <w:r>
+        <w:t xml:space="preserve">	</w:t>
+      </w:r>
+      <w:r>
         <w:t xml:space="preserve">Zou, H.-X.</w:t>
       </w:r>
       <w:r>
@@ -7075,14 +7299,14 @@
         <w:t xml:space="preserve">27, e14432</w:t>
       </w:r>
     </w:p>
-    <w:bookmarkEnd w:id="123"/>
-    <w:bookmarkStart w:id="124" w:name="ref-Li2023"/>
+    <w:bookmarkEnd w:id="125"/>
+    <w:bookmarkStart w:id="126" w:name="ref-Li2023"/>
     <w:p>
       <w:pPr>
         <w:pStyle w:val="Bibliography"/>
       </w:pPr>
       <w:r>
-        <w:t xml:space="preserve">82.</w:t>
+        <w:t xml:space="preserve">84.</w:t>
       </w:r>
       <w:r>
         <w:t xml:space="preserve"> </w:t>
@@ -7126,14 +7350,14 @@
         <w:t xml:space="preserve">114, 103583</w:t>
       </w:r>
     </w:p>
-    <w:bookmarkEnd w:id="124"/>
-    <w:bookmarkStart w:id="125" w:name="ref-Zhu2024"/>
+    <w:bookmarkEnd w:id="126"/>
+    <w:bookmarkStart w:id="127" w:name="ref-Zhu2024"/>
     <w:p>
       <w:pPr>
         <w:pStyle w:val="Bibliography"/>
       </w:pPr>
       <w:r>
-        <w:t xml:space="preserve">83.</w:t>
+        <w:t xml:space="preserve">85.</w:t>
       </w:r>
       <w:r>
         <w:t xml:space="preserve"> </w:t>
@@ -7177,14 +7401,14 @@
         <w:t xml:space="preserve">39, 165–180</w:t>
       </w:r>
     </w:p>
-    <w:bookmarkEnd w:id="125"/>
-    <w:bookmarkStart w:id="126" w:name="ref-Assessment_undated-fv"/>
+    <w:bookmarkEnd w:id="127"/>
+    <w:bookmarkStart w:id="128" w:name="ref-Assessment_undated-fv"/>
     <w:p>
       <w:pPr>
         <w:pStyle w:val="Bibliography"/>
       </w:pPr>
       <w:r>
-        <w:t xml:space="preserve">84.</w:t>
+        <w:t xml:space="preserve">86.</w:t>
       </w:r>
       <w:r>
         <w:t xml:space="preserve"> </w:t>
@@ -7196,14 +7420,14 @@
         <w:t xml:space="preserve">Assessment, M.E. (2005) Opportunities and challenges for business and industryunioviedo.es</w:t>
       </w:r>
     </w:p>
-    <w:bookmarkEnd w:id="126"/>
-    <w:bookmarkStart w:id="127" w:name="ref-Dandy2019"/>
+    <w:bookmarkEnd w:id="128"/>
+    <w:bookmarkStart w:id="129" w:name="ref-Dandy2019"/>
     <w:p>
       <w:pPr>
         <w:pStyle w:val="Bibliography"/>
       </w:pPr>
       <w:r>
-        <w:t xml:space="preserve">85.</w:t>
+        <w:t xml:space="preserve">87.</w:t>
       </w:r>
       <w:r>
         <w:t xml:space="preserve"> </w:t>
@@ -7247,14 +7471,14 @@
         <w:t xml:space="preserve">19, 615–620</w:t>
       </w:r>
     </w:p>
-    <w:bookmarkEnd w:id="127"/>
-    <w:bookmarkStart w:id="128" w:name="ref-Price2014"/>
+    <w:bookmarkEnd w:id="129"/>
+    <w:bookmarkStart w:id="130" w:name="ref-Price2014"/>
     <w:p>
       <w:pPr>
         <w:pStyle w:val="Bibliography"/>
       </w:pPr>
       <w:r>
-        <w:t xml:space="preserve">86.</w:t>
+        <w:t xml:space="preserve">88.</w:t>
       </w:r>
       <w:r>
         <w:t xml:space="preserve"> </w:t>
@@ -7282,14 +7506,14 @@
         <w:t xml:space="preserve">34, 65–78</w:t>
       </w:r>
     </w:p>
-    <w:bookmarkEnd w:id="128"/>
-    <w:bookmarkStart w:id="129" w:name="ref-Leviston2018"/>
+    <w:bookmarkEnd w:id="130"/>
+    <w:bookmarkStart w:id="131" w:name="ref-Leviston2018"/>
     <w:p>
       <w:pPr>
         <w:pStyle w:val="Bibliography"/>
       </w:pPr>
       <w:r>
-        <w:t xml:space="preserve">87.</w:t>
+        <w:t xml:space="preserve">89.</w:t>
       </w:r>
       <w:r>
         <w:t xml:space="preserve"> </w:t>
@@ -7333,14 +7557,14 @@
         <w:t xml:space="preserve">93, 658–668</w:t>
       </w:r>
     </w:p>
-    <w:bookmarkEnd w:id="129"/>
-    <w:bookmarkStart w:id="130" w:name="ref-Bai2016"/>
+    <w:bookmarkEnd w:id="131"/>
+    <w:bookmarkStart w:id="132" w:name="ref-Bai2016"/>
     <w:p>
       <w:pPr>
         <w:pStyle w:val="Bibliography"/>
       </w:pPr>
       <w:r>
-        <w:t xml:space="preserve">88.</w:t>
+        <w:t xml:space="preserve">90.</w:t>
       </w:r>
       <w:r>
         <w:t xml:space="preserve"> </w:t>
@@ -7384,14 +7608,14 @@
         <w:t xml:space="preserve">23, 69–78</w:t>
       </w:r>
     </w:p>
-    <w:bookmarkEnd w:id="130"/>
-    <w:bookmarkStart w:id="131" w:name="ref-Grimm2008"/>
+    <w:bookmarkEnd w:id="132"/>
+    <w:bookmarkStart w:id="133" w:name="ref-Grimm2008"/>
     <w:p>
       <w:pPr>
         <w:pStyle w:val="Bibliography"/>
       </w:pPr>
       <w:r>
-        <w:t xml:space="preserve">89.</w:t>
+        <w:t xml:space="preserve">91.</w:t>
       </w:r>
       <w:r>
         <w:t xml:space="preserve"> </w:t>
@@ -7435,14 +7659,14 @@
         <w:t xml:space="preserve">319, 756–760</w:t>
       </w:r>
     </w:p>
-    <w:bookmarkEnd w:id="131"/>
-    <w:bookmarkStart w:id="132" w:name="ref-Hendricks2022"/>
+    <w:bookmarkEnd w:id="133"/>
+    <w:bookmarkStart w:id="134" w:name="ref-Hendricks2022"/>
     <w:p>
       <w:pPr>
         <w:pStyle w:val="Bibliography"/>
       </w:pPr>
       <w:r>
-        <w:t xml:space="preserve">90.</w:t>
+        <w:t xml:space="preserve">92.</w:t>
       </w:r>
       <w:r>
         <w:t xml:space="preserve"> </w:t>
@@ -7486,14 +7710,14 @@
         <w:t xml:space="preserve">105, 5893–5908</w:t>
       </w:r>
     </w:p>
-    <w:bookmarkEnd w:id="132"/>
-    <w:bookmarkStart w:id="133" w:name="ref-Sutanto2020"/>
+    <w:bookmarkEnd w:id="134"/>
+    <w:bookmarkStart w:id="135" w:name="ref-Sutanto2020"/>
     <w:p>
       <w:pPr>
         <w:pStyle w:val="Bibliography"/>
       </w:pPr>
       <w:r>
-        <w:t xml:space="preserve">91.</w:t>
+        <w:t xml:space="preserve">93.</w:t>
       </w:r>
       <w:r>
         <w:t xml:space="preserve"> </w:t>
@@ -7537,14 +7761,14 @@
         <w:t xml:space="preserve">134, 105276</w:t>
       </w:r>
     </w:p>
-    <w:bookmarkEnd w:id="133"/>
-    <w:bookmarkStart w:id="134" w:name="ref-Liu2007"/>
+    <w:bookmarkEnd w:id="135"/>
+    <w:bookmarkStart w:id="136" w:name="ref-Liu2007"/>
     <w:p>
       <w:pPr>
         <w:pStyle w:val="Bibliography"/>
       </w:pPr>
       <w:r>
-        <w:t xml:space="preserve">92.</w:t>
+        <w:t xml:space="preserve">94.</w:t>
       </w:r>
       <w:r>
         <w:t xml:space="preserve"> </w:t>
@@ -7588,14 +7812,14 @@
         <w:t xml:space="preserve">36, 639–649</w:t>
       </w:r>
     </w:p>
-    <w:bookmarkEnd w:id="134"/>
-    <w:bookmarkStart w:id="135" w:name="ref-Black2011"/>
+    <w:bookmarkEnd w:id="136"/>
+    <w:bookmarkStart w:id="137" w:name="ref-Black2011"/>
     <w:p>
       <w:pPr>
         <w:pStyle w:val="Bibliography"/>
       </w:pPr>
       <w:r>
-        <w:t xml:space="preserve">93.</w:t>
+        <w:t xml:space="preserve">95.</w:t>
       </w:r>
       <w:r>
         <w:t xml:space="preserve"> </w:t>
@@ -7639,14 +7863,14 @@
         <w:t xml:space="preserve">21, S3–S11</w:t>
       </w:r>
     </w:p>
-    <w:bookmarkEnd w:id="135"/>
-    <w:bookmarkStart w:id="136" w:name="ref-Neil_Adger1999"/>
+    <w:bookmarkEnd w:id="137"/>
+    <w:bookmarkStart w:id="138" w:name="ref-Neil_Adger1999"/>
     <w:p>
       <w:pPr>
         <w:pStyle w:val="Bibliography"/>
       </w:pPr>
       <w:r>
-        <w:t xml:space="preserve">94.</w:t>
+        <w:t xml:space="preserve">96.</w:t>
       </w:r>
       <w:r>
         <w:t xml:space="preserve"> </w:t>
@@ -7674,14 +7898,14 @@
         <w:t xml:space="preserve">27, 249–269</w:t>
       </w:r>
     </w:p>
-    <w:bookmarkEnd w:id="136"/>
-    <w:bookmarkStart w:id="137" w:name="ref-Folke2016"/>
+    <w:bookmarkEnd w:id="138"/>
+    <w:bookmarkStart w:id="139" w:name="ref-Folke2016"/>
     <w:p>
       <w:pPr>
         <w:pStyle w:val="Bibliography"/>
       </w:pPr>
       <w:r>
-        <w:t xml:space="preserve">95.</w:t>
+        <w:t xml:space="preserve">97.</w:t>
       </w:r>
       <w:r>
         <w:t xml:space="preserve"> </w:t>
@@ -7725,14 +7949,14 @@
         <w:t xml:space="preserve">21</w:t>
       </w:r>
     </w:p>
-    <w:bookmarkEnd w:id="137"/>
-    <w:bookmarkStart w:id="138" w:name="ref-Schluter2012"/>
+    <w:bookmarkEnd w:id="139"/>
+    <w:bookmarkStart w:id="140" w:name="ref-Schluter2012"/>
     <w:p>
       <w:pPr>
         <w:pStyle w:val="Bibliography"/>
       </w:pPr>
       <w:r>
-        <w:t xml:space="preserve">96.</w:t>
+        <w:t xml:space="preserve">98.</w:t>
       </w:r>
       <w:r>
         <w:t xml:space="preserve"> </w:t>
@@ -7776,14 +8000,14 @@
         <w:t xml:space="preserve">25, 219–272</w:t>
       </w:r>
     </w:p>
-    <w:bookmarkEnd w:id="138"/>
-    <w:bookmarkStart w:id="139" w:name="ref-Wise2014"/>
+    <w:bookmarkEnd w:id="140"/>
+    <w:bookmarkStart w:id="141" w:name="ref-Wise2014"/>
     <w:p>
       <w:pPr>
         <w:pStyle w:val="Bibliography"/>
       </w:pPr>
       <w:r>
-        <w:t xml:space="preserve">97.</w:t>
+        <w:t xml:space="preserve">99.</w:t>
       </w:r>
       <w:r>
         <w:t xml:space="preserve"> </w:t>
@@ -7827,14 +8051,14 @@
         <w:t xml:space="preserve">28, 325–336</w:t>
       </w:r>
     </w:p>
-    <w:bookmarkEnd w:id="139"/>
-    <w:bookmarkStart w:id="140" w:name="ref-Biggs2021"/>
+    <w:bookmarkEnd w:id="141"/>
+    <w:bookmarkStart w:id="142" w:name="ref-Biggs2021"/>
     <w:p>
       <w:pPr>
         <w:pStyle w:val="Bibliography"/>
       </w:pPr>
       <w:r>
-        <w:t xml:space="preserve">98.</w:t>
+        <w:t xml:space="preserve">100.</w:t>
       </w:r>
       <w:r>
         <w:t xml:space="preserve"> </w:t>
@@ -7875,14 +8099,14 @@
         <w:t xml:space="preserve">, Taylor &amp; Francis</w:t>
       </w:r>
     </w:p>
-    <w:bookmarkEnd w:id="140"/>
-    <w:bookmarkStart w:id="141" w:name="ref-Brown2021"/>
+    <w:bookmarkEnd w:id="142"/>
+    <w:bookmarkStart w:id="143" w:name="ref-Brown2021"/>
     <w:p>
       <w:pPr>
         <w:pStyle w:val="Bibliography"/>
       </w:pPr>
       <w:r>
-        <w:t xml:space="preserve">99.</w:t>
+        <w:t xml:space="preserve">101.</w:t>
       </w:r>
       <w:r>
         <w:t xml:space="preserve"> </w:t>
@@ -7910,14 +8134,14 @@
         <w:t xml:space="preserve">3, 88–103</w:t>
       </w:r>
     </w:p>
-    <w:bookmarkEnd w:id="141"/>
-    <w:bookmarkStart w:id="142" w:name="ref-Kwakkel2013"/>
+    <w:bookmarkEnd w:id="143"/>
+    <w:bookmarkStart w:id="144" w:name="ref-Kwakkel2013"/>
     <w:p>
       <w:pPr>
         <w:pStyle w:val="Bibliography"/>
       </w:pPr>
       <w:r>
-        <w:t xml:space="preserve">100.</w:t>
+        <w:t xml:space="preserve">102.</w:t>
       </w:r>
       <w:r>
         <w:t xml:space="preserve"> </w:t>
@@ -7945,14 +8169,14 @@
         <w:t xml:space="preserve">80, 419–431</w:t>
       </w:r>
     </w:p>
-    <w:bookmarkEnd w:id="142"/>
-    <w:bookmarkStart w:id="143" w:name="ref-Kearney2009a"/>
+    <w:bookmarkEnd w:id="144"/>
+    <w:bookmarkStart w:id="145" w:name="ref-Kearney2009a"/>
     <w:p>
       <w:pPr>
         <w:pStyle w:val="Bibliography"/>
       </w:pPr>
       <w:r>
-        <w:t xml:space="preserve">101.</w:t>
+        <w:t xml:space="preserve">103.</w:t>
       </w:r>
       <w:r>
         <w:t xml:space="preserve"> </w:t>
@@ -7996,9 +8220,9 @@
         <w:t xml:space="preserve">23, 528–538</w:t>
       </w:r>
     </w:p>
-    <w:bookmarkEnd w:id="143"/>
-    <w:bookmarkEnd w:id="144"/>
     <w:bookmarkEnd w:id="145"/>
+    <w:bookmarkEnd w:id="146"/>
+    <w:bookmarkEnd w:id="147"/>
     <w:sectPr>
       <w:pgSz w:h="15840" w:w="12240"/>
       <w:pgMar w:bottom="851" w:footer="720" w:gutter="0" w:header="720" w:left="851" w:right="851" w:top="851"/>

</xml_diff>

<commit_message>
Updated. We have too many refs so need to go through and trim down a bit.
</commit_message>
<xml_diff>
--- a/docs/ms.docx
+++ b/docs/ms.docx
@@ -849,7 +849,7 @@
         <w:pStyle w:val="FirstParagraph"/>
       </w:pPr>
       <w:r>
-        <w:t xml:space="preserve">Ultimately, we need to know how an extreme weather event is experienced by different members of a community. This can vary widely; when the air temperature at a weather station is 50°C, an organism a metre below the surface may be 25 °C cooler, where soil temperatures are tracking the mean monthly air temperature (</w:t>
+        <w:t xml:space="preserve">Ultimately, we need to know how an extreme weather event is experienced by different species in a community. This can vary widely; when the air temperature at a weather station is 50°C, an organism a metre below the surface may be 25°C cooler, where soil temperatures are tracking the mean monthly air temperature (</w:t>
       </w:r>
       <w:hyperlink w:anchor="fig-sys">
         <w:r>
@@ -1047,17 +1047,7 @@
         <w:t xml:space="preserve"> </w:t>
       </w:r>
       <w:r>
-        <w:t xml:space="preserve">[33,</w:t>
-      </w:r>
-      <w:r>
-        <w:rPr>
-          <w:b/>
-          <w:bCs/>
-        </w:rPr>
-        <w:t xml:space="preserve">Riddle?</w:t>
-      </w:r>
-      <w:r>
-        <w:t xml:space="preserve">]</w:t>
+        <w:t xml:space="preserve">[33,43]</w:t>
       </w:r>
       <w:r>
         <w:t xml:space="preserve">. Equivalent models of leaves incorporate the dynamic role of stomata</w:t>
@@ -1066,7 +1056,7 @@
         <w:t xml:space="preserve"> </w:t>
       </w:r>
       <w:r>
-        <w:t xml:space="preserve">[19,e.g., 43]</w:t>
+        <w:t xml:space="preserve">[19,e.g., 44]</w:t>
       </w:r>
       <w:r>
         <w:t xml:space="preserve">, while models of endotherms can account for the role of insulation and metabolic heat production</w:t>
@@ -1075,7 +1065,7 @@
         <w:t xml:space="preserve"> </w:t>
       </w:r>
       <w:r>
-        <w:t xml:space="preserve">[44]</w:t>
+        <w:t xml:space="preserve">[45]</w:t>
       </w:r>
       <w:r>
         <w:t xml:space="preserve">. Future development in biophysical modelling of organismal temperature under extreme heat involves understanding the nuances of physiological and behavioural responses. For example, lizards may pant when exposed to high temperatures</w:t>
@@ -1084,7 +1074,7 @@
         <w:t xml:space="preserve"> </w:t>
       </w:r>
       <w:r>
-        <w:t xml:space="preserve">[45]</w:t>
+        <w:t xml:space="preserve">[46]</w:t>
       </w:r>
       <w:r>
         <w:t xml:space="preserve">, birds may</w:t>
@@ -1105,7 +1095,7 @@
         <w:t xml:space="preserve"> </w:t>
       </w:r>
       <w:r>
-        <w:t xml:space="preserve">[46]</w:t>
+        <w:t xml:space="preserve">[47]</w:t>
       </w:r>
       <w:r>
         <w:t xml:space="preserve">, and stomatal behaviour may depart from the typical responses to vapour pressure and light intensity to allow emergency cooling</w:t>
@@ -1114,7 +1104,7 @@
         <w:t xml:space="preserve"> </w:t>
       </w:r>
       <w:r>
-        <w:t xml:space="preserve">[47]</w:t>
+        <w:t xml:space="preserve">[48]</w:t>
       </w:r>
       <w:r>
         <w:t xml:space="preserve">, though this response may depend on prior soil moisture conditions</w:t>
@@ -1123,7 +1113,7 @@
         <w:t xml:space="preserve"> </w:t>
       </w:r>
       <w:r>
-        <w:t xml:space="preserve">[48]</w:t>
+        <w:t xml:space="preserve">[49]</w:t>
       </w:r>
       <w:r>
         <w:t xml:space="preserve">. The application of biophysical heat budget models in concert with microclimate models can thus be used to infer differential exposure of members of a community to specific temperatures to predict relative exposure with different degrees of detail, from rank-order stress exposure to hourly trajectories that can be linked to physiological models of damage and repair.</w:t>
@@ -1182,7 +1172,7 @@
         <w:t xml:space="preserve"> </w:t>
       </w:r>
       <w:r>
-        <w:t xml:space="preserve">[21,49]</w:t>
+        <w:t xml:space="preserve">[21,50]</w:t>
       </w:r>
       <w:r>
         <w:t xml:space="preserve">. Sensitivity to extreme heat can be captured by thermal load sensitivity (TLS) / thermal death time (TDT) models that explicitly account for how heat stress depends on both temperature and the duration of time at a given temperature</w:t>
@@ -1249,20 +1239,7 @@
         <w:t xml:space="preserve"> </w:t>
       </w:r>
       <w:r>
-        <w:t xml:space="preserve">[e.g. Table 1 in</w:t>
-      </w:r>
-      <w:r>
-        <w:t xml:space="preserve"> </w:t>
-      </w:r>
-      <w:r>
-        <w:rPr>
-          <w:b/>
-          <w:bCs/>
-        </w:rPr>
-        <w:t xml:space="preserve">Jagadish2021?</w:t>
-      </w:r>
-      <w:r>
-        <w:t xml:space="preserve">]</w:t>
+        <w:t xml:space="preserve">[e.g. Table 1 in 51]</w:t>
       </w:r>
       <w:r>
         <w:t xml:space="preserve">. Endpoints are predicted by assuming the effect of time at a given temperature decreases survival or fertility exponentially</w:t>
@@ -1271,7 +1248,7 @@
         <w:t xml:space="preserve"> </w:t>
       </w:r>
       <w:r>
-        <w:t xml:space="preserve">[11,12,21,49]</w:t>
+        <w:t xml:space="preserve">[11,12,21,50]</w:t>
       </w:r>
       <w:r>
         <w:t xml:space="preserve">. For example, Ørsted</w:t>
@@ -1337,20 +1314,7 @@
         <w:t xml:space="preserve"> </w:t>
       </w:r>
       <w:r>
-        <w:t xml:space="preserve">[50,@</w:t>
-      </w:r>
-      <w:r>
-        <w:t xml:space="preserve"> </w:t>
-      </w:r>
-      <w:r>
-        <w:rPr>
-          <w:b/>
-          <w:bCs/>
-        </w:rPr>
-        <w:t xml:space="preserve">Jagadish2021?</w:t>
-      </w:r>
-      <w:r>
-        <w:t xml:space="preserve">]</w:t>
+        <w:t xml:space="preserve">[@ 51,52]</w:t>
       </w:r>
       <w:r>
         <w:t xml:space="preserve"> </w:t>
@@ -1370,7 +1334,7 @@
         <w:t xml:space="preserve"> </w:t>
       </w:r>
       <w:r>
-        <w:t xml:space="preserve">[51]</w:t>
+        <w:t xml:space="preserve">[53]</w:t>
       </w:r>
       <w:r>
         <w:t xml:space="preserve">. Once a thermal tolerance landscape for a particular endpoint has been quantified, the thermal sensitivity (i.e., the slope</w:t>
@@ -1390,7 +1354,7 @@
         <w:t xml:space="preserve"> </w:t>
       </w:r>
       <w:r>
-        <w:t xml:space="preserve">[11,12,49]</w:t>
+        <w:t xml:space="preserve">[11,12,50]</w:t>
       </w:r>
       <w:r>
         <w:t xml:space="preserve">. Several approaches can be used to capture the accumulation of damage</w:t>
@@ -1399,7 +1363,7 @@
         <w:t xml:space="preserve"> </w:t>
       </w:r>
       <w:r>
-        <w:t xml:space="preserve">[11,12,49]</w:t>
+        <w:t xml:space="preserve">[11,12,50]</w:t>
       </w:r>
       <w:r>
         <w:t xml:space="preserve">, but a simplistic way can be computed following Ørsted</w:t>
@@ -1892,7 +1856,7 @@
         <w:t xml:space="preserve"> </w:t>
       </w:r>
       <w:r>
-        <w:t xml:space="preserve">[52]</w:t>
+        <w:t xml:space="preserve">[54]</w:t>
       </w:r>
       <w:r>
         <w:t xml:space="preserve">, which is thought to be associated with transcriptional buffering of hosts by the natural microbiome</w:t>
@@ -1901,7 +1865,7 @@
         <w:t xml:space="preserve"> </w:t>
       </w:r>
       <w:r>
-        <w:t xml:space="preserve">[53]</w:t>
+        <w:t xml:space="preserve">[55]</w:t>
       </w:r>
       <w:r>
         <w:t xml:space="preserve">. Specific gut bacteria may provide a protective effect on their host.</w:t>
@@ -1942,7 +1906,7 @@
         <w:t xml:space="preserve"> </w:t>
       </w:r>
       <w:r>
-        <w:t xml:space="preserve">[54]</w:t>
+        <w:t xml:space="preserve">[56]</w:t>
       </w:r>
       <w:r>
         <w:t xml:space="preserve">. Moreover, this protective effect can influence the ability of the host to evolve further resistance to the heat shock and harboured more bacteria</w:t>
@@ -1951,7 +1915,7 @@
         <w:t xml:space="preserve"> </w:t>
       </w:r>
       <w:r>
-        <w:t xml:space="preserve">[55]</w:t>
+        <w:t xml:space="preserve">[57]</w:t>
       </w:r>
       <w:r>
         <w:t xml:space="preserve">. Even microbes that are normally parasitic on their hosts can generate benefits to them under stressful conditions. In the mussel</w:t>
@@ -1973,7 +1937,7 @@
         <w:t xml:space="preserve"> </w:t>
       </w:r>
       <w:r>
-        <w:t xml:space="preserve">[56]</w:t>
+        <w:t xml:space="preserve">[58]</w:t>
       </w:r>
       <w:r>
         <w:t xml:space="preserve">, On the other hand, many endosymbionts including those providing host benefits appear particularly sensitive to heat</w:t>
@@ -1982,7 +1946,7 @@
         <w:t xml:space="preserve"> </w:t>
       </w:r>
       <w:r>
-        <w:t xml:space="preserve">[57]</w:t>
+        <w:t xml:space="preserve">[59]</w:t>
       </w:r>
       <w:r>
         <w:t xml:space="preserve">. The density of</w:t>
@@ -2023,7 +1987,7 @@
         <w:t xml:space="preserve"> </w:t>
       </w:r>
       <w:r>
-        <w:t xml:space="preserve">[58]</w:t>
+        <w:t xml:space="preserve">[60]</w:t>
       </w:r>
       <w:r>
         <w:t xml:space="preserve">. Nevertheless, the heat tolerance of pea aphids can be sharply increased through a mutation in a heat shock protein encoded by</w:t>
@@ -2042,7 +2006,7 @@
         <w:t xml:space="preserve"> </w:t>
       </w:r>
       <w:r>
-        <w:t xml:space="preserve">[59]</w:t>
+        <w:t xml:space="preserve">[61]</w:t>
       </w:r>
       <w:r>
         <w:t xml:space="preserve">.</w:t>
@@ -2059,7 +2023,7 @@
         <w:t xml:space="preserve"> </w:t>
       </w:r>
       <w:r>
-        <w:t xml:space="preserve">[60–62]</w:t>
+        <w:t xml:space="preserve">[62–64]</w:t>
       </w:r>
       <w:r>
         <w:t xml:space="preserve">. These interactions are usually achieved by stimulating the production of essential phytohormones, secondary metabolites, organic acids, and amino acids that helps the plant to mitigate heat stress</w:t>
@@ -2068,7 +2032,7 @@
         <w:t xml:space="preserve"> </w:t>
       </w:r>
       <w:r>
-        <w:t xml:space="preserve">[63,64]</w:t>
+        <w:t xml:space="preserve">[65,66]</w:t>
       </w:r>
       <w:r>
         <w:t xml:space="preserve">. Under the current global climate change scenarios, each degree Celsius increase in global mean temperature is estimated to reduce the global yield of wheat by 6.0% and soybean (Glycine max) by 3.1%</w:t>
@@ -2077,7 +2041,7 @@
         <w:t xml:space="preserve"> </w:t>
       </w:r>
       <w:r>
-        <w:t xml:space="preserve">[65]</w:t>
+        <w:t xml:space="preserve">[67]</w:t>
       </w:r>
       <w:r>
         <w:t xml:space="preserve">. For instance, bread wheat (</w:t>
@@ -2096,7 +2060,7 @@
         <w:t xml:space="preserve"> </w:t>
       </w:r>
       <w:r>
-        <w:t xml:space="preserve">[66,67]</w:t>
+        <w:t xml:space="preserve">[68,69]</w:t>
       </w:r>
       <w:r>
         <w:t xml:space="preserve">. The complexity of plant-microbe interaction under heat stress means that enormous efforts are required to decipher the interaction networks at molecular, tissue, and organism levels. These cannot be fully understood without the advanced bioinformatics tools and models of Artificial Intelligence/Machine Learning (AI/ML) in the new era of AI for all aspects of sciences. There are excellent AI/ML models developed for plants</w:t>
@@ -2105,7 +2069,7 @@
         <w:t xml:space="preserve"> </w:t>
       </w:r>
       <w:r>
-        <w:t xml:space="preserve">[68,69]</w:t>
+        <w:t xml:space="preserve">[70,71]</w:t>
       </w:r>
       <w:r>
         <w:t xml:space="preserve"> </w:t>
@@ -2117,7 +2081,7 @@
         <w:t xml:space="preserve"> </w:t>
       </w:r>
       <w:r>
-        <w:t xml:space="preserve">[70]</w:t>
+        <w:t xml:space="preserve">[72]</w:t>
       </w:r>
       <w:r>
         <w:t xml:space="preserve">. However, comprehensive models with high prediction powers for plant microbe interactions are still lacking, which hampers our understanding of the heat tolerance in plants and microorganisms.</w:t>
@@ -2144,7 +2108,7 @@
         <w:t xml:space="preserve"> </w:t>
       </w:r>
       <w:r>
-        <w:t xml:space="preserve">[16,71]</w:t>
+        <w:t xml:space="preserve">[16,73]</w:t>
       </w:r>
       <w:r>
         <w:t xml:space="preserve">. DEB models consider organisms as a thermodynamic system (adhering to energy-mass balance) capturing the exchange of food, water, respiratory gases and metabolic waste from egg to adult</w:t>
@@ -2162,7 +2126,7 @@
         <w:t xml:space="preserve"> </w:t>
       </w:r>
       <w:r>
-        <w:t xml:space="preserve">[73]</w:t>
+        <w:t xml:space="preserve">[75]</w:t>
       </w:r>
       <w:r>
         <w:t xml:space="preserve">) and resource availability (nutrients)</w:t>
@@ -2171,7 +2135,7 @@
         <w:t xml:space="preserve"> </w:t>
       </w:r>
       <w:r>
-        <w:t xml:space="preserve">[74,75]</w:t>
+        <w:t xml:space="preserve">[76,77]</w:t>
       </w:r>
       <w:r>
         <w:t xml:space="preserve"> </w:t>
@@ -2201,7 +2165,7 @@
         <w:t xml:space="preserve"> </w:t>
       </w:r>
       <w:r>
-        <w:t xml:space="preserve">[76,77]</w:t>
+        <w:t xml:space="preserve">[78,79]</w:t>
       </w:r>
       <w:r>
         <w:t xml:space="preserve">. New analytical approaches using phylogenetic imputation methods can be used to predict DEB parameters for over 1.3 million species providing immense opportunities to model how heat will affect life-cycles of multi-species assemblages (see https://deb.bolding-bruggeman.com,</w:t>
@@ -2210,7 +2174,7 @@
         <w:t xml:space="preserve"> </w:t>
       </w:r>
       <w:r>
-        <w:t xml:space="preserve">[78]</w:t>
+        <w:t xml:space="preserve">[80]</w:t>
       </w:r>
       <w:r>
         <w:t xml:space="preserve">). In addition, software packages such as</w:t>
@@ -2229,7 +2193,7 @@
         <w:t xml:space="preserve"> </w:t>
       </w:r>
       <w:r>
-        <w:t xml:space="preserve">[33,79]</w:t>
+        <w:t xml:space="preserve">[33,81]</w:t>
       </w:r>
       <w:r>
         <w:t xml:space="preserve"> </w:t>
@@ -2271,7 +2235,7 @@
         <w:t xml:space="preserve"> </w:t>
       </w:r>
       <w:r>
-        <w:t xml:space="preserve">[80]</w:t>
+        <w:t xml:space="preserve">[82]</w:t>
       </w:r>
       <w:r>
         <w:t xml:space="preserve"> </w:t>
@@ -2283,7 +2247,7 @@
         <w:t xml:space="preserve"> </w:t>
       </w:r>
       <w:r>
-        <w:t xml:space="preserve">[81]</w:t>
+        <w:t xml:space="preserve">[83]</w:t>
       </w:r>
       <w:r>
         <w:t xml:space="preserve"> </w:t>
@@ -2295,7 +2259,7 @@
         <w:t xml:space="preserve"> </w:t>
       </w:r>
       <w:r>
-        <w:t xml:space="preserve">[82]</w:t>
+        <w:t xml:space="preserve">[84]</w:t>
       </w:r>
       <w:r>
         <w:t xml:space="preserve">. In thinking about thermal extremes, it is likely that species experience a switch from amenable to harsh conditions, making it likely that interaction outcomes may flip signs</w:t>
@@ -2378,7 +2342,7 @@
         <w:t xml:space="preserve"> </w:t>
       </w:r>
       <w:r>
-        <w:t xml:space="preserve">[83]</w:t>
+        <w:t xml:space="preserve">[85]</w:t>
       </w:r>
       <w:r>
         <w:t xml:space="preserve">.</w:t>
@@ -2405,7 +2369,7 @@
         <w:t xml:space="preserve"> </w:t>
       </w:r>
       <w:r>
-        <w:t xml:space="preserve">[84–86]</w:t>
+        <w:t xml:space="preserve">[86–88]</w:t>
       </w:r>
       <w:r>
         <w:t xml:space="preserve">. Phenotypic plasticity and adaptive evolutionary change are two processes that are expected to allow systems to respond and build resilience to extreme heat. Evolutionary responses will depend on the amount of phenotypic and genetic variation exposed to natural selection and the strength of selection on phenotypes. Extreme environments pose unique challenges for predicting evolutionary change because they are, by definition, rare events. Adaptive evolution will therefore depend on the frequency of extreme environments and the underlying genetic correlation between traits expressed across environments</w:t>
@@ -2414,7 +2378,7 @@
         <w:t xml:space="preserve"> </w:t>
       </w:r>
       <w:r>
-        <w:t xml:space="preserve">[84]</w:t>
+        <w:t xml:space="preserve">[86]</w:t>
       </w:r>
       <w:r>
         <w:t xml:space="preserve">. In addition, phenotypic plasticity can result in both maladaptive and adaptive outcomes by either shielding selection on genetic variation or by facilitating persistence and selection making the relative role of plasticity and adaptive evolution to building population resilience complex</w:t>
@@ -2423,7 +2387,7 @@
         <w:t xml:space="preserve"> </w:t>
       </w:r>
       <w:r>
-        <w:t xml:space="preserve">[85,87–90]</w:t>
+        <w:t xml:space="preserve">[87,89–92]</w:t>
       </w:r>
       <w:r>
         <w:t xml:space="preserve">.</w:t>
@@ -2488,7 +2452,7 @@
         <w:t xml:space="preserve"> </w:t>
       </w:r>
       <w:r>
-        <w:t xml:space="preserve">[91]</w:t>
+        <w:t xml:space="preserve">[93]</w:t>
       </w:r>
       <w:r>
         <w:t xml:space="preserve"> </w:t>
@@ -2500,7 +2464,7 @@
         <w:t xml:space="preserve"> </w:t>
       </w:r>
       <w:r>
-        <w:t xml:space="preserve">[92]</w:t>
+        <w:t xml:space="preserve">[94]</w:t>
       </w:r>
       <w:r>
         <w:t xml:space="preserve">. Plasticity can be captured by mapping trait development to the environment. In contrast, evolutionary change takes place in multivariate trait space where genetic variance and covariance between traits (i.e., constraints) along with varying patterns of selection can be used to predcit trait change across generations. One way to make such predictions is by using the multivariate breeders equation</w:t>
@@ -2509,7 +2473,7 @@
         <w:t xml:space="preserve"> </w:t>
       </w:r>
       <w:r>
-        <w:t xml:space="preserve">[93]</w:t>
+        <w:t xml:space="preserve">[95]</w:t>
       </w:r>
       <w:r>
         <w:t xml:space="preserve">:</w:t>
@@ -2731,7 +2695,7 @@
         <w:t xml:space="preserve"> </w:t>
       </w:r>
       <w:r>
-        <w:t xml:space="preserve">[94]</w:t>
+        <w:t xml:space="preserve">[96]</w:t>
       </w:r>
       <w:r>
         <w:t xml:space="preserve">). While the multivariate breeders equation can be useful for predicting short term evolutionary responses (i.e., one or a few generations) it is likely limited in predictive power over longer timespans because of changes in heritability and selection through time</w:t>
@@ -2740,7 +2704,7 @@
         <w:t xml:space="preserve"> </w:t>
       </w:r>
       <w:r>
-        <w:t xml:space="preserve">[86,94]</w:t>
+        <w:t xml:space="preserve">[88,96]</w:t>
       </w:r>
       <w:r>
         <w:t xml:space="preserve">.</w:t>
@@ -2766,7 +2730,7 @@
         <w:t xml:space="preserve"> </w:t>
       </w:r>
       <w:r>
-        <w:t xml:space="preserve">[95–100]</w:t>
+        <w:t xml:space="preserve">[97–102]</w:t>
       </w:r>
       <w:r>
         <w:t xml:space="preserve">. For example, using isogenic lines of</w:t>
@@ -2788,7 +2752,7 @@
         <w:t xml:space="preserve"> </w:t>
       </w:r>
       <w:r>
-        <w:t xml:space="preserve">[100]</w:t>
+        <w:t xml:space="preserve">[102]</w:t>
       </w:r>
       <w:r>
         <w:t xml:space="preserve"> </w:t>
@@ -2853,7 +2817,7 @@
         <w:t xml:space="preserve"> </w:t>
       </w:r>
       <w:r>
-        <w:t xml:space="preserve">[96]</w:t>
+        <w:t xml:space="preserve">[98]</w:t>
       </w:r>
       <w:r>
         <w:t xml:space="preserve">, and in locusts drought can also affect heat tolerance</w:t>
@@ -2862,7 +2826,7 @@
         <w:t xml:space="preserve"> </w:t>
       </w:r>
       <w:r>
-        <w:t xml:space="preserve">[95]</w:t>
+        <w:t xml:space="preserve">[97]</w:t>
       </w:r>
       <w:r>
         <w:t xml:space="preserve">.</w:t>
@@ -2920,7 +2884,7 @@
               <w:t xml:space="preserve"> </w:t>
             </w:r>
             <w:r>
-              <w:t xml:space="preserve">[101]</w:t>
+              <w:t xml:space="preserve">[103]</w:t>
             </w:r>
             <w:r>
               <w:t xml:space="preserve">. For example, loss of output from production ecosystems will have substantial economic consequences for the local area. Degradation of natural ecosystems may affect their regulating services, such as flood mitigation, affecting nearby areas. Impacts on cultural services may be severe for communities that are closely connected to a landscape.</w:t>
@@ -2937,7 +2901,7 @@
               <w:t xml:space="preserve"> </w:t>
             </w:r>
             <w:r>
-              <w:t xml:space="preserve">[102]</w:t>
+              <w:t xml:space="preserve">[104]</w:t>
             </w:r>
             <w:r>
               <w:t xml:space="preserve">. Thermal stressors may even influence producers’ psychological beliefs about their level of control over land management, and perceived resources available for management practices</w:t>
@@ -2946,7 +2910,7 @@
               <w:t xml:space="preserve"> </w:t>
             </w:r>
             <w:r>
-              <w:t xml:space="preserve">[103]</w:t>
+              <w:t xml:space="preserve">[105]</w:t>
             </w:r>
             <w:r>
               <w:t xml:space="preserve">. Thermal risks to ecosystems may also precipitate declines in individual wellbeing, and these consequences may accrue differently across regions and across peoples</w:t>
@@ -2955,7 +2919,7 @@
               <w:t xml:space="preserve"> </w:t>
             </w:r>
             <w:r>
-              <w:t xml:space="preserve">[104]</w:t>
+              <w:t xml:space="preserve">[106]</w:t>
             </w:r>
             <w:r>
               <w:t xml:space="preserve">, and compound or accelerate the prior responses. Many of these impacts and responses, however, are poorly understood.</w:t>
@@ -2972,7 +2936,7 @@
               <w:t xml:space="preserve"> </w:t>
             </w:r>
             <w:r>
-              <w:t xml:space="preserve">[105,106]</w:t>
+              <w:t xml:space="preserve">[107,108]</w:t>
             </w:r>
             <w:r>
               <w:t xml:space="preserve">. On the other hand, adapting thermal risks in upper stream producers may also be influenced by the perception and behaviour of downstream consumers</w:t>
@@ -2981,7 +2945,7 @@
               <w:t xml:space="preserve"> </w:t>
             </w:r>
             <w:r>
-              <w:t xml:space="preserve">[107]</w:t>
+              <w:t xml:space="preserve">[109]</w:t>
             </w:r>
             <w:r>
               <w:t xml:space="preserve">. The cascading</w:t>
@@ -2990,7 +2954,7 @@
               <w:t xml:space="preserve"> </w:t>
             </w:r>
             <w:r>
-              <w:t xml:space="preserve">[108]</w:t>
+              <w:t xml:space="preserve">[110]</w:t>
             </w:r>
             <w:r>
               <w:t xml:space="preserve"> </w:t>
@@ -3002,7 +2966,7 @@
               <w:t xml:space="preserve"> </w:t>
             </w:r>
             <w:r>
-              <w:t xml:space="preserve">[109]</w:t>
+              <w:t xml:space="preserve">[111]</w:t>
             </w:r>
             <w:r>
               <w:t xml:space="preserve"> </w:t>
@@ -3014,7 +2978,7 @@
               <w:t xml:space="preserve"> </w:t>
             </w:r>
             <w:r>
-              <w:t xml:space="preserve">[110]</w:t>
+              <w:t xml:space="preserve">[112]</w:t>
             </w:r>
             <w:r>
               <w:t xml:space="preserve">. These external pressures will interact with a system that is already constraint by multiple stressors, including direct impacts imposed by extreme heat and other aspects of clime change- to maintaining its normal functionality and the health and wellbeing of its citizens. If sufficiently widespread, economic and political destabilisation may occur as already observed in other parts of the world</w:t>
@@ -3023,7 +2987,7 @@
               <w:t xml:space="preserve"> </w:t>
             </w:r>
             <w:r>
-              <w:t xml:space="preserve">[111]</w:t>
+              <w:t xml:space="preserve">[113]</w:t>
             </w:r>
             <w:r>
               <w:t xml:space="preserve">, which could in turn affect the management of the original ecosystems.</w:t>
@@ -3040,7 +3004,7 @@
               <w:t xml:space="preserve"> </w:t>
             </w:r>
             <w:r>
-              <w:t xml:space="preserve">[112]</w:t>
+              <w:t xml:space="preserve">[114]</w:t>
             </w:r>
             <w:r>
               <w:t xml:space="preserve">. Social-ecological models aim to capture the social systems, natural systems and their interactions</w:t>
@@ -3049,7 +3013,7 @@
               <w:t xml:space="preserve"> </w:t>
             </w:r>
             <w:r>
-              <w:t xml:space="preserve">[113]</w:t>
+              <w:t xml:space="preserve">[115]</w:t>
             </w:r>
             <w:r>
               <w:t xml:space="preserve">. Such models can display non-trivial emergent behaviour resulting from complex interactions within the social-ecological systems. For example, responding to decreased productivity from thermal stress by farming more intensively could lead to a maladaptation or</w:t>
@@ -3070,7 +3034,7 @@
               <w:t xml:space="preserve"> </w:t>
             </w:r>
             <w:r>
-              <w:t xml:space="preserve">[114]</w:t>
+              <w:t xml:space="preserve">[116]</w:t>
             </w:r>
             <w:r>
               <w:t xml:space="preserve">.</w:t>
@@ -3090,7 +3054,7 @@
               <w:t xml:space="preserve"> </w:t>
             </w:r>
             <w:r>
-              <w:t xml:space="preserve">[115]</w:t>
+              <w:t xml:space="preserve">[117]</w:t>
             </w:r>
             <w:r>
               <w:t xml:space="preserve">. Process-based approaches are critical to understanding how emergent social-ecological phenomena develop</w:t>
@@ -3099,7 +3063,7 @@
               <w:t xml:space="preserve"> </w:t>
             </w:r>
             <w:r>
-              <w:t xml:space="preserve">[116]</w:t>
+              <w:t xml:space="preserve">[118]</w:t>
             </w:r>
             <w:r>
               <w:t xml:space="preserve">, such as tipping points, traps or other dynamics. Constructing process-based dynamical models requires knowledge and data about: the biophysical processes, which could be provided by the models from the previous sections; social processes, which could be developed from a combination of behavioural theory and empirical data; and interactions between them in the system of interest. Since obtaining all these data can be challenging, social-ecological modelling is often performed in an exploratory mode</w:t>
@@ -3108,7 +3072,7 @@
               <w:t xml:space="preserve"> </w:t>
             </w:r>
             <w:r>
-              <w:t xml:space="preserve">[117]</w:t>
+              <w:t xml:space="preserve">[119]</w:t>
             </w:r>
             <w:r>
               <w:t xml:space="preserve"> </w:t>
@@ -3437,7 +3401,7 @@
         <w:t xml:space="preserve"> </w:t>
       </w:r>
       <w:r>
-        <w:t xml:space="preserve">[97]</w:t>
+        <w:t xml:space="preserve">[99]</w:t>
       </w:r>
       <w:r>
         <w:t xml:space="preserve"> </w:t>
@@ -3493,7 +3457,7 @@
       </w:r>
     </w:p>
     <w:bookmarkEnd w:id="40"/>
-    <w:bookmarkStart w:id="159" w:name="references"/>
+    <w:bookmarkStart w:id="161" w:name="references"/>
     <w:p>
       <w:pPr>
         <w:pStyle w:val="Heading1"/>
@@ -3507,7 +3471,7 @@
         <w:pStyle w:val="FirstParagraph"/>
       </w:pPr>
     </w:p>
-    <w:bookmarkStart w:id="158" w:name="refs"/>
+    <w:bookmarkStart w:id="160" w:name="refs"/>
     <w:bookmarkStart w:id="41" w:name="ref-Barriopedro2023"/>
     <w:p>
       <w:pPr>
@@ -5657,7 +5621,7 @@
       </w:r>
     </w:p>
     <w:bookmarkEnd w:id="82"/>
-    <w:bookmarkStart w:id="83" w:name="ref-Duursma2015"/>
+    <w:bookmarkStart w:id="83" w:name="ref-Riddell2017"/>
     <w:p>
       <w:pPr>
         <w:pStyle w:val="Bibliography"/>
@@ -5672,6 +5636,57 @@
         <w:t xml:space="preserve">	</w:t>
       </w:r>
       <w:r>
+        <w:t xml:space="preserve">Riddell, E.A.</w:t>
+      </w:r>
+      <w:r>
+        <w:t xml:space="preserve"> </w:t>
+      </w:r>
+      <w:r>
+        <w:rPr>
+          <w:i/>
+          <w:iCs/>
+        </w:rPr>
+        <w:t xml:space="preserve">et al.</w:t>
+      </w:r>
+      <w:r>
+        <w:t xml:space="preserve"> </w:t>
+      </w:r>
+      <w:r>
+        <w:t xml:space="preserve">(2017) Physical calculations of resistance to water loss improve predictions of species range models.</w:t>
+      </w:r>
+      <w:r>
+        <w:t xml:space="preserve"> </w:t>
+      </w:r>
+      <w:r>
+        <w:rPr>
+          <w:i/>
+          <w:iCs/>
+        </w:rPr>
+        <w:t xml:space="preserve">Ecol. Monogr.</w:t>
+      </w:r>
+      <w:r>
+        <w:t xml:space="preserve"> </w:t>
+      </w:r>
+      <w:r>
+        <w:t xml:space="preserve">87, 21–33</w:t>
+      </w:r>
+    </w:p>
+    <w:bookmarkEnd w:id="83"/>
+    <w:bookmarkStart w:id="84" w:name="ref-Duursma2015"/>
+    <w:p>
+      <w:pPr>
+        <w:pStyle w:val="Bibliography"/>
+      </w:pPr>
+      <w:r>
+        <w:t xml:space="preserve">44.</w:t>
+      </w:r>
+      <w:r>
+        <w:t xml:space="preserve"> </w:t>
+      </w:r>
+      <w:r>
+        <w:t xml:space="preserve">	</w:t>
+      </w:r>
+      <w:r>
         <w:t xml:space="preserve">Duursma, R.A. (2015) Plantecophys–an</w:t>
       </w:r>
       <w:r>
@@ -5703,14 +5718,14 @@
         <w:t xml:space="preserve">10, e0143346</w:t>
       </w:r>
     </w:p>
-    <w:bookmarkEnd w:id="83"/>
-    <w:bookmarkStart w:id="84" w:name="ref-Briscoe2022"/>
+    <w:bookmarkEnd w:id="84"/>
+    <w:bookmarkStart w:id="85" w:name="ref-Briscoe2022"/>
     <w:p>
       <w:pPr>
         <w:pStyle w:val="Bibliography"/>
       </w:pPr>
       <w:r>
-        <w:t xml:space="preserve">44.</w:t>
+        <w:t xml:space="preserve">45.</w:t>
       </w:r>
       <w:r>
         <w:t xml:space="preserve"> </w:t>
@@ -5754,14 +5769,14 @@
         <w:t xml:space="preserve">15</w:t>
       </w:r>
     </w:p>
-    <w:bookmarkEnd w:id="84"/>
-    <w:bookmarkStart w:id="85" w:name="ref-Loughran2020"/>
+    <w:bookmarkEnd w:id="85"/>
+    <w:bookmarkStart w:id="86" w:name="ref-Loughran2020"/>
     <w:p>
       <w:pPr>
         <w:pStyle w:val="Bibliography"/>
       </w:pPr>
       <w:r>
-        <w:t xml:space="preserve">45.</w:t>
+        <w:t xml:space="preserve">46.</w:t>
       </w:r>
       <w:r>
         <w:t xml:space="preserve"> </w:t>
@@ -5789,14 +5804,14 @@
         <w:t xml:space="preserve">223, jeb224139</w:t>
       </w:r>
     </w:p>
-    <w:bookmarkEnd w:id="85"/>
-    <w:bookmarkStart w:id="86" w:name="ref-Sharpe2022"/>
+    <w:bookmarkEnd w:id="86"/>
+    <w:bookmarkStart w:id="87" w:name="ref-Sharpe2022"/>
     <w:p>
       <w:pPr>
         <w:pStyle w:val="Bibliography"/>
       </w:pPr>
       <w:r>
-        <w:t xml:space="preserve">46.</w:t>
+        <w:t xml:space="preserve">47.</w:t>
       </w:r>
       <w:r>
         <w:t xml:space="preserve"> </w:t>
@@ -5840,14 +5855,14 @@
         <w:t xml:space="preserve">10</w:t>
       </w:r>
     </w:p>
-    <w:bookmarkEnd w:id="86"/>
-    <w:bookmarkStart w:id="87" w:name="ref-Drake2018"/>
+    <w:bookmarkEnd w:id="87"/>
+    <w:bookmarkStart w:id="88" w:name="ref-Drake2018"/>
     <w:p>
       <w:pPr>
         <w:pStyle w:val="Bibliography"/>
       </w:pPr>
       <w:r>
-        <w:t xml:space="preserve">47.</w:t>
+        <w:t xml:space="preserve">48.</w:t>
       </w:r>
       <w:r>
         <w:t xml:space="preserve"> </w:t>
@@ -5891,14 +5906,14 @@
         <w:t xml:space="preserve">24, 2390–2402</w:t>
       </w:r>
     </w:p>
-    <w:bookmarkEnd w:id="87"/>
-    <w:bookmarkStart w:id="88" w:name="ref-Posch2024"/>
+    <w:bookmarkEnd w:id="88"/>
+    <w:bookmarkStart w:id="89" w:name="ref-Posch2024"/>
     <w:p>
       <w:pPr>
         <w:pStyle w:val="Bibliography"/>
       </w:pPr>
       <w:r>
-        <w:t xml:space="preserve">48.</w:t>
+        <w:t xml:space="preserve">49.</w:t>
       </w:r>
       <w:r>
         <w:t xml:space="preserve"> </w:t>
@@ -5942,14 +5957,14 @@
         <w:t xml:space="preserve">121, e2408583121</w:t>
       </w:r>
     </w:p>
-    <w:bookmarkEnd w:id="88"/>
-    <w:bookmarkStart w:id="89" w:name="ref-Orsted2022"/>
+    <w:bookmarkEnd w:id="89"/>
+    <w:bookmarkStart w:id="90" w:name="ref-Orsted2022"/>
     <w:p>
       <w:pPr>
         <w:pStyle w:val="Bibliography"/>
       </w:pPr>
       <w:r>
-        <w:t xml:space="preserve">49.</w:t>
+        <w:t xml:space="preserve">50.</w:t>
       </w:r>
       <w:r>
         <w:t xml:space="preserve"> </w:t>
@@ -6005,14 +6020,14 @@
         <w:t xml:space="preserve">225, jeb244514</w:t>
       </w:r>
     </w:p>
-    <w:bookmarkEnd w:id="89"/>
-    <w:bookmarkStart w:id="90" w:name="ref-Faber2024"/>
+    <w:bookmarkEnd w:id="90"/>
+    <w:bookmarkStart w:id="91" w:name="ref-Jagadish2021"/>
     <w:p>
       <w:pPr>
         <w:pStyle w:val="Bibliography"/>
       </w:pPr>
       <w:r>
-        <w:t xml:space="preserve">50.</w:t>
+        <w:t xml:space="preserve">51.</w:t>
       </w:r>
       <w:r>
         <w:t xml:space="preserve"> </w:t>
@@ -6021,6 +6036,57 @@
         <w:t xml:space="preserve">	</w:t>
       </w:r>
       <w:r>
+        <w:t xml:space="preserve">Jagadish, S.V.K.</w:t>
+      </w:r>
+      <w:r>
+        <w:t xml:space="preserve"> </w:t>
+      </w:r>
+      <w:r>
+        <w:rPr>
+          <w:i/>
+          <w:iCs/>
+        </w:rPr>
+        <w:t xml:space="preserve">et al.</w:t>
+      </w:r>
+      <w:r>
+        <w:t xml:space="preserve"> </w:t>
+      </w:r>
+      <w:r>
+        <w:t xml:space="preserve">(2021) Plant heat stress: Concepts directing future research.</w:t>
+      </w:r>
+      <w:r>
+        <w:t xml:space="preserve"> </w:t>
+      </w:r>
+      <w:r>
+        <w:rPr>
+          <w:i/>
+          <w:iCs/>
+        </w:rPr>
+        <w:t xml:space="preserve">Plant Cell Environ.</w:t>
+      </w:r>
+      <w:r>
+        <w:t xml:space="preserve"> </w:t>
+      </w:r>
+      <w:r>
+        <w:t xml:space="preserve">44, 1992–2005</w:t>
+      </w:r>
+    </w:p>
+    <w:bookmarkEnd w:id="91"/>
+    <w:bookmarkStart w:id="92" w:name="ref-Faber2024"/>
+    <w:p>
+      <w:pPr>
+        <w:pStyle w:val="Bibliography"/>
+      </w:pPr>
+      <w:r>
+        <w:t xml:space="preserve">52.</w:t>
+      </w:r>
+      <w:r>
+        <w:t xml:space="preserve"> </w:t>
+      </w:r>
+      <w:r>
+        <w:t xml:space="preserve">	</w:t>
+      </w:r>
+      <w:r>
         <w:t xml:space="preserve">Faber, A.H.</w:t>
       </w:r>
       <w:r>
@@ -6056,14 +6122,14 @@
         <w:t xml:space="preserve">75, 3467–3482</w:t>
       </w:r>
     </w:p>
-    <w:bookmarkEnd w:id="90"/>
-    <w:bookmarkStart w:id="91" w:name="ref-Martinez-De_Leon2024"/>
+    <w:bookmarkEnd w:id="92"/>
+    <w:bookmarkStart w:id="93" w:name="ref-Martinez-De_Leon2024"/>
     <w:p>
       <w:pPr>
         <w:pStyle w:val="Bibliography"/>
       </w:pPr>
       <w:r>
-        <w:t xml:space="preserve">51.</w:t>
+        <w:t xml:space="preserve">53.</w:t>
       </w:r>
       <w:r>
         <w:t xml:space="preserve"> </w:t>
@@ -6085,14 +6151,14 @@
         <w:t xml:space="preserve">Trends Ecol. Evol.</w:t>
       </w:r>
     </w:p>
-    <w:bookmarkEnd w:id="91"/>
-    <w:bookmarkStart w:id="92" w:name="ref-Fontaine2022"/>
+    <w:bookmarkEnd w:id="93"/>
+    <w:bookmarkStart w:id="94" w:name="ref-Fontaine2022"/>
     <w:p>
       <w:pPr>
         <w:pStyle w:val="Bibliography"/>
       </w:pPr>
       <w:r>
-        <w:t xml:space="preserve">52.</w:t>
+        <w:t xml:space="preserve">54.</w:t>
       </w:r>
       <w:r>
         <w:t xml:space="preserve"> </w:t>
@@ -6136,14 +6202,14 @@
         <w:t xml:space="preserve">6, 405–417</w:t>
       </w:r>
     </w:p>
-    <w:bookmarkEnd w:id="92"/>
-    <w:bookmarkStart w:id="93" w:name="ref-Fontaine2023"/>
+    <w:bookmarkEnd w:id="94"/>
+    <w:bookmarkStart w:id="95" w:name="ref-Fontaine2023"/>
     <w:p>
       <w:pPr>
         <w:pStyle w:val="Bibliography"/>
       </w:pPr>
       <w:r>
-        <w:t xml:space="preserve">53.</w:t>
+        <w:t xml:space="preserve">55.</w:t>
       </w:r>
       <w:r>
         <w:t xml:space="preserve"> </w:t>
@@ -6171,14 +6237,14 @@
         <w:t xml:space="preserve">226, jeb245191</w:t>
       </w:r>
     </w:p>
-    <w:bookmarkEnd w:id="93"/>
-    <w:bookmarkStart w:id="94" w:name="ref-Hoang2019"/>
+    <w:bookmarkEnd w:id="95"/>
+    <w:bookmarkStart w:id="96" w:name="ref-Hoang2019"/>
     <w:p>
       <w:pPr>
         <w:pStyle w:val="Bibliography"/>
       </w:pPr>
       <w:r>
-        <w:t xml:space="preserve">54.</w:t>
+        <w:t xml:space="preserve">56.</w:t>
       </w:r>
       <w:r>
         <w:t xml:space="preserve"> </w:t>
@@ -6222,14 +6288,14 @@
         <w:t xml:space="preserve">9, 3491–3499</w:t>
       </w:r>
     </w:p>
-    <w:bookmarkEnd w:id="94"/>
-    <w:bookmarkStart w:id="95" w:name="ref-Gehman2019"/>
+    <w:bookmarkEnd w:id="96"/>
+    <w:bookmarkStart w:id="97" w:name="ref-Gehman2019"/>
     <w:p>
       <w:pPr>
         <w:pStyle w:val="Bibliography"/>
       </w:pPr>
       <w:r>
-        <w:t xml:space="preserve">55.</w:t>
+        <w:t xml:space="preserve">57.</w:t>
       </w:r>
       <w:r>
         <w:t xml:space="preserve"> </w:t>
@@ -6257,14 +6323,14 @@
         <w:t xml:space="preserve">10, e02683</w:t>
       </w:r>
     </w:p>
-    <w:bookmarkEnd w:id="95"/>
-    <w:bookmarkStart w:id="96" w:name="ref-Hoang2021"/>
+    <w:bookmarkEnd w:id="97"/>
+    <w:bookmarkStart w:id="98" w:name="ref-Hoang2021"/>
     <w:p>
       <w:pPr>
         <w:pStyle w:val="Bibliography"/>
       </w:pPr>
       <w:r>
-        <w:t xml:space="preserve">56.</w:t>
+        <w:t xml:space="preserve">58.</w:t>
       </w:r>
       <w:r>
         <w:t xml:space="preserve"> </w:t>
@@ -6308,14 +6374,14 @@
         <w:t xml:space="preserve">5, 118–129</w:t>
       </w:r>
     </w:p>
-    <w:bookmarkEnd w:id="96"/>
-    <w:bookmarkStart w:id="97" w:name="ref-Corbin2016"/>
+    <w:bookmarkEnd w:id="98"/>
+    <w:bookmarkStart w:id="99" w:name="ref-Corbin2016"/>
     <w:p>
       <w:pPr>
         <w:pStyle w:val="Bibliography"/>
       </w:pPr>
       <w:r>
-        <w:t xml:space="preserve">57.</w:t>
+        <w:t xml:space="preserve">59.</w:t>
       </w:r>
       <w:r>
         <w:t xml:space="preserve"> </w:t>
@@ -6359,14 +6425,14 @@
         <w:t xml:space="preserve">118, 10–20</w:t>
       </w:r>
     </w:p>
-    <w:bookmarkEnd w:id="97"/>
-    <w:bookmarkStart w:id="98" w:name="ref-Zhang2019"/>
+    <w:bookmarkEnd w:id="99"/>
+    <w:bookmarkStart w:id="100" w:name="ref-Zhang2019"/>
     <w:p>
       <w:pPr>
         <w:pStyle w:val="Bibliography"/>
       </w:pPr>
       <w:r>
-        <w:t xml:space="preserve">58.</w:t>
+        <w:t xml:space="preserve">60.</w:t>
       </w:r>
       <w:r>
         <w:t xml:space="preserve"> </w:t>
@@ -6410,14 +6476,14 @@
         <w:t xml:space="preserve">116, 24712–24718</w:t>
       </w:r>
     </w:p>
-    <w:bookmarkEnd w:id="98"/>
-    <w:bookmarkStart w:id="99" w:name="ref-Dunbar2007"/>
+    <w:bookmarkEnd w:id="100"/>
+    <w:bookmarkStart w:id="101" w:name="ref-Dunbar2007"/>
     <w:p>
       <w:pPr>
         <w:pStyle w:val="Bibliography"/>
       </w:pPr>
       <w:r>
-        <w:t xml:space="preserve">59.</w:t>
+        <w:t xml:space="preserve">61.</w:t>
       </w:r>
       <w:r>
         <w:t xml:space="preserve"> </w:t>
@@ -6461,14 +6527,14 @@
         <w:t xml:space="preserve">5, e96</w:t>
       </w:r>
     </w:p>
-    <w:bookmarkEnd w:id="99"/>
-    <w:bookmarkStart w:id="100" w:name="ref-Chouhan2023"/>
+    <w:bookmarkEnd w:id="101"/>
+    <w:bookmarkStart w:id="102" w:name="ref-Chouhan2023"/>
     <w:p>
       <w:pPr>
         <w:pStyle w:val="Bibliography"/>
       </w:pPr>
       <w:r>
-        <w:t xml:space="preserve">60.</w:t>
+        <w:t xml:space="preserve">62.</w:t>
       </w:r>
       <w:r>
         <w:t xml:space="preserve"> </w:t>
@@ -6509,14 +6575,14 @@
         <w:t xml:space="preserve">, pp. 127–147, Springer Nature Singapore</w:t>
       </w:r>
     </w:p>
-    <w:bookmarkEnd w:id="100"/>
-    <w:bookmarkStart w:id="101" w:name="ref-Liu2025"/>
+    <w:bookmarkEnd w:id="102"/>
+    <w:bookmarkStart w:id="103" w:name="ref-Liu2025"/>
     <w:p>
       <w:pPr>
         <w:pStyle w:val="Bibliography"/>
       </w:pPr>
       <w:r>
-        <w:t xml:space="preserve">61.</w:t>
+        <w:t xml:space="preserve">63.</w:t>
       </w:r>
       <w:r>
         <w:t xml:space="preserve"> </w:t>
@@ -6560,14 +6626,14 @@
         <w:t xml:space="preserve">23, 986–998</w:t>
       </w:r>
     </w:p>
-    <w:bookmarkEnd w:id="101"/>
-    <w:bookmarkStart w:id="102" w:name="ref-Marquez2007"/>
+    <w:bookmarkEnd w:id="103"/>
+    <w:bookmarkStart w:id="104" w:name="ref-Marquez2007"/>
     <w:p>
       <w:pPr>
         <w:pStyle w:val="Bibliography"/>
       </w:pPr>
       <w:r>
-        <w:t xml:space="preserve">62.</w:t>
+        <w:t xml:space="preserve">64.</w:t>
       </w:r>
       <w:r>
         <w:t xml:space="preserve"> </w:t>
@@ -6611,14 +6677,14 @@
         <w:t xml:space="preserve">315, 513–515</w:t>
       </w:r>
     </w:p>
-    <w:bookmarkEnd w:id="102"/>
-    <w:bookmarkStart w:id="103" w:name="ref-Huang2019"/>
+    <w:bookmarkEnd w:id="104"/>
+    <w:bookmarkStart w:id="105" w:name="ref-Huang2019"/>
     <w:p>
       <w:pPr>
         <w:pStyle w:val="Bibliography"/>
       </w:pPr>
       <w:r>
-        <w:t xml:space="preserve">63.</w:t>
+        <w:t xml:space="preserve">65.</w:t>
       </w:r>
       <w:r>
         <w:t xml:space="preserve"> </w:t>
@@ -6662,14 +6728,14 @@
         <w:t xml:space="preserve">364, eaau6389</w:t>
       </w:r>
     </w:p>
-    <w:bookmarkEnd w:id="103"/>
-    <w:bookmarkStart w:id="104" w:name="ref-Dastogeer2022"/>
+    <w:bookmarkEnd w:id="105"/>
+    <w:bookmarkStart w:id="106" w:name="ref-Dastogeer2022"/>
     <w:p>
       <w:pPr>
         <w:pStyle w:val="Bibliography"/>
       </w:pPr>
       <w:r>
-        <w:t xml:space="preserve">64.</w:t>
+        <w:t xml:space="preserve">66.</w:t>
       </w:r>
       <w:r>
         <w:t xml:space="preserve"> </w:t>
@@ -6713,14 +6779,14 @@
         <w:t xml:space="preserve">13, 833566</w:t>
       </w:r>
     </w:p>
-    <w:bookmarkEnd w:id="104"/>
-    <w:bookmarkStart w:id="105" w:name="ref-Shekhawat2022"/>
+    <w:bookmarkEnd w:id="106"/>
+    <w:bookmarkStart w:id="107" w:name="ref-Shekhawat2022"/>
     <w:p>
       <w:pPr>
         <w:pStyle w:val="Bibliography"/>
       </w:pPr>
       <w:r>
-        <w:t xml:space="preserve">65.</w:t>
+        <w:t xml:space="preserve">67.</w:t>
       </w:r>
       <w:r>
         <w:t xml:space="preserve"> </w:t>
@@ -6764,14 +6830,14 @@
         <w:t xml:space="preserve">27, 802–813</w:t>
       </w:r>
     </w:p>
-    <w:bookmarkEnd w:id="105"/>
-    <w:bookmarkStart w:id="106" w:name="ref-Lobell2012"/>
+    <w:bookmarkEnd w:id="107"/>
+    <w:bookmarkStart w:id="108" w:name="ref-Lobell2012"/>
     <w:p>
       <w:pPr>
         <w:pStyle w:val="Bibliography"/>
       </w:pPr>
       <w:r>
-        <w:t xml:space="preserve">66.</w:t>
+        <w:t xml:space="preserve">68.</w:t>
       </w:r>
       <w:r>
         <w:t xml:space="preserve"> </w:t>
@@ -6815,14 +6881,14 @@
         <w:t xml:space="preserve">2, 186–189</w:t>
       </w:r>
     </w:p>
-    <w:bookmarkEnd w:id="106"/>
-    <w:bookmarkStart w:id="107" w:name="ref-Farooq2011"/>
+    <w:bookmarkEnd w:id="108"/>
+    <w:bookmarkStart w:id="109" w:name="ref-Farooq2011"/>
     <w:p>
       <w:pPr>
         <w:pStyle w:val="Bibliography"/>
       </w:pPr>
       <w:r>
-        <w:t xml:space="preserve">67.</w:t>
+        <w:t xml:space="preserve">69.</w:t>
       </w:r>
       <w:r>
         <w:t xml:space="preserve"> </w:t>
@@ -6866,14 +6932,14 @@
         <w:t xml:space="preserve">30, 491–507</w:t>
       </w:r>
     </w:p>
-    <w:bookmarkEnd w:id="107"/>
-    <w:bookmarkStart w:id="108" w:name="ref-He2025"/>
+    <w:bookmarkEnd w:id="109"/>
+    <w:bookmarkStart w:id="110" w:name="ref-He2025"/>
     <w:p>
       <w:pPr>
         <w:pStyle w:val="Bibliography"/>
       </w:pPr>
       <w:r>
-        <w:t xml:space="preserve">68.</w:t>
+        <w:t xml:space="preserve">70.</w:t>
       </w:r>
       <w:r>
         <w:t xml:space="preserve"> </w:t>
@@ -6911,14 +6977,14 @@
         <w:t xml:space="preserve">Journal of Experimental Botany (in press)</w:t>
       </w:r>
     </w:p>
-    <w:bookmarkEnd w:id="108"/>
-    <w:bookmarkStart w:id="109" w:name="ref-Zhang2021"/>
+    <w:bookmarkEnd w:id="110"/>
+    <w:bookmarkStart w:id="111" w:name="ref-Zhang2021"/>
     <w:p>
       <w:pPr>
         <w:pStyle w:val="Bibliography"/>
       </w:pPr>
       <w:r>
-        <w:t xml:space="preserve">69.</w:t>
+        <w:t xml:space="preserve">71.</w:t>
       </w:r>
       <w:r>
         <w:t xml:space="preserve"> </w:t>
@@ -6962,14 +7028,14 @@
         <w:t xml:space="preserve">7, 864–876</w:t>
       </w:r>
     </w:p>
-    <w:bookmarkEnd w:id="109"/>
-    <w:bookmarkStart w:id="110" w:name="ref-Zhang2023a"/>
+    <w:bookmarkEnd w:id="111"/>
+    <w:bookmarkStart w:id="112" w:name="ref-Zhang2023a"/>
     <w:p>
       <w:pPr>
         <w:pStyle w:val="Bibliography"/>
       </w:pPr>
       <w:r>
-        <w:t xml:space="preserve">70.</w:t>
+        <w:t xml:space="preserve">72.</w:t>
       </w:r>
       <w:r>
         <w:t xml:space="preserve"> </w:t>
@@ -7013,14 +7079,14 @@
         <w:t xml:space="preserve">56, 1013–1070</w:t>
       </w:r>
     </w:p>
-    <w:bookmarkEnd w:id="110"/>
-    <w:bookmarkStart w:id="111" w:name="ref-Nisbet2000"/>
+    <w:bookmarkEnd w:id="112"/>
+    <w:bookmarkStart w:id="113" w:name="ref-Nisbet2000"/>
     <w:p>
       <w:pPr>
         <w:pStyle w:val="Bibliography"/>
       </w:pPr>
       <w:r>
-        <w:t xml:space="preserve">71.</w:t>
+        <w:t xml:space="preserve">73.</w:t>
       </w:r>
       <w:r>
         <w:t xml:space="preserve"> </w:t>
@@ -7064,14 +7130,14 @@
         <w:t xml:space="preserve">69, 913–926</w:t>
       </w:r>
     </w:p>
-    <w:bookmarkEnd w:id="111"/>
-    <w:bookmarkStart w:id="112" w:name="ref-Jager2020"/>
+    <w:bookmarkEnd w:id="113"/>
+    <w:bookmarkStart w:id="114" w:name="ref-Jager2020"/>
     <w:p>
       <w:pPr>
         <w:pStyle w:val="Bibliography"/>
       </w:pPr>
       <w:r>
-        <w:t xml:space="preserve">72.</w:t>
+        <w:t xml:space="preserve">74.</w:t>
       </w:r>
       <w:r>
         <w:t xml:space="preserve"> </w:t>
@@ -7111,14 +7177,14 @@
         <w:t xml:space="preserve">416, 108904</w:t>
       </w:r>
     </w:p>
-    <w:bookmarkEnd w:id="112"/>
-    <w:bookmarkStart w:id="113" w:name="ref-Haberle2025"/>
+    <w:bookmarkEnd w:id="114"/>
+    <w:bookmarkStart w:id="115" w:name="ref-Haberle2025"/>
     <w:p>
       <w:pPr>
         <w:pStyle w:val="Bibliography"/>
       </w:pPr>
       <w:r>
-        <w:t xml:space="preserve">73.</w:t>
+        <w:t xml:space="preserve">75.</w:t>
       </w:r>
       <w:r>
         <w:t xml:space="preserve"> </w:t>
@@ -7162,14 +7228,14 @@
         <w:t xml:space="preserve">958, 177664</w:t>
       </w:r>
     </w:p>
-    <w:bookmarkEnd w:id="113"/>
-    <w:bookmarkStart w:id="114" w:name="ref-Kearney2013"/>
+    <w:bookmarkEnd w:id="115"/>
+    <w:bookmarkStart w:id="116" w:name="ref-Kearney2013"/>
     <w:p>
       <w:pPr>
         <w:pStyle w:val="Bibliography"/>
       </w:pPr>
       <w:r>
-        <w:t xml:space="preserve">74.</w:t>
+        <w:t xml:space="preserve">76.</w:t>
       </w:r>
       <w:r>
         <w:t xml:space="preserve"> </w:t>
@@ -7213,14 +7279,14 @@
         <w:t xml:space="preserve">27, 950–966</w:t>
       </w:r>
     </w:p>
-    <w:bookmarkEnd w:id="114"/>
-    <w:bookmarkStart w:id="115" w:name="ref-Kearney2010"/>
+    <w:bookmarkEnd w:id="116"/>
+    <w:bookmarkStart w:id="117" w:name="ref-Kearney2010"/>
     <w:p>
       <w:pPr>
         <w:pStyle w:val="Bibliography"/>
       </w:pPr>
       <w:r>
-        <w:t xml:space="preserve">75.</w:t>
+        <w:t xml:space="preserve">77.</w:t>
       </w:r>
       <w:r>
         <w:t xml:space="preserve"> </w:t>
@@ -7264,14 +7330,14 @@
         <w:t xml:space="preserve">365, 3469–3483</w:t>
       </w:r>
     </w:p>
-    <w:bookmarkEnd w:id="115"/>
-    <w:bookmarkStart w:id="116" w:name="ref-Marques2018"/>
+    <w:bookmarkEnd w:id="117"/>
+    <w:bookmarkStart w:id="118" w:name="ref-Marques2018"/>
     <w:p>
       <w:pPr>
         <w:pStyle w:val="Bibliography"/>
       </w:pPr>
       <w:r>
-        <w:t xml:space="preserve">76.</w:t>
+        <w:t xml:space="preserve">78.</w:t>
       </w:r>
       <w:r>
         <w:t xml:space="preserve"> </w:t>
@@ -7327,14 +7393,14 @@
         <w:t xml:space="preserve">14, e1006100</w:t>
       </w:r>
     </w:p>
-    <w:bookmarkEnd w:id="116"/>
-    <w:bookmarkStart w:id="117" w:name="ref-Kooijman2021"/>
+    <w:bookmarkEnd w:id="118"/>
+    <w:bookmarkStart w:id="119" w:name="ref-Kooijman2021"/>
     <w:p>
       <w:pPr>
         <w:pStyle w:val="Bibliography"/>
       </w:pPr>
       <w:r>
-        <w:t xml:space="preserve">77.</w:t>
+        <w:t xml:space="preserve">79.</w:t>
       </w:r>
       <w:r>
         <w:t xml:space="preserve"> </w:t>
@@ -7378,14 +7444,14 @@
         <w:t xml:space="preserve">9, coab086</w:t>
       </w:r>
     </w:p>
-    <w:bookmarkEnd w:id="117"/>
-    <w:bookmarkStart w:id="118" w:name="ref-Bruggeman2009"/>
+    <w:bookmarkEnd w:id="119"/>
+    <w:bookmarkStart w:id="120" w:name="ref-Bruggeman2009"/>
     <w:p>
       <w:pPr>
         <w:pStyle w:val="Bibliography"/>
       </w:pPr>
       <w:r>
-        <w:t xml:space="preserve">78.</w:t>
+        <w:t xml:space="preserve">80.</w:t>
       </w:r>
       <w:r>
         <w:t xml:space="preserve"> </w:t>
@@ -7438,14 +7504,14 @@
         <w:t xml:space="preserve">37, W179–W184</w:t>
       </w:r>
     </w:p>
-    <w:bookmarkEnd w:id="118"/>
-    <w:bookmarkStart w:id="119" w:name="ref-Kearney2020a"/>
+    <w:bookmarkEnd w:id="120"/>
+    <w:bookmarkStart w:id="121" w:name="ref-Kearney2020a"/>
     <w:p>
       <w:pPr>
         <w:pStyle w:val="Bibliography"/>
       </w:pPr>
       <w:r>
-        <w:t xml:space="preserve">79.</w:t>
+        <w:t xml:space="preserve">81.</w:t>
       </w:r>
       <w:r>
         <w:t xml:space="preserve"> </w:t>
@@ -7497,14 +7563,14 @@
         <w:t xml:space="preserve">43, 85–96</w:t>
       </w:r>
     </w:p>
-    <w:bookmarkEnd w:id="119"/>
-    <w:bookmarkStart w:id="120" w:name="ref-Ricker1954a"/>
+    <w:bookmarkEnd w:id="121"/>
+    <w:bookmarkStart w:id="122" w:name="ref-Ricker1954a"/>
     <w:p>
       <w:pPr>
         <w:pStyle w:val="Bibliography"/>
       </w:pPr>
       <w:r>
-        <w:t xml:space="preserve">80.</w:t>
+        <w:t xml:space="preserve">82.</w:t>
       </w:r>
       <w:r>
         <w:t xml:space="preserve"> </w:t>
@@ -7532,14 +7598,14 @@
         <w:t xml:space="preserve">11, 559–623</w:t>
       </w:r>
     </w:p>
-    <w:bookmarkEnd w:id="120"/>
-    <w:bookmarkStart w:id="121" w:name="ref-Beverton2012"/>
+    <w:bookmarkEnd w:id="122"/>
+    <w:bookmarkStart w:id="123" w:name="ref-Beverton2012"/>
     <w:p>
       <w:pPr>
         <w:pStyle w:val="Bibliography"/>
       </w:pPr>
       <w:r>
-        <w:t xml:space="preserve">81.</w:t>
+        <w:t xml:space="preserve">83.</w:t>
       </w:r>
       <w:r>
         <w:t xml:space="preserve"> </w:t>
@@ -7564,14 +7630,14 @@
         <w:t xml:space="preserve">, Springer</w:t>
       </w:r>
     </w:p>
-    <w:bookmarkEnd w:id="121"/>
-    <w:bookmarkStart w:id="122" w:name="ref-Bertness1994"/>
+    <w:bookmarkEnd w:id="123"/>
+    <w:bookmarkStart w:id="124" w:name="ref-Bertness1994"/>
     <w:p>
       <w:pPr>
         <w:pStyle w:val="Bibliography"/>
       </w:pPr>
       <w:r>
-        <w:t xml:space="preserve">82.</w:t>
+        <w:t xml:space="preserve">84.</w:t>
       </w:r>
       <w:r>
         <w:t xml:space="preserve"> </w:t>
@@ -7599,14 +7665,14 @@
         <w:t xml:space="preserve">9, 191–193</w:t>
       </w:r>
     </w:p>
-    <w:bookmarkEnd w:id="122"/>
-    <w:bookmarkStart w:id="123" w:name="ref-Weiss-Lehman2022"/>
+    <w:bookmarkEnd w:id="124"/>
+    <w:bookmarkStart w:id="125" w:name="ref-Weiss-Lehman2022"/>
     <w:p>
       <w:pPr>
         <w:pStyle w:val="Bibliography"/>
       </w:pPr>
       <w:r>
-        <w:t xml:space="preserve">83.</w:t>
+        <w:t xml:space="preserve">85.</w:t>
       </w:r>
       <w:r>
         <w:t xml:space="preserve"> </w:t>
@@ -7650,14 +7716,14 @@
         <w:t xml:space="preserve">25, 1263–1276</w:t>
       </w:r>
     </w:p>
-    <w:bookmarkEnd w:id="123"/>
-    <w:bookmarkStart w:id="124" w:name="ref-Chevin2017"/>
+    <w:bookmarkEnd w:id="125"/>
+    <w:bookmarkStart w:id="126" w:name="ref-Chevin2017"/>
     <w:p>
       <w:pPr>
         <w:pStyle w:val="Bibliography"/>
       </w:pPr>
       <w:r>
-        <w:t xml:space="preserve">84.</w:t>
+        <w:t xml:space="preserve">86.</w:t>
       </w:r>
       <w:r>
         <w:t xml:space="preserve"> </w:t>
@@ -7685,14 +7751,14 @@
         <w:t xml:space="preserve">372</w:t>
       </w:r>
     </w:p>
-    <w:bookmarkEnd w:id="124"/>
-    <w:bookmarkStart w:id="125" w:name="ref-Urban2024"/>
+    <w:bookmarkEnd w:id="126"/>
+    <w:bookmarkStart w:id="127" w:name="ref-Urban2024"/>
     <w:p>
       <w:pPr>
         <w:pStyle w:val="Bibliography"/>
       </w:pPr>
       <w:r>
-        <w:t xml:space="preserve">85.</w:t>
+        <w:t xml:space="preserve">87.</w:t>
       </w:r>
       <w:r>
         <w:t xml:space="preserve"> </w:t>
@@ -7736,14 +7802,14 @@
         <w:t xml:space="preserve">8, 172–187</w:t>
       </w:r>
     </w:p>
-    <w:bookmarkEnd w:id="125"/>
-    <w:bookmarkStart w:id="126" w:name="ref-Hoffmann2011"/>
+    <w:bookmarkEnd w:id="127"/>
+    <w:bookmarkStart w:id="128" w:name="ref-Hoffmann2011"/>
     <w:p>
       <w:pPr>
         <w:pStyle w:val="Bibliography"/>
       </w:pPr>
       <w:r>
-        <w:t xml:space="preserve">86.</w:t>
+        <w:t xml:space="preserve">88.</w:t>
       </w:r>
       <w:r>
         <w:t xml:space="preserve"> </w:t>
@@ -7755,14 +7821,14 @@
         <w:t xml:space="preserve">Hoffmann, A.A. and Sgrò, C.M. (2011) Climate change and evolutionary adaptation. 470, 479–485</w:t>
       </w:r>
     </w:p>
-    <w:bookmarkEnd w:id="126"/>
-    <w:bookmarkStart w:id="127" w:name="ref-Hoffmann2022"/>
+    <w:bookmarkEnd w:id="128"/>
+    <w:bookmarkStart w:id="129" w:name="ref-Hoffmann2022"/>
     <w:p>
       <w:pPr>
         <w:pStyle w:val="Bibliography"/>
       </w:pPr>
       <w:r>
-        <w:t xml:space="preserve">87.</w:t>
+        <w:t xml:space="preserve">89.</w:t>
       </w:r>
       <w:r>
         <w:t xml:space="preserve"> </w:t>
@@ -7790,14 +7856,14 @@
         <w:t xml:space="preserve">2022</w:t>
       </w:r>
     </w:p>
-    <w:bookmarkEnd w:id="127"/>
-    <w:bookmarkStart w:id="128" w:name="ref-Ghalambor2015"/>
+    <w:bookmarkEnd w:id="129"/>
+    <w:bookmarkStart w:id="130" w:name="ref-Ghalambor2015"/>
     <w:p>
       <w:pPr>
         <w:pStyle w:val="Bibliography"/>
       </w:pPr>
       <w:r>
-        <w:t xml:space="preserve">88.</w:t>
+        <w:t xml:space="preserve">90.</w:t>
       </w:r>
       <w:r>
         <w:t xml:space="preserve"> </w:t>
@@ -7841,14 +7907,14 @@
         <w:t xml:space="preserve">525, 372–375</w:t>
       </w:r>
     </w:p>
-    <w:bookmarkEnd w:id="128"/>
-    <w:bookmarkStart w:id="129" w:name="ref-Oostra2018"/>
+    <w:bookmarkEnd w:id="130"/>
+    <w:bookmarkStart w:id="131" w:name="ref-Oostra2018"/>
     <w:p>
       <w:pPr>
         <w:pStyle w:val="Bibliography"/>
       </w:pPr>
       <w:r>
-        <w:t xml:space="preserve">89.</w:t>
+        <w:t xml:space="preserve">91.</w:t>
       </w:r>
       <w:r>
         <w:t xml:space="preserve"> </w:t>
@@ -7892,14 +7958,14 @@
         <w:t xml:space="preserve">9, 1005</w:t>
       </w:r>
     </w:p>
-    <w:bookmarkEnd w:id="129"/>
-    <w:bookmarkStart w:id="130" w:name="ref-Noble2019"/>
+    <w:bookmarkEnd w:id="131"/>
+    <w:bookmarkStart w:id="132" w:name="ref-Noble2019"/>
     <w:p>
       <w:pPr>
         <w:pStyle w:val="Bibliography"/>
       </w:pPr>
       <w:r>
-        <w:t xml:space="preserve">90.</w:t>
+        <w:t xml:space="preserve">92.</w:t>
       </w:r>
       <w:r>
         <w:t xml:space="preserve"> </w:t>
@@ -7943,14 +8009,14 @@
         <w:t xml:space="preserve">116, 13452–13461</w:t>
       </w:r>
     </w:p>
-    <w:bookmarkEnd w:id="130"/>
-    <w:bookmarkStart w:id="131" w:name="ref-Sousa2010"/>
+    <w:bookmarkEnd w:id="132"/>
+    <w:bookmarkStart w:id="133" w:name="ref-Sousa2010"/>
     <w:p>
       <w:pPr>
         <w:pStyle w:val="Bibliography"/>
       </w:pPr>
       <w:r>
-        <w:t xml:space="preserve">91.</w:t>
+        <w:t xml:space="preserve">93.</w:t>
       </w:r>
       <w:r>
         <w:t xml:space="preserve"> </w:t>
@@ -7994,14 +8060,14 @@
         <w:t xml:space="preserve">365, 3413–3428</w:t>
       </w:r>
     </w:p>
-    <w:bookmarkEnd w:id="131"/>
-    <w:bookmarkStart w:id="132" w:name="ref-Stinchcombe2012"/>
+    <w:bookmarkEnd w:id="133"/>
+    <w:bookmarkStart w:id="134" w:name="ref-Stinchcombe2012"/>
     <w:p>
       <w:pPr>
         <w:pStyle w:val="Bibliography"/>
       </w:pPr>
       <w:r>
-        <w:t xml:space="preserve">92.</w:t>
+        <w:t xml:space="preserve">94.</w:t>
       </w:r>
       <w:r>
         <w:t xml:space="preserve"> </w:t>
@@ -8045,14 +8111,14 @@
         <w:t xml:space="preserve">27, 637–647</w:t>
       </w:r>
     </w:p>
-    <w:bookmarkEnd w:id="132"/>
-    <w:bookmarkStart w:id="133" w:name="ref-Lande1979"/>
+    <w:bookmarkEnd w:id="134"/>
+    <w:bookmarkStart w:id="135" w:name="ref-Lande1979"/>
     <w:p>
       <w:pPr>
         <w:pStyle w:val="Bibliography"/>
       </w:pPr>
       <w:r>
-        <w:t xml:space="preserve">93.</w:t>
+        <w:t xml:space="preserve">95.</w:t>
       </w:r>
       <w:r>
         <w:t xml:space="preserve"> </w:t>
@@ -8080,14 +8146,14 @@
         <w:t xml:space="preserve">33</w:t>
       </w:r>
     </w:p>
-    <w:bookmarkEnd w:id="133"/>
-    <w:bookmarkStart w:id="134" w:name="ref-Walsh2018"/>
+    <w:bookmarkEnd w:id="135"/>
+    <w:bookmarkStart w:id="136" w:name="ref-Walsh2018"/>
     <w:p>
       <w:pPr>
         <w:pStyle w:val="Bibliography"/>
       </w:pPr>
       <w:r>
-        <w:t xml:space="preserve">94.</w:t>
+        <w:t xml:space="preserve">96.</w:t>
       </w:r>
       <w:r>
         <w:t xml:space="preserve"> </w:t>
@@ -8112,14 +8178,14 @@
         <w:t xml:space="preserve">, Oxford University Press</w:t>
       </w:r>
     </w:p>
-    <w:bookmarkEnd w:id="134"/>
-    <w:bookmarkStart w:id="135" w:name="ref-Youngblood2025"/>
+    <w:bookmarkEnd w:id="136"/>
+    <w:bookmarkStart w:id="137" w:name="ref-Youngblood2025"/>
     <w:p>
       <w:pPr>
         <w:pStyle w:val="Bibliography"/>
       </w:pPr>
       <w:r>
-        <w:t xml:space="preserve">95.</w:t>
+        <w:t xml:space="preserve">97.</w:t>
       </w:r>
       <w:r>
         <w:t xml:space="preserve"> </w:t>
@@ -8157,14 +8223,14 @@
         <w:t xml:space="preserve">Funct. Ecol.</w:t>
       </w:r>
     </w:p>
-    <w:bookmarkEnd w:id="135"/>
-    <w:bookmarkStart w:id="136" w:name="ref-Baeza_Icaza2025"/>
+    <w:bookmarkEnd w:id="137"/>
+    <w:bookmarkStart w:id="138" w:name="ref-Baeza_Icaza2025"/>
     <w:p>
       <w:pPr>
         <w:pStyle w:val="Bibliography"/>
       </w:pPr>
       <w:r>
-        <w:t xml:space="preserve">96.</w:t>
+        <w:t xml:space="preserve">98.</w:t>
       </w:r>
       <w:r>
         <w:t xml:space="preserve"> </w:t>
@@ -8208,14 +8274,14 @@
         <w:t xml:space="preserve">94, 896–907</w:t>
       </w:r>
     </w:p>
-    <w:bookmarkEnd w:id="136"/>
-    <w:bookmarkStart w:id="137" w:name="ref-Kearney2009a"/>
+    <w:bookmarkEnd w:id="138"/>
+    <w:bookmarkStart w:id="139" w:name="ref-Kearney2009a"/>
     <w:p>
       <w:pPr>
         <w:pStyle w:val="Bibliography"/>
       </w:pPr>
       <w:r>
-        <w:t xml:space="preserve">97.</w:t>
+        <w:t xml:space="preserve">99.</w:t>
       </w:r>
       <w:r>
         <w:t xml:space="preserve"> </w:t>
@@ -8259,14 +8325,14 @@
         <w:t xml:space="preserve">23, 528–538</w:t>
       </w:r>
     </w:p>
-    <w:bookmarkEnd w:id="137"/>
-    <w:bookmarkStart w:id="138" w:name="ref-Ellner2011"/>
+    <w:bookmarkEnd w:id="139"/>
+    <w:bookmarkStart w:id="140" w:name="ref-Ellner2011"/>
     <w:p>
       <w:pPr>
         <w:pStyle w:val="Bibliography"/>
       </w:pPr>
       <w:r>
-        <w:t xml:space="preserve">98.</w:t>
+        <w:t xml:space="preserve">100.</w:t>
       </w:r>
       <w:r>
         <w:t xml:space="preserve"> </w:t>
@@ -8310,14 +8376,14 @@
         <w:t xml:space="preserve">14, 603–614</w:t>
       </w:r>
     </w:p>
-    <w:bookmarkEnd w:id="138"/>
-    <w:bookmarkStart w:id="139" w:name="ref-Pottier2022a"/>
+    <w:bookmarkEnd w:id="140"/>
+    <w:bookmarkStart w:id="141" w:name="ref-Pottier2022a"/>
     <w:p>
       <w:pPr>
         <w:pStyle w:val="Bibliography"/>
       </w:pPr>
       <w:r>
-        <w:t xml:space="preserve">99.</w:t>
+        <w:t xml:space="preserve">101.</w:t>
       </w:r>
       <w:r>
         <w:t xml:space="preserve"> </w:t>
@@ -8361,14 +8427,14 @@
         <w:t xml:space="preserve">25, 2245–2268</w:t>
       </w:r>
     </w:p>
-    <w:bookmarkEnd w:id="139"/>
-    <w:bookmarkStart w:id="140" w:name="ref-Leiva2024b"/>
+    <w:bookmarkEnd w:id="141"/>
+    <w:bookmarkStart w:id="142" w:name="ref-Leiva2024b"/>
     <w:p>
       <w:pPr>
         <w:pStyle w:val="Bibliography"/>
       </w:pPr>
       <w:r>
-        <w:t xml:space="preserve">100.</w:t>
+        <w:t xml:space="preserve">102.</w:t>
       </w:r>
       <w:r>
         <w:t xml:space="preserve"> </w:t>
@@ -8396,14 +8462,14 @@
         <w:t xml:space="preserve">(2024) Genetic variation of heat tolerance in a model ectotherm: An approach using thermal death time curves</w:t>
       </w:r>
     </w:p>
-    <w:bookmarkEnd w:id="140"/>
-    <w:bookmarkStart w:id="141" w:name="ref-Assessment_undated-fv"/>
+    <w:bookmarkEnd w:id="142"/>
+    <w:bookmarkStart w:id="143" w:name="ref-Assessment_undated-fv"/>
     <w:p>
       <w:pPr>
         <w:pStyle w:val="Bibliography"/>
       </w:pPr>
       <w:r>
-        <w:t xml:space="preserve">101.</w:t>
+        <w:t xml:space="preserve">103.</w:t>
       </w:r>
       <w:r>
         <w:t xml:space="preserve"> </w:t>
@@ -8415,14 +8481,14 @@
         <w:t xml:space="preserve">Assessment, M.E. (2005) Opportunities and challenges for business and industryunioviedo.es</w:t>
       </w:r>
     </w:p>
-    <w:bookmarkEnd w:id="141"/>
-    <w:bookmarkStart w:id="142" w:name="ref-Dandy2019"/>
+    <w:bookmarkEnd w:id="143"/>
+    <w:bookmarkStart w:id="144" w:name="ref-Dandy2019"/>
     <w:p>
       <w:pPr>
         <w:pStyle w:val="Bibliography"/>
       </w:pPr>
       <w:r>
-        <w:t xml:space="preserve">102.</w:t>
+        <w:t xml:space="preserve">104.</w:t>
       </w:r>
       <w:r>
         <w:t xml:space="preserve"> </w:t>
@@ -8466,14 +8532,14 @@
         <w:t xml:space="preserve">19, 615–620</w:t>
       </w:r>
     </w:p>
-    <w:bookmarkEnd w:id="142"/>
-    <w:bookmarkStart w:id="143" w:name="ref-Price2014"/>
+    <w:bookmarkEnd w:id="144"/>
+    <w:bookmarkStart w:id="145" w:name="ref-Price2014"/>
     <w:p>
       <w:pPr>
         <w:pStyle w:val="Bibliography"/>
       </w:pPr>
       <w:r>
-        <w:t xml:space="preserve">103.</w:t>
+        <w:t xml:space="preserve">105.</w:t>
       </w:r>
       <w:r>
         <w:t xml:space="preserve"> </w:t>
@@ -8501,14 +8567,14 @@
         <w:t xml:space="preserve">34, 65–78</w:t>
       </w:r>
     </w:p>
-    <w:bookmarkEnd w:id="143"/>
-    <w:bookmarkStart w:id="144" w:name="ref-Leviston2018"/>
+    <w:bookmarkEnd w:id="145"/>
+    <w:bookmarkStart w:id="146" w:name="ref-Leviston2018"/>
     <w:p>
       <w:pPr>
         <w:pStyle w:val="Bibliography"/>
       </w:pPr>
       <w:r>
-        <w:t xml:space="preserve">104.</w:t>
+        <w:t xml:space="preserve">106.</w:t>
       </w:r>
       <w:r>
         <w:t xml:space="preserve"> </w:t>
@@ -8552,14 +8618,14 @@
         <w:t xml:space="preserve">93, 658–668</w:t>
       </w:r>
     </w:p>
-    <w:bookmarkEnd w:id="144"/>
-    <w:bookmarkStart w:id="145" w:name="ref-Bai2016"/>
+    <w:bookmarkEnd w:id="146"/>
+    <w:bookmarkStart w:id="147" w:name="ref-Bai2016"/>
     <w:p>
       <w:pPr>
         <w:pStyle w:val="Bibliography"/>
       </w:pPr>
       <w:r>
-        <w:t xml:space="preserve">105.</w:t>
+        <w:t xml:space="preserve">107.</w:t>
       </w:r>
       <w:r>
         <w:t xml:space="preserve"> </w:t>
@@ -8603,14 +8669,14 @@
         <w:t xml:space="preserve">23, 69–78</w:t>
       </w:r>
     </w:p>
-    <w:bookmarkEnd w:id="145"/>
-    <w:bookmarkStart w:id="146" w:name="ref-Grimm2008"/>
+    <w:bookmarkEnd w:id="147"/>
+    <w:bookmarkStart w:id="148" w:name="ref-Grimm2008"/>
     <w:p>
       <w:pPr>
         <w:pStyle w:val="Bibliography"/>
       </w:pPr>
       <w:r>
-        <w:t xml:space="preserve">106.</w:t>
+        <w:t xml:space="preserve">108.</w:t>
       </w:r>
       <w:r>
         <w:t xml:space="preserve"> </w:t>
@@ -8654,14 +8720,14 @@
         <w:t xml:space="preserve">319, 756–760</w:t>
       </w:r>
     </w:p>
-    <w:bookmarkEnd w:id="146"/>
-    <w:bookmarkStart w:id="147" w:name="ref-Hendricks2022"/>
+    <w:bookmarkEnd w:id="148"/>
+    <w:bookmarkStart w:id="149" w:name="ref-Hendricks2022"/>
     <w:p>
       <w:pPr>
         <w:pStyle w:val="Bibliography"/>
       </w:pPr>
       <w:r>
-        <w:t xml:space="preserve">107.</w:t>
+        <w:t xml:space="preserve">109.</w:t>
       </w:r>
       <w:r>
         <w:t xml:space="preserve"> </w:t>
@@ -8705,14 +8771,14 @@
         <w:t xml:space="preserve">105, 5893–5908</w:t>
       </w:r>
     </w:p>
-    <w:bookmarkEnd w:id="147"/>
-    <w:bookmarkStart w:id="148" w:name="ref-Sutanto2020"/>
+    <w:bookmarkEnd w:id="149"/>
+    <w:bookmarkStart w:id="150" w:name="ref-Sutanto2020"/>
     <w:p>
       <w:pPr>
         <w:pStyle w:val="Bibliography"/>
       </w:pPr>
       <w:r>
-        <w:t xml:space="preserve">108.</w:t>
+        <w:t xml:space="preserve">110.</w:t>
       </w:r>
       <w:r>
         <w:t xml:space="preserve"> </w:t>
@@ -8756,14 +8822,14 @@
         <w:t xml:space="preserve">134, 105276</w:t>
       </w:r>
     </w:p>
-    <w:bookmarkEnd w:id="148"/>
-    <w:bookmarkStart w:id="149" w:name="ref-Liu2007"/>
+    <w:bookmarkEnd w:id="150"/>
+    <w:bookmarkStart w:id="151" w:name="ref-Liu2007"/>
     <w:p>
       <w:pPr>
         <w:pStyle w:val="Bibliography"/>
       </w:pPr>
       <w:r>
-        <w:t xml:space="preserve">109.</w:t>
+        <w:t xml:space="preserve">111.</w:t>
       </w:r>
       <w:r>
         <w:t xml:space="preserve"> </w:t>
@@ -8807,14 +8873,14 @@
         <w:t xml:space="preserve">36, 639–649</w:t>
       </w:r>
     </w:p>
-    <w:bookmarkEnd w:id="149"/>
-    <w:bookmarkStart w:id="150" w:name="ref-Black2011"/>
+    <w:bookmarkEnd w:id="151"/>
+    <w:bookmarkStart w:id="152" w:name="ref-Black2011"/>
     <w:p>
       <w:pPr>
         <w:pStyle w:val="Bibliography"/>
       </w:pPr>
       <w:r>
-        <w:t xml:space="preserve">110.</w:t>
+        <w:t xml:space="preserve">112.</w:t>
       </w:r>
       <w:r>
         <w:t xml:space="preserve"> </w:t>
@@ -8858,14 +8924,14 @@
         <w:t xml:space="preserve">21, S3–S11</w:t>
       </w:r>
     </w:p>
-    <w:bookmarkEnd w:id="150"/>
-    <w:bookmarkStart w:id="151" w:name="ref-Neil_Adger1999"/>
+    <w:bookmarkEnd w:id="152"/>
+    <w:bookmarkStart w:id="153" w:name="ref-Neil_Adger1999"/>
     <w:p>
       <w:pPr>
         <w:pStyle w:val="Bibliography"/>
       </w:pPr>
       <w:r>
-        <w:t xml:space="preserve">111.</w:t>
+        <w:t xml:space="preserve">113.</w:t>
       </w:r>
       <w:r>
         <w:t xml:space="preserve"> </w:t>
@@ -8893,14 +8959,14 @@
         <w:t xml:space="preserve">27, 249–269</w:t>
       </w:r>
     </w:p>
-    <w:bookmarkEnd w:id="151"/>
-    <w:bookmarkStart w:id="152" w:name="ref-Folke2016"/>
+    <w:bookmarkEnd w:id="153"/>
+    <w:bookmarkStart w:id="154" w:name="ref-Folke2016"/>
     <w:p>
       <w:pPr>
         <w:pStyle w:val="Bibliography"/>
       </w:pPr>
       <w:r>
-        <w:t xml:space="preserve">112.</w:t>
+        <w:t xml:space="preserve">114.</w:t>
       </w:r>
       <w:r>
         <w:t xml:space="preserve"> </w:t>
@@ -8944,14 +9010,14 @@
         <w:t xml:space="preserve">21</w:t>
       </w:r>
     </w:p>
-    <w:bookmarkEnd w:id="152"/>
-    <w:bookmarkStart w:id="153" w:name="ref-Schluter2012"/>
+    <w:bookmarkEnd w:id="154"/>
+    <w:bookmarkStart w:id="155" w:name="ref-Schluter2012"/>
     <w:p>
       <w:pPr>
         <w:pStyle w:val="Bibliography"/>
       </w:pPr>
       <w:r>
-        <w:t xml:space="preserve">113.</w:t>
+        <w:t xml:space="preserve">115.</w:t>
       </w:r>
       <w:r>
         <w:t xml:space="preserve"> </w:t>
@@ -8995,14 +9061,14 @@
         <w:t xml:space="preserve">25, 219–272</w:t>
       </w:r>
     </w:p>
-    <w:bookmarkEnd w:id="153"/>
-    <w:bookmarkStart w:id="154" w:name="ref-Wise2014"/>
+    <w:bookmarkEnd w:id="155"/>
+    <w:bookmarkStart w:id="156" w:name="ref-Wise2014"/>
     <w:p>
       <w:pPr>
         <w:pStyle w:val="Bibliography"/>
       </w:pPr>
       <w:r>
-        <w:t xml:space="preserve">114.</w:t>
+        <w:t xml:space="preserve">116.</w:t>
       </w:r>
       <w:r>
         <w:t xml:space="preserve"> </w:t>
@@ -9046,14 +9112,14 @@
         <w:t xml:space="preserve">28, 325–336</w:t>
       </w:r>
     </w:p>
-    <w:bookmarkEnd w:id="154"/>
-    <w:bookmarkStart w:id="155" w:name="ref-Biggs2021"/>
+    <w:bookmarkEnd w:id="156"/>
+    <w:bookmarkStart w:id="157" w:name="ref-Biggs2021"/>
     <w:p>
       <w:pPr>
         <w:pStyle w:val="Bibliography"/>
       </w:pPr>
       <w:r>
-        <w:t xml:space="preserve">115.</w:t>
+        <w:t xml:space="preserve">117.</w:t>
       </w:r>
       <w:r>
         <w:t xml:space="preserve"> </w:t>
@@ -9094,14 +9160,14 @@
         <w:t xml:space="preserve">, Taylor &amp; Francis</w:t>
       </w:r>
     </w:p>
-    <w:bookmarkEnd w:id="155"/>
-    <w:bookmarkStart w:id="156" w:name="ref-Brown2021"/>
+    <w:bookmarkEnd w:id="157"/>
+    <w:bookmarkStart w:id="158" w:name="ref-Brown2021"/>
     <w:p>
       <w:pPr>
         <w:pStyle w:val="Bibliography"/>
       </w:pPr>
       <w:r>
-        <w:t xml:space="preserve">116.</w:t>
+        <w:t xml:space="preserve">118.</w:t>
       </w:r>
       <w:r>
         <w:t xml:space="preserve"> </w:t>
@@ -9129,14 +9195,14 @@
         <w:t xml:space="preserve">3, 88–103</w:t>
       </w:r>
     </w:p>
-    <w:bookmarkEnd w:id="156"/>
-    <w:bookmarkStart w:id="157" w:name="ref-Kwakkel2013"/>
+    <w:bookmarkEnd w:id="158"/>
+    <w:bookmarkStart w:id="159" w:name="ref-Kwakkel2013"/>
     <w:p>
       <w:pPr>
         <w:pStyle w:val="Bibliography"/>
       </w:pPr>
       <w:r>
-        <w:t xml:space="preserve">117.</w:t>
+        <w:t xml:space="preserve">119.</w:t>
       </w:r>
       <w:r>
         <w:t xml:space="preserve"> </w:t>
@@ -9164,14 +9230,14 @@
         <w:t xml:space="preserve">80, 419–431</w:t>
       </w:r>
     </w:p>
-    <w:bookmarkEnd w:id="157"/>
-    <w:bookmarkEnd w:id="158"/>
+    <w:bookmarkEnd w:id="159"/>
+    <w:bookmarkEnd w:id="160"/>
     <w:p>
       <w:pPr>
         <w:pStyle w:val="BodyText"/>
       </w:pPr>
     </w:p>
-    <w:bookmarkEnd w:id="159"/>
+    <w:bookmarkEnd w:id="161"/>
     <w:sectPr>
       <w:pgSz w:h="15840" w:w="12240"/>
       <w:pgMar w:bottom="851" w:footer="720" w:gutter="0" w:header="720" w:left="851" w:right="851" w:top="851"/>

</xml_diff>

<commit_message>
Updated MS to fix Arnold ref
</commit_message>
<xml_diff>
--- a/docs/ms.docx
+++ b/docs/ms.docx
@@ -4575,7 +4575,23 @@
         <w:t xml:space="preserve">	</w:t>
       </w:r>
       <w:r>
-        <w:t xml:space="preserve">Pieter A. Arnold, Daniel W. A. Noble, Adrienne B. Nicotra, Michael R. Kearney, EnricoL.Rezende, Samuel C. Andrew, Verónica F. Briceño, Lauren B. Buckley, KeithA.Christian, Susana Clusella-Trullas, Sonya R. Geange, Lydia K. Guja, OctavioJiménez Robles, Ben J. Kefford, Vanessa Kellermann, Andrea Leigh, Renée M. Marchin, Karel Mokany, Joanne M. Bennett (2025) A framework for modelling thermal load sensitivity across life.</w:t>
+        <w:t xml:space="preserve">Arnold, P.A.</w:t>
+      </w:r>
+      <w:r>
+        <w:t xml:space="preserve"> </w:t>
+      </w:r>
+      <w:r>
+        <w:rPr>
+          <w:i/>
+          <w:iCs/>
+        </w:rPr>
+        <w:t xml:space="preserve">et al.</w:t>
+      </w:r>
+      <w:r>
+        <w:t xml:space="preserve"> </w:t>
+      </w:r>
+      <w:r>
+        <w:t xml:space="preserve">(2025) A framework for modelling thermal load sensitivity across life.</w:t>
       </w:r>
       <w:r>
         <w:t xml:space="preserve"> </w:t>

</xml_diff>

<commit_message>
Fixed error in authorship
</commit_message>
<xml_diff>
--- a/docs/ms.docx
+++ b/docs/ms.docx
@@ -199,13 +199,19 @@
         </m:r>
       </m:oMath>
       <w:r>
-        <w:t>, Adrienne Nicotra</w:t>
+        <w:t xml:space="preserve">, </w:t>
+      </w:r>
+      <w:r>
+        <w:t xml:space="preserve">Owen </w:t>
+      </w:r>
+      <w:r>
+        <w:t>Atkin</w:t>
       </w:r>
       <w:r>
         <w:rPr>
           <w:vertAlign w:val="superscript"/>
         </w:rPr>
-        <w:t>1,4</w:t>
+        <w:t>4</w:t>
       </w:r>
       <w:r>
         <w:t xml:space="preserve"> </w:t>
@@ -222,6 +228,41 @@
         </m:r>
       </m:oMath>
       <w:r>
+        <w:rPr>
+          <w:rFonts w:eastAsiaTheme="minorEastAsia"/>
+        </w:rPr>
+        <w:t>,</w:t>
+      </w:r>
+      <w:r>
+        <w:t xml:space="preserve"> </w:t>
+      </w:r>
+      <w:r>
+        <w:t>Adrienne</w:t>
+      </w:r>
+      <w:r>
+        <w:t xml:space="preserve"> Nicotra</w:t>
+      </w:r>
+      <w:r>
+        <w:rPr>
+          <w:vertAlign w:val="superscript"/>
+        </w:rPr>
+        <w:t>1,4</w:t>
+      </w:r>
+      <w:r>
+        <w:t xml:space="preserve"> </w:t>
+      </w:r>
+      <m:oMath>
+        <m:r>
+          <m:rPr>
+            <m:sty m:val="p"/>
+          </m:rPr>
+          <w:rPr>
+            <w:rFonts w:ascii="Cambria Math" w:hAnsi="Cambria Math"/>
+          </w:rPr>
+          <m:t>†</m:t>
+        </m:r>
+      </m:oMath>
+      <w:r>
         <w:t>, James Cook</w:t>
       </w:r>
       <w:r>
@@ -249,16 +290,7 @@
         <w:t>3</w:t>
       </w:r>
       <w:r>
-        <w:t>, Owen Atkin</w:t>
-      </w:r>
-      <w:r>
-        <w:rPr>
-          <w:vertAlign w:val="superscript"/>
-        </w:rPr>
-        <w:t>4</w:t>
-      </w:r>
-      <w:r>
-        <w:t>, Barry Pogson</w:t>
+        <w:t>, , Barry Pogson</w:t>
       </w:r>
       <w:r>
         <w:rPr>
@@ -3806,7 +3838,15 @@
         <w:t>et al.</w:t>
       </w:r>
       <w:r>
-        <w:t xml:space="preserve"> (2014) Analysing the </w:t>
+        <w:t xml:space="preserve"> (2014) </w:t>
+      </w:r>
+      <w:proofErr w:type="spellStart"/>
+      <w:r>
+        <w:t>Analysing</w:t>
+      </w:r>
+      <w:proofErr w:type="spellEnd"/>
+      <w:r>
+        <w:t xml:space="preserve"> the </w:t>
       </w:r>
       <w:proofErr w:type="spellStart"/>
       <w:r>
@@ -6250,7 +6290,15 @@
       </w:r>
       <w:proofErr w:type="spellEnd"/>
       <w:r>
-        <w:t xml:space="preserve"> models for analysing ecotoxicity data. </w:t>
+        <w:t xml:space="preserve"> models for </w:t>
+      </w:r>
+      <w:proofErr w:type="spellStart"/>
+      <w:r>
+        <w:t>analysing</w:t>
+      </w:r>
+      <w:proofErr w:type="spellEnd"/>
+      <w:r>
+        <w:t xml:space="preserve"> ecotoxicity data. </w:t>
       </w:r>
       <w:r>
         <w:rPr>
@@ -9392,6 +9440,7 @@
   <w:style w:type="character" w:default="1" w:styleId="DefaultParagraphFont">
     <w:name w:val="Default Paragraph Font"/>
     <w:uiPriority w:val="1"/>
+    <w:semiHidden/>
     <w:unhideWhenUsed/>
   </w:style>
   <w:style w:type="table" w:default="1" w:styleId="TableNormal">

</xml_diff>

<commit_message>
Fixing symbol in fig legend. Degrees C causing problems
</commit_message>
<xml_diff>
--- a/docs/ms.docx
+++ b/docs/ms.docx
@@ -7,7 +7,61 @@
         <w:pStyle w:val="Title"/>
       </w:pPr>
       <w:r>
-        <w:t xml:space="preserve">A systems-modelling approach to predict biological responses to extreme heat</w:t>
+        <w:t xml:space="preserve">A</w:t>
+      </w:r>
+      <w:r>
+        <w:t xml:space="preserve"> </w:t>
+      </w:r>
+      <w:r>
+        <w:t xml:space="preserve">systems-modelling</w:t>
+      </w:r>
+      <w:r>
+        <w:t xml:space="preserve"> </w:t>
+      </w:r>
+      <w:r>
+        <w:t xml:space="preserve">approach</w:t>
+      </w:r>
+      <w:r>
+        <w:t xml:space="preserve"> </w:t>
+      </w:r>
+      <w:r>
+        <w:t xml:space="preserve">to</w:t>
+      </w:r>
+      <w:r>
+        <w:t xml:space="preserve"> </w:t>
+      </w:r>
+      <w:r>
+        <w:t xml:space="preserve">predict</w:t>
+      </w:r>
+      <w:r>
+        <w:t xml:space="preserve"> </w:t>
+      </w:r>
+      <w:r>
+        <w:t xml:space="preserve">biological</w:t>
+      </w:r>
+      <w:r>
+        <w:t xml:space="preserve"> </w:t>
+      </w:r>
+      <w:r>
+        <w:t xml:space="preserve">responses</w:t>
+      </w:r>
+      <w:r>
+        <w:t xml:space="preserve"> </w:t>
+      </w:r>
+      <w:r>
+        <w:t xml:space="preserve">to</w:t>
+      </w:r>
+      <w:r>
+        <w:t xml:space="preserve"> </w:t>
+      </w:r>
+      <w:r>
+        <w:t xml:space="preserve">extreme</w:t>
+      </w:r>
+      <w:r>
+        <w:t xml:space="preserve"> </w:t>
+      </w:r>
+      <w:r>
+        <w:t xml:space="preserve">heat</w:t>
       </w:r>
     </w:p>
     <w:p>
@@ -538,7 +592,7 @@
         <w:pStyle w:val="FirstParagraph"/>
       </w:pPr>
       <w:r>
-        <w:t xml:space="preserve">Anthropogenic climate change is leading to more frequent and extreme heat waves. These short-term but large-scale events are radically re-shaping interactions among organisms – impacting biodiversity, community composition and ecosystem services crucial to natural systems and food security. Predicting heat wave impacts on interacting species requires an understanding of the processes driving differential exposure and sensitivity of organisms to extreme heat events in a life-cycle context. To achieve this predictive capacity, we need to integrate models across scales while capturing species-specific responses at the level of individuals. We show how existing models in disparate fields can be linked to achieve a level of understanding necessary for calculated responses to extreme heat from individuals to socioecological systems, now and into the future.</w:t>
+        <w:t xml:space="preserve">Anthropogenic climate change is leading to more frequent and extreme heat waves. These short-term but large-scale events are radically re-shaping interactions among organisms, impacting biodiversity, community composition and ecosystem services crucial to natural systems and food security. Predicting heat wave impacts on interacting species requires an understanding of the processes driving differential exposure and sensitivity of organisms to extreme heat events in a life-cycle context. To achieve this predictive capacity, we need to integrate models across scales while capturing species-specific responses at the level of individuals. We show how existing models in disparate fields can be linked to achieve a level of understanding necessary for calculated responses to extreme heat from individuals to socioecological systems, now and into the future.</w:t>
       </w:r>
     </w:p>
     <w:bookmarkEnd w:id="22"/>
@@ -660,7 +714,7 @@
         <w:t xml:space="preserve">[10,11,19,20]</w:t>
       </w:r>
       <w:r>
-        <w:t xml:space="preserve">, yielding predictions of the immediate and cumulative impacts of extreme heat on growth, survival and reproduction. Importantly, mechanistic physiological models provide vital rates (e.g., survival and reproduction) that can be integrated into population and community ecology models to capture how extreme heat events perturb interactions among species</w:t>
+        <w:t xml:space="preserve">, yielding predictions of the immediate and cumulative impacts of extreme heat on growth, survival and reproduction. Importantly, mechanistic physiological models provide outputs at the individual level (e.g., energy and water requirements, waste production, activity constraints, vital rates) that can be integrated into population and community ecology models to capture how extreme heat events perturb interactions among species</w:t>
       </w:r>
       <w:r>
         <w:t xml:space="preserve"> </w:t>
@@ -683,13 +737,19 @@
         <w:t xml:space="preserve"> </w:t>
       </w:r>
       <w:r>
-        <w:t xml:space="preserve">‘extreme heat’</w:t>
-      </w:r>
-      <w:r>
-        <w:t xml:space="preserve"> </w:t>
-      </w:r>
-      <w:r>
-        <w:t xml:space="preserve">can take on a different meaning for these diverse organisms. For example, plants and animals have different thermal tolerances or can exploit microthermal environments in different ways to dampen the effects of extreme atmospheric heat events. Thermal tolerances also vary among life cycle stages/developmental processes of individual organisms; for example, in plants, vegetative tissues generally exhibit greater tolerance to high temperatures than pollen</w:t>
+        <w:t xml:space="preserve">‘</w:t>
+      </w:r>
+      <w:r>
+        <w:t xml:space="preserve">extreme heat</w:t>
+      </w:r>
+      <w:r>
+        <w:t xml:space="preserve">’</w:t>
+      </w:r>
+      <w:r>
+        <w:t xml:space="preserve"> </w:t>
+      </w:r>
+      <w:r>
+        <w:t xml:space="preserve">can take on a different meaning for these diverse organisms. For example, plants and animals have different thermal tolerances or can exploit microthermal environments in different ways to offset the effects of extreme atmospheric heat events. Thermal tolerances also vary among life cycle stages/developmental processes of individual organisms; for example, in plants, vegetative tissues generally exhibit greater tolerance to high temperatures than pollen</w:t>
       </w:r>
       <w:r>
         <w:t xml:space="preserve"> </w:t>
@@ -704,13 +764,19 @@
         <w:t xml:space="preserve"> </w:t>
       </w:r>
       <w:r>
-        <w:t xml:space="preserve">‘extreme’</w:t>
-      </w:r>
-      <w:r>
-        <w:t xml:space="preserve"> </w:t>
-      </w:r>
-      <w:r>
-        <w:t xml:space="preserve">will be relative to the biology of the organism in question. Our framework can capture these complexities and be extended to incorporate other, diverse interactions including the socioecological systems in which ecological communities and production systems are embedded.</w:t>
+        <w:t xml:space="preserve">‘</w:t>
+      </w:r>
+      <w:r>
+        <w:t xml:space="preserve">extreme</w:t>
+      </w:r>
+      <w:r>
+        <w:t xml:space="preserve">’</w:t>
+      </w:r>
+      <w:r>
+        <w:t xml:space="preserve"> </w:t>
+      </w:r>
+      <w:r>
+        <w:t xml:space="preserve">will be relative to the biology of the organism in question. Our modelling framework can capture these complexities and be extended to incorporate other, diverse interactions including the socioecological systems in which ecological communities and production systems are embedded.</w:t>
       </w:r>
     </w:p>
     <w:bookmarkEnd w:id="23"/>
@@ -871,7 +937,7 @@
               <w:t xml:space="preserve">A new, integrative framework for predicting the effects of extreme heat on ecological communities</w:t>
             </w:r>
             <w:r>
-              <w:t xml:space="preserve">. The modelling approach developed here integrates (1) climate/biophysical models to predict the different temperatures species experience in their respective microhabitats. (2) Temperatures experienced by organisms then provide inputs for damage-repair and vegetation growth or animal dynamic energy budget models that integrate temperature exposure with explicit physiological models that simulate development, behavior, survival and reproduction in response to temperature dynamics across life history stages. Physiological models can be built around the unique life cycles of the diverse species in communities, capturing lagged responses to extreme heat, phenological mismatches and mechanistically informed responses to extreme heat for species of the system in question. Outputs (behavior, growth rate, biomass accumulation, survival and reproduction) from physiological models of individual organisms can then be integrated into (3) population and community ecology models to predict population growth and community composition under a specific type of change (either to the environment or suite of interacting organisms). We then discuss how (4) environment-mediated feedback loops influence organism thermal exposure and sensitivity (e.g., water availability, microbiota), which can vary across different life stages and organs. The integration of existing models in this novel way will allow simulations at the organismal level to generate emergent predictions for entire communities. In turn, such simulations will allow quantitative predictions to be made on how extreme heatwaves perturb biological systems and allow for the development and implementation of strategies to enhance both biological and socioecological system resilience to extreme heat. Created with BioRender.com.</w:t>
+              <w:t xml:space="preserve">. The modelling approach developed here integrates (1) climate/biophysical models to predict the different temperatures species experience in their respective microhabitats. (2) Temperatures experienced by organisms then provide inputs for damage-repair and vegetation growth or animal dynamic energy budget models that integrate temperature exposure with explicit physiological models that simulate development, behavior, survival and reproduction in response to temperature dynamics across life history stages. Physiological models can be built around the unique life cycles of the diverse species in communities, capturing lagged responses to extreme heat, phenological mismatches and mechanistically informed responses to extreme heat for species of the system in question. Outputs (behavior, growth rate, biomass accumulation, survival and reproduction) from physiological models of individual organisms can then be integrated into (3) population and community ecology models to predict population growth and community composition under a specific type of change (either to the environment or suite of interacting organisms). We then discuss how (4) environment-mediated feedback loops influence organism thermal exposure and sensitivity (e.g., water availability, microbiota), which can vary across different life stages and organs. This novel integration of existing models in this novel way will allow simulations at the organismal level to generate emergent predictions for entire communities. In turn, such simulations will allow quantitative predictions to be made on how extreme heatwaves perturb biological systems and allow for the development and implementation of strategies to enhance both biological and socioecological system resilience to extreme heat. Created with BioRender.com.</w:t>
             </w:r>
           </w:p>
           <w:bookmarkEnd w:id="27"/>
@@ -916,7 +982,13 @@
         <w:t xml:space="preserve"> </w:t>
       </w:r>
       <w:r>
-        <w:t xml:space="preserve">‘reanalysis’</w:t>
+        <w:t xml:space="preserve">‘</w:t>
+      </w:r>
+      <w:r>
+        <w:t xml:space="preserve">reanalysis</w:t>
+      </w:r>
+      <w:r>
+        <w:t xml:space="preserve">’</w:t>
       </w:r>
       <w:r>
         <w:t xml:space="preserve"> </w:t>
@@ -928,7 +1000,13 @@
         <w:t xml:space="preserve"> </w:t>
       </w:r>
       <w:r>
-        <w:t xml:space="preserve">‘surface’</w:t>
+        <w:t xml:space="preserve">‘</w:t>
+      </w:r>
+      <w:r>
+        <w:t xml:space="preserve">surface</w:t>
+      </w:r>
+      <w:r>
+        <w:t xml:space="preserve">’</w:t>
       </w:r>
       <w:r>
         <w:t xml:space="preserve"> </w:t>
@@ -1032,7 +1110,13 @@
         <w:t xml:space="preserve"> </w:t>
       </w:r>
       <w:r>
-        <w:t xml:space="preserve">‘land-surface models’</w:t>
+        <w:t xml:space="preserve">‘</w:t>
+      </w:r>
+      <w:r>
+        <w:t xml:space="preserve">land-surface models</w:t>
+      </w:r>
+      <w:r>
+        <w:t xml:space="preserve">’</w:t>
       </w:r>
       <w:r>
         <w:t xml:space="preserve"> </w:t>
@@ -1064,7 +1148,7 @@
         <w:pStyle w:val="BodyText"/>
       </w:pPr>
       <w:r>
-        <w:t xml:space="preserve">The primary role of LSMs is to better understand overall atmospheric dynamics rather than resolve the details of microclimates to which organisms are exposed. Thus, agronomists and ecologists have developed microclimate models that can provide more detailed inferences of environmental exposure. These microclimate models take the atmospheric conditions as independent forcing variables, together with detailed information on terrain (slope, aspect, hill shade), vegetation [plant-area index (PAI), stomatal behaviour, leaf reflectance] and soil properties (thermal and hydraulic properties) to predict how radiation, wind speed, air temperature, humidity, soil temperature and soil moisture vary on small scales. The available models vary in the physical processes they incorporate yet can be powerful in predicting relevant microclimates to organisms</w:t>
+        <w:t xml:space="preserve">The primary role of LSMs is to better understand overall atmospheric dynamics rather than resolve the details of microclimates to which organisms are exposed. Thus, agronomists and ecologists have developed microclimate models that can provide more detailed inferences of environmental exposure. These microclimate models take the atmospheric conditions as independent forcing variables, together with detailed information on terrain (slope, aspect, hill shade), vegetation [plant-area index (PAI), stomatal behaviour, leaf reflectance] and soil properties (thermal and hydraulic) to predict how radiation, wind speed, air temperature, humidity, soil temperature and soil moisture vary on small scales. The available models vary in the physical processes they incorporate yet can be powerful in predicting relevant microclimates to organisms</w:t>
       </w:r>
       <w:r>
         <w:t xml:space="preserve"> </w:t>
@@ -1233,7 +1317,13 @@
         <w:t xml:space="preserve"> </w:t>
       </w:r>
       <w:r>
-        <w:t xml:space="preserve">‘wind surf’</w:t>
+        <w:t xml:space="preserve">‘</w:t>
+      </w:r>
+      <w:r>
+        <w:t xml:space="preserve">wind surf</w:t>
+      </w:r>
+      <w:r>
+        <w:t xml:space="preserve">’</w:t>
       </w:r>
       <w:r>
         <w:t xml:space="preserve"> </w:t>
@@ -1474,7 +1564,7 @@
         <w:t xml:space="preserve"> </w:t>
       </w:r>
       <w:r>
-        <w:t xml:space="preserve">also show that reproductive sensitivity can be higher than mortality, with heat injury accumulating faster to impact productivity earlier than survival. TLS theory also applies well to photosynthetic function in plants</w:t>
+        <w:t xml:space="preserve">show that reproductive sensitivity can be higher than mortality, with heat injury accumulating faster to impact productivity earlier than survival. TLS theory also applies well to photosynthetic function in plants</w:t>
       </w:r>
       <w:r>
         <w:t xml:space="preserve"> </w:t>
@@ -1644,8 +1734,8 @@
                   <m:d>
                     <m:dPr>
                       <m:begChr m:val="("/>
+                      <m:endChr m:val=")"/>
                       <m:sepChr m:val=""/>
-                      <m:endChr m:val=")"/>
                       <m:grow/>
                     </m:dPr>
                     <m:e>
@@ -1702,8 +1792,8 @@
                       <m:d>
                         <m:dPr>
                           <m:begChr m:val="("/>
+                          <m:endChr m:val=")"/>
                           <m:sepChr m:val=""/>
-                          <m:endChr m:val=")"/>
                           <m:grow/>
                         </m:dPr>
                         <m:e>
@@ -1746,8 +1836,8 @@
                           <m:d>
                             <m:dPr>
                               <m:begChr m:val="("/>
+                              <m:endChr m:val=")"/>
                               <m:sepChr m:val=""/>
-                              <m:endChr m:val=")"/>
                               <m:grow/>
                             </m:dPr>
                             <m:e>
@@ -1815,8 +1905,8 @@
           <m:d>
             <m:dPr>
               <m:begChr m:val="("/>
+              <m:endChr m:val=")"/>
               <m:sepChr m:val=""/>
-              <m:endChr m:val=")"/>
               <m:grow/>
             </m:dPr>
             <m:e>
@@ -2683,7 +2773,7 @@
         <w:t xml:space="preserve">[18]</w:t>
       </w:r>
       <w:r>
-        <w:t xml:space="preserve">. Perhaps most importantly, DEB theory calculates the life cycle trajectory of an organism and so can account for the effects of timing of heat wave impacts relative to life stage. Applied to multi-species assemblages, DEB models can capture how different species’ life cycles are impacted by heat and interact with each other to predict how traits such as birth, age at maturity, reproductive events, energy flow and lifespan vary across species. While DEB models are parameter rich, necessary parameters have been estimated for &gt; 5000 species already (although there are taxonomic biases)</w:t>
+        <w:t xml:space="preserve">. Perhaps most importantly, DEB theory calculates the life cycle trajectory of an organism and so can account for the effects of timing of heat wave impacts relative to life stage. Applied to multi-species assemblages, DEB models can capture how different species’ life cycles are impacted by heat and interact with each other to predict how traits such as birth, age at maturity, reproductive events, energy flow and lifespan vary across species. DEB models integrate many processes in a parameter-sparse manner, and necessary parameters have been estimated for &gt; 6000 species already (although there are taxonomic biases)</w:t>
       </w:r>
       <w:r>
         <w:t xml:space="preserve"> </w:t>
@@ -2723,7 +2813,7 @@
         <w:t xml:space="preserve"> </w:t>
       </w:r>
       <w:r>
-        <w:t xml:space="preserve">allow for simulations of life-cycles using parameters for diverse species. From these models, predictions on body mass and size, reproductive success and events, along with survival can be used to parameterize vital rates needed for population and community models, with additional options to incorporate eco-evolutionary feedbacks (see</w:t>
+        <w:t xml:space="preserve">allow for simulations of life-cycles using parameters for diverse species. DEB model outputs, such as body mass and size, reproductive success and timing, and survival, can be used to parameterize vital rates needed for population and community models, with additional options to incorporate eco-evolutionary feedbacks (see</w:t>
       </w:r>
       <w:r>
         <w:t xml:space="preserve"> </w:t>
@@ -2771,7 +2861,7 @@
         <w:t xml:space="preserve">[73]</w:t>
       </w:r>
       <w:r>
-        <w:t xml:space="preserve">. Direct damage to plant tissue from extreme heat has yet to be represented in such models, but the thermal death time framework outlined above offers a promising way forwards.</w:t>
+        <w:t xml:space="preserve">. Direct damage to plant tissue from extreme heat has yet to be represented in such models, but the thermal death time framework outlined above offers a promising way forward.</w:t>
       </w:r>
     </w:p>
     <w:bookmarkEnd w:id="39"/>
@@ -2787,7 +2877,13 @@
         <w:t xml:space="preserve"> </w:t>
       </w:r>
       <w:r>
-        <w:t xml:space="preserve">‘speak’</w:t>
+        <w:t xml:space="preserve">‘</w:t>
+      </w:r>
+      <w:r>
+        <w:t xml:space="preserve">speak</w:t>
+      </w:r>
+      <w:r>
+        <w:t xml:space="preserve">’</w:t>
       </w:r>
       <w:r>
         <w:t xml:space="preserve"> </w:t>
@@ -2835,7 +2931,13 @@
         <w:t xml:space="preserve"> </w:t>
       </w:r>
       <w:r>
-        <w:t xml:space="preserve">“coexistence”</w:t>
+        <w:t xml:space="preserve">“</w:t>
+      </w:r>
+      <w:r>
+        <w:t xml:space="preserve">coexistence</w:t>
+      </w:r>
+      <w:r>
+        <w:t xml:space="preserve">”</w:t>
       </w:r>
       <w:r>
         <w:t xml:space="preserve">.</w:t>
@@ -2950,7 +3052,13 @@
         <w:t xml:space="preserve"> </w:t>
       </w:r>
       <w:r>
-        <w:t xml:space="preserve">‘trait’</w:t>
+        <w:t xml:space="preserve">‘</w:t>
+      </w:r>
+      <w:r>
+        <w:t xml:space="preserve">trait</w:t>
+      </w:r>
+      <w:r>
+        <w:t xml:space="preserve">’</w:t>
       </w:r>
       <w:r>
         <w:t xml:space="preserve"> </w:t>
@@ -3072,7 +3180,13 @@
               <w:t xml:space="preserve"> </w:t>
             </w:r>
             <w:r>
-              <w:t xml:space="preserve">‘trait’</w:t>
+              <w:t xml:space="preserve">‘</w:t>
+            </w:r>
+            <w:r>
+              <w:t xml:space="preserve">trait</w:t>
+            </w:r>
+            <w:r>
+              <w:t xml:space="preserve">’</w:t>
             </w:r>
             <w:r>
               <w:t xml:space="preserve"> </w:t>
@@ -3084,7 +3198,13 @@
               <w:t xml:space="preserve"> </w:t>
             </w:r>
             <w:r>
-              <w:t xml:space="preserve">‘traits’</w:t>
+              <w:t xml:space="preserve">‘</w:t>
+            </w:r>
+            <w:r>
+              <w:t xml:space="preserve">traits</w:t>
+            </w:r>
+            <w:r>
+              <w:t xml:space="preserve">’</w:t>
             </w:r>
             <w:r>
               <w:t xml:space="preserve"> </w:t>
@@ -3096,7 +3216,13 @@
               <w:t xml:space="preserve"> </w:t>
             </w:r>
             <w:r>
-              <w:t xml:space="preserve">‘traits’</w:t>
+              <w:t xml:space="preserve">‘</w:t>
+            </w:r>
+            <w:r>
+              <w:t xml:space="preserve">traits</w:t>
+            </w:r>
+            <w:r>
+              <w:t xml:space="preserve">’</w:t>
             </w:r>
             <w:r>
               <w:t xml:space="preserve"> </w:t>
@@ -3108,7 +3234,13 @@
               <w:t xml:space="preserve"> </w:t>
             </w:r>
             <w:r>
-              <w:t xml:space="preserve">‘traits’</w:t>
+              <w:t xml:space="preserve">‘</w:t>
+            </w:r>
+            <w:r>
+              <w:t xml:space="preserve">traits</w:t>
+            </w:r>
+            <w:r>
+              <w:t xml:space="preserve">’</w:t>
             </w:r>
             <w:r>
               <w:t xml:space="preserve"> </w:t>
@@ -3188,8 +3320,8 @@
                 <m:d>
                   <m:dPr>
                     <m:begChr m:val="("/>
+                    <m:endChr m:val=")"/>
                     <m:sepChr m:val=""/>
-                    <m:endChr m:val=")"/>
                     <m:grow/>
                   </m:dPr>
                   <m:e>
@@ -3377,7 +3509,13 @@
               <w:t xml:space="preserve"> </w:t>
             </w:r>
             <w:r>
-              <w:t xml:space="preserve">‘traits’</w:t>
+              <w:t xml:space="preserve">‘</w:t>
+            </w:r>
+            <w:r>
+              <w:t xml:space="preserve">traits</w:t>
+            </w:r>
+            <w:r>
+              <w:t xml:space="preserve">’</w:t>
             </w:r>
             <w:r>
               <w:t xml:space="preserve">. Studies that have attempted to measure plasticity and evolutionary potential in traits demonstrate how such processes can shape outcomes in important ways</w:t>
@@ -3732,7 +3870,13 @@
               <w:t xml:space="preserve"> </w:t>
             </w:r>
             <w:r>
-              <w:t xml:space="preserve">‘lock-in’</w:t>
+              <w:t xml:space="preserve">‘</w:t>
+            </w:r>
+            <w:r>
+              <w:t xml:space="preserve">lock-in</w:t>
+            </w:r>
+            <w:r>
+              <w:t xml:space="preserve">’</w:t>
             </w:r>
             <w:r>
               <w:t xml:space="preserve"> </w:t>
@@ -3852,7 +3996,13 @@
         <w:pStyle w:val="Heading1"/>
       </w:pPr>
       <w:r>
-        <w:t xml:space="preserve">‘Hot’</w:t>
+        <w:t xml:space="preserve">‘</w:t>
+      </w:r>
+      <w:r>
+        <w:t xml:space="preserve">Hot</w:t>
+      </w:r>
+      <w:r>
+        <w:t xml:space="preserve">’</w:t>
       </w:r>
       <w:r>
         <w:t xml:space="preserve"> </w:t>
@@ -4011,7 +4161,7 @@
               <w:pStyle w:val="ImageCaption"/>
             </w:pPr>
             <w:r>
-              <w:t xml:space="preserve">Figure 4- How a systems modelling approach to extreme heat can be used to inform solutions. A hypothetical example of an insect-plant interaction. (A) To counteract an extreme heat wave event, different watering scenarios to cool plants of agricultural importance during heat stress could be applied. Of critical importance is understanding how much water to apply to a system to keep plants cool while minimizing: 1) water use, given that heat waves are often associated with extreme drought conditions and 2) pest outbreaks, given watering may create more ideal conditions for pest insects. (B) We can obtain actual or predicted future climate data from weather stations or climate models for rainfall and create alternative scenarios where rainfall layers are manipulated by modifying the watering regimes during a heatwave event. We could then assess how adding 2, 5, 10, or 20 mm of water and compares to original rainfall. (C) Adding water during an extreme heat event should result in cooling effects and by using microclimate and biophysical models we can quantify how much cooling would occur by calculating leaf temperature across all scenarios. Adding 5 mm of water can result in a 3.63 Celsius decrease in leaf temperature. Adding more water does not result in significant gains in cooling. Note, in this simple example, we have assumed vegetation properties to remain constant; by linking in a crop growth model we could also estimate how the additional water would impact on plant growth and yield, enabling the trade-offs between plant shading, leaf temperatures, crop health and yield to be explored. (D) We can then use the microclimatic conditions created by the plant to better understand how these different microclimates impact grasshopper pest body temperatures using biophysical models in combination with dynamic energy budget models that simulate the entire life-cycle of the grasshopper keeping tabs on how energy and mass flow between growth (struture) and (reproduction) during adult stages. These models also include survival estimates through time (senesence) using hazards functions allowing us to estimate an intrinsic growth rate parameter (i.e.,</w:t>
+              <w:t xml:space="preserve">Figure 4- How a systems modelling approach to extreme heat can be used to inform solutions. A hypothetical example of an insect-plant interaction. (A) To counteract an extreme heat wave event, different watering scenarios to cool plants of agricultural importance during heat stress could be applied. Of critical importance is understanding how much water to apply to a system to keep plants cool while minimizing: 1) water use, given that heat waves are often associated with extreme drought conditions and 2) pest outbreaks, given watering may create more ideal conditions for pest insects. (B) We can obtain actual or predicted future climate data from weather stations or climate models for rainfall and create alternative scenarios where rainfall layers are manipulated by modifying the watering regimes during a heatwave event. We could then assess how adding 2, 5, 10, or 20 mm d-1 of water and compares to original rainfall. (C) Adding water during an extreme heat event should result in cooling effects and by using microclimate and biophysical models we can quantify how much cooling would occur by calculating leaf temperature across all scenarios. Adding 5 mm of water can result in a 3.63 C decrease in leaf temperature. Adding more water does not result in significant gains in cooling. Note, in this simple example, we have assumed vegetation properties to remain constant; by linking in a crop growth model we could also estimate how the additional water would affect plant growth and yield, enabling the trade-offs between plant shading, leaf temperatures, crop health and yield to be explored. (D) We can then use the microclimatic conditions created by the plant to better understand how these different microclimates impact grasshopper pest body temperatures using biophysical models in combination with dynamic energy budget models that simulate the entire life-cycle of the grasshopper keeping tabs on how energy and mass flow between growth (struture) and (reproduction) during adult stages. These models also include survival estimates through time (senesence) using hazards functions allowing us to estimate an intrinsic growth rate parameter (i.e.,</w:t>
             </w:r>
             <w:r>
               <w:t xml:space="preserve"> </w:t>
@@ -4037,7 +4187,7 @@
               </m:sSub>
             </m:oMath>
             <w:r>
-              <w:t xml:space="preserve">) for the pest under the different watering scenarios. (E) Using estimates of intrinsic growth rate we can then estimate the population growth rate of grasshoppers using a simple Ricker’s population growth model applied to the different scenarios. Assuming we would add 5 mm each season during heatwave events, grasshopper populations would be suppressed over time whereas adding 2 mm results in grasshopper population growth, leading to heatwave associated outbreaks. Here, the optimal solution is thus 5 mm of water added to both 1) cool plants to protect them during a heat wave and 2) supress pest outbreaks. Created with BioRender.com.</w:t>
+              <w:t xml:space="preserve">) for the pest under the different watering scenarios. (E) Using estimates of intrinsic growth rate we can then estimate the population growth rate of grasshoppers using a simple Ricker’s population growth model applied to the different scenarios. Assuming we would add 5 mm d-1 each season during heatwave events, grasshopper populations would be suppressed over time whereas adding 2 mm d-1 results in grasshopper population growth, leading to heatwave associated outbreaks. Here, the optimal solution is thus 5 mm d-1 of water added to both 1) cool plants to protect them during a heat wave and 2) supress pest outbreaks. Created with BioRender.com.</w:t>
             </w:r>
           </w:p>
           <w:bookmarkEnd w:id="49"/>
@@ -4091,7 +4241,7 @@
               </w:numPr>
             </w:pPr>
             <w:r>
-              <w:t xml:space="preserve">How effective are models that use parameters of closely related species at predicting the impacts of extreme heat for species lacking data?</w:t>
+              <w:t xml:space="preserve">For data deficient species, can we use parameters of closely related species at predicting the impacts of extreme heat for species lacking data?</w:t>
             </w:r>
           </w:p>
           <w:p>
@@ -4225,7 +4375,7 @@
         <w:t xml:space="preserve">Outstanding Questions</w:t>
       </w:r>
       <w:r>
-        <w:t xml:space="preserve">). Developing a systems modelling framework will require collaboration between different research fields, including biophysics, physiology, ecology and evolutionary biology as well as collaboration with socio-ecologists. Nonetheless, by working collaboratively and integratively we can develop a more calculated understanding of the impacts that extreme heat will have on organisms, populations, and communities along with how to mitigate these impacts to preserve diverse systems now and into the future.</w:t>
+        <w:t xml:space="preserve">). Developing a systems modelling framework will require collaboration between different research fields, including biophysics, physiology, ecology and evolutionary biology as well as collaboration with socio-ecologists. Nonetheless, by working collaboratively and integratively we can develop a more quantitative and predictive understanding of the impacts that extreme heat will have on organisms, populations, and communities along with how to mitigate these impacts to preserve diverse systems now and into the future.</w:t>
       </w:r>
     </w:p>
     <w:bookmarkEnd w:id="51"/>
@@ -4247,12 +4397,30 @@
       </w:r>
     </w:p>
     <w:bookmarkEnd w:id="52"/>
-    <w:bookmarkStart w:id="164" w:name="references"/>
+    <w:bookmarkStart w:id="53" w:name="supplement-and-code"/>
     <w:p>
       <w:pPr>
         <w:pStyle w:val="Heading1"/>
       </w:pPr>
       <w:r>
+        <w:t xml:space="preserve">Supplement and Code</w:t>
+      </w:r>
+    </w:p>
+    <w:p>
+      <w:pPr>
+        <w:pStyle w:val="FirstParagraph"/>
+      </w:pPr>
+      <w:r>
+        <w:t xml:space="preserve">Link to the supplement can be found here: https://daniel1noble.github.io/thermal_tol_interactions/ with the full set of files being located on our GitHub repository at https://github.com/daniel1noble/thermal_tol_interactions.</w:t>
+      </w:r>
+    </w:p>
+    <w:bookmarkEnd w:id="53"/>
+    <w:bookmarkStart w:id="165" w:name="references"/>
+    <w:p>
+      <w:pPr>
+        <w:pStyle w:val="Heading1"/>
+      </w:pPr>
+      <w:r>
         <w:t xml:space="preserve">References</w:t>
       </w:r>
     </w:p>
@@ -4261,8 +4429,8 @@
         <w:pStyle w:val="FirstParagraph"/>
       </w:pPr>
     </w:p>
-    <w:bookmarkStart w:id="163" w:name="refs"/>
-    <w:bookmarkStart w:id="53" w:name="ref-Barriopedro2023"/>
+    <w:bookmarkStart w:id="164" w:name="refs"/>
+    <w:bookmarkStart w:id="54" w:name="ref-Barriopedro2023"/>
     <w:p>
       <w:pPr>
         <w:pStyle w:val="Bibliography"/>
@@ -4312,8 +4480,8 @@
         <w:t xml:space="preserve">61, e2022RG000780</w:t>
       </w:r>
     </w:p>
-    <w:bookmarkEnd w:id="53"/>
-    <w:bookmarkStart w:id="54" w:name="ref-Aglas-Leitner2024"/>
+    <w:bookmarkEnd w:id="54"/>
+    <w:bookmarkStart w:id="55" w:name="ref-Aglas-Leitner2024"/>
     <w:p>
       <w:pPr>
         <w:pStyle w:val="Bibliography"/>
@@ -4360,8 +4528,8 @@
         <w:t xml:space="preserve">, Copernicus Meetings</w:t>
       </w:r>
     </w:p>
-    <w:bookmarkEnd w:id="54"/>
-    <w:bookmarkStart w:id="55" w:name="ref-Evans2025"/>
+    <w:bookmarkEnd w:id="55"/>
+    <w:bookmarkStart w:id="56" w:name="ref-Evans2025"/>
     <w:p>
       <w:pPr>
         <w:pStyle w:val="Bibliography"/>
@@ -4411,8 +4579,8 @@
         <w:t xml:space="preserve">388, 1167–1173</w:t>
       </w:r>
     </w:p>
-    <w:bookmarkEnd w:id="55"/>
-    <w:bookmarkStart w:id="56" w:name="ref-Margalef-Marrase2020"/>
+    <w:bookmarkEnd w:id="56"/>
+    <w:bookmarkStart w:id="57" w:name="ref-Margalef-Marrase2020"/>
     <w:p>
       <w:pPr>
         <w:pStyle w:val="Bibliography"/>
@@ -4462,8 +4630,8 @@
         <w:t xml:space="preserve">26, 3134–3146</w:t>
       </w:r>
     </w:p>
-    <w:bookmarkEnd w:id="56"/>
-    <w:bookmarkStart w:id="57" w:name="ref-Kazenel2024"/>
+    <w:bookmarkEnd w:id="57"/>
+    <w:bookmarkStart w:id="58" w:name="ref-Kazenel2024"/>
     <w:p>
       <w:pPr>
         <w:pStyle w:val="Bibliography"/>
@@ -4507,8 +4675,8 @@
         <w:t xml:space="preserve">Nature</w:t>
       </w:r>
     </w:p>
-    <w:bookmarkEnd w:id="57"/>
-    <w:bookmarkStart w:id="58" w:name="ref-Zhao2017"/>
+    <w:bookmarkEnd w:id="58"/>
+    <w:bookmarkStart w:id="59" w:name="ref-Zhao2017"/>
     <w:p>
       <w:pPr>
         <w:pStyle w:val="Bibliography"/>
@@ -4558,8 +4726,8 @@
         <w:t xml:space="preserve">114, 9326–9331</w:t>
       </w:r>
     </w:p>
-    <w:bookmarkEnd w:id="58"/>
-    <w:bookmarkStart w:id="59" w:name="ref-Tito2018"/>
+    <w:bookmarkEnd w:id="59"/>
+    <w:bookmarkStart w:id="60" w:name="ref-Tito2018"/>
     <w:p>
       <w:pPr>
         <w:pStyle w:val="Bibliography"/>
@@ -4609,8 +4777,8 @@
         <w:t xml:space="preserve">24, e592–e602</w:t>
       </w:r>
     </w:p>
-    <w:bookmarkEnd w:id="59"/>
-    <w:bookmarkStart w:id="60" w:name="ref-Bernacchi2025"/>
+    <w:bookmarkEnd w:id="60"/>
+    <w:bookmarkStart w:id="61" w:name="ref-Bernacchi2025"/>
     <w:p>
       <w:pPr>
         <w:pStyle w:val="Bibliography"/>
@@ -4660,8 +4828,8 @@
         <w:t xml:space="preserve">388, 1153–1160</w:t>
       </w:r>
     </w:p>
-    <w:bookmarkEnd w:id="60"/>
-    <w:bookmarkStart w:id="61" w:name="ref-Martinez2023"/>
+    <w:bookmarkEnd w:id="61"/>
+    <w:bookmarkStart w:id="62" w:name="ref-Martinez2023"/>
     <w:p>
       <w:pPr>
         <w:pStyle w:val="Bibliography"/>
@@ -4705,8 +4873,8 @@
         <w:t xml:space="preserve">J. Appl. Entomol.</w:t>
       </w:r>
     </w:p>
-    <w:bookmarkEnd w:id="61"/>
-    <w:bookmarkStart w:id="62" w:name="ref-Rezende2020"/>
+    <w:bookmarkEnd w:id="62"/>
+    <w:bookmarkStart w:id="63" w:name="ref-Rezende2020"/>
     <w:p>
       <w:pPr>
         <w:pStyle w:val="Bibliography"/>
@@ -4756,8 +4924,8 @@
         <w:t xml:space="preserve">369, 1242–1245</w:t>
       </w:r>
     </w:p>
-    <w:bookmarkEnd w:id="62"/>
-    <w:bookmarkStart w:id="63" w:name="ref-Orsted2024"/>
+    <w:bookmarkEnd w:id="63"/>
+    <w:bookmarkStart w:id="64" w:name="ref-Orsted2024"/>
     <w:p>
       <w:pPr>
         <w:pStyle w:val="Bibliography"/>
@@ -4807,8 +4975,8 @@
         <w:t xml:space="preserve">27, e14421</w:t>
       </w:r>
     </w:p>
-    <w:bookmarkEnd w:id="63"/>
-    <w:bookmarkStart w:id="64" w:name="ref-Lopez-Goldar2024"/>
+    <w:bookmarkEnd w:id="64"/>
+    <w:bookmarkStart w:id="65" w:name="ref-Lopez-Goldar2024"/>
     <w:p>
       <w:pPr>
         <w:pStyle w:val="Bibliography"/>
@@ -4852,8 +5020,8 @@
         <w:t xml:space="preserve">Plant Cell Environ.</w:t>
       </w:r>
     </w:p>
-    <w:bookmarkEnd w:id="64"/>
-    <w:bookmarkStart w:id="65" w:name="ref-Trivedi2022"/>
+    <w:bookmarkEnd w:id="65"/>
+    <w:bookmarkStart w:id="66" w:name="ref-Trivedi2022"/>
     <w:p>
       <w:pPr>
         <w:pStyle w:val="Bibliography"/>
@@ -4903,8 +5071,8 @@
         <w:t xml:space="preserve">234, 1951–1959</w:t>
       </w:r>
     </w:p>
-    <w:bookmarkEnd w:id="65"/>
-    <w:bookmarkStart w:id="66" w:name="ref-Kooijman2010"/>
+    <w:bookmarkEnd w:id="66"/>
+    <w:bookmarkStart w:id="67" w:name="ref-Kooijman2010"/>
     <w:p>
       <w:pPr>
         <w:pStyle w:val="Bibliography"/>
@@ -4935,8 +5103,8 @@
         <w:t xml:space="preserve">, Cambridge university press</w:t>
       </w:r>
     </w:p>
-    <w:bookmarkEnd w:id="66"/>
-    <w:bookmarkStart w:id="67" w:name="ref-Kearney2009b"/>
+    <w:bookmarkEnd w:id="67"/>
+    <w:bookmarkStart w:id="68" w:name="ref-Kearney2009b"/>
     <w:p>
       <w:pPr>
         <w:pStyle w:val="Bibliography"/>
@@ -4970,8 +5138,8 @@
         <w:t xml:space="preserve">12, 334–350</w:t>
       </w:r>
     </w:p>
-    <w:bookmarkEnd w:id="67"/>
-    <w:bookmarkStart w:id="68" w:name="ref-Jusup2024"/>
+    <w:bookmarkEnd w:id="68"/>
+    <w:bookmarkStart w:id="69" w:name="ref-Jusup2024"/>
     <w:p>
       <w:pPr>
         <w:pStyle w:val="Bibliography"/>
@@ -4999,8 +5167,8 @@
         <w:t xml:space="preserve">arXiv preprint arXiv:2408. 13998</w:t>
       </w:r>
     </w:p>
-    <w:bookmarkEnd w:id="68"/>
-    <w:bookmarkStart w:id="69" w:name="ref-Kearney2024"/>
+    <w:bookmarkEnd w:id="69"/>
+    <w:bookmarkStart w:id="70" w:name="ref-Kearney2024"/>
     <w:p>
       <w:pPr>
         <w:pStyle w:val="Bibliography"/>
@@ -5043,8 +5211,8 @@
         <w:t xml:space="preserve">15, 1516–1531</w:t>
       </w:r>
     </w:p>
-    <w:bookmarkEnd w:id="69"/>
-    <w:bookmarkStart w:id="70" w:name="ref-Briscoe2023"/>
+    <w:bookmarkEnd w:id="70"/>
+    <w:bookmarkStart w:id="71" w:name="ref-Briscoe2023"/>
     <w:p>
       <w:pPr>
         <w:pStyle w:val="Bibliography"/>
@@ -5094,8 +5262,8 @@
         <w:t xml:space="preserve">29, 1451–1470</w:t>
       </w:r>
     </w:p>
-    <w:bookmarkEnd w:id="70"/>
-    <w:bookmarkStart w:id="71" w:name="ref-Rezende2014"/>
+    <w:bookmarkEnd w:id="71"/>
+    <w:bookmarkStart w:id="72" w:name="ref-Rezende2014"/>
     <w:p>
       <w:pPr>
         <w:pStyle w:val="Bibliography"/>
@@ -5145,8 +5313,8 @@
         <w:t xml:space="preserve">28, 799–809</w:t>
       </w:r>
     </w:p>
-    <w:bookmarkEnd w:id="71"/>
-    <w:bookmarkStart w:id="72" w:name="ref-Arnold2025a"/>
+    <w:bookmarkEnd w:id="72"/>
+    <w:bookmarkStart w:id="73" w:name="ref-Arnold2025a"/>
     <w:p>
       <w:pPr>
         <w:pStyle w:val="Bibliography"/>
@@ -5196,8 +5364,8 @@
         <w:t xml:space="preserve">31, e70315</w:t>
       </w:r>
     </w:p>
-    <w:bookmarkEnd w:id="72"/>
-    <w:bookmarkStart w:id="73" w:name="ref-Bimler2018"/>
+    <w:bookmarkEnd w:id="73"/>
+    <w:bookmarkStart w:id="74" w:name="ref-Bimler2018"/>
     <w:p>
       <w:pPr>
         <w:pStyle w:val="Bibliography"/>
@@ -5247,8 +5415,8 @@
         <w:t xml:space="preserve">106, 1839–1852</w:t>
       </w:r>
     </w:p>
-    <w:bookmarkEnd w:id="73"/>
-    <w:bookmarkStart w:id="74" w:name="ref-Bowler2022"/>
+    <w:bookmarkEnd w:id="74"/>
+    <w:bookmarkStart w:id="75" w:name="ref-Bowler2022"/>
     <w:p>
       <w:pPr>
         <w:pStyle w:val="Bibliography"/>
@@ -5298,8 +5466,8 @@
         <w:t xml:space="preserve">25, 1618–1628</w:t>
       </w:r>
     </w:p>
-    <w:bookmarkEnd w:id="74"/>
-    <w:bookmarkStart w:id="75" w:name="ref-Tushabe2025"/>
+    <w:bookmarkEnd w:id="75"/>
+    <w:bookmarkStart w:id="76" w:name="ref-Tushabe2025"/>
     <w:p>
       <w:pPr>
         <w:pStyle w:val="Bibliography"/>
@@ -5333,8 +5501,8 @@
         <w:t xml:space="preserve">48, 1366–1379</w:t>
       </w:r>
     </w:p>
-    <w:bookmarkEnd w:id="75"/>
-    <w:bookmarkStart w:id="76" w:name="ref-Fick2017"/>
+    <w:bookmarkEnd w:id="76"/>
+    <w:bookmarkStart w:id="77" w:name="ref-Fick2017"/>
     <w:p>
       <w:pPr>
         <w:pStyle w:val="Bibliography"/>
@@ -5425,8 +5593,8 @@
         <w:t xml:space="preserve">37, 4302–4315</w:t>
       </w:r>
     </w:p>
-    <w:bookmarkEnd w:id="76"/>
-    <w:bookmarkStart w:id="77" w:name="ref-Kalnay2018"/>
+    <w:bookmarkEnd w:id="77"/>
+    <w:bookmarkStart w:id="78" w:name="ref-Kalnay2018"/>
     <w:p>
       <w:pPr>
         <w:pStyle w:val="Bibliography"/>
@@ -5491,8 +5659,8 @@
         <w:t xml:space="preserve">, pp. 146–194, Routledge</w:t>
       </w:r>
     </w:p>
-    <w:bookmarkEnd w:id="77"/>
-    <w:bookmarkStart w:id="78" w:name="ref-Hersbach2020"/>
+    <w:bookmarkEnd w:id="78"/>
+    <w:bookmarkStart w:id="79" w:name="ref-Hersbach2020"/>
     <w:p>
       <w:pPr>
         <w:pStyle w:val="Bibliography"/>
@@ -5554,8 +5722,8 @@
         <w:t xml:space="preserve">146, 1999–2049</w:t>
       </w:r>
     </w:p>
-    <w:bookmarkEnd w:id="78"/>
-    <w:bookmarkStart w:id="79" w:name="ref-Klinges2022"/>
+    <w:bookmarkEnd w:id="79"/>
+    <w:bookmarkStart w:id="80" w:name="ref-Klinges2022"/>
     <w:p>
       <w:pPr>
         <w:pStyle w:val="Bibliography"/>
@@ -5629,8 +5797,8 @@
         <w:t xml:space="preserve">13, 1402–1411</w:t>
       </w:r>
     </w:p>
-    <w:bookmarkEnd w:id="79"/>
-    <w:bookmarkStart w:id="80" w:name="ref-Meyer2023"/>
+    <w:bookmarkEnd w:id="80"/>
+    <w:bookmarkStart w:id="81" w:name="ref-Meyer2023"/>
     <w:p>
       <w:pPr>
         <w:pStyle w:val="Bibliography"/>
@@ -5680,8 +5848,8 @@
         <w:t xml:space="preserve">14</w:t>
       </w:r>
     </w:p>
-    <w:bookmarkEnd w:id="80"/>
-    <w:bookmarkStart w:id="81" w:name="ref-Munoz-Sabater2021"/>
+    <w:bookmarkEnd w:id="81"/>
+    <w:bookmarkStart w:id="82" w:name="ref-Munoz-Sabater2021"/>
     <w:p>
       <w:pPr>
         <w:pStyle w:val="Bibliography"/>
@@ -5740,8 +5908,8 @@
         <w:t xml:space="preserve">13, 4349–4383</w:t>
       </w:r>
     </w:p>
-    <w:bookmarkEnd w:id="81"/>
-    <w:bookmarkStart w:id="82" w:name="ref-Bezanson2012"/>
+    <w:bookmarkEnd w:id="82"/>
+    <w:bookmarkStart w:id="83" w:name="ref-Bezanson2012"/>
     <w:p>
       <w:pPr>
         <w:pStyle w:val="Bibliography"/>
@@ -5785,8 +5953,8 @@
         <w:t xml:space="preserve">arXiv [cs.PL]</w:t>
       </w:r>
     </w:p>
-    <w:bookmarkEnd w:id="82"/>
-    <w:bookmarkStart w:id="83" w:name="ref-Bonan2019"/>
+    <w:bookmarkEnd w:id="83"/>
+    <w:bookmarkStart w:id="84" w:name="ref-Bonan2019"/>
     <w:p>
       <w:pPr>
         <w:pStyle w:val="Bibliography"/>
@@ -5817,8 +5985,8 @@
         <w:t xml:space="preserve">, Cambridge University Press</w:t>
       </w:r>
     </w:p>
-    <w:bookmarkEnd w:id="83"/>
-    <w:bookmarkStart w:id="84" w:name="ref-Argles2022"/>
+    <w:bookmarkEnd w:id="84"/>
+    <w:bookmarkStart w:id="85" w:name="ref-Argles2022"/>
     <w:p>
       <w:pPr>
         <w:pStyle w:val="Bibliography"/>
@@ -5868,8 +6036,8 @@
         <w:t xml:space="preserve">1, e0000068</w:t>
       </w:r>
     </w:p>
-    <w:bookmarkEnd w:id="84"/>
-    <w:bookmarkStart w:id="85" w:name="ref-Kearney2017"/>
+    <w:bookmarkEnd w:id="85"/>
+    <w:bookmarkStart w:id="86" w:name="ref-Kearney2017"/>
     <w:p>
       <w:pPr>
         <w:pStyle w:val="Bibliography"/>
@@ -5927,8 +6095,8 @@
         <w:t xml:space="preserve">40, 664–674</w:t>
       </w:r>
     </w:p>
-    <w:bookmarkEnd w:id="85"/>
-    <w:bookmarkStart w:id="86" w:name="ref-Maclean2019"/>
+    <w:bookmarkEnd w:id="86"/>
+    <w:bookmarkStart w:id="87" w:name="ref-Maclean2019"/>
     <w:p>
       <w:pPr>
         <w:pStyle w:val="Bibliography"/>
@@ -5978,8 +6146,8 @@
         <w:t xml:space="preserve">10, 280–290</w:t>
       </w:r>
     </w:p>
-    <w:bookmarkEnd w:id="86"/>
-    <w:bookmarkStart w:id="87" w:name="ref-Kearney2020"/>
+    <w:bookmarkEnd w:id="87"/>
+    <w:bookmarkStart w:id="88" w:name="ref-Kearney2020"/>
     <w:p>
       <w:pPr>
         <w:pStyle w:val="Bibliography"/>
@@ -6029,8 +6197,8 @@
         <w:t xml:space="preserve">11, 38–43</w:t>
       </w:r>
     </w:p>
-    <w:bookmarkEnd w:id="87"/>
-    <w:bookmarkStart w:id="88" w:name="ref-Maclean2021"/>
+    <w:bookmarkEnd w:id="88"/>
+    <w:bookmarkStart w:id="89" w:name="ref-Maclean2021"/>
     <w:p>
       <w:pPr>
         <w:pStyle w:val="Bibliography"/>
@@ -6080,8 +6248,8 @@
         <w:t xml:space="preserve">12, 1397–1410</w:t>
       </w:r>
     </w:p>
-    <w:bookmarkEnd w:id="88"/>
-    <w:bookmarkStart w:id="89" w:name="ref-Buckley2023"/>
+    <w:bookmarkEnd w:id="89"/>
+    <w:bookmarkStart w:id="90" w:name="ref-Buckley2023"/>
     <w:p>
       <w:pPr>
         <w:pStyle w:val="Bibliography"/>
@@ -6152,8 +6320,8 @@
         <w:t xml:space="preserve">2, e0000139</w:t>
       </w:r>
     </w:p>
-    <w:bookmarkEnd w:id="89"/>
-    <w:bookmarkStart w:id="90" w:name="ref-De_Frenne2024"/>
+    <w:bookmarkEnd w:id="90"/>
+    <w:bookmarkStart w:id="91" w:name="ref-De_Frenne2024"/>
     <w:p>
       <w:pPr>
         <w:pStyle w:val="Bibliography"/>
@@ -6197,8 +6365,8 @@
         <w:t xml:space="preserve">Methods Ecol. Evol.</w:t>
       </w:r>
     </w:p>
-    <w:bookmarkEnd w:id="90"/>
-    <w:bookmarkStart w:id="91" w:name="ref-Levy2016"/>
+    <w:bookmarkEnd w:id="91"/>
+    <w:bookmarkStart w:id="92" w:name="ref-Levy2016"/>
     <w:p>
       <w:pPr>
         <w:pStyle w:val="Bibliography"/>
@@ -6248,8 +6416,8 @@
         <w:t xml:space="preserve">97, 1888–1888</w:t>
       </w:r>
     </w:p>
-    <w:bookmarkEnd w:id="91"/>
-    <w:bookmarkStart w:id="92" w:name="ref-Drake2018"/>
+    <w:bookmarkEnd w:id="92"/>
+    <w:bookmarkStart w:id="93" w:name="ref-Drake2018"/>
     <w:p>
       <w:pPr>
         <w:pStyle w:val="Bibliography"/>
@@ -6299,8 +6467,8 @@
         <w:t xml:space="preserve">24, 2390–2402</w:t>
       </w:r>
     </w:p>
-    <w:bookmarkEnd w:id="92"/>
-    <w:bookmarkStart w:id="93" w:name="ref-Holzworth2018"/>
+    <w:bookmarkEnd w:id="93"/>
+    <w:bookmarkStart w:id="94" w:name="ref-Holzworth2018"/>
     <w:p>
       <w:pPr>
         <w:pStyle w:val="Bibliography"/>
@@ -6362,8 +6530,8 @@
         <w:t xml:space="preserve">103, 43–51</w:t>
       </w:r>
     </w:p>
-    <w:bookmarkEnd w:id="93"/>
-    <w:bookmarkStart w:id="94" w:name="ref-Medlyn2011"/>
+    <w:bookmarkEnd w:id="94"/>
+    <w:bookmarkStart w:id="95" w:name="ref-Medlyn2011"/>
     <w:p>
       <w:pPr>
         <w:pStyle w:val="Bibliography"/>
@@ -6452,8 +6620,8 @@
         <w:t xml:space="preserve">17, 2134–2144</w:t>
       </w:r>
     </w:p>
-    <w:bookmarkEnd w:id="94"/>
-    <w:bookmarkStart w:id="95" w:name="ref-Porter1973"/>
+    <w:bookmarkEnd w:id="95"/>
+    <w:bookmarkStart w:id="96" w:name="ref-Porter1973"/>
     <w:p>
       <w:pPr>
         <w:pStyle w:val="Bibliography"/>
@@ -6503,8 +6671,8 @@
         <w:t xml:space="preserve">13, 1–54</w:t>
       </w:r>
     </w:p>
-    <w:bookmarkEnd w:id="95"/>
-    <w:bookmarkStart w:id="96" w:name="ref-Porter1969"/>
+    <w:bookmarkEnd w:id="96"/>
+    <w:bookmarkStart w:id="97" w:name="ref-Porter1969"/>
     <w:p>
       <w:pPr>
         <w:pStyle w:val="Bibliography"/>
@@ -6538,8 +6706,8 @@
         <w:t xml:space="preserve">39, 227–244</w:t>
       </w:r>
     </w:p>
-    <w:bookmarkEnd w:id="96"/>
-    <w:bookmarkStart w:id="97" w:name="ref-Riddell2017"/>
+    <w:bookmarkEnd w:id="97"/>
+    <w:bookmarkStart w:id="98" w:name="ref-Riddell2017"/>
     <w:p>
       <w:pPr>
         <w:pStyle w:val="Bibliography"/>
@@ -6589,8 +6757,8 @@
         <w:t xml:space="preserve">87, 21–33</w:t>
       </w:r>
     </w:p>
-    <w:bookmarkEnd w:id="97"/>
-    <w:bookmarkStart w:id="98" w:name="ref-Duursma2015"/>
+    <w:bookmarkEnd w:id="98"/>
+    <w:bookmarkStart w:id="99" w:name="ref-Duursma2015"/>
     <w:p>
       <w:pPr>
         <w:pStyle w:val="Bibliography"/>
@@ -6636,8 +6804,8 @@
         <w:t xml:space="preserve">10, e0143346</w:t>
       </w:r>
     </w:p>
-    <w:bookmarkEnd w:id="98"/>
-    <w:bookmarkStart w:id="99" w:name="ref-Briscoe2022"/>
+    <w:bookmarkEnd w:id="99"/>
+    <w:bookmarkStart w:id="100" w:name="ref-Briscoe2022"/>
     <w:p>
       <w:pPr>
         <w:pStyle w:val="Bibliography"/>
@@ -6687,8 +6855,8 @@
         <w:t xml:space="preserve">15</w:t>
       </w:r>
     </w:p>
-    <w:bookmarkEnd w:id="99"/>
-    <w:bookmarkStart w:id="100" w:name="ref-Loughran2020"/>
+    <w:bookmarkEnd w:id="100"/>
+    <w:bookmarkStart w:id="101" w:name="ref-Loughran2020"/>
     <w:p>
       <w:pPr>
         <w:pStyle w:val="Bibliography"/>
@@ -6722,8 +6890,8 @@
         <w:t xml:space="preserve">223, jeb224139</w:t>
       </w:r>
     </w:p>
-    <w:bookmarkEnd w:id="100"/>
-    <w:bookmarkStart w:id="101" w:name="ref-Sharpe2022"/>
+    <w:bookmarkEnd w:id="101"/>
+    <w:bookmarkStart w:id="102" w:name="ref-Sharpe2022"/>
     <w:p>
       <w:pPr>
         <w:pStyle w:val="Bibliography"/>
@@ -6773,8 +6941,8 @@
         <w:t xml:space="preserve">10</w:t>
       </w:r>
     </w:p>
-    <w:bookmarkEnd w:id="101"/>
-    <w:bookmarkStart w:id="102" w:name="ref-Posch2024"/>
+    <w:bookmarkEnd w:id="102"/>
+    <w:bookmarkStart w:id="103" w:name="ref-Posch2024"/>
     <w:p>
       <w:pPr>
         <w:pStyle w:val="Bibliography"/>
@@ -6824,8 +6992,8 @@
         <w:t xml:space="preserve">121, e2408583121</w:t>
       </w:r>
     </w:p>
-    <w:bookmarkEnd w:id="102"/>
-    <w:bookmarkStart w:id="103" w:name="ref-Orsted2022"/>
+    <w:bookmarkEnd w:id="103"/>
+    <w:bookmarkStart w:id="104" w:name="ref-Orsted2022"/>
     <w:p>
       <w:pPr>
         <w:pStyle w:val="Bibliography"/>
@@ -6887,8 +7055,8 @@
         <w:t xml:space="preserve">225, jeb244514</w:t>
       </w:r>
     </w:p>
-    <w:bookmarkEnd w:id="103"/>
-    <w:bookmarkStart w:id="104" w:name="ref-Jagadish2021"/>
+    <w:bookmarkEnd w:id="104"/>
+    <w:bookmarkStart w:id="105" w:name="ref-Jagadish2021"/>
     <w:p>
       <w:pPr>
         <w:pStyle w:val="Bibliography"/>
@@ -6938,8 +7106,8 @@
         <w:t xml:space="preserve">44, 1992–2005</w:t>
       </w:r>
     </w:p>
-    <w:bookmarkEnd w:id="104"/>
-    <w:bookmarkStart w:id="105" w:name="ref-Faber2024"/>
+    <w:bookmarkEnd w:id="105"/>
+    <w:bookmarkStart w:id="106" w:name="ref-Faber2024"/>
     <w:p>
       <w:pPr>
         <w:pStyle w:val="Bibliography"/>
@@ -6989,8 +7157,8 @@
         <w:t xml:space="preserve">75, 3467–3482</w:t>
       </w:r>
     </w:p>
-    <w:bookmarkEnd w:id="105"/>
-    <w:bookmarkStart w:id="106" w:name="ref-Martinez-De_Leon2024"/>
+    <w:bookmarkEnd w:id="106"/>
+    <w:bookmarkStart w:id="107" w:name="ref-Martinez-De_Leon2024"/>
     <w:p>
       <w:pPr>
         <w:pStyle w:val="Bibliography"/>
@@ -7018,8 +7186,8 @@
         <w:t xml:space="preserve">Trends Ecol. Evol.</w:t>
       </w:r>
     </w:p>
-    <w:bookmarkEnd w:id="106"/>
-    <w:bookmarkStart w:id="107" w:name="ref-Chouhan2023"/>
+    <w:bookmarkEnd w:id="107"/>
+    <w:bookmarkStart w:id="108" w:name="ref-Chouhan2023"/>
     <w:p>
       <w:pPr>
         <w:pStyle w:val="Bibliography"/>
@@ -7066,8 +7234,8 @@
         <w:t xml:space="preserve">, pp. 127–147, Springer Nature Singapore</w:t>
       </w:r>
     </w:p>
-    <w:bookmarkEnd w:id="107"/>
-    <w:bookmarkStart w:id="108" w:name="ref-Marquez2007"/>
+    <w:bookmarkEnd w:id="108"/>
+    <w:bookmarkStart w:id="109" w:name="ref-Marquez2007"/>
     <w:p>
       <w:pPr>
         <w:pStyle w:val="Bibliography"/>
@@ -7117,8 +7285,8 @@
         <w:t xml:space="preserve">315, 513–515</w:t>
       </w:r>
     </w:p>
-    <w:bookmarkEnd w:id="108"/>
-    <w:bookmarkStart w:id="109" w:name="ref-Dastogeer2022"/>
+    <w:bookmarkEnd w:id="109"/>
+    <w:bookmarkStart w:id="110" w:name="ref-Dastogeer2022"/>
     <w:p>
       <w:pPr>
         <w:pStyle w:val="Bibliography"/>
@@ -7168,8 +7336,8 @@
         <w:t xml:space="preserve">13, 833566</w:t>
       </w:r>
     </w:p>
-    <w:bookmarkEnd w:id="109"/>
-    <w:bookmarkStart w:id="110" w:name="ref-Hoang2019"/>
+    <w:bookmarkEnd w:id="110"/>
+    <w:bookmarkStart w:id="111" w:name="ref-Hoang2019"/>
     <w:p>
       <w:pPr>
         <w:pStyle w:val="Bibliography"/>
@@ -7219,8 +7387,8 @@
         <w:t xml:space="preserve">9, 3491–3499</w:t>
       </w:r>
     </w:p>
-    <w:bookmarkEnd w:id="110"/>
-    <w:bookmarkStart w:id="111" w:name="ref-Marchin2022"/>
+    <w:bookmarkEnd w:id="111"/>
+    <w:bookmarkStart w:id="112" w:name="ref-Marchin2022"/>
     <w:p>
       <w:pPr>
         <w:pStyle w:val="Bibliography"/>
@@ -7270,8 +7438,8 @@
         <w:t xml:space="preserve">28, 1133–1146</w:t>
       </w:r>
     </w:p>
-    <w:bookmarkEnd w:id="111"/>
-    <w:bookmarkStart w:id="112" w:name="ref-Li2025"/>
+    <w:bookmarkEnd w:id="112"/>
+    <w:bookmarkStart w:id="113" w:name="ref-Li2025"/>
     <w:p>
       <w:pPr>
         <w:pStyle w:val="Bibliography"/>
@@ -7321,8 +7489,8 @@
         <w:t xml:space="preserve">33, 882–900.e7</w:t>
       </w:r>
     </w:p>
-    <w:bookmarkEnd w:id="112"/>
-    <w:bookmarkStart w:id="113" w:name="ref-Youngblood2025"/>
+    <w:bookmarkEnd w:id="113"/>
+    <w:bookmarkStart w:id="114" w:name="ref-Youngblood2025"/>
     <w:p>
       <w:pPr>
         <w:pStyle w:val="Bibliography"/>
@@ -7366,8 +7534,8 @@
         <w:t xml:space="preserve">Funct. Ecol.</w:t>
       </w:r>
     </w:p>
-    <w:bookmarkEnd w:id="113"/>
-    <w:bookmarkStart w:id="114" w:name="ref-Mengutay2013"/>
+    <w:bookmarkEnd w:id="114"/>
+    <w:bookmarkStart w:id="115" w:name="ref-Mengutay2013"/>
     <w:p>
       <w:pPr>
         <w:pStyle w:val="Bibliography"/>
@@ -7417,8 +7585,8 @@
         <w:t xml:space="preserve">368, 57–72</w:t>
       </w:r>
     </w:p>
-    <w:bookmarkEnd w:id="114"/>
-    <w:bookmarkStart w:id="115" w:name="ref-Andersen2010"/>
+    <w:bookmarkEnd w:id="115"/>
+    <w:bookmarkStart w:id="116" w:name="ref-Andersen2010"/>
     <w:p>
       <w:pPr>
         <w:pStyle w:val="Bibliography"/>
@@ -7468,8 +7636,8 @@
         <w:t xml:space="preserve">56, 336–340</w:t>
       </w:r>
     </w:p>
-    <w:bookmarkEnd w:id="115"/>
-    <w:bookmarkStart w:id="116" w:name="ref-Nisbet2000"/>
+    <w:bookmarkEnd w:id="116"/>
+    <w:bookmarkStart w:id="117" w:name="ref-Nisbet2000"/>
     <w:p>
       <w:pPr>
         <w:pStyle w:val="Bibliography"/>
@@ -7519,8 +7687,8 @@
         <w:t xml:space="preserve">69, 913–926</w:t>
       </w:r>
     </w:p>
-    <w:bookmarkEnd w:id="116"/>
-    <w:bookmarkStart w:id="117" w:name="ref-Jager2020"/>
+    <w:bookmarkEnd w:id="117"/>
+    <w:bookmarkStart w:id="118" w:name="ref-Jager2020"/>
     <w:p>
       <w:pPr>
         <w:pStyle w:val="Bibliography"/>
@@ -7566,8 +7734,8 @@
         <w:t xml:space="preserve">416, 108904</w:t>
       </w:r>
     </w:p>
-    <w:bookmarkEnd w:id="117"/>
-    <w:bookmarkStart w:id="118" w:name="ref-Kearney2013"/>
+    <w:bookmarkEnd w:id="118"/>
+    <w:bookmarkStart w:id="119" w:name="ref-Kearney2013"/>
     <w:p>
       <w:pPr>
         <w:pStyle w:val="Bibliography"/>
@@ -7617,8 +7785,8 @@
         <w:t xml:space="preserve">27, 950–966</w:t>
       </w:r>
     </w:p>
-    <w:bookmarkEnd w:id="118"/>
-    <w:bookmarkStart w:id="119" w:name="ref-Kearney2010"/>
+    <w:bookmarkEnd w:id="119"/>
+    <w:bookmarkStart w:id="120" w:name="ref-Kearney2010"/>
     <w:p>
       <w:pPr>
         <w:pStyle w:val="Bibliography"/>
@@ -7668,8 +7836,8 @@
         <w:t xml:space="preserve">365, 3469–3483</w:t>
       </w:r>
     </w:p>
-    <w:bookmarkEnd w:id="119"/>
-    <w:bookmarkStart w:id="120" w:name="ref-Marques2018"/>
+    <w:bookmarkEnd w:id="120"/>
+    <w:bookmarkStart w:id="121" w:name="ref-Marques2018"/>
     <w:p>
       <w:pPr>
         <w:pStyle w:val="Bibliography"/>
@@ -7731,8 +7899,8 @@
         <w:t xml:space="preserve">14, e1006100</w:t>
       </w:r>
     </w:p>
-    <w:bookmarkEnd w:id="120"/>
-    <w:bookmarkStart w:id="121" w:name="ref-Kooijman2021"/>
+    <w:bookmarkEnd w:id="121"/>
+    <w:bookmarkStart w:id="122" w:name="ref-Kooijman2021"/>
     <w:p>
       <w:pPr>
         <w:pStyle w:val="Bibliography"/>
@@ -7782,8 +7950,8 @@
         <w:t xml:space="preserve">9, coab086</w:t>
       </w:r>
     </w:p>
-    <w:bookmarkEnd w:id="121"/>
-    <w:bookmarkStart w:id="122" w:name="ref-Bruggeman2009"/>
+    <w:bookmarkEnd w:id="122"/>
+    <w:bookmarkStart w:id="123" w:name="ref-Bruggeman2009"/>
     <w:p>
       <w:pPr>
         <w:pStyle w:val="Bibliography"/>
@@ -7842,8 +8010,8 @@
         <w:t xml:space="preserve">37, W179–W184</w:t>
       </w:r>
     </w:p>
-    <w:bookmarkEnd w:id="122"/>
-    <w:bookmarkStart w:id="123" w:name="ref-Kearney2020a"/>
+    <w:bookmarkEnd w:id="123"/>
+    <w:bookmarkStart w:id="124" w:name="ref-Kearney2020a"/>
     <w:p>
       <w:pPr>
         <w:pStyle w:val="Bibliography"/>
@@ -7901,8 +8069,8 @@
         <w:t xml:space="preserve">43, 85–96</w:t>
       </w:r>
     </w:p>
-    <w:bookmarkEnd w:id="123"/>
-    <w:bookmarkStart w:id="124" w:name="ref-Kumarathunge2019"/>
+    <w:bookmarkEnd w:id="124"/>
+    <w:bookmarkStart w:id="125" w:name="ref-Kumarathunge2019"/>
     <w:p>
       <w:pPr>
         <w:pStyle w:val="Bibliography"/>
@@ -7952,8 +8120,8 @@
         <w:t xml:space="preserve">222, 768–784</w:t>
       </w:r>
     </w:p>
-    <w:bookmarkEnd w:id="124"/>
-    <w:bookmarkStart w:id="125" w:name="ref-De_Kauwe2020"/>
+    <w:bookmarkEnd w:id="125"/>
+    <w:bookmarkStart w:id="126" w:name="ref-De_Kauwe2020"/>
     <w:p>
       <w:pPr>
         <w:pStyle w:val="Bibliography"/>
@@ -8003,8 +8171,8 @@
         <w:t xml:space="preserve">26, 5716–5733</w:t>
       </w:r>
     </w:p>
-    <w:bookmarkEnd w:id="125"/>
-    <w:bookmarkStart w:id="126" w:name="ref-Chesson2000"/>
+    <w:bookmarkEnd w:id="126"/>
+    <w:bookmarkStart w:id="127" w:name="ref-Chesson2000"/>
     <w:p>
       <w:pPr>
         <w:pStyle w:val="Bibliography"/>
@@ -8038,8 +8206,8 @@
         <w:t xml:space="preserve">58, 211–237</w:t>
       </w:r>
     </w:p>
-    <w:bookmarkEnd w:id="126"/>
-    <w:bookmarkStart w:id="127" w:name="ref-Ricker1954a"/>
+    <w:bookmarkEnd w:id="127"/>
+    <w:bookmarkStart w:id="128" w:name="ref-Ricker1954a"/>
     <w:p>
       <w:pPr>
         <w:pStyle w:val="Bibliography"/>
@@ -8073,8 +8241,8 @@
         <w:t xml:space="preserve">11, 559–623</w:t>
       </w:r>
     </w:p>
-    <w:bookmarkEnd w:id="127"/>
-    <w:bookmarkStart w:id="128" w:name="ref-Beverton2012"/>
+    <w:bookmarkEnd w:id="128"/>
+    <w:bookmarkStart w:id="129" w:name="ref-Beverton2012"/>
     <w:p>
       <w:pPr>
         <w:pStyle w:val="Bibliography"/>
@@ -8105,8 +8273,8 @@
         <w:t xml:space="preserve">, Springer</w:t>
       </w:r>
     </w:p>
-    <w:bookmarkEnd w:id="128"/>
-    <w:bookmarkStart w:id="129" w:name="ref-Mayfield2017"/>
+    <w:bookmarkEnd w:id="129"/>
+    <w:bookmarkStart w:id="130" w:name="ref-Mayfield2017"/>
     <w:p>
       <w:pPr>
         <w:pStyle w:val="Bibliography"/>
@@ -8140,8 +8308,8 @@
         <w:t xml:space="preserve">1, 0062</w:t>
       </w:r>
     </w:p>
-    <w:bookmarkEnd w:id="129"/>
-    <w:bookmarkStart w:id="130" w:name="ref-Buche2025"/>
+    <w:bookmarkEnd w:id="130"/>
+    <w:bookmarkStart w:id="131" w:name="ref-Buche2025"/>
     <w:p>
       <w:pPr>
         <w:pStyle w:val="Bibliography"/>
@@ -8191,8 +8359,8 @@
         <w:t xml:space="preserve">28, e70059</w:t>
       </w:r>
     </w:p>
-    <w:bookmarkEnd w:id="130"/>
-    <w:bookmarkStart w:id="131" w:name="ref-Bimler2024"/>
+    <w:bookmarkEnd w:id="131"/>
+    <w:bookmarkStart w:id="132" w:name="ref-Bimler2024"/>
     <w:p>
       <w:pPr>
         <w:pStyle w:val="Bibliography"/>
@@ -8242,8 +8410,8 @@
         <w:t xml:space="preserve">27, e14376</w:t>
       </w:r>
     </w:p>
-    <w:bookmarkEnd w:id="131"/>
-    <w:bookmarkStart w:id="132" w:name="ref-Martyn2021"/>
+    <w:bookmarkEnd w:id="132"/>
+    <w:bookmarkStart w:id="133" w:name="ref-Martyn2021"/>
     <w:p>
       <w:pPr>
         <w:pStyle w:val="Bibliography"/>
@@ -8305,8 +8473,8 @@
         <w:t xml:space="preserve">197, 415–433</w:t>
       </w:r>
     </w:p>
-    <w:bookmarkEnd w:id="132"/>
-    <w:bookmarkStart w:id="133" w:name="ref-Chevin2017"/>
+    <w:bookmarkEnd w:id="133"/>
+    <w:bookmarkStart w:id="134" w:name="ref-Chevin2017"/>
     <w:p>
       <w:pPr>
         <w:pStyle w:val="Bibliography"/>
@@ -8340,8 +8508,8 @@
         <w:t xml:space="preserve">372</w:t>
       </w:r>
     </w:p>
-    <w:bookmarkEnd w:id="133"/>
-    <w:bookmarkStart w:id="134" w:name="ref-Urban2024"/>
+    <w:bookmarkEnd w:id="134"/>
+    <w:bookmarkStart w:id="135" w:name="ref-Urban2024"/>
     <w:p>
       <w:pPr>
         <w:pStyle w:val="Bibliography"/>
@@ -8391,8 +8559,8 @@
         <w:t xml:space="preserve">8, 172–187</w:t>
       </w:r>
     </w:p>
-    <w:bookmarkEnd w:id="134"/>
-    <w:bookmarkStart w:id="135" w:name="ref-Hoffmann2011"/>
+    <w:bookmarkEnd w:id="135"/>
+    <w:bookmarkStart w:id="136" w:name="ref-Hoffmann2011"/>
     <w:p>
       <w:pPr>
         <w:pStyle w:val="Bibliography"/>
@@ -8410,8 +8578,8 @@
         <w:t xml:space="preserve">Hoffmann, A.A. and Sgrò, C.M. (2011) Climate change and evolutionary adaptation. 470, 479–485</w:t>
       </w:r>
     </w:p>
-    <w:bookmarkEnd w:id="135"/>
-    <w:bookmarkStart w:id="136" w:name="ref-Hoffmann2022"/>
+    <w:bookmarkEnd w:id="136"/>
+    <w:bookmarkStart w:id="137" w:name="ref-Hoffmann2022"/>
     <w:p>
       <w:pPr>
         <w:pStyle w:val="Bibliography"/>
@@ -8445,8 +8613,8 @@
         <w:t xml:space="preserve">2022</w:t>
       </w:r>
     </w:p>
-    <w:bookmarkEnd w:id="136"/>
-    <w:bookmarkStart w:id="137" w:name="ref-Ghalambor2015"/>
+    <w:bookmarkEnd w:id="137"/>
+    <w:bookmarkStart w:id="138" w:name="ref-Ghalambor2015"/>
     <w:p>
       <w:pPr>
         <w:pStyle w:val="Bibliography"/>
@@ -8496,8 +8664,8 @@
         <w:t xml:space="preserve">525, 372–375</w:t>
       </w:r>
     </w:p>
-    <w:bookmarkEnd w:id="137"/>
-    <w:bookmarkStart w:id="138" w:name="ref-Oostra2018"/>
+    <w:bookmarkEnd w:id="138"/>
+    <w:bookmarkStart w:id="139" w:name="ref-Oostra2018"/>
     <w:p>
       <w:pPr>
         <w:pStyle w:val="Bibliography"/>
@@ -8547,8 +8715,8 @@
         <w:t xml:space="preserve">9, 1005</w:t>
       </w:r>
     </w:p>
-    <w:bookmarkEnd w:id="138"/>
-    <w:bookmarkStart w:id="139" w:name="ref-Noble2019"/>
+    <w:bookmarkEnd w:id="139"/>
+    <w:bookmarkStart w:id="140" w:name="ref-Noble2019"/>
     <w:p>
       <w:pPr>
         <w:pStyle w:val="Bibliography"/>
@@ -8598,8 +8766,8 @@
         <w:t xml:space="preserve">116, 13452–13461</w:t>
       </w:r>
     </w:p>
-    <w:bookmarkEnd w:id="139"/>
-    <w:bookmarkStart w:id="140" w:name="ref-Sousa2010"/>
+    <w:bookmarkEnd w:id="140"/>
+    <w:bookmarkStart w:id="141" w:name="ref-Sousa2010"/>
     <w:p>
       <w:pPr>
         <w:pStyle w:val="Bibliography"/>
@@ -8649,8 +8817,8 @@
         <w:t xml:space="preserve">365, 3413–3428</w:t>
       </w:r>
     </w:p>
-    <w:bookmarkEnd w:id="140"/>
-    <w:bookmarkStart w:id="141" w:name="ref-Lande1979"/>
+    <w:bookmarkEnd w:id="141"/>
+    <w:bookmarkStart w:id="142" w:name="ref-Lande1979"/>
     <w:p>
       <w:pPr>
         <w:pStyle w:val="Bibliography"/>
@@ -8684,8 +8852,8 @@
         <w:t xml:space="preserve">33</w:t>
       </w:r>
     </w:p>
-    <w:bookmarkEnd w:id="141"/>
-    <w:bookmarkStart w:id="142" w:name="ref-Walsh2018"/>
+    <w:bookmarkEnd w:id="142"/>
+    <w:bookmarkStart w:id="143" w:name="ref-Walsh2018"/>
     <w:p>
       <w:pPr>
         <w:pStyle w:val="Bibliography"/>
@@ -8716,8 +8884,8 @@
         <w:t xml:space="preserve">, Oxford University Press</w:t>
       </w:r>
     </w:p>
-    <w:bookmarkEnd w:id="142"/>
-    <w:bookmarkStart w:id="143" w:name="ref-Baeza_Icaza2025"/>
+    <w:bookmarkEnd w:id="143"/>
+    <w:bookmarkStart w:id="144" w:name="ref-Baeza_Icaza2025"/>
     <w:p>
       <w:pPr>
         <w:pStyle w:val="Bibliography"/>
@@ -8767,8 +8935,8 @@
         <w:t xml:space="preserve">94, 896–907</w:t>
       </w:r>
     </w:p>
-    <w:bookmarkEnd w:id="143"/>
-    <w:bookmarkStart w:id="144" w:name="ref-Kearney2009a"/>
+    <w:bookmarkEnd w:id="144"/>
+    <w:bookmarkStart w:id="145" w:name="ref-Kearney2009a"/>
     <w:p>
       <w:pPr>
         <w:pStyle w:val="Bibliography"/>
@@ -8818,8 +8986,8 @@
         <w:t xml:space="preserve">23, 528–538</w:t>
       </w:r>
     </w:p>
-    <w:bookmarkEnd w:id="144"/>
-    <w:bookmarkStart w:id="145" w:name="ref-Ellner2011"/>
+    <w:bookmarkEnd w:id="145"/>
+    <w:bookmarkStart w:id="146" w:name="ref-Ellner2011"/>
     <w:p>
       <w:pPr>
         <w:pStyle w:val="Bibliography"/>
@@ -8869,8 +9037,8 @@
         <w:t xml:space="preserve">14, 603–614</w:t>
       </w:r>
     </w:p>
-    <w:bookmarkEnd w:id="145"/>
-    <w:bookmarkStart w:id="146" w:name="ref-Pottier2022a"/>
+    <w:bookmarkEnd w:id="146"/>
+    <w:bookmarkStart w:id="147" w:name="ref-Pottier2022a"/>
     <w:p>
       <w:pPr>
         <w:pStyle w:val="Bibliography"/>
@@ -8920,8 +9088,8 @@
         <w:t xml:space="preserve">25, 2245–2268</w:t>
       </w:r>
     </w:p>
-    <w:bookmarkEnd w:id="146"/>
-    <w:bookmarkStart w:id="147" w:name="ref-Leiva2024b"/>
+    <w:bookmarkEnd w:id="147"/>
+    <w:bookmarkStart w:id="148" w:name="ref-Leiva2024b"/>
     <w:p>
       <w:pPr>
         <w:pStyle w:val="Bibliography"/>
@@ -8955,8 +9123,8 @@
         <w:t xml:space="preserve">(2024) Genetic variation of heat tolerance in a model ectotherm: An approach using thermal death time curves</w:t>
       </w:r>
     </w:p>
-    <w:bookmarkEnd w:id="147"/>
-    <w:bookmarkStart w:id="148" w:name="ref-Arnold2019a"/>
+    <w:bookmarkEnd w:id="148"/>
+    <w:bookmarkStart w:id="149" w:name="ref-Arnold2019a"/>
     <w:p>
       <w:pPr>
         <w:pStyle w:val="Bibliography"/>
@@ -9006,8 +9174,8 @@
         <w:t xml:space="preserve">374, 20180185</w:t>
       </w:r>
     </w:p>
-    <w:bookmarkEnd w:id="148"/>
-    <w:bookmarkStart w:id="149" w:name="ref-Arnold2024"/>
+    <w:bookmarkEnd w:id="149"/>
+    <w:bookmarkStart w:id="150" w:name="ref-Arnold2024"/>
     <w:p>
       <w:pPr>
         <w:pStyle w:val="Bibliography"/>
@@ -9057,8 +9225,8 @@
         <w:t xml:space="preserve">75, 5971–5988</w:t>
       </w:r>
     </w:p>
-    <w:bookmarkEnd w:id="149"/>
-    <w:bookmarkStart w:id="150" w:name="ref-Assessment_undated-fv"/>
+    <w:bookmarkEnd w:id="150"/>
+    <w:bookmarkStart w:id="151" w:name="ref-Assessment_undated-fv"/>
     <w:p>
       <w:pPr>
         <w:pStyle w:val="Bibliography"/>
@@ -9076,8 +9244,8 @@
         <w:t xml:space="preserve">Assessment, M.E. (2005) Opportunities and challenges for business and industryunioviedo.es</w:t>
       </w:r>
     </w:p>
-    <w:bookmarkEnd w:id="150"/>
-    <w:bookmarkStart w:id="151" w:name="ref-Dandy2019"/>
+    <w:bookmarkEnd w:id="151"/>
+    <w:bookmarkStart w:id="152" w:name="ref-Dandy2019"/>
     <w:p>
       <w:pPr>
         <w:pStyle w:val="Bibliography"/>
@@ -9127,8 +9295,8 @@
         <w:t xml:space="preserve">19, 615–620</w:t>
       </w:r>
     </w:p>
-    <w:bookmarkEnd w:id="151"/>
-    <w:bookmarkStart w:id="152" w:name="ref-Leviston2018"/>
+    <w:bookmarkEnd w:id="152"/>
+    <w:bookmarkStart w:id="153" w:name="ref-Leviston2018"/>
     <w:p>
       <w:pPr>
         <w:pStyle w:val="Bibliography"/>
@@ -9178,8 +9346,8 @@
         <w:t xml:space="preserve">93, 658–668</w:t>
       </w:r>
     </w:p>
-    <w:bookmarkEnd w:id="152"/>
-    <w:bookmarkStart w:id="153" w:name="ref-Bai2016"/>
+    <w:bookmarkEnd w:id="153"/>
+    <w:bookmarkStart w:id="154" w:name="ref-Bai2016"/>
     <w:p>
       <w:pPr>
         <w:pStyle w:val="Bibliography"/>
@@ -9229,8 +9397,8 @@
         <w:t xml:space="preserve">23, 69–78</w:t>
       </w:r>
     </w:p>
-    <w:bookmarkEnd w:id="153"/>
-    <w:bookmarkStart w:id="154" w:name="ref-Grimm2008"/>
+    <w:bookmarkEnd w:id="154"/>
+    <w:bookmarkStart w:id="155" w:name="ref-Grimm2008"/>
     <w:p>
       <w:pPr>
         <w:pStyle w:val="Bibliography"/>
@@ -9280,8 +9448,8 @@
         <w:t xml:space="preserve">319, 756–760</w:t>
       </w:r>
     </w:p>
-    <w:bookmarkEnd w:id="154"/>
-    <w:bookmarkStart w:id="155" w:name="ref-Shekhawat2022"/>
+    <w:bookmarkEnd w:id="155"/>
+    <w:bookmarkStart w:id="156" w:name="ref-Shekhawat2022"/>
     <w:p>
       <w:pPr>
         <w:pStyle w:val="Bibliography"/>
@@ -9331,8 +9499,8 @@
         <w:t xml:space="preserve">27, 802–813</w:t>
       </w:r>
     </w:p>
-    <w:bookmarkEnd w:id="155"/>
-    <w:bookmarkStart w:id="156" w:name="ref-Black2011"/>
+    <w:bookmarkEnd w:id="156"/>
+    <w:bookmarkStart w:id="157" w:name="ref-Black2011"/>
     <w:p>
       <w:pPr>
         <w:pStyle w:val="Bibliography"/>
@@ -9382,8 +9550,8 @@
         <w:t xml:space="preserve">21, S3–S11</w:t>
       </w:r>
     </w:p>
-    <w:bookmarkEnd w:id="156"/>
-    <w:bookmarkStart w:id="157" w:name="ref-Neil_Adger1999"/>
+    <w:bookmarkEnd w:id="157"/>
+    <w:bookmarkStart w:id="158" w:name="ref-Neil_Adger1999"/>
     <w:p>
       <w:pPr>
         <w:pStyle w:val="Bibliography"/>
@@ -9417,8 +9585,8 @@
         <w:t xml:space="preserve">27, 249–269</w:t>
       </w:r>
     </w:p>
-    <w:bookmarkEnd w:id="157"/>
-    <w:bookmarkStart w:id="158" w:name="ref-Folke2016"/>
+    <w:bookmarkEnd w:id="158"/>
+    <w:bookmarkStart w:id="159" w:name="ref-Folke2016"/>
     <w:p>
       <w:pPr>
         <w:pStyle w:val="Bibliography"/>
@@ -9468,8 +9636,8 @@
         <w:t xml:space="preserve">21</w:t>
       </w:r>
     </w:p>
-    <w:bookmarkEnd w:id="158"/>
-    <w:bookmarkStart w:id="159" w:name="ref-Schluter2012"/>
+    <w:bookmarkEnd w:id="159"/>
+    <w:bookmarkStart w:id="160" w:name="ref-Schluter2012"/>
     <w:p>
       <w:pPr>
         <w:pStyle w:val="Bibliography"/>
@@ -9519,8 +9687,8 @@
         <w:t xml:space="preserve">25, 219–272</w:t>
       </w:r>
     </w:p>
-    <w:bookmarkEnd w:id="159"/>
-    <w:bookmarkStart w:id="160" w:name="ref-Biggs2021"/>
+    <w:bookmarkEnd w:id="160"/>
+    <w:bookmarkStart w:id="161" w:name="ref-Biggs2021"/>
     <w:p>
       <w:pPr>
         <w:pStyle w:val="Bibliography"/>
@@ -9567,8 +9735,8 @@
         <w:t xml:space="preserve">, Taylor &amp; Francis</w:t>
       </w:r>
     </w:p>
-    <w:bookmarkEnd w:id="160"/>
-    <w:bookmarkStart w:id="161" w:name="ref-Brown2021"/>
+    <w:bookmarkEnd w:id="161"/>
+    <w:bookmarkStart w:id="162" w:name="ref-Brown2021"/>
     <w:p>
       <w:pPr>
         <w:pStyle w:val="Bibliography"/>
@@ -9602,8 +9770,8 @@
         <w:t xml:space="preserve">3, 88–103</w:t>
       </w:r>
     </w:p>
-    <w:bookmarkEnd w:id="161"/>
-    <w:bookmarkStart w:id="162" w:name="ref-Wise2014"/>
+    <w:bookmarkEnd w:id="162"/>
+    <w:bookmarkStart w:id="163" w:name="ref-Wise2014"/>
     <w:p>
       <w:pPr>
         <w:pStyle w:val="Bibliography"/>
@@ -9653,14 +9821,14 @@
         <w:t xml:space="preserve">28, 325–336</w:t>
       </w:r>
     </w:p>
-    <w:bookmarkEnd w:id="162"/>
     <w:bookmarkEnd w:id="163"/>
+    <w:bookmarkEnd w:id="164"/>
     <w:p>
       <w:pPr>
         <w:pStyle w:val="BodyText"/>
       </w:pPr>
     </w:p>
-    <w:bookmarkEnd w:id="164"/>
+    <w:bookmarkEnd w:id="165"/>
     <w:sectPr>
       <w:pgSz w:h="15840" w:w="12240"/>
       <w:pgMar w:bottom="851" w:footer="720" w:gutter="0" w:header="720" w:left="851" w:right="851" w:top="851"/>

</xml_diff>

<commit_message>
Fixing symbols in legend. Unicode needed for degree C. Shift+Option+8
</commit_message>
<xml_diff>
--- a/docs/ms.docx
+++ b/docs/ms.docx
@@ -4011,7 +4011,19 @@
               <w:pStyle w:val="ImageCaption"/>
             </w:pPr>
             <w:r>
-              <w:t xml:space="preserve">Figure 4- How a systems modelling approach to extreme heat can be used to inform solutions. A hypothetical example of an insect-plant interaction. (A) To counteract an extreme heat wave event, different watering scenarios to cool plants of agricultural importance during heat stress could be applied. Of critical importance is understanding how much water to apply to a system to keep plants cool while minimizing: 1) water use, given that heat waves are often associated with extreme drought conditions and 2) pest outbreaks, given watering may create more ideal conditions for pest insects. (B) We can obtain actual or predicted future climate data from weather stations or climate models for rainfall and create alternative scenarios where rainfall layers are manipulated by modifying the watering regimes during a heatwave event. We could then assess how adding 2, 5, 10, or 20 mm d-1 of water and compares to original rainfall. (C) Adding water during an extreme heat event should result in cooling effects and by using microclimate and biophysical models we can quantify how much cooling would occur by calculating leaf temperature across all scenarios. Adding 5 mm of water can result in a 3.63 C decrease in leaf temperature. Adding more water does not result in significant gains in cooling. Note, in this simple example, we have assumed vegetation properties to remain constant; by linking in a crop growth model we could also estimate how the additional water would affect plant growth and yield, enabling the trade-offs between plant shading, leaf temperatures, crop health and yield to be explored. (D) We can then use the microclimatic conditions created by the plant to better understand how these different microclimates impact grasshopper pest body temperatures using biophysical models in combination with dynamic energy budget models that simulate the entire life-cycle of the grasshopper keeping tabs on how energy and mass flow between growth (struture) and (reproduction) during adult stages. These models also include survival estimates through time (senesence) using hazards functions allowing us to estimate an intrinsic growth rate parameter (i.e.,</w:t>
+              <w:t xml:space="preserve">Figure 4- How a systems modelling approach to extreme heat can be used to inform solutions. A hypothetical example of an insect-plant interaction. (A) To counteract an extreme heat wave event, different watering scenarios to cool plants of agricultural importance during heat stress could be applied. Of critical importance is understanding how much water to apply to a system to keep plants cool while minimizing: 1) water use, given that heat waves are often associated with extreme drought conditions and 2) pest outbreaks, given watering may create more ideal conditions for pest insects. (B) We can obtain actual or predicted future climate data from weather stations or climate models for rainfall and create alternative scenarios where rainfall layers are manipulated by modifying the watering regimes during a heatwave event. We could then assess how adding 2, 5, 10, or 20 mm d</w:t>
+            </w:r>
+            <w:r>
+              <w:rPr>
+                <w:vertAlign w:val="superscript"/>
+              </w:rPr>
+              <w:t xml:space="preserve">-1</w:t>
+            </w:r>
+            <w:r>
+              <w:t xml:space="preserve"> </w:t>
+            </w:r>
+            <w:r>
+              <w:t xml:space="preserve">of water and compares to original rainfall. (C) Adding water during an extreme heat event should result in cooling effects and by using microclimate and biophysical models we can quantify how much cooling would occur by calculating leaf temperature across all scenarios. Adding 5 mm of water can result in a 3.63°C decrease in leaf temperature. Adding more water does not result in significant gains in cooling. Note, in this simple example, we have assumed vegetation properties to remain constant; by linking in a crop growth model we could also estimate how the additional water would affect plant growth and yield, enabling the trade-offs between plant shading, leaf temperatures, crop health and yield to be explored. (D) We can then use the microclimatic conditions created by the plant to better understand how these different microclimates impact grasshopper pest body temperatures using biophysical models in combination with dynamic energy budget models that simulate the entire life-cycle of the grasshopper keeping tabs on how energy and mass flow between growth (struture) and (reproduction) during adult stages. These models also include survival estimates through time (senesence) using hazards functions allowing us to estimate an intrinsic growth rate parameter (i.e.,</w:t>
             </w:r>
             <w:r>
               <w:t xml:space="preserve"> </w:t>
@@ -4037,7 +4049,43 @@
               </m:sSub>
             </m:oMath>
             <w:r>
-              <w:t xml:space="preserve">) for the pest under the different watering scenarios. (E) Using estimates of intrinsic growth rate we can then estimate the population growth rate of grasshoppers using a simple Ricker’s population growth model applied to the different scenarios. Assuming we would add 5 mm d-1 each season during heatwave events, grasshopper populations would be suppressed over time whereas adding 2 mm d-1 results in grasshopper population growth, leading to heatwave associated outbreaks. Here, the optimal solution is thus 5 mm d-1 of water added to both 1) cool plants to protect them during a heat wave and 2) supress pest outbreaks. Created with BioRender.com.</w:t>
+              <w:t xml:space="preserve">) for the pest under the different watering scenarios. (E) Using estimates of intrinsic growth rate we can then estimate the population growth rate of grasshoppers using a simple Ricker’s population growth model applied to the different scenarios. Assuming we would add 5 mm d</w:t>
+            </w:r>
+            <w:r>
+              <w:rPr>
+                <w:vertAlign w:val="superscript"/>
+              </w:rPr>
+              <w:t xml:space="preserve">-1</w:t>
+            </w:r>
+            <w:r>
+              <w:t xml:space="preserve"> </w:t>
+            </w:r>
+            <w:r>
+              <w:t xml:space="preserve">each season during heatwave events, grasshopper populations would be suppressed over time whereas adding 2 mm d</w:t>
+            </w:r>
+            <w:r>
+              <w:rPr>
+                <w:vertAlign w:val="superscript"/>
+              </w:rPr>
+              <w:t xml:space="preserve">-1</w:t>
+            </w:r>
+            <w:r>
+              <w:t xml:space="preserve"> </w:t>
+            </w:r>
+            <w:r>
+              <w:t xml:space="preserve">results in grasshopper population growth, leading to heatwave associated outbreaks. Here, the optimal solution is thus 5 mm d</w:t>
+            </w:r>
+            <w:r>
+              <w:rPr>
+                <w:vertAlign w:val="superscript"/>
+              </w:rPr>
+              <w:t xml:space="preserve">-1</w:t>
+            </w:r>
+            <w:r>
+              <w:t xml:space="preserve"> </w:t>
+            </w:r>
+            <w:r>
+              <w:t xml:space="preserve">of water added to both 1) cool plants to protect them during a heat wave and 2) supress pest outbreaks. Created with BioRender.com.</w:t>
             </w:r>
           </w:p>
           <w:bookmarkEnd w:id="49"/>

</xml_diff>

<commit_message>
Re-rendered and will check and format everything
</commit_message>
<xml_diff>
--- a/docs/ms.docx
+++ b/docs/ms.docx
@@ -412,15 +412,6 @@
       <w:pPr>
         <w:pStyle w:val="BodyText"/>
       </w:pPr>
-      <w:r>
-        <w:rPr>
-          <w:vertAlign w:val="superscript"/>
-        </w:rPr>
-        <w:t>1</w:t>
-      </w:r>
-      <w:r>
-        <w:t xml:space="preserve"> </w:t>
-      </w:r>
       <m:oMath>
         <m:r>
           <m:rPr>
@@ -484,10 +475,10 @@
       <w:pPr>
         <w:pStyle w:val="Heading1"/>
       </w:pPr>
-      <w:bookmarkStart w:id="2" w:name="X2b97b971c201f11017c10c1d6e4dbfd69043166"/>
+      <w:bookmarkStart w:id="2" w:name="Xe4b8c356939b3cc7693ee883750fbc90cda6ece"/>
       <w:bookmarkEnd w:id="1"/>
       <w:r>
-        <w:t>A systems-modelling approach to modelling biotic impacts of heatwaves</w:t>
+        <w:t>A systems-modelling approach to understand the biotic impacts of heatwaves</w:t>
       </w:r>
     </w:p>
     <w:p>
@@ -499,7 +490,7 @@
       </w:r>
       <w:r>
         <w:lastRenderedPageBreak/>
-        <w:t>effects on interactions (both positive and negative) among species [e.g., 12]. Understanding the dynamic interplay between direct and indirect effects of extreme heat, and how these are mediated by environmental factors (e.g., water and food availability, microbes), has been hampered by inadequate coupling of models that predict short-term physiological damage on a given species’ fitness with population and community dynamic models across species [11,13,14]. A systems-thinking approach is now needed to tackle the multifaceted nature with which extreme heat manifests within in a community. This approach will require interdisciplinary collaboration to integrate biophysical, physiological, population and community ecology models so that we can capture the dynamic feedbacks, nonlinearities and interactions between species that drive responses at population and community scales [15,16].</w:t>
+        <w:t>effects on interactions (both positive and negative) among species [e.g., 12]. Understanding the dynamic interplay between direct and indirect effects of extreme heat, and how these are mediated by environmental factors (e.g., water and food availability, microbial community), has been hampered by inadequate coupling of models that predict short-term physiological damage on a given species’ fitness with population and community dynamic models across species [11,13,14]. A systems-thinking approach is now needed to tackle the multifaceted nature with which extreme heat manifests within a community. This approach will require interdisciplinary collaboration to integrate biophysical, physiological, population and community ecology processes so that we can capture and model the dynamic feedbacks, nonlinearities and interactions between species that drive responses across scales [15,16].</w:t>
       </w:r>
     </w:p>
     <w:p>
@@ -518,7 +509,7 @@
         </w:r>
       </w:hyperlink>
       <w:r>
-        <w:t>). We focus on plant and insect communities given the strong interconnections between them, the ease with which they can and have been studied, and their importance to socioecological systems. Physiological models can now be seamlessly integrated with biophysical models to characterize temperatures experienced by organisms and simulate the effects of extreme heat events on the entire life cycle of species within ecological communities [17–20] (</w:t>
+        <w:t>). We focus on plant and insect communities given the strong interconnections between them, the ease with which they can and have been studied, and their importance to socioecological systems [17]. Physiological models can now be seamlessly integrated with biophysical models to characterize temperatures experienced by organisms and simulate the effects of extreme heat events on the entire life cycle of species within ecological communities [18–21] (</w:t>
       </w:r>
       <w:hyperlink w:anchor="fig-sys">
         <w:r>
@@ -529,7 +520,7 @@
         </w:r>
       </w:hyperlink>
       <w:r>
-        <w:t>). Physiological models that incorporate estimates of thermal sensitivity across species can capture the delicate balance between damage and repair of physiological systems [10,11,13,21], yielding predictions of the immediate and cumulative impacts of extreme heat on growth, survival and reproduction. Importantly, mechanistic physiological models provide outputs at the individual level (e.g., energy and water requirements, waste production, activity constraints, vital rates) that can be integrated into population and community ecology models to capture how extreme heat events perturb interactions among species and across whole, complex communities [22,23]. We demonstrate how such a coupling can be made within and across species and highlight the opportunities it presents to develop a greater understanding of the ways in which extreme heat stress manifests across species. We discuss the challenges of coupling models across diverse species in communities, and of capturing the eco-evolutionary feedbacks that will be necessary for accurate predictions in the future.</w:t>
+        <w:t>). Physiological models that incorporate estimates of thermal sensitivity across species can capture the delicate balance between damage and repair of physiological systems [10,11,13,22], yielding predictions of the immediate and cumulative impacts of extreme heat on growth, survival and reproduction. Importantly, mechanistic physiological models provide outputs at the individual level (e.g., energy and water requirements, waste production, activity constraints, vital rates) that can be integrated into population and community ecology models to capture how extreme heat events perturb interactions among species and across whole, complex communities [23,24]. We demonstrate how such a coupling can be made within and across species and highlight the opportunities it presents to develop a greater understanding of the ways in which extreme heat stress manifests across species. We discuss the challenges of coupling models across diverse species in communities, and of capturing the eco-evolutionary feedbacks that will be necessary for accurate predictions in the future.</w:t>
       </w:r>
     </w:p>
     <w:tbl>
@@ -559,7 +550,7 @@
               </w:rPr>
               <w:lastRenderedPageBreak/>
               <w:drawing>
-                <wp:inline distT="0" distB="0" distL="0" distR="0" wp14:anchorId="5BE6A6A8" wp14:editId="3A94711E">
+                <wp:inline distT="0" distB="0" distL="0" distR="0" wp14:anchorId="5A5D8416" wp14:editId="50A12ECF">
                   <wp:extent cx="6096000" cy="4876800"/>
                   <wp:effectExtent l="0" t="0" r="0" b="0"/>
                   <wp:docPr id="23" name="Picture"/>
@@ -607,7 +598,14 @@
               <w:spacing w:before="200"/>
             </w:pPr>
             <w:r>
-              <w:t xml:space="preserve">Figure 1- </w:t>
+              <w:rPr>
+                <w:b/>
+                <w:bCs/>
+              </w:rPr>
+              <w:t>Figure 1-</w:t>
+            </w:r>
+            <w:r>
+              <w:t xml:space="preserve"> </w:t>
             </w:r>
             <w:r>
               <w:rPr>
@@ -617,7 +615,7 @@
               <w:t>A coupled systems modelling framework for predicting the effects of extreme heat on ecological communities</w:t>
             </w:r>
             <w:r>
-              <w:t>. The modelling approach we develop here integrates (1) climate/biophysical models to predict the different microclimates species experience. (2) Microclimates experienced by organisms then provide inputs for physiological models that integrate temperature exposure with explicit physiological processes that simulate development, behaviour, survival and reproduction in response to microclimate dynamics across life history stages. Physiological models can be built around the unique life cycles of the diverse species in communities, capturing lagged responses to extreme heat, phenological mismatches and mechanistically informed responses to extreme heat for species of the system in question. Outputs (behaviour, growth rate, biomass accumulation, survival and reproduction) from physiological models of individual organisms can then be integrated into (3) population and community ecology models (such as those developed with in the Modern Coexistence Theory Framework – see text) to predict population growth and community composition under a specific type of change (either to the environment or suite of interacting organisms). Environment-mediated feedback loops (4) influence organism thermal exposure and sensitivity (e.g., water availability, microbiota), which can vary across different life stages and organs. Coupling existing models will allow for quantitative predictions to be made on how extreme heatwaves perturb biological systems and allow for the development and implementation of strategies to enhance biological system resilience to extreme heat. Created with BioRender.com.</w:t>
+              <w:t>. The modelling approach we review here integrates (1) climate/biophysical models to predict the different microclimates species experience. (2) Microclimates experienced by organisms then provide inputs for physiological models that integrate temperature exposure with explicit physiological processes that simulate development, behaviour, survival (e.g., 50% survival thresholds, LT50) and reproduction in response to microclimate dynamics across life history stages. Physiological models can be built around the unique life cycles of the diverse species in communities, capturing lagged responses to extreme heat, phenological mismatches and mechanistically informed responses to extreme heat for species of the system in question. Outputs (behaviour, growth rate, biomass accumulation, survival and reproduction) from physiological models of individual organisms can then be integrated into (3) population and community ecology models (such as those developed with in the Modern Coexistence Theory Framework – see text) to predict population growth and community composition under a specific type of change (either to the environment or suite of interacting species). Environment-mediated feedback loops (4) influence organism thermal exposure and sensitivity, including water availability and microbial communities, which can vary across different life stages and organs depending on the microclimates occupied. Coupling existing models will allow for quantitative predictions to be made on how extreme heatwaves perturb biological systems and allow for the development and implementation of strategies to enhance biological system resilience to extreme heat. Created with BioRender.com.</w:t>
             </w:r>
           </w:p>
         </w:tc>
@@ -640,40 +638,13 @@
         <w:pStyle w:val="FirstParagraph"/>
       </w:pPr>
       <w:r>
-        <w:t xml:space="preserve">Extreme weather events are predicted by Global Circulation Models (GCMs), typically at large spatial scales (e.g. 0.5 </w:t>
-      </w:r>
-      <m:oMath>
-        <m:sSup>
-          <m:sSupPr>
-            <m:ctrlPr>
-              <w:rPr>
-                <w:rFonts w:ascii="Cambria Math" w:hAnsi="Cambria Math"/>
-              </w:rPr>
-            </m:ctrlPr>
-          </m:sSupPr>
-          <m:e>
-            <m:r>
-              <w:rPr>
-                <w:rFonts w:ascii="Cambria Math" w:hAnsi="Cambria Math"/>
-              </w:rPr>
-              <m:t>​</m:t>
-            </m:r>
-          </m:e>
-          <m:sup>
-            <m:r>
-              <m:rPr>
-                <m:sty m:val="p"/>
-              </m:rPr>
-              <w:rPr>
-                <w:rFonts w:ascii="Cambria Math" w:hAnsi="Cambria Math"/>
-              </w:rPr>
-              <m:t>∘</m:t>
-            </m:r>
-          </m:sup>
-        </m:sSup>
-      </m:oMath>
-      <w:r>
-        <w:t xml:space="preserve"> grid cells). Yet, species across communities experience these heatwaves differently because of the varied microhabitats they occupy. For example, while air temperature may be 50°C, an organism a metre below the soil surface may be exposed to temperatures ~20°C cooler (</w:t>
+        <w:t>Extreme weather events such as heatwaves are predicted by Global Circulation Models (GCMs), typically at large spatial scales (e.g. 0.5</w:t>
+      </w:r>
+      <w:r>
+        <w:sym w:font="Symbol" w:char="F0B0"/>
+      </w:r>
+      <w:r>
+        <w:t>grid cells), and can be regionalized by downscaling to smaller spatial scales. However, species within communities experience heatwaves differently because of the varied microhabitats they occupy. For example, while air temperature may be 50°C, an organism a metre below the soil surface may be exposed to temperatures ~20°C cooler (</w:t>
       </w:r>
       <w:hyperlink w:anchor="fig-sys">
         <w:r>
@@ -684,7 +655,7 @@
         </w:r>
       </w:hyperlink>
       <w:r>
-        <w:t>). Therefore, to understand how extreme heat affects a community of organisms, we must characterize the ‘</w:t>
+        <w:t xml:space="preserve">). Therefore, to understand how extreme heat affects a community of organisms, we must characterize the </w:t>
       </w:r>
       <w:r>
         <w:rPr>
@@ -694,7 +665,7 @@
         <w:t>microclimates</w:t>
       </w:r>
       <w:r>
-        <w:t>’ experienced by individuals of different species under a given atmospheric event. Microclimate predictions are made by taking the atmospheric conditions as independent forcing variables and combining them with detailed information on terrain (slope, aspect, hill shade), vegetation [plant-area index (PAI), stomatal behaviour, leaf reflectance] and soil hydrothermal properties to predict how radiation, wind speed, air temperature, humidity, soil temperature and soil moisture vary on small spatial scales [24–31]. Capturing the interaction between soil moisture and temperature in microclimate models is critical because the same atmospheric heat wave can have different implications for microclimatic conditions depending on the recent history of rainfall and temperature [32]. Downscaling to microclimate conditions does require additional variables for a given location than typically used in climate models (e.g., % shade, soil characteristics, surface albedo), however, many of the additional variables are readily available. Depending on the organism and question of interest, not all input variables are needed to parameterize a given microclimate calculation, as recent guides to microclimate modelling illustrate [e.g., 33,34,35].</w:t>
+        <w:t xml:space="preserve"> experienced by individuals of different species under a given atmospheric event. Microclimate predictions are made by taking the atmospheric conditions as independent forcing variables and combining them with detailed information on terrain (slope, aspect, hill shade), vegetation [plant-area index (PAI), stomatal behaviour, leaf reflectance] and soil hydrothermal properties to predict how radiation, wind speed, air temperature, humidity, soil temperature and soil moisture vary on small spatial scales [25–32]. Capturing the interaction between soil moisture and temperature in microclimate models is critical because the same atmospheric heat wave can have different implications for microclimatic conditions depending on the recent history of rainfall and temperature [33]. Downscaling to microclimate conditions requires the specification of key environmental properties (e.g. % shade, soil characteristics, surface albedo) at a fine scale (metres) for the local area of interest. Depending on the organism and question of interest, not all input variables are needed to parameterize a given microclimate calculation, as recent guides to microclimate modelling illustrate [e.g., 34,35,36].</w:t>
       </w:r>
     </w:p>
     <w:p>
@@ -702,7 +673,27 @@
         <w:pStyle w:val="BodyText"/>
       </w:pPr>
       <w:r>
-        <w:t>Beyond parameterization, the benefit of a systems-thinking approach in the context of microclimate modelling is its ability to capture vegetation and soil dynamics which can dramatically shape microclimate conditions within and between species dynamically across time. For example, plant water use dynamics during heatwaves can amplify or reduce high temperatures via effects on photosynthetic capacity, stomatal decoupling, cuticular conductance, leaf damage and plant mortality [19,36]. These impacts are important for the plants themselves and for thermal regimes available to other organisms. Forecasting future thermal regimes is challenging because it involves forecasting future vegetation dynamics, including changes in key vegetation properties such as leaf area index, as a function of plant growth, plant population dynamics and shifts in community composition. Despite the complexity and non-linearity of these interactions across the soil-plant-atmosphere continuum, there is existing capacity, and growing potential, to model them and determine individual-specific exposure to extreme heat. For example, a wide range of vegetation models is available for this purpose, from crop growth models that simulate growth and yield of crops over a season [e.g. Agricultural Production Systems sIMulator (APSIM); [37]] up to the dynamic global vegetation models (DGVMs) that simulate vegetation function and distribution at local to global scales [38].</w:t>
+        <w:t xml:space="preserve">Beyond parameterization, the benefit of a systems-thinking approach in the context of microclimate modelling is its ability to capture vegetation and soil dynamics which can dramatically shape microclimate conditions within and between species dynamically across time. While the large-scale feedbacks from plant and soil dynamics to heatwave development are captured in GCMs [e.g. 37], these dynamics are also important in determining thermal regimes at micro-scales. For example, plant water use dynamics can amplify or reduce within-canopy temperatures via effects on photosynthetic capacity, stomatal decoupling, cuticular conductance, leaf damage and plant mortality [20,38]. These impacts are important for the plants themselves and for thermal regimes available to other organisms. Forecasting future thermal regimes is challenging because it involves forecasting future vegetation dynamics, including changes in key vegetation properties such as leaf area index, as a function of plant growth, phenology, plant population dynamics and shifts in community composition. Despite the complexity and non-linearity of these interactions across the soil-plant-atmosphere continuum, there is existing capacity, and growing potential, to model them and determine individual-specific exposure to extreme heat. For example, a wide range of vegetation models is available for this purpose, from crop growth models that simulate growth and yield of crops over a season </w:t>
+      </w:r>
+      <w:r>
+        <w:t>(</w:t>
+      </w:r>
+      <w:r>
+        <w:t xml:space="preserve">e.g. Agricultural Production Systems </w:t>
+      </w:r>
+      <w:proofErr w:type="spellStart"/>
+      <w:r>
+        <w:t>sIMulator</w:t>
+      </w:r>
+      <w:proofErr w:type="spellEnd"/>
+      <w:r>
+        <w:t xml:space="preserve"> (APSIM); [39]</w:t>
+      </w:r>
+      <w:r>
+        <w:t>)</w:t>
+      </w:r>
+      <w:r>
+        <w:t xml:space="preserve"> up to the dynamic global vegetation models (DGVMs) that simulate vegetation function and distribution at local to global scales [40].</w:t>
       </w:r>
     </w:p>
     <w:p>
@@ -730,22 +721,22 @@
         <w:t>biophysical models</w:t>
       </w:r>
       <w:r>
-        <w:t xml:space="preserve"> have a long history[39,40,e.g. 19] but have become more widely applied in ecology in the past 20 years, facilitated by developments in environmental datasets, microclimate modelling, and the emergence of high-level programming languages such as R [20]. Biophysical models of ectothermic animals make use of equations for energy and mass exchange between an organism and its environment and can account for complex radiative heat transfer and the role of evaporative water loss across surfaces [20,24,41]. Equivalent models of leaves incorporate the dynamic role of stomata </w:t>
+        <w:t xml:space="preserve"> have a long history [41,42] but have become more widely applied in ecology in the past 20 years, facilitated by developments in environmental datasets, microclimate modelling, and the emergence of high-level programming languages such as R [21]. Biophysical models of ectothermic animals make use of equations for energy and mass exchange between an organism and its environment and can account for complex radiative heat transfer and the role of evaporative water loss across surfaces [21,25,43]. Equivalent models of </w:t>
+      </w:r>
+      <w:r>
+        <w:lastRenderedPageBreak/>
+        <w:t xml:space="preserve">leaves incorporate the dynamic role of stomata </w:t>
       </w:r>
       <w:hyperlink r:id="rId6">
         <w:r>
           <w:rPr>
             <w:rStyle w:val="Hyperlink"/>
           </w:rPr>
-          <w:t>[42]; [19]</w:t>
+          <w:t>[44]; [20]</w:t>
         </w:r>
       </w:hyperlink>
       <w:r>
-        <w:t xml:space="preserve">. Biophysical models are powerful because, by translating microclimate conditions to organism body temperature and hydric states, simple </w:t>
-      </w:r>
-      <w:r>
-        <w:lastRenderedPageBreak/>
-        <w:t>regulatory decision-making models can be used [43,44]. For example, given an understanding of an organism’s thermal activity windows, thermal optima, and critical thermal limits we can determine what microclimates should be chosen to get as close as possible to its target body temperature [e.g., 43,44]. Incorporating such behavioural thermoregulatory decision making is crucial for mitigating the negative impacts of extreme heat and can inherently capture the trade-offs such a strategy entails through reduced foraging time [20,43]. Incorporating stomatal behaviour can mitigate or exacerbate the extreme temperatures leaf tissue experiences while simultaneously shaping the microclimate conditions for other organisms [19,45] (</w:t>
+        <w:t>. Biophysical models are powerful because, by translating microclimate conditions to organism body temperature and hydric states, simple regulatory decision-making models can be used [45,46]. For example, given an understanding of an organism’s thermal activity windows, thermal optima, and critical thermal limits we can determine what microclimates the organism should chose to get close to its target body temperature [e.g., 45,46]. Such behavioural thermoregulatory decision making is crucial for mitigating the negative impacts of extreme heat and incorporating it into models can inherently capture the trade-offs such a strategy entails through reduced foraging time [21,45]. Similarly, changes in stomatal behaviour can mitigate or exacerbate the extreme temperatures leaf tissue experiences while simultaneously shaping the microclimate conditions for other organisms [20,47] (</w:t>
       </w:r>
       <w:r>
         <w:rPr>
@@ -755,7 +746,7 @@
         <w:t>Box 1</w:t>
       </w:r>
       <w:r>
-        <w:t>). Future developments in biophysical modelling of organismal temperature under extreme heat will involve understanding the nuances of plastic physiological and behavioral responses. For example, lizards may pant when exposed to high temperatures [46], birds may ‘wind surf’ or seek thermal micro-refugia [47], and stomata can enact emergency cooling, departing from the typical responses to vapor pressure and light intensity [36], though this response may depend on prior soil moisture conditions [48]. While biophysical models require many variables for parameterization they can be tailored to the question and organism of interest [20]. Many traits can be safely assumed, or traits of similar species can be used to construct basic models which can be validated and updated. The application of biophysical models in concert with microclimate models can thus be used to infer the thermal conditions to which members of the same ecological community are exposed with different degrees of detail. Realised thermal exposure can then be linked to physiological models.</w:t>
+        <w:t>). Future developments in biophysical modelling of organismal temperature under extreme heat will involve understanding the nuances of plastic physiological and behavioral responses. For example, lizards may pant when exposed to high temperatures [48], birds may ‘wind surf’ or seek thermal micro-refugia [49], and stomata can enact emergency cooling, departing from the typical responses to vapor pressure and light intensity [38], though this response may depend on prior soil moisture conditions [50]. Although biophysical models require many traits for parameterization, the models and parameters can be tailored to the question and organism of interest [21]. In addition, many traits can be approximated based on traits of similar species, and then validated and updated as more species-specific data become available. The application of biophysical models in concert with microclimate models can thus be used to infer the thermal conditions to which members of the same ecological community are exposed with different degrees of detail. Realised thermal exposure can then be linked to physiological models.</w:t>
       </w:r>
     </w:p>
     <w:p>
@@ -773,7 +764,7 @@
         <w:pStyle w:val="FirstParagraph"/>
       </w:pPr>
       <w:r>
-        <w:t xml:space="preserve">Translating how heat waves impact plants and animals not only depend on modelling temperature </w:t>
+        <w:t xml:space="preserve">Translating how heat waves impact plants and animals not only depends on modelling temperature </w:t>
       </w:r>
       <w:r>
         <w:rPr>
@@ -793,7 +784,7 @@
         <w:t>sensitivity</w:t>
       </w:r>
       <w:r>
-        <w:t xml:space="preserve"> of organisms to extreme heat [21,49]. Sensitivity to extreme heat can be captured by </w:t>
+        <w:t xml:space="preserve"> of organisms to extreme heat [22,51]. Sensitivity to extreme heat can be captured by </w:t>
       </w:r>
       <w:r>
         <w:rPr>
@@ -803,7 +794,7 @@
         <w:t>thermal load sensitivity (TLS) / thermal death time (TDT)</w:t>
       </w:r>
       <w:r>
-        <w:t xml:space="preserve"> models that explicitly account for how heat stress depends on both the body temperature experienced and and its duration [13,21]. TLS models predict the relative accumulation of damage to cellular and sub-cellular systems that compromise physiological function. Without periods of recovery, where damage can be repaired, organisms accumulate damage over time reducing growth and impacting survival and reproduction. Typically, TLS models focus on endpoints that include survival (e.g., lethal temperatures, </w:t>
+        <w:t xml:space="preserve"> models that explicitly account for how heat stress depends on both the body temperature experienced and its duration [13,22]. TLS models predict the relative accumulation of damage to cellular and sub-cellular systems that compromise physiological function. Without periods of recovery, where damage can be repaired, organisms accumulate damage over time, reducing growth and impacting survival and reproduction. Typically, TLS models focus on endpoints that include survival (e.g., lethal temperatures, </w:t>
       </w:r>
       <m:oMath>
         <m:r>
@@ -815,9 +806,11 @@
         <m:sSub>
           <m:sSubPr>
             <m:ctrlPr>
-              <w:rPr>
-                <w:rFonts w:ascii="Cambria Math" w:hAnsi="Cambria Math"/>
-              </w:rPr>
+              <w:ins w:id="7" w:author="Daniel Noble" w:date="2025-12-12T15:01:00Z" w16du:dateUtc="2025-12-12T04:01:00Z">
+                <w:rPr>
+                  <w:rFonts w:ascii="Cambria Math" w:hAnsi="Cambria Math"/>
+                </w:rPr>
+              </w:ins>
             </m:ctrlPr>
           </m:sSubPr>
           <m:e>
@@ -851,9 +844,11 @@
         <m:sSub>
           <m:sSubPr>
             <m:ctrlPr>
-              <w:rPr>
-                <w:rFonts w:ascii="Cambria Math" w:hAnsi="Cambria Math"/>
-              </w:rPr>
+              <w:ins w:id="8" w:author="Daniel Noble" w:date="2025-12-12T15:01:00Z" w16du:dateUtc="2025-12-12T04:01:00Z">
+                <w:rPr>
+                  <w:rFonts w:ascii="Cambria Math" w:hAnsi="Cambria Math"/>
+                </w:rPr>
+              </w:ins>
             </m:ctrlPr>
           </m:sSubPr>
           <m:e>
@@ -875,7 +870,7 @@
         </m:sSub>
       </m:oMath>
       <w:r>
-        <w:t xml:space="preserve">) or some measure of reduced fertility, but this need not be the case [13]. Endpoints are predicted by assuming the effect of time at a given temperature decreases survival and/or fertility exponentially and have been shown to have high predictive power [10,11,21,49]. For example, Ørsted </w:t>
+        <w:t xml:space="preserve">) or some measure of reduced fertility, but this need not be the case [13]. Endpoints are predicted by assuming the effect of time at a given temperature decreases survival and/or fertility exponentially, and have been shown to have high predictive power [10,11,22,51]. For example, Ørsted </w:t>
       </w:r>
       <w:r>
         <w:rPr>
@@ -892,20 +887,10 @@
           <w:i/>
           <w:iCs/>
         </w:rPr>
-        <w:t>Drosophila suzuki</w:t>
-      </w:r>
-      <w:r>
-        <w:t xml:space="preserve">), with survival and fecundity being compromised most for long thermal exposures at high temperatures. Importantly, Ørsted </w:t>
-      </w:r>
-      <w:r>
-        <w:rPr>
-          <w:i/>
-          <w:iCs/>
-        </w:rPr>
-        <w:t>et al.</w:t>
-      </w:r>
-      <w:r>
-        <w:t xml:space="preserve"> [11] show that reproductive sensitivity can be higher than mortality, with heat injury accumulating faster to impact productivity earlier than survival. TLS theory applies well to photosynthetic function in plants [50,51], highlighting the potential generality of the TLS framework and its capacity to explore plastic responses (e.g., acclimation and priming) of organisms. TLS models are crucial for predicting how heat waves affect organisms because accumulated damage to physiological systems can result in lagged responses to heat stress or exacerbate future stress (i.e., future heat waves / droughts) – a common feature of extreme heat events [13,52].</w:t>
+        <w:t>Drosophila suzukii</w:t>
+      </w:r>
+      <w:r>
+        <w:t>), with survival and fecundity being compromised most for long thermal exposures at high temperatures. Importantly, they also show that reproductive sensitivity can be higher than mortality, with heat injury impacts accumulating faster for reproduction than survival [11]. TLS theory also applies well to photosynthetic function in plants [52,53], highlighting its generality. TLS models are crucial for predicting how heat waves affect organisms because accumulated damage to physiological systems can result in lagged responses to heat stress or exacerbate future stress (i.e., future heat waves / droughts) – a common feature of extreme heat events [13,54].</w:t>
       </w:r>
     </w:p>
     <w:p>
@@ -913,7 +898,7 @@
         <w:pStyle w:val="BodyText"/>
       </w:pPr>
       <w:r>
-        <w:t>Environmental factors known to impact thermal sensitivity, such as water and drought stress [e.g., 53,54] along with nutritional and dietary changes [e.g., 55,56] can be incorporated into systems modelling approaches through their impacts on thermal sensitivity and tolerance [13] (</w:t>
+        <w:t>Environmental factors known to impact thermal sensitivity, such as water and drought stress [e.g., 55,56], along with nutritional and dietary changes [e.g., 57,58], can be incorporated into systems modelling approaches through their impacts on thermal sensitivity and tolerance [13] (</w:t>
       </w:r>
       <w:hyperlink w:anchor="fig-sys">
         <w:r>
@@ -924,11 +909,11 @@
         </w:r>
       </w:hyperlink>
       <w:r>
-        <w:t xml:space="preserve">). Indeed, an exciting potential application of a systems-modelling approach is to explore how microclimatic conditions mediate changes to interactions between plant and animal microbial communities. Interactions between plants and microorganisms, such as plant growth-promoting rhizobacteria (PGPR), arbuscular mycorrhizal fungi (AMF), and bacterial or fungal endophytes are known to enhance growth, defense, and heat tolerance in </w:t>
+        <w:t xml:space="preserve">). Indeed, an exciting potential application of a systems-modelling approach is to explore how microclimatic conditions mediate changes to interactions between plant and animal microbial communities. Interactions between plants and microorganisms, such as plant growth-promoting rhizobacteria (PGPR), arbuscular mycorrhizal fungi (AMF), and bacterial or fungal endophytes, are known to enhance growth, defense, and heat tolerance in </w:t>
       </w:r>
       <w:r>
         <w:lastRenderedPageBreak/>
-        <w:t>plants [57,58], and gut microbiota can improve heat tolerance in animals [59]. Additionally, modelling the intricate balance between damage and repair for a suite of different species can help identify susceptible species, life stages and tissues that are most at risk from extreme heat events due to direct sensitivity to extreme heat, allowing more accurate predictions of the varying levels of species sensitivity within a community [13].</w:t>
+        <w:t>plants [59,60], and gut microbiota can improve heat tolerance in animals [61]. Additionally, modelling the intricate balance between damage and repair for a suite of different species can help identify susceptible species, life stages and tissues that are most at risk from extreme heat events due to direct sensitivity to extreme heat, allowing more accurate predictions of the varying levels of species sensitivity within a community [13].</w:t>
       </w:r>
     </w:p>
     <w:tbl>
@@ -997,7 +982,7 @@
               <w:pStyle w:val="BodyText"/>
             </w:pPr>
             <w:r>
-              <w:t xml:space="preserve">The context is a heatwave event in January 2018/19 at Renmark, South Australia (Calperum Station). The historical SILO climate dataset (0.05° resolution, 1889 to present) [60] was used as input to the </w:t>
+              <w:t xml:space="preserve">The context is a heatwave event in January 2018/19 at Renmark, South Australia (Calperum Station). The historical SILO climate dataset (0.05° resolution, 1889 to present) [62] was used as input to the </w:t>
             </w:r>
             <w:r>
               <w:rPr>
@@ -1016,7 +1001,7 @@
               <w:t>NicheMapR</w:t>
             </w:r>
             <w:r>
-              <w:t xml:space="preserve"> [19,61] in conjunction with </w:t>
+              <w:t xml:space="preserve"> [20,63], in conjunction with </w:t>
             </w:r>
             <w:r>
               <w:rPr>
@@ -1026,7 +1011,7 @@
               <w:t>microclima</w:t>
             </w:r>
             <w:r>
-              <w:t xml:space="preserve"> [25,26] in the R statistical language to compute microclimates. Microclimates are calculated at various heights above ground (20cm-1.2m, relevant to our plants and insects) and soil depths (for burrowers) with varying levels of shade (we use 40% and 80%). Simulating these varied conditions captured the diversity of microclimates that different species in a community might experience and provided opportunities to build in behavioural plasticity.</w:t>
+              <w:t xml:space="preserve"> [26,27] in the R statistical language to compute microclimates. Microclimates are calculated at various heights above ground (20cm-1.2m, relevant to our plants and insects) and soil depths (for burrowers) with varying levels of shade (we use 40% and 80%). Simulating these varied conditions captured the diversity of microclimates that different species in a community might experience and provided opportunities to build in behavioural plasticity.</w:t>
             </w:r>
           </w:p>
           <w:p>
@@ -1034,7 +1019,7 @@
               <w:pStyle w:val="BodyText"/>
             </w:pPr>
             <w:r>
-              <w:t xml:space="preserve">With available microclimates predicted, we can compute leaf and body temperatures using biophysical models. However, plant temperatures will impact temperatures experienced by the grasshopper because plant stomata change in response to extreme heat events. Stomatal responses of leaves to their environment can be captured with the help of the </w:t>
+              <w:t xml:space="preserve">With available microclimates predicted, we can compute leaf and body temperatures using biophysical models. However, plant temperatures will impact the temperatures experienced by the grasshoppers because plant stomatal conductance changes in response to extreme heat events. Stomatal responses of leaves to their environment can be captured with the help of the </w:t>
             </w:r>
             <w:r>
               <w:rPr>
@@ -1044,7 +1029,7 @@
               <w:t>plantecophys</w:t>
             </w:r>
             <w:r>
-              <w:t xml:space="preserve"> package [42] and used in conjunction with the </w:t>
+              <w:t xml:space="preserve"> package [44] and used in conjunction with the </w:t>
             </w:r>
             <w:r>
               <w:rPr>
@@ -1063,7 +1048,7 @@
               <w:t>NicheMapR</w:t>
             </w:r>
             <w:r>
-              <w:t xml:space="preserve"> to compute realistic leaf temperatures as stoma open and close in response to temperature and vapor pressure deficit (Figure I). The combination of microclimate, leaf traits (e.g., shape, leaf conductance, emissivity) and stomatal behaviour thereby produces realistic leaf temperature estimates during the heatwave event.</w:t>
+              <w:t xml:space="preserve"> to compute realistic leaf temperatures as stomata open and close in response to temperature and vapor pressure deficit (Figure I). The combination of microclimate, leaf traits (e.g., shape, leaf conductance, emissivity) and stomatal behaviour thereby produces realistic leaf temperature estimates during the heatwave event.</w:t>
             </w:r>
           </w:p>
           <w:p>
@@ -1090,7 +1075,7 @@
               <w:t>NicheMapR</w:t>
             </w:r>
             <w:r>
-              <w:t xml:space="preserve"> can be used to compute insect body temperature, given the microclimate (including plant leaf temperature) and insect traits. The insect temperature calculations incorporate their capacity to thermoregulate behaviourally (Species B moves to cooler parts of plant - Figure I) to minimize thermal stress when possible, given a range of available microclimates and using information on their thermal preferences. All code to demonstrate this process is available at: https://daniel1noble.github.io/thermal_tol_interactions/.</w:t>
+              <w:t xml:space="preserve"> can be used to compute insect body temperature, given the microclimate (including plant leaf temperature) and insect traits. The insect temperature calculations incorporate their capacity to thermoregulate behaviourally. For example, Species B moves to cooler parts of the plant to minimize thermal stress, when possible (Figure I), given a range of available microclimates and using information on their thermal preferences. All code to demonstrate this process is available at: https://daniel1noble.github.io/thermal_tol_interactions/.</w:t>
             </w:r>
           </w:p>
           <w:tbl>
@@ -1113,16 +1098,16 @@
                     <w:pStyle w:val="Compact"/>
                     <w:jc w:val="center"/>
                   </w:pPr>
-                  <w:bookmarkStart w:id="7" w:name="fig-box1"/>
+                  <w:bookmarkStart w:id="9" w:name="fig-box1"/>
                   <w:r>
                     <w:rPr>
                       <w:noProof/>
                     </w:rPr>
                     <w:lastRenderedPageBreak/>
                     <w:drawing>
-                      <wp:inline distT="0" distB="0" distL="0" distR="0" wp14:anchorId="6BC46FED" wp14:editId="6A06C3BE">
-                        <wp:extent cx="6680200" cy="4141099"/>
-                        <wp:effectExtent l="0" t="0" r="0" b="0"/>
+                      <wp:inline distT="0" distB="0" distL="0" distR="0" wp14:anchorId="528DADD7" wp14:editId="5D64643C">
+                        <wp:extent cx="6106886" cy="3952058"/>
+                        <wp:effectExtent l="0" t="0" r="1905" b="0"/>
                         <wp:docPr id="31" name="Picture"/>
                         <wp:cNvGraphicFramePr/>
                         <a:graphic xmlns:a="http://schemas.openxmlformats.org/drawingml/2006/main">
@@ -1143,7 +1128,7 @@
                               <pic:spPr bwMode="auto">
                                 <a:xfrm>
                                   <a:off x="0" y="0"/>
-                                  <a:ext cx="6680200" cy="4141099"/>
+                                  <a:ext cx="6112902" cy="3955951"/>
                                 </a:xfrm>
                                 <a:prstGeom prst="rect">
                                   <a:avLst/>
@@ -1168,11 +1153,11 @@
                     <w:spacing w:before="200"/>
                   </w:pPr>
                   <w:r>
-                    <w:t>Figure 2- Figure I: Predicting and coupling microclimate and biophysical models of plants and insects. Created with BioRender.com.</w:t>
+                    <w:t>Figure I: Predicting and coupling microclimate and biophysical models of a plant and two grasshopper species that vary in their thermal tolerance and life history (A). Biophysical and thermoregulatory models use miroclimate data to predict leaf (B) and grasshopper (C) temperatures through time (coloured lines) incorporating changes in insect and stomatal behaviour. Created with BioRender.com.</w:t>
                   </w:r>
                 </w:p>
               </w:tc>
-              <w:bookmarkEnd w:id="7"/>
+              <w:bookmarkEnd w:id="9"/>
             </w:tr>
           </w:tbl>
           <w:p>
@@ -1277,7 +1262,7 @@
               <w:t>Microclimate</w:t>
             </w:r>
             <w:r>
-              <w:t>: Microclimates are the local atmospheric conditions experienced by organisms, which can differ substantially from the broader atmospheric conditions. Microclimates are influenced by factors such as vegetation cover, soil properties, and topography, and can significantly affect the thermal and hydric environment experienced by organisms.</w:t>
+              <w:t>: Microclimates are the local conditions experienced by organisms, which can differ substantially from the broader atmospheric conditions. Microclimates are influenced by factors such as vegetation cover, soil properties, and topography, and can significantly affect the thermal and hydric environment experienced by organisms.</w:t>
             </w:r>
           </w:p>
           <w:p>
@@ -1292,7 +1277,7 @@
               <w:t>Functional traits</w:t>
             </w:r>
             <w:r>
-              <w:t>: Functional traits are the measurable characteristics of organisms that influence their performance and fitness, such as body size, reproductive output, and metabolic rates. In the context of extreme heat, functional traits can be used to categorize species based on their responses to thermal stress.</w:t>
+              <w:t>: Functional traits are the characteristics of organisms that influence their performance and fitness, such as body size, reproductive output, and metabolic rates. In the context of extreme heat, functional traits can be used to categorize species based on their responses to thermal stress.</w:t>
             </w:r>
           </w:p>
           <w:p>
@@ -1348,7 +1333,7 @@
       <w:pPr>
         <w:pStyle w:val="Heading1"/>
       </w:pPr>
-      <w:bookmarkStart w:id="8" w:name="Xa42fff9f9b55ab8c457a10a6df2c5c7c3edac3c"/>
+      <w:bookmarkStart w:id="10" w:name="Xa42fff9f9b55ab8c457a10a6df2c5c7c3edac3c"/>
       <w:bookmarkEnd w:id="6"/>
       <w:r>
         <w:t>Physiological models that capture the effects of extreme heat across life</w:t>
@@ -1359,7 +1344,7 @@
         <w:pStyle w:val="FirstParagraph"/>
       </w:pPr>
       <w:r>
-        <w:t>Dynamic Energy Budget (DEB) models are physiologically-explicit life-cycle models of energy and mass uptake and conversion that predict key life-history transitions, growth, reproduction and survival (senescence) through time [17,62]. DEB models consider organisms as a thermodynamic system (fully obeying energy-mass conservation) capturing the exchange of food, water, respiratory gases and metabolic waste throughout the life cycle [20]. DEB models can translate short-term (hours) variation in factors such as temperature, toxins (e.g., toxicants, [63]) and resource availability (nutrients) [64,65] into long-term (days, months, years) effects on development, growth, reproduction and survival [18,20]. DEB theory, when combined with biophysical models more generally, allows the full water budget to be computed to account for heat stress impacts of a hydric nature [20]. Perhaps most importantly, DEB theory calculates the life cycle trajectory of an organism and so can account for the effects of timing of heat wave impacts relative to life stage. Applied to multi-species assemblages, DEB models can capture how different species’ life cycles are affected by heat and interact with each other to predict how traits such as birth, age at maturity, reproductive events, energy flow and lifespan vary across species (</w:t>
+        <w:t>Accumulated damage to an organism from experiencing extreme heat events will impact survival probability in the future and needs to be integrated with a full account of growth, development and reproduction through life to scale effects to populations and communities. Dynamic Energy Budget (DEB) models are physiologically-explicit life-cycle models of energy and mass uptake and conversion that predict key life-history transitions, growth, reproduction and survival (senescence) through time [18,64]. DEB models consider organisms as a thermodynamic system (fully obeying energy-mass conservation) capturing the exchange of food, water, respiratory gases and metabolic waste throughout the life cycle [21]. DEB models can translate short-term (hours) variation in factors such as temperature, toxins (e.g., toxicants, [65]) and resource availability (nutrients) [66,67] into long-term (days, months, years) effects on development, growth, reproduction and survival [19,21]. DEB theory, when combined with biophysical models more generally, allows the full water budget to be computed to account for heat stress impacts of a hydric nature [21]. Perhaps most importantly, DEB theory calculates the life cycle trajectory of an organism and so can account for the effects of timing of heat wave impacts relative to life stage. Applied to multi-species assemblages, DEB models can capture how different species’ life cycles are affected by heat and interact with each other to predict how traits such as birth, age at maturity, reproductive events, energy flow and lifespan vary across species (</w:t>
       </w:r>
       <w:r>
         <w:rPr>
@@ -1369,7 +1354,7 @@
         <w:t>Box 2</w:t>
       </w:r>
       <w:r>
-        <w:t xml:space="preserve">). DEB models integrate many fundamental physiological processes, are parameter-sparse (one parameter per process), and necessary parameters have been estimated for &gt; 7000 species already (although there are taxonomic biases) [66,67]. New analytical approaches using phylogenetic imputation methods show promise for calculating energy budgets for species without data. Such methods have, for instance, already been used to predict DEB parameters for over 1.3 million animal species [see, 68]. In addition, software packages such as </w:t>
+        <w:t xml:space="preserve">). DEB models integrate many fundamental physiological processes and are parameter-sparse (one parameter per process). Moreover, the necessary parameters have already been estimated for &gt; 7000 species already (although there are taxonomic biases) [68,69]. New analytical approaches using phylogenetic imputation methods show promise for calculating energy budgets for species without data. Such methods have, for instance, already been used to predict DEB parameters for over 1.3 million animal species [see, 70]. In addition, software packages such as </w:t>
       </w:r>
       <w:r>
         <w:rPr>
@@ -1379,11 +1364,11 @@
         <w:t>NicheMapR</w:t>
       </w:r>
       <w:r>
-        <w:t xml:space="preserve"> [24,61] allow for simulations of life-cycles using parameters for diverse species. DEB model outputs, such as body mass and size, reproductive success and timing, and survival, can be used to parameterize vital rates needed for </w:t>
+        <w:t xml:space="preserve"> [25,63] allow for simulations of life-cycles using </w:t>
       </w:r>
       <w:r>
         <w:lastRenderedPageBreak/>
-        <w:t xml:space="preserve">population and community models, with additional options to incorporate eco-evolutionary feedbacks (see </w:t>
+        <w:t xml:space="preserve">parameters for diverse species. DEB model outputs, such as body mass and size, reproductive success and timing, and survival, can be used to parameterize vital rates needed for population and community models, with additional options to incorporate eco-evolutionary feedbacks (see </w:t>
       </w:r>
       <w:r>
         <w:rPr>
@@ -1401,15 +1386,15 @@
         <w:pStyle w:val="BodyText"/>
       </w:pPr>
       <w:r>
-        <w:t>Analogously, physiology-based vegetation models simulate plant growth over time as a function of carbon, water and nutrient uptake and use, following mass balance principles [69]. Model drivers typically include incident radiation, humidity, rainfall, and soil properties as well as air temperature. The models capture the direct effects of temperature on key physiological processes, such as photosynthesis, respiration and phenology, as well as the indirect effects via feedbacks on the vegetation water balance and soil nutrient availability. Short-term responses to temperature are captured well in these models through representations of enzyme kinetics, but representation of longer-term responses remains challenging because plants show high flexibility in their ability to acclimate to ambient temperatures [70]. Another area under active research is capturing plant damage and death from hot-dry weather extremes. Considerable progress has been made by representing the plant hydraulic system explicitly, enabling the risk of hydraulic failure to be predicted under conditions of low rainfall and high evaporative demand [71]. Direct damage to plant tissue from extreme heat has yet to be represented in such models, but the thermal death time framework outlined above offers a promising way forward.</w:t>
+        <w:t>Analogously, physiology-based vegetation models simulate plant growth over time as a function of carbon, water and nutrient uptake and use, following mass balance principles [71]. Model drivers typically include incident radiation, humidity, rainfall, and soil properties, as well as air temperature. The models capture the direct effects of temperature on key physiological processes, such as photosynthesis, respiration and phenology, as well as the indirect effects via feedbacks on vegetation water balance and soil nutrient availability. Short-term responses to temperature are captured well in these models through representations of enzyme kinetics, but representation of longer-term responses remains challenging because plants show high flexibility in their ability to acclimate to ambient temperatures [72]. Another area under active research is capturing plant damage and death from hot-dry weather extremes. Considerable progress has been made by representing the plant hydraulic system explicitly, enabling the risk of hydraulic failure to be predicted under conditions of low rainfall and high evaporative demand [73]. Direct damage to plant tissue from extreme heat has yet to be represented in such models, but the thermal death time framework outlined above offers a promising way forward.</w:t>
       </w:r>
     </w:p>
     <w:p>
       <w:pPr>
         <w:pStyle w:val="Heading1"/>
       </w:pPr>
-      <w:bookmarkStart w:id="9" w:name="Xe20b556bb99a49ef81dd5b1307d42fae8e49e0c"/>
-      <w:bookmarkEnd w:id="8"/>
+      <w:bookmarkStart w:id="11" w:name="Xe20b556bb99a49ef81dd5b1307d42fae8e49e0c"/>
+      <w:bookmarkEnd w:id="10"/>
       <w:r>
         <w:t>Mechanistic approaches that ‘speak’ to population and community ecology under extreme heat</w:t>
       </w:r>
@@ -1439,7 +1424,7 @@
         <w:t>coexistence</w:t>
       </w:r>
       <w:r>
-        <w:t xml:space="preserve"> within this framework. In their most recent applications, these simple pairwise population growth models have been used to underpin horizontal network models that allow one to examine how species in a community interact and create stable communities [15,72]. Other extensions of MCT tools have integrated environmental variation [23], traits [73] and cross-trophic dynamics [74,75] in predicting the outcomes of species interactions in community contexts. Fundamentally, this approach relies on simple two-species individual-based population growth models [76,77] but key extensions involve the use of whole communities as one “species” [78,79] or the grouping species to simplify interaction matrices while accounting for a small number of dominant species [75].</w:t>
+        <w:t xml:space="preserve"> within this framework. In their most recent applications, these simple pairwise population growth models have been used to underpin horizontal network models that allow one to examine how species in a community interact and create stable communities [15,74]. Other extensions of MCT tools have integrated environmental variation [24], traits [75] and cross-trophic dynamics [76,77] in predicting the outcomes of species interactions in community contexts. Fundamentally, this approach relies on simple two-species individual-based population growth models [78,79], but key extensions involve the use of whole communities as one “species” [80,81] or the grouping of species to simplify interaction matrices while accounting for a small number of dominant species [77].</w:t>
       </w:r>
     </w:p>
     <w:p>
@@ -1447,7 +1432,7 @@
         <w:pStyle w:val="BodyText"/>
       </w:pPr>
       <w:r>
-        <w:t>Population dynamic models that are used as part of MCT can calculate the individual fitness effect of interactions in relation to environments experienced by organisms [22,75,80] (</w:t>
+        <w:t>Population dynamic models that are used as part of MCT can calculate the individual fitness effect of interactions in relation to environments experienced by organisms [23,77,82] (</w:t>
       </w:r>
       <w:r>
         <w:rPr>
@@ -1457,7 +1442,7 @@
         <w:t>Box 2</w:t>
       </w:r>
       <w:r>
-        <w:t xml:space="preserve">). As these models use the same fitness measures as DEB models, they offer a population modelling framework to add thermal biology to community diversity predictions. This is because population dynamical models can be combined, for example as networks [15] and compared between microsites with different biophysical properties harbouring species with different thermal responses to their microenvironment. For example, Bimler </w:t>
+        <w:t xml:space="preserve">). As these models use the same fitness measures as DEB models, they offer a population modelling framework to add thermal biology to community diversity predictions. This is because population dynamical models can be combined, for example as networks [15] and compared between microsites with different biophysical properties and harbouring species with different thermal responses to their microenvironment. For example, Bimler </w:t>
       </w:r>
       <w:r>
         <w:rPr>
@@ -1485,7 +1470,7 @@
         <w:t>vital rate</w:t>
       </w:r>
       <w:r>
-        <w:t xml:space="preserve"> functions (which can incorperate any measure of fitness) can be used in population growth models to compare population dynamics for individuals in areas with different biophysical properties and/or thermal tolerances. Indeed, the predicted traits from DEB models could be used to directly parameterise growth rate models or to predict </w:t>
+        <w:t xml:space="preserve"> functions (which can incorporate any measure of fitness) can be used in population growth models to compare population dynamics for individuals in areas with different biophysical properties and/or thermal tolerances. Indeed, the predicted traits from DEB models could be used to directly parameterise growth rate models or to predict </w:t>
       </w:r>
       <w:r>
         <w:rPr>
@@ -1495,11 +1480,11 @@
         <w:t>functional traits</w:t>
       </w:r>
       <w:r>
-        <w:t xml:space="preserve"> which, at a community scale, can be used to categorize species with different response and effect profiles. Horizontal interaction networks can then be used to determine how important microclimates with different biophysical properties are for species interactions (defined by their fitness responses to their thermal environment) within the context of whole communities. These networks can be made to target particular types of interaction effects or responses to extreme heat events, or used to compare how species interact in areas with different thermal landscapes. The limitation of these methods is that they are data hungry, but even this can be handled by categorizing species </w:t>
+        <w:t xml:space="preserve"> which, at a community scale, can be used to categorize species with different response and effect profiles. Horizontal interaction networks can then be used to determine how important microclimates with different biophysical properties are for species interactions (defined by their fitness responses to their thermal environment) within the context of whole communities. These networks can be made to target particular types of interaction effects or responses to extreme heat events, or used to compare how species interact in areas with different thermal landscapes. The </w:t>
       </w:r>
       <w:r>
         <w:lastRenderedPageBreak/>
-        <w:t>by ‘traits’ or shared phylogenetic relationships, which are simplifications shown to be effective at reducing model complexity without sacrificing model accuracy [81].</w:t>
+        <w:t>main limitation of these methods is that they are data hungry, but even this can be handled by categorizing species by ‘traits’ or shared phylogenetic relationships, which are simplifications shown to be effective at reducing model complexity without sacrificing model accuracy [83].</w:t>
       </w:r>
     </w:p>
     <w:tbl>
@@ -1568,7 +1553,7 @@
               <w:pStyle w:val="BodyText"/>
             </w:pPr>
             <w:r>
-              <w:t xml:space="preserve">To start, using existing parameters for a dynamic energy budget (DEB) model for a grasshopper [82], we can use the </w:t>
+              <w:t xml:space="preserve">To start, using existing parameters for a dynamic energy budget (DEB) model for grasshoppers [84], we can use the </w:t>
             </w:r>
             <w:r>
               <w:rPr>
@@ -1617,15 +1602,81 @@
               </m:r>
             </m:oMath>
             <w:r>
-              <w:t xml:space="preserve"> = critical thermal limit), they can be used to predict the accumulation of damage during stressful temperatures experienced under realistic conditions for each species by calculating heat injury (HI) accumulated between time point </w:t>
+              <w:t xml:space="preserve"> = critical thermal limit), they can be used to predict the accumulation of damage through time during stressful temperatures (environmental temperatures </w:t>
             </w:r>
             <m:oMath>
               <m:sSub>
                 <m:sSubPr>
                   <m:ctrlPr>
+                    <w:ins w:id="12" w:author="Daniel Noble" w:date="2025-12-12T15:01:00Z" w16du:dateUtc="2025-12-12T04:01:00Z">
+                      <w:rPr>
+                        <w:rFonts w:ascii="Cambria Math" w:hAnsi="Cambria Math"/>
+                      </w:rPr>
+                    </w:ins>
+                  </m:ctrlPr>
+                </m:sSubPr>
+                <m:e>
+                  <m:r>
                     <w:rPr>
                       <w:rFonts w:ascii="Cambria Math" w:hAnsi="Cambria Math"/>
                     </w:rPr>
+                    <m:t>T</m:t>
+                  </m:r>
+                </m:e>
+                <m:sub>
+                  <m:r>
+                    <w:rPr>
+                      <w:rFonts w:ascii="Cambria Math" w:hAnsi="Cambria Math"/>
+                    </w:rPr>
+                    <m:t>e</m:t>
+                  </m:r>
+                </m:sub>
+              </m:sSub>
+            </m:oMath>
+            <w:r>
+              <w:t xml:space="preserve"> &gt; critical temperatures </w:t>
+            </w:r>
+            <m:oMath>
+              <m:sSub>
+                <m:sSubPr>
+                  <m:ctrlPr>
+                    <w:ins w:id="13" w:author="Daniel Noble" w:date="2025-12-12T15:01:00Z" w16du:dateUtc="2025-12-12T04:01:00Z">
+                      <w:rPr>
+                        <w:rFonts w:ascii="Cambria Math" w:hAnsi="Cambria Math"/>
+                      </w:rPr>
+                    </w:ins>
+                  </m:ctrlPr>
+                </m:sSubPr>
+                <m:e>
+                  <m:r>
+                    <w:rPr>
+                      <w:rFonts w:ascii="Cambria Math" w:hAnsi="Cambria Math"/>
+                    </w:rPr>
+                    <m:t>T</m:t>
+                  </m:r>
+                </m:e>
+                <m:sub>
+                  <m:r>
+                    <w:rPr>
+                      <w:rFonts w:ascii="Cambria Math" w:hAnsi="Cambria Math"/>
+                    </w:rPr>
+                    <m:t>c</m:t>
+                  </m:r>
+                </m:sub>
+              </m:sSub>
+            </m:oMath>
+            <w:r>
+              <w:t xml:space="preserve">) experienced under realistic conditions for each species by calculating heat injury (HI) accumulated between time point </w:t>
+            </w:r>
+            <m:oMath>
+              <m:sSub>
+                <m:sSubPr>
+                  <m:ctrlPr>
+                    <w:ins w:id="14" w:author="Daniel Noble" w:date="2025-12-12T15:01:00Z" w16du:dateUtc="2025-12-12T04:01:00Z">
+                      <w:rPr>
+                        <w:rFonts w:ascii="Cambria Math" w:hAnsi="Cambria Math"/>
+                      </w:rPr>
+                    </w:ins>
                   </m:ctrlPr>
                 </m:sSubPr>
                 <m:e>
@@ -1653,9 +1704,11 @@
               <m:sSub>
                 <m:sSubPr>
                   <m:ctrlPr>
-                    <w:rPr>
-                      <w:rFonts w:ascii="Cambria Math" w:hAnsi="Cambria Math"/>
-                    </w:rPr>
+                    <w:ins w:id="15" w:author="Daniel Noble" w:date="2025-12-12T15:01:00Z" w16du:dateUtc="2025-12-12T04:01:00Z">
+                      <w:rPr>
+                        <w:rFonts w:ascii="Cambria Math" w:hAnsi="Cambria Math"/>
+                      </w:rPr>
+                    </w:ins>
                   </m:ctrlPr>
                 </m:sSubPr>
                 <m:e>
@@ -1692,7 +1745,7 @@
               </m:sSub>
             </m:oMath>
             <w:r>
-              <w:t xml:space="preserve"> across life (using an </w:t>
+              <w:t xml:space="preserve"> across the insect’s life (using an </w:t>
             </w:r>
             <m:oMath>
               <m:r>
@@ -1704,9 +1757,11 @@
               <m:sSub>
                 <m:sSubPr>
                   <m:ctrlPr>
-                    <w:rPr>
-                      <w:rFonts w:ascii="Cambria Math" w:hAnsi="Cambria Math"/>
-                    </w:rPr>
+                    <w:ins w:id="16" w:author="Daniel Noble" w:date="2025-12-12T15:01:00Z" w16du:dateUtc="2025-12-12T04:01:00Z">
+                      <w:rPr>
+                        <w:rFonts w:ascii="Cambria Math" w:hAnsi="Cambria Math"/>
+                      </w:rPr>
+                    </w:ins>
                   </m:ctrlPr>
                 </m:sSubPr>
                 <m:e>
@@ -1739,14 +1794,14 @@
               </w:r>
             </w:hyperlink>
             <w:r>
-              <w:t>) (‘red lines’ in Fig IIA) [10,11,13,49].</w:t>
+              <w:t>) (‘red lines’ in Fig IIA) [10,11,13,51].</w:t>
             </w:r>
           </w:p>
           <w:p>
             <w:pPr>
               <w:pStyle w:val="BodyText"/>
             </w:pPr>
-            <w:bookmarkStart w:id="10" w:name="eq-hi"/>
+            <w:bookmarkStart w:id="17" w:name="eq-hi"/>
             <m:oMathPara>
               <m:oMathParaPr>
                 <m:jc m:val="center"/>
@@ -1772,9 +1827,11 @@
                     <m:chr m:val="∑"/>
                     <m:limLoc m:val="undOvr"/>
                     <m:ctrlPr>
-                      <w:rPr>
-                        <w:rFonts w:ascii="Cambria Math" w:hAnsi="Cambria Math"/>
-                      </w:rPr>
+                      <w:ins w:id="18" w:author="Daniel Noble" w:date="2025-12-12T15:01:00Z" w16du:dateUtc="2025-12-12T04:01:00Z">
+                        <w:rPr>
+                          <w:rFonts w:ascii="Cambria Math" w:hAnsi="Cambria Math"/>
+                        </w:rPr>
+                      </w:ins>
                     </m:ctrlPr>
                   </m:naryPr>
                   <m:sub>
@@ -1804,9 +1861,11 @@
                     <m:sSub>
                       <m:sSubPr>
                         <m:ctrlPr>
-                          <w:rPr>
-                            <w:rFonts w:ascii="Cambria Math" w:hAnsi="Cambria Math"/>
-                          </w:rPr>
+                          <w:ins w:id="19" w:author="Daniel Noble" w:date="2025-12-12T15:01:00Z" w16du:dateUtc="2025-12-12T04:01:00Z">
+                            <w:rPr>
+                              <w:rFonts w:ascii="Cambria Math" w:hAnsi="Cambria Math"/>
+                            </w:rPr>
+                          </w:ins>
                         </m:ctrlPr>
                       </m:sSubPr>
                       <m:e>
@@ -1838,9 +1897,11 @@
                     <m:sSub>
                       <m:sSubPr>
                         <m:ctrlPr>
-                          <w:rPr>
-                            <w:rFonts w:ascii="Cambria Math" w:hAnsi="Cambria Math"/>
-                          </w:rPr>
+                          <w:ins w:id="20" w:author="Daniel Noble" w:date="2025-12-12T15:01:00Z" w16du:dateUtc="2025-12-12T04:01:00Z">
+                            <w:rPr>
+                              <w:rFonts w:ascii="Cambria Math" w:hAnsi="Cambria Math"/>
+                            </w:rPr>
+                          </w:ins>
                         </m:ctrlPr>
                       </m:sSubPr>
                       <m:e>
@@ -1865,9 +1926,11 @@
                     <m:f>
                       <m:fPr>
                         <m:ctrlPr>
-                          <w:rPr>
-                            <w:rFonts w:ascii="Cambria Math" w:hAnsi="Cambria Math"/>
-                          </w:rPr>
+                          <w:ins w:id="21" w:author="Daniel Noble" w:date="2025-12-12T15:01:00Z" w16du:dateUtc="2025-12-12T04:01:00Z">
+                            <w:rPr>
+                              <w:rFonts w:ascii="Cambria Math" w:hAnsi="Cambria Math"/>
+                            </w:rPr>
+                          </w:ins>
                         </m:ctrlPr>
                       </m:fPr>
                       <m:num>
@@ -1889,18 +1952,22 @@
                         <m:d>
                           <m:dPr>
                             <m:ctrlPr>
-                              <w:rPr>
-                                <w:rFonts w:ascii="Cambria Math" w:hAnsi="Cambria Math"/>
-                              </w:rPr>
+                              <w:ins w:id="22" w:author="Daniel Noble" w:date="2025-12-12T15:01:00Z" w16du:dateUtc="2025-12-12T04:01:00Z">
+                                <w:rPr>
+                                  <w:rFonts w:ascii="Cambria Math" w:hAnsi="Cambria Math"/>
+                                </w:rPr>
+                              </w:ins>
                             </m:ctrlPr>
                           </m:dPr>
                           <m:e>
                             <m:sSub>
                               <m:sSubPr>
                                 <m:ctrlPr>
-                                  <w:rPr>
-                                    <w:rFonts w:ascii="Cambria Math" w:hAnsi="Cambria Math"/>
-                                  </w:rPr>
+                                  <w:ins w:id="23" w:author="Daniel Noble" w:date="2025-12-12T15:01:00Z" w16du:dateUtc="2025-12-12T04:01:00Z">
+                                    <w:rPr>
+                                      <w:rFonts w:ascii="Cambria Math" w:hAnsi="Cambria Math"/>
+                                    </w:rPr>
+                                  </w:ins>
                                 </m:ctrlPr>
                               </m:sSubPr>
                               <m:e>
@@ -1947,9 +2014,11 @@
                             <m:sSub>
                               <m:sSubPr>
                                 <m:ctrlPr>
-                                  <w:rPr>
-                                    <w:rFonts w:ascii="Cambria Math" w:hAnsi="Cambria Math"/>
-                                  </w:rPr>
+                                  <w:ins w:id="24" w:author="Daniel Noble" w:date="2025-12-12T15:01:00Z" w16du:dateUtc="2025-12-12T04:01:00Z">
+                                    <w:rPr>
+                                      <w:rFonts w:ascii="Cambria Math" w:hAnsi="Cambria Math"/>
+                                    </w:rPr>
+                                  </w:ins>
                                 </m:ctrlPr>
                               </m:sSubPr>
                               <m:e>
@@ -1976,9 +2045,11 @@
                         <m:sSup>
                           <m:sSupPr>
                             <m:ctrlPr>
-                              <w:rPr>
-                                <w:rFonts w:ascii="Cambria Math" w:hAnsi="Cambria Math"/>
-                              </w:rPr>
+                              <w:ins w:id="25" w:author="Daniel Noble" w:date="2025-12-12T15:01:00Z" w16du:dateUtc="2025-12-12T04:01:00Z">
+                                <w:rPr>
+                                  <w:rFonts w:ascii="Cambria Math" w:hAnsi="Cambria Math"/>
+                                </w:rPr>
+                              </w:ins>
                             </m:ctrlPr>
                           </m:sSupPr>
                           <m:e>
@@ -1993,9 +2064,11 @@
                             <m:d>
                               <m:dPr>
                                 <m:ctrlPr>
-                                  <w:rPr>
-                                    <w:rFonts w:ascii="Cambria Math" w:hAnsi="Cambria Math"/>
-                                  </w:rPr>
+                                  <w:ins w:id="26" w:author="Daniel Noble" w:date="2025-12-12T15:01:00Z" w16du:dateUtc="2025-12-12T04:01:00Z">
+                                    <w:rPr>
+                                      <w:rFonts w:ascii="Cambria Math" w:hAnsi="Cambria Math"/>
+                                    </w:rPr>
+                                  </w:ins>
                                 </m:ctrlPr>
                               </m:dPr>
                               <m:e>
@@ -2011,9 +2084,11 @@
                                 <m:f>
                                   <m:fPr>
                                     <m:ctrlPr>
-                                      <w:rPr>
-                                        <w:rFonts w:ascii="Cambria Math" w:hAnsi="Cambria Math"/>
-                                      </w:rPr>
+                                      <w:ins w:id="27" w:author="Daniel Noble" w:date="2025-12-12T15:01:00Z" w16du:dateUtc="2025-12-12T04:01:00Z">
+                                        <w:rPr>
+                                          <w:rFonts w:ascii="Cambria Math" w:hAnsi="Cambria Math"/>
+                                        </w:rPr>
+                                      </w:ins>
                                     </m:ctrlPr>
                                   </m:fPr>
                                   <m:num>
@@ -2051,18 +2126,22 @@
                                 <m:d>
                                   <m:dPr>
                                     <m:ctrlPr>
-                                      <w:rPr>
-                                        <w:rFonts w:ascii="Cambria Math" w:hAnsi="Cambria Math"/>
-                                      </w:rPr>
+                                      <w:ins w:id="28" w:author="Daniel Noble" w:date="2025-12-12T15:01:00Z" w16du:dateUtc="2025-12-12T04:01:00Z">
+                                        <w:rPr>
+                                          <w:rFonts w:ascii="Cambria Math" w:hAnsi="Cambria Math"/>
+                                        </w:rPr>
+                                      </w:ins>
                                     </m:ctrlPr>
                                   </m:dPr>
                                   <m:e>
                                     <m:sSub>
                                       <m:sSubPr>
                                         <m:ctrlPr>
-                                          <w:rPr>
-                                            <w:rFonts w:ascii="Cambria Math" w:hAnsi="Cambria Math"/>
-                                          </w:rPr>
+                                          <w:ins w:id="29" w:author="Daniel Noble" w:date="2025-12-12T15:01:00Z" w16du:dateUtc="2025-12-12T04:01:00Z">
+                                            <w:rPr>
+                                              <w:rFonts w:ascii="Cambria Math" w:hAnsi="Cambria Math"/>
+                                            </w:rPr>
+                                          </w:ins>
                                         </m:ctrlPr>
                                       </m:sSubPr>
                                       <m:e>
@@ -2094,9 +2173,11 @@
                                     <m:sSub>
                                       <m:sSubPr>
                                         <m:ctrlPr>
-                                          <w:rPr>
-                                            <w:rFonts w:ascii="Cambria Math" w:hAnsi="Cambria Math"/>
-                                          </w:rPr>
+                                          <w:ins w:id="30" w:author="Daniel Noble" w:date="2025-12-12T15:01:00Z" w16du:dateUtc="2025-12-12T04:01:00Z">
+                                            <w:rPr>
+                                              <w:rFonts w:ascii="Cambria Math" w:hAnsi="Cambria Math"/>
+                                            </w:rPr>
+                                          </w:ins>
                                         </m:ctrlPr>
                                       </m:sSubPr>
                                       <m:e>
@@ -2165,9 +2246,11 @@
                 <m:d>
                   <m:dPr>
                     <m:ctrlPr>
-                      <w:rPr>
-                        <w:rFonts w:ascii="Cambria Math" w:hAnsi="Cambria Math"/>
-                      </w:rPr>
+                      <w:ins w:id="31" w:author="Daniel Noble" w:date="2025-12-12T15:01:00Z" w16du:dateUtc="2025-12-12T04:01:00Z">
+                        <w:rPr>
+                          <w:rFonts w:ascii="Cambria Math" w:hAnsi="Cambria Math"/>
+                        </w:rPr>
+                      </w:ins>
                     </m:ctrlPr>
                   </m:dPr>
                   <m:e>
@@ -2181,22 +2264,24 @@
                 </m:d>
               </m:oMath>
             </m:oMathPara>
-            <w:bookmarkEnd w:id="10"/>
+            <w:bookmarkEnd w:id="17"/>
           </w:p>
           <w:p>
             <w:pPr>
               <w:pStyle w:val="FirstParagraph"/>
             </w:pPr>
             <w:r>
-              <w:t>After calculating HI accounting for repair [83], and converting to the probability of mortality through time, we can calculate the total probability of survival (i.e., from senescence, thermal stress, and activity-based mortality) for each age/stage class. In combination with the DEB model outputs on total reproduction across life, we can build a simple age/stage-structured population matrix (day of life or developmental stage) (Fig IIB) to estimate population growth rate [</w:t>
+              <w:t>After calculating HI accounting for repair [85], and converting to the probability of mortality through time, we can calculate the total probability of survival (i.e., from senescence, thermal stress, and activity-based mortality) for each age/stage class. In combination with the DEB model outputs on total reproduction across life, we can build a simple age/stage-structured population matrix (day of life or developmental stage) (Fig IIB) to estimate population growth rate [</w:t>
             </w:r>
             <m:oMath>
               <m:sSub>
                 <m:sSubPr>
                   <m:ctrlPr>
-                    <w:rPr>
-                      <w:rFonts w:ascii="Cambria Math" w:hAnsi="Cambria Math"/>
-                    </w:rPr>
+                    <w:ins w:id="32" w:author="Daniel Noble" w:date="2025-12-12T15:01:00Z" w16du:dateUtc="2025-12-12T04:01:00Z">
+                      <w:rPr>
+                        <w:rFonts w:ascii="Cambria Math" w:hAnsi="Cambria Math"/>
+                      </w:rPr>
+                    </w:ins>
                   </m:ctrlPr>
                 </m:sSubPr>
                 <m:e>
@@ -2235,9 +2320,11 @@
               <m:sSub>
                 <m:sSubPr>
                   <m:ctrlPr>
-                    <w:rPr>
-                      <w:rFonts w:ascii="Cambria Math" w:hAnsi="Cambria Math"/>
-                    </w:rPr>
+                    <w:ins w:id="33" w:author="Daniel Noble" w:date="2025-12-12T15:01:00Z" w16du:dateUtc="2025-12-12T04:01:00Z">
+                      <w:rPr>
+                        <w:rFonts w:ascii="Cambria Math" w:hAnsi="Cambria Math"/>
+                      </w:rPr>
+                    </w:ins>
                   </m:ctrlPr>
                 </m:sSubPr>
                 <m:e>
@@ -2273,22 +2360,31 @@
               <w:t>).</w:t>
             </w:r>
           </w:p>
-          <w:bookmarkStart w:id="11" w:name="eq-general"/>
           <w:p>
             <w:pPr>
               <w:pStyle w:val="BodyText"/>
             </w:pPr>
+            <w:bookmarkStart w:id="34" w:name="eq-general"/>
             <m:oMathPara>
               <m:oMathParaPr>
                 <m:jc m:val="center"/>
               </m:oMathParaPr>
               <m:oMath>
+                <m:r>
+                  <w:rPr>
+                    <w:rFonts w:ascii="Cambria Math" w:hAnsi="Cambria Math"/>
+                  </w:rPr>
+                  <m:t> </m:t>
+                </m:r>
                 <m:sSubSup>
                   <m:sSubSupPr>
                     <m:ctrlPr>
-                      <w:rPr>
-                        <w:rFonts w:ascii="Cambria Math" w:hAnsi="Cambria Math"/>
-                      </w:rPr>
+                      <w:ins w:id="35" w:author="Unknown" w:date="2025-12-12T15:16:00Z" w16du:dateUtc="2025-12-12T04:16:00Z">
+                        <w:rPr>
+                          <w:rFonts w:ascii="Cambria Math" w:hAnsi="Cambria Math"/>
+                          <w:i/>
+                        </w:rPr>
+                      </w:ins>
                     </m:ctrlPr>
                   </m:sSubSupPr>
                   <m:e>
@@ -2304,22 +2400,7 @@
                       <w:rPr>
                         <w:rFonts w:ascii="Cambria Math" w:hAnsi="Cambria Math"/>
                       </w:rPr>
-                      <m:t>t</m:t>
-                    </m:r>
-                    <m:r>
-                      <m:rPr>
-                        <m:sty m:val="p"/>
-                      </m:rPr>
-                      <w:rPr>
-                        <w:rFonts w:ascii="Cambria Math" w:hAnsi="Cambria Math"/>
-                      </w:rPr>
-                      <m:t>+</m:t>
-                    </m:r>
-                    <m:r>
-                      <w:rPr>
-                        <w:rFonts w:ascii="Cambria Math" w:hAnsi="Cambria Math"/>
-                      </w:rPr>
-                      <m:t>1</m:t>
+                      <m:t>t+1</m:t>
                     </m:r>
                   </m:sub>
                   <m:sup>
@@ -2332,20 +2413,19 @@
                   </m:sup>
                 </m:sSubSup>
                 <m:r>
-                  <m:rPr>
-                    <m:sty m:val="p"/>
-                  </m:rPr>
                   <w:rPr>
-                    <w:rFonts w:ascii="Cambria Math" w:hAnsi="Cambria Math"/>
+                    <w:rFonts w:ascii="Cambria Math" w:eastAsiaTheme="minorEastAsia" w:hAnsi="Cambria Math"/>
                   </w:rPr>
-                  <m:t>=</m:t>
+                  <m:t xml:space="preserve">= </m:t>
                 </m:r>
                 <m:sSubSup>
                   <m:sSubSupPr>
                     <m:ctrlPr>
-                      <w:rPr>
-                        <w:rFonts w:ascii="Cambria Math" w:hAnsi="Cambria Math"/>
-                      </w:rPr>
+                      <w:ins w:id="36" w:author="Daniel Noble" w:date="2025-12-12T15:01:00Z" w16du:dateUtc="2025-12-12T04:01:00Z">
+                        <w:rPr>
+                          <w:rFonts w:ascii="Cambria Math" w:hAnsi="Cambria Math"/>
+                        </w:rPr>
+                      </w:ins>
                     </m:ctrlPr>
                   </m:sSubSupPr>
                   <m:e>
@@ -2374,104 +2454,91 @@
                   </m:sup>
                 </m:sSubSup>
                 <m:r>
-                  <m:rPr>
-                    <m:sty m:val="p"/>
-                  </m:rPr>
                   <w:rPr>
-                    <w:rFonts w:ascii="Cambria Math" w:hAnsi="Cambria Math"/>
+                    <w:rFonts w:ascii="Cambria Math" w:eastAsiaTheme="minorEastAsia" w:hAnsi="Cambria Math"/>
                   </w:rPr>
-                  <m:t>⋅exp</m:t>
-                </m:r>
-                <m:r>
-                  <w:rPr>
-                    <w:rFonts w:ascii="Cambria Math" w:hAnsi="Cambria Math"/>
-                  </w:rPr>
-                  <m:t>​</m:t>
+                  <m:t xml:space="preserve">∙exp </m:t>
                 </m:r>
                 <m:d>
                   <m:dPr>
                     <m:begChr m:val="["/>
                     <m:endChr m:val="]"/>
                     <m:ctrlPr>
-                      <w:rPr>
-                        <w:rFonts w:ascii="Cambria Math" w:hAnsi="Cambria Math"/>
-                      </w:rPr>
+                      <w:ins w:id="37" w:author="Unknown" w:date="2025-12-12T15:18:00Z" w16du:dateUtc="2025-12-12T04:18:00Z">
+                        <w:rPr>
+                          <w:rFonts w:ascii="Cambria Math" w:eastAsiaTheme="minorEastAsia" w:hAnsi="Cambria Math"/>
+                          <w:i/>
+                        </w:rPr>
+                      </w:ins>
                     </m:ctrlPr>
                   </m:dPr>
                   <m:e>
                     <m:sSub>
                       <m:sSubPr>
                         <m:ctrlPr>
-                          <w:rPr>
-                            <w:rFonts w:ascii="Cambria Math" w:hAnsi="Cambria Math"/>
-                          </w:rPr>
+                          <w:ins w:id="38" w:author="Unknown" w:date="2025-12-12T15:16:00Z" w16du:dateUtc="2025-12-12T04:16:00Z">
+                            <w:rPr>
+                              <w:rFonts w:ascii="Cambria Math" w:eastAsiaTheme="minorEastAsia" w:hAnsi="Cambria Math"/>
+                              <w:i/>
+                            </w:rPr>
+                          </w:ins>
                         </m:ctrlPr>
                       </m:sSubPr>
                       <m:e>
                         <m:r>
                           <w:rPr>
-                            <w:rFonts w:ascii="Cambria Math" w:hAnsi="Cambria Math"/>
+                            <w:rFonts w:ascii="Cambria Math" w:eastAsiaTheme="minorEastAsia" w:hAnsi="Cambria Math"/>
                           </w:rPr>
                           <m:t>r</m:t>
                         </m:r>
                       </m:e>
                       <m:sub>
                         <m:r>
-                          <m:rPr>
-                            <m:sty m:val="p"/>
-                          </m:rPr>
                           <w:rPr>
-                            <w:rFonts w:ascii="Cambria Math" w:hAnsi="Cambria Math"/>
+                            <w:rFonts w:ascii="Cambria Math" w:eastAsiaTheme="minorEastAsia" w:hAnsi="Cambria Math"/>
                           </w:rPr>
-                          <m:t>max,</m:t>
-                        </m:r>
-                        <m:r>
-                          <w:rPr>
-                            <w:rFonts w:ascii="Cambria Math" w:hAnsi="Cambria Math"/>
-                          </w:rPr>
-                          <m:t>i</m:t>
+                          <m:t>max,i</m:t>
                         </m:r>
                       </m:sub>
                     </m:sSub>
                     <m:d>
                       <m:dPr>
                         <m:ctrlPr>
-                          <w:rPr>
-                            <w:rFonts w:ascii="Cambria Math" w:hAnsi="Cambria Math"/>
-                          </w:rPr>
+                          <w:ins w:id="39" w:author="Unknown" w:date="2025-12-12T15:18:00Z" w16du:dateUtc="2025-12-12T04:18:00Z">
+                            <w:rPr>
+                              <w:rFonts w:ascii="Cambria Math" w:eastAsiaTheme="minorEastAsia" w:hAnsi="Cambria Math"/>
+                              <w:i/>
+                            </w:rPr>
+                          </w:ins>
                         </m:ctrlPr>
                       </m:dPr>
                       <m:e>
                         <m:r>
                           <w:rPr>
-                            <w:rFonts w:ascii="Cambria Math" w:hAnsi="Cambria Math"/>
+                            <w:rFonts w:ascii="Cambria Math" w:eastAsiaTheme="minorEastAsia" w:hAnsi="Cambria Math"/>
                           </w:rPr>
-                          <m:t>1</m:t>
-                        </m:r>
-                        <m:r>
-                          <m:rPr>
-                            <m:sty m:val="p"/>
-                          </m:rPr>
-                          <w:rPr>
-                            <w:rFonts w:ascii="Cambria Math" w:hAnsi="Cambria Math"/>
-                          </w:rPr>
-                          <m:t>-</m:t>
+                          <m:t xml:space="preserve">1- </m:t>
                         </m:r>
                         <m:f>
                           <m:fPr>
                             <m:ctrlPr>
-                              <w:rPr>
-                                <w:rFonts w:ascii="Cambria Math" w:hAnsi="Cambria Math"/>
-                              </w:rPr>
+                              <w:ins w:id="40" w:author="Unknown" w:date="2025-12-12T15:19:00Z" w16du:dateUtc="2025-12-12T04:19:00Z">
+                                <w:rPr>
+                                  <w:rFonts w:ascii="Cambria Math" w:eastAsiaTheme="minorEastAsia" w:hAnsi="Cambria Math"/>
+                                  <w:i/>
+                                </w:rPr>
+                              </w:ins>
                             </m:ctrlPr>
                           </m:fPr>
                           <m:num>
                             <m:sSubSup>
                               <m:sSubSupPr>
                                 <m:ctrlPr>
-                                  <w:rPr>
-                                    <w:rFonts w:ascii="Cambria Math" w:hAnsi="Cambria Math"/>
-                                  </w:rPr>
+                                  <w:ins w:id="41" w:author="Daniel Noble" w:date="2025-12-12T15:01:00Z" w16du:dateUtc="2025-12-12T04:01:00Z">
+                                    <w:rPr>
+                                      <w:rFonts w:ascii="Cambria Math" w:hAnsi="Cambria Math"/>
+                                    </w:rPr>
+                                  </w:ins>
                                 </m:ctrlPr>
                               </m:sSubSupPr>
                               <m:e>
@@ -2500,13 +2567,10 @@
                               </m:sup>
                             </m:sSubSup>
                             <m:r>
-                              <m:rPr>
-                                <m:sty m:val="p"/>
-                              </m:rPr>
                               <w:rPr>
                                 <w:rFonts w:ascii="Cambria Math" w:hAnsi="Cambria Math"/>
                               </w:rPr>
-                              <m:t>+</m:t>
+                              <m:t xml:space="preserve">+ </m:t>
                             </m:r>
                             <m:nary>
                               <m:naryPr>
@@ -2514,9 +2578,12 @@
                                 <m:limLoc m:val="undOvr"/>
                                 <m:supHide m:val="1"/>
                                 <m:ctrlPr>
-                                  <w:rPr>
-                                    <w:rFonts w:ascii="Cambria Math" w:hAnsi="Cambria Math"/>
-                                  </w:rPr>
+                                  <w:ins w:id="42" w:author="Unknown" w:date="2025-12-12T15:20:00Z" w16du:dateUtc="2025-12-12T04:20:00Z">
+                                    <w:rPr>
+                                      <w:rFonts w:ascii="Cambria Math" w:hAnsi="Cambria Math"/>
+                                      <w:i/>
+                                    </w:rPr>
+                                  </w:ins>
                                 </m:ctrlPr>
                               </m:naryPr>
                               <m:sub>
@@ -2524,39 +2591,20 @@
                                   <w:rPr>
                                     <w:rFonts w:ascii="Cambria Math" w:hAnsi="Cambria Math"/>
                                   </w:rPr>
-                                  <m:t>j</m:t>
-                                </m:r>
-                                <m:r>
-                                  <m:rPr>
-                                    <m:sty m:val="p"/>
-                                  </m:rPr>
-                                  <w:rPr>
-                                    <w:rFonts w:ascii="Cambria Math" w:hAnsi="Cambria Math"/>
-                                  </w:rPr>
-                                  <m:t>≠</m:t>
-                                </m:r>
-                                <m:r>
-                                  <w:rPr>
-                                    <w:rFonts w:ascii="Cambria Math" w:hAnsi="Cambria Math"/>
-                                  </w:rPr>
-                                  <m:t>i</m:t>
+                                  <m:t>j≠i</m:t>
                                 </m:r>
                               </m:sub>
-                              <m:sup>
-                                <m:r>
-                                  <w:rPr>
-                                    <w:rFonts w:ascii="Cambria Math" w:hAnsi="Cambria Math"/>
-                                  </w:rPr>
-                                  <m:t>​</m:t>
-                                </m:r>
-                              </m:sup>
+                              <m:sup/>
                               <m:e>
                                 <m:sSub>
                                   <m:sSubPr>
                                     <m:ctrlPr>
-                                      <w:rPr>
-                                        <w:rFonts w:ascii="Cambria Math" w:hAnsi="Cambria Math"/>
-                                      </w:rPr>
+                                      <w:ins w:id="43" w:author="Unknown" w:date="2025-12-12T15:16:00Z" w16du:dateUtc="2025-12-12T04:16:00Z">
+                                        <w:rPr>
+                                          <w:rFonts w:ascii="Cambria Math" w:hAnsi="Cambria Math"/>
+                                          <w:i/>
+                                        </w:rPr>
+                                      </w:ins>
                                     </m:ctrlPr>
                                   </m:sSubPr>
                                   <m:e>
@@ -2576,49 +2624,54 @@
                                     </m:r>
                                   </m:sub>
                                 </m:sSub>
+                                <m:sSubSup>
+                                  <m:sSubSupPr>
+                                    <m:ctrlPr>
+                                      <w:ins w:id="44" w:author="Unknown" w:date="2025-12-12T15:16:00Z" w16du:dateUtc="2025-12-12T04:16:00Z">
+                                        <w:rPr>
+                                          <w:rFonts w:ascii="Cambria Math" w:hAnsi="Cambria Math"/>
+                                          <w:i/>
+                                        </w:rPr>
+                                      </w:ins>
+                                    </m:ctrlPr>
+                                  </m:sSubSupPr>
+                                  <m:e>
+                                    <m:r>
+                                      <w:rPr>
+                                        <w:rFonts w:ascii="Cambria Math" w:hAnsi="Cambria Math"/>
+                                      </w:rPr>
+                                      <m:t>N</m:t>
+                                    </m:r>
+                                  </m:e>
+                                  <m:sub>
+                                    <m:r>
+                                      <w:rPr>
+                                        <w:rFonts w:ascii="Cambria Math" w:hAnsi="Cambria Math"/>
+                                      </w:rPr>
+                                      <m:t>t</m:t>
+                                    </m:r>
+                                  </m:sub>
+                                  <m:sup>
+                                    <m:r>
+                                      <w:rPr>
+                                        <w:rFonts w:ascii="Cambria Math" w:hAnsi="Cambria Math"/>
+                                      </w:rPr>
+                                      <m:t>j</m:t>
+                                    </m:r>
+                                  </m:sup>
+                                </m:sSubSup>
                               </m:e>
                             </m:nary>
-                            <m:sSubSup>
-                              <m:sSubSupPr>
-                                <m:ctrlPr>
-                                  <w:rPr>
-                                    <w:rFonts w:ascii="Cambria Math" w:hAnsi="Cambria Math"/>
-                                  </w:rPr>
-                                </m:ctrlPr>
-                              </m:sSubSupPr>
-                              <m:e>
-                                <m:r>
-                                  <w:rPr>
-                                    <w:rFonts w:ascii="Cambria Math" w:hAnsi="Cambria Math"/>
-                                  </w:rPr>
-                                  <m:t>N</m:t>
-                                </m:r>
-                              </m:e>
-                              <m:sub>
-                                <m:r>
-                                  <w:rPr>
-                                    <w:rFonts w:ascii="Cambria Math" w:hAnsi="Cambria Math"/>
-                                  </w:rPr>
-                                  <m:t>t</m:t>
-                                </m:r>
-                              </m:sub>
-                              <m:sup>
-                                <m:r>
-                                  <w:rPr>
-                                    <w:rFonts w:ascii="Cambria Math" w:hAnsi="Cambria Math"/>
-                                  </w:rPr>
-                                  <m:t>j</m:t>
-                                </m:r>
-                              </m:sup>
-                            </m:sSubSup>
                           </m:num>
                           <m:den>
                             <m:sSub>
                               <m:sSubPr>
                                 <m:ctrlPr>
-                                  <w:rPr>
-                                    <w:rFonts w:ascii="Cambria Math" w:hAnsi="Cambria Math"/>
-                                  </w:rPr>
+                                  <w:ins w:id="45" w:author="Daniel Noble" w:date="2025-12-12T15:01:00Z" w16du:dateUtc="2025-12-12T04:01:00Z">
+                                    <w:rPr>
+                                      <w:rFonts w:ascii="Cambria Math" w:hAnsi="Cambria Math"/>
+                                    </w:rPr>
+                                  </w:ins>
                                 </m:ctrlPr>
                               </m:sSubPr>
                               <m:e>
@@ -2648,14 +2701,16 @@
                   <w:rPr>
                     <w:rFonts w:ascii="Cambria Math" w:hAnsi="Cambria Math"/>
                   </w:rPr>
-                  <m:t>  </m:t>
+                  <m:t> </m:t>
                 </m:r>
                 <m:d>
                   <m:dPr>
                     <m:ctrlPr>
-                      <w:rPr>
-                        <w:rFonts w:ascii="Cambria Math" w:hAnsi="Cambria Math"/>
-                      </w:rPr>
+                      <w:ins w:id="46" w:author="Daniel Noble" w:date="2025-12-12T15:01:00Z" w16du:dateUtc="2025-12-12T04:01:00Z">
+                        <w:rPr>
+                          <w:rFonts w:ascii="Cambria Math" w:hAnsi="Cambria Math"/>
+                        </w:rPr>
+                      </w:ins>
                     </m:ctrlPr>
                   </m:dPr>
                   <m:e>
@@ -2669,7 +2724,7 @@
                 </m:d>
               </m:oMath>
             </m:oMathPara>
-            <w:bookmarkEnd w:id="11"/>
+            <w:bookmarkEnd w:id="34"/>
           </w:p>
           <w:p>
             <w:pPr>
@@ -2682,9 +2737,11 @@
               <m:sSubSup>
                 <m:sSubSupPr>
                   <m:ctrlPr>
-                    <w:rPr>
-                      <w:rFonts w:ascii="Cambria Math" w:hAnsi="Cambria Math"/>
-                    </w:rPr>
+                    <w:ins w:id="47" w:author="Daniel Noble" w:date="2025-12-12T15:01:00Z" w16du:dateUtc="2025-12-12T04:01:00Z">
+                      <w:rPr>
+                        <w:rFonts w:ascii="Cambria Math" w:hAnsi="Cambria Math"/>
+                      </w:rPr>
+                    </w:ins>
                   </m:ctrlPr>
                 </m:sSubSupPr>
                 <m:e>
@@ -2742,9 +2799,11 @@
               <m:sSub>
                 <m:sSubPr>
                   <m:ctrlPr>
-                    <w:rPr>
-                      <w:rFonts w:ascii="Cambria Math" w:hAnsi="Cambria Math"/>
-                    </w:rPr>
+                    <w:ins w:id="48" w:author="Daniel Noble" w:date="2025-12-12T15:01:00Z" w16du:dateUtc="2025-12-12T04:01:00Z">
+                      <w:rPr>
+                        <w:rFonts w:ascii="Cambria Math" w:hAnsi="Cambria Math"/>
+                      </w:rPr>
+                    </w:ins>
                   </m:ctrlPr>
                 </m:sSubPr>
                 <m:e>
@@ -2759,9 +2818,11 @@
                   <m:sSub>
                     <m:sSubPr>
                       <m:ctrlPr>
-                        <w:rPr>
-                          <w:rFonts w:ascii="Cambria Math" w:hAnsi="Cambria Math"/>
-                        </w:rPr>
+                        <w:ins w:id="49" w:author="Daniel Noble" w:date="2025-12-12T15:01:00Z" w16du:dateUtc="2025-12-12T04:01:00Z">
+                          <w:rPr>
+                            <w:rFonts w:ascii="Cambria Math" w:hAnsi="Cambria Math"/>
+                          </w:rPr>
+                        </w:ins>
                       </m:ctrlPr>
                     </m:sSubPr>
                     <m:e>
@@ -2802,9 +2863,11 @@
               <m:sSub>
                 <m:sSubPr>
                   <m:ctrlPr>
-                    <w:rPr>
-                      <w:rFonts w:ascii="Cambria Math" w:hAnsi="Cambria Math"/>
-                    </w:rPr>
+                    <w:ins w:id="50" w:author="Daniel Noble" w:date="2025-12-12T15:01:00Z" w16du:dateUtc="2025-12-12T04:01:00Z">
+                      <w:rPr>
+                        <w:rFonts w:ascii="Cambria Math" w:hAnsi="Cambria Math"/>
+                      </w:rPr>
+                    </w:ins>
                   </m:ctrlPr>
                 </m:sSubPr>
                 <m:e>
@@ -2843,9 +2906,11 @@
               <m:sSub>
                 <m:sSubPr>
                   <m:ctrlPr>
-                    <w:rPr>
-                      <w:rFonts w:ascii="Cambria Math" w:hAnsi="Cambria Math"/>
-                    </w:rPr>
+                    <w:ins w:id="51" w:author="Daniel Noble" w:date="2025-12-12T15:01:00Z" w16du:dateUtc="2025-12-12T04:01:00Z">
+                      <w:rPr>
+                        <w:rFonts w:ascii="Cambria Math" w:hAnsi="Cambria Math"/>
+                      </w:rPr>
+                    </w:ins>
                   </m:ctrlPr>
                 </m:sSubPr>
                 <m:e>
@@ -2912,14 +2977,14 @@
                     <w:pStyle w:val="Compact"/>
                     <w:jc w:val="center"/>
                   </w:pPr>
-                  <w:bookmarkStart w:id="12" w:name="fig-box2"/>
+                  <w:bookmarkStart w:id="52" w:name="fig-box2"/>
                   <w:r>
                     <w:rPr>
                       <w:noProof/>
                     </w:rPr>
                     <w:lastRenderedPageBreak/>
                     <w:drawing>
-                      <wp:inline distT="0" distB="0" distL="0" distR="0" wp14:anchorId="20903867" wp14:editId="57D07BDE">
+                      <wp:inline distT="0" distB="0" distL="0" distR="0" wp14:anchorId="2787DD89" wp14:editId="224AA7EA">
                         <wp:extent cx="6096000" cy="4876800"/>
                         <wp:effectExtent l="0" t="0" r="0" b="0"/>
                         <wp:docPr id="39" name="Picture"/>
@@ -2967,11 +3032,11 @@
                     <w:spacing w:before="200"/>
                   </w:pPr>
                   <w:r>
-                    <w:t>Figure 3- Figure II: A systems approach to using mechanistic physiological models to capture life-cycle vital rates and thermal load stress on survival to scale up to multi-species population dynamics. Created with BioRender.com.</w:t>
+                    <w:t>Figure II: A systems approach to using mechanistic physiological models to capture life-cycle vital rates and thermal load stress on survival to scale up to multi-species population dynamics. Created with BioRender.com.</w:t>
                   </w:r>
                 </w:p>
               </w:tc>
-              <w:bookmarkEnd w:id="12"/>
+              <w:bookmarkEnd w:id="52"/>
             </w:tr>
           </w:tbl>
           <w:p>
@@ -2986,8 +3051,8 @@
       <w:pPr>
         <w:pStyle w:val="Heading1"/>
       </w:pPr>
-      <w:bookmarkStart w:id="13" w:name="hot-solutions-for-a-changing-world"/>
-      <w:bookmarkEnd w:id="9"/>
+      <w:bookmarkStart w:id="53" w:name="hot-solutions-for-a-changing-world"/>
+      <w:bookmarkEnd w:id="11"/>
       <w:r>
         <w:lastRenderedPageBreak/>
         <w:t>‘Hot’ solutions for a changing world</w:t>
@@ -2998,18 +3063,32 @@
         <w:pStyle w:val="FirstParagraph"/>
       </w:pPr>
       <w:r>
-        <w:t>Extreme heat will have dramatic and widespread effects on biological and socioecological systems that humans rely upon. For example, under current global climate change scenarios, each degree Celsius increase in global mean temperature is estimated to reduce the global yield of wheat by 6.0% and soybean by 3.1% [84], exacerbating food shortages. A systems-modelling approach can help us develop suitable interventions, predict the varied consequences of such interventions, and allow for adjustments that can improve decision making for mitigating the impacts of extreme heat in real world situations. As a simple example (</w:t>
+        <w:t>Extreme heat will have dramatic and widespread effects on biological and socioecological systems that humans rely upon. For example, under current global climate change scenarios, each degree Celsius increase in global mean temperature is estimated to reduce the global yield of wheat by 6.0% and soybean by 3.1% [86], exacerbating food shortages.</w:t>
+      </w:r>
+    </w:p>
+    <w:p>
+      <w:pPr>
+        <w:pStyle w:val="BodyText"/>
+      </w:pPr>
+      <w:r>
+        <w:t>A systems-modelling approach can help us develop suitable interventions, predict the varied consequences of such interventions, and allow for adjustments that can improve decision making for mitigating the impacts of extreme heat in real world situations. As a simple example (</w:t>
       </w:r>
       <w:hyperlink w:anchor="fig-2">
         <w:r>
           <w:rPr>
             <w:rStyle w:val="Hyperlink"/>
           </w:rPr>
-          <w:t>Figure 4</w:t>
+          <w:t>Figure </w:t>
+        </w:r>
+        <w:r>
+          <w:rPr>
+            <w:rStyle w:val="Hyperlink"/>
+          </w:rPr>
+          <w:t>2</w:t>
         </w:r>
       </w:hyperlink>
       <w:r>
-        <w:t>A), a systems modelling approach can allow for informed predictions about how to mitigate heat stress to crops while also considering the potential for pest outbreaks. In essence, we want to add a minimal amount of water to a system to cool leaves while avoiding depleting limited water supplies and creating microclimate conditions from becoming more optimal for pests. Making use of real weather data to predict microclimates and organism temperatures, we can assess how adding 2, 5, 10, or 20 mm d</w:t>
+        <w:t>A), a systems modelling approach can allow for informed predictions about how to mitigate heat stress to crops while also considering the potential for pest outbreaks. In essence, we want to add a minimal amount of water to a system to cool leaves while avoiding depleting limited water supplies and/or creating better microclimate conditions for pests. Making use of real weather data to predict microclimates and organism temperatures, we can assess how adding 2, 5, 10, or 20 mm d</w:t>
       </w:r>
       <w:r>
         <w:rPr>
@@ -3025,7 +3104,13 @@
           <w:rPr>
             <w:rStyle w:val="Hyperlink"/>
           </w:rPr>
-          <w:t>Figure 4</w:t>
+          <w:t>Figure </w:t>
+        </w:r>
+        <w:r>
+          <w:rPr>
+            <w:rStyle w:val="Hyperlink"/>
+          </w:rPr>
+          <w:t>2</w:t>
         </w:r>
       </w:hyperlink>
       <w:r>
@@ -3038,22 +3123,28 @@
         <w:t>-1</w:t>
       </w:r>
       <w:r>
-        <w:t xml:space="preserve"> of water can result in as much as a 3.87°C decrease in leaf temperature (</w:t>
+        <w:t xml:space="preserve"> of water can decrease leaf temperature by up to 3.87°C (</w:t>
       </w:r>
       <w:hyperlink w:anchor="fig-2">
         <w:r>
           <w:rPr>
             <w:rStyle w:val="Hyperlink"/>
           </w:rPr>
-          <w:t>Figure 4</w:t>
+          <w:t>Figure </w:t>
+        </w:r>
+        <w:r>
+          <w:rPr>
+            <w:rStyle w:val="Hyperlink"/>
+          </w:rPr>
+          <w:t>2</w:t>
         </w:r>
       </w:hyperlink>
       <w:r>
-        <w:t xml:space="preserve">B), but adding more water does not result in significant gains in cooling. In addition, 2-5 mm of water added each day to avoid extreme heat impacts results in grasshopper populations being suppressed over time whereas not </w:t>
+        <w:t xml:space="preserve">B), but adding more water does not result in significant gains in cooling. In addition, </w:t>
       </w:r>
       <w:r>
         <w:lastRenderedPageBreak/>
-        <w:t>adding water at all results in grasshopper population growth, leading to potential heatwave associated outbreaks. Here, the optimal solution is adding 2-5 mm d</w:t>
+        <w:t>2-5 mm of water added each day results in the grasshopper population being suppressed over time, whereas not adding water at all results in grasshopper population growth, leading to potential heatwave-associated outbreaks. Here, the optimal solution is adding 2-5 mm d</w:t>
       </w:r>
       <w:r>
         <w:rPr>
@@ -3062,7 +3153,15 @@
         <w:t>-1</w:t>
       </w:r>
       <w:r>
-        <w:t xml:space="preserve"> of water to both cool plants and protect them from pests. Identifying and/or modifying the thermal suitability of landscapes, such as in our simple example, may dramatically benefit plants and animals under extreme heat and is a promising feature of a systems-thinking approach [20]. Additionally, as our understanding of the mechanisms associated with heat tolerance improve, genetic tools, environmental manipulations (e.g., promoting beneficial microbes) and artificial breeding can be used to enhance thermal tolerance creating more resilience to extreme heat events [e.g., 58]. Systems modelling can help understand how people’s responses to the impacts of extreme heat could lead to accelerating changes in plants, animals and landscapes. Farmers or ecosystem managers may introduce new species, alter management practices or farm remaining unaffected areas more intensively. Thermal stress may ultimately result in people leaving areas, potentially making remaining communities more vulnerable through loss of resources and services [85]. Thermal risks to ecosystems may also precipitate declines in individual wellbeing, and these consequences may accrue differently across regions and peoples [86].</w:t>
+        <w:t xml:space="preserve"> of water to both cool plants and protect them from pests. Identifying and/or modifying the thermal suitability of landscapes, such as in our simple example, may dramatically benefit plants and animals under extreme heat and is a promising feature of a systems-thinking approach [21]. Additionally, as our understanding of the mechanisms associated with heat tolerance improve, genetic tools, environmental manipulations (e.g., promoting beneficial microbes) and targeted plant breeding can be used to enhance thermal tolerance, creating more resilience to extreme heat events [e.g., 60].</w:t>
+      </w:r>
+    </w:p>
+    <w:p>
+      <w:pPr>
+        <w:pStyle w:val="BodyText"/>
+      </w:pPr>
+      <w:r>
+        <w:t>Systems modelling can also help understand how people’s responses to the impacts of extreme heat could lead to accelerating changes in plants, animals and landscapes. Farmers or ecosystem managers may introduce new species, alter management practices or farm remaining unaffected areas more intensively. Thermal stress may ultimately result in people leaving areas, potentially making remaining communities more vulnerable through loss of resources and services [87]. Thermal risks to ecosystems may also precipitate declines in individual wellbeing, and these consequences may accrue differently across regions and peoples [88].</w:t>
       </w:r>
     </w:p>
     <w:tbl>
@@ -3085,13 +3184,13 @@
               <w:pStyle w:val="Compact"/>
               <w:jc w:val="center"/>
             </w:pPr>
-            <w:bookmarkStart w:id="14" w:name="fig-2"/>
+            <w:bookmarkStart w:id="54" w:name="fig-2"/>
             <w:r>
               <w:rPr>
                 <w:noProof/>
               </w:rPr>
               <w:drawing>
-                <wp:inline distT="0" distB="0" distL="0" distR="0" wp14:anchorId="742CD32E" wp14:editId="76AE7C40">
+                <wp:inline distT="0" distB="0" distL="0" distR="0" wp14:anchorId="25187900" wp14:editId="36E6C94C">
                   <wp:extent cx="6096000" cy="4876800"/>
                   <wp:effectExtent l="0" t="0" r="0" b="0"/>
                   <wp:docPr id="44" name="Picture"/>
@@ -3139,11 +3238,39 @@
               <w:spacing w:before="200"/>
             </w:pPr>
             <w:r>
-              <w:t xml:space="preserve">Figure 4- How a systems modelling approach to extreme heat can be used to inform solutions. Heat stress to crops can result in foliage loss and crop failure but also weaken crops to pests. Using a hypothetical case study of a crop and associated pest, we explore how different watering regimes affect plant temperatures and the flow on effects such regimes have for pest dynamics (A). Using a site near Renmark, South Australia, we use microclimate and biophysical models to estimate leaf temperatures (detailed in Boxes 1 &amp; 2). We see that, compared to original rainfall conditions, certain watering regimes can significantly reduce leaf temperatures by nearly 4°C, providing protection to leaves (B). Modelling how these changed microclimate conditions translate to grasshopper body temperatures, we can then estimate changes to </w:t>
+              <w:rPr>
+                <w:b/>
+                <w:bCs/>
+              </w:rPr>
+              <w:t>Figure </w:t>
+            </w:r>
+            <w:r>
+              <w:rPr>
+                <w:b/>
+                <w:bCs/>
+              </w:rPr>
+              <w:t>2</w:t>
+            </w:r>
+            <w:r>
+              <w:rPr>
+                <w:b/>
+                <w:bCs/>
+              </w:rPr>
+              <w:t xml:space="preserve"> </w:t>
+            </w:r>
+            <w:r>
+              <w:rPr>
+                <w:b/>
+                <w:bCs/>
+              </w:rPr>
+              <w:t xml:space="preserve">- How a systems modelling approach to extreme heat can be used to inform solutions. </w:t>
+            </w:r>
+            <w:r>
+              <w:t xml:space="preserve">Heat stress to crops can result in foliage loss and crop failure, but also weaken crops to pests. Using a hypothetical case study of a crop and associated pest, we explore how different watering regimes affect plant temperatures and the flow on effects such regimes have for pest dynamics (A). Using a site near Renmark, South Australia, we use microclimate and biophysical models to estimate leaf temperatures (detailed in Boxes 1 &amp; 2). We see that, compared to original rainfall conditions, certain watering regimes </w:t>
             </w:r>
             <w:r>
               <w:lastRenderedPageBreak/>
-              <w:t>grasshopper life cycles and use the vital rates to predict population dynamics, showing, in this case, that even small amounts of water can indirectly supress pest growth through lower body temperatures (C). Created with BioRender.com.</w:t>
+              <w:t>can significantly reduce leaf temperatures by nearly 4°C, providing protection to leaves (B). Modelling how these changed microclimate conditions translate to grasshopper body temperatures, we can then estimate changes to grasshopper life cycles and use the vital rates to predict population dynamics, showing, in this case, that even small amounts of water can indirectly suppress pest growth through lower body temperatures (C). Created with BioRender.com.</w:t>
             </w:r>
           </w:p>
           <w:p>
@@ -3153,7 +3280,7 @@
             </w:pPr>
           </w:p>
         </w:tc>
-        <w:bookmarkEnd w:id="14"/>
+        <w:bookmarkEnd w:id="54"/>
       </w:tr>
     </w:tbl>
     <w:tbl>
@@ -3204,7 +3331,7 @@
               <w:spacing w:before="16"/>
             </w:pPr>
             <w:r>
-              <w:t>Extreme climactic events, such as heatwaves and droughts, are known to result in intense episodes of selection which can lead to rapid evolutionary change when traits are heritable [87]. Given the intensity of selection associated with extreme climatic events, they have the potential to radically alter the phenotypic and genetic variability available to selection in the future [88], potentially impacting population resilience to future events. Predicting evolutionary responses from extreme heat events is challenging because of their rarity and stochasticity which makes quantifying the strength of selection difficult as it often can only be opportunistically measured [87].</w:t>
+              <w:t>Extreme climactic events, such as heatwaves and droughts, can result in intense episodes of selection which can lead to rapid evolution of heritable traits [89]. Given the intensity of selection associated with extreme climatic events, these events have the potential to radically alter the phenotypic and genetic variability available to selection [90], potentially impacting population resilience to future events. Predicting evolutionary responses from extreme heat events is challenging because of their rarity and stochasticity which makes quantifying the strength of selection difficult as it often can only be opportunistically measured [89].</w:t>
             </w:r>
           </w:p>
           <w:p>
@@ -3212,7 +3339,7 @@
               <w:pStyle w:val="BodyText"/>
             </w:pPr>
             <w:r>
-              <w:t>Predicting evolutionary responses also relies on our ability to predict heatwaves and how organisms experience them in the future – a task that is becoming more feasible with new climate models [e.g., 89,90]. Evolutionary consequences of extreme heat events will depend on their characteristics (e.g., frequency, timing, exposure intensity and duration), the traits under selection and their levels of genetic (co)variation, as well as the demographic and ecological context in which the event occurs [91–93]. Considering various forms of plastic responses (e.g., behavioural, developmental, and physiological plasticity) as environments change through time is also crucial because it can weaken selection and shelter genetic variation while also promoting persistence [94,95]. Many of these processes can now be incorporated into a systems modelling framework (e.g, behavioural plasticity), to capture environment-phenotype feedbacks.</w:t>
+              <w:t>Predicting evolutionary responses also relies on our ability to predict heatwaves and how organisms experience them in the future – a task that is becoming more feasible with new climate models [e.g., 91,92]. Evolutionary consequences of extreme heat events will depend on the characteristics of these events (e.g., frequency, timing, exposure intensity and duration), the traits under selection and their levels of genetic (co)variation, as well as the demographic and ecological context in which the event occurs [93–95]. Considering various forms of plastic responses (e.g., behavioural, developmental, and physiological plasticity) as environments change through time is also crucial because plasticity can weaken selection and shelter genetic variation while also promoting persistence [96,97]. Many of these processes can now be incorporated into a systems modelling framework (e.g, behavioural plasticity), to capture environment-phenotype feedbacks.</w:t>
             </w:r>
           </w:p>
           <w:p>
@@ -3220,14 +3347,14 @@
               <w:pStyle w:val="BodyText"/>
             </w:pPr>
             <w:r>
-              <w:t>A more complete systems modelling approach that captures eco-evolutionary dynamics needs treat ‘traits’ more broadly than is typically done in evolutionary ecology (e.g., body mass). For example, ‘traits’ can include the parameters within models that establish functional traits within a population (e.g., DEB parameters)[96,97], which may provide predictions for suites of resulting traits that emerge from such parameters. Furthermore, it is important to consider the evolution of suites of traits as can be done using the multivariate breeders equation [98]:</w:t>
+              <w:t>A more complete systems modelling approach that captures eco-evolutionary dynamics needs to treat ‘traits’ more broadly than is typically done in evolutionary ecology (e.g., body mass). For example, ‘traits’ can include the parameters within models that establish functional traits within a population (e.g., DEB parameters)[98,99], which may provide predictions for suites of resulting traits that emerge from such parameters. Furthermore, it is important to consider the evolution of suites of traits as can be done using the multivariate breeders equation [100]:</w:t>
             </w:r>
           </w:p>
           <w:p>
             <w:pPr>
               <w:pStyle w:val="BodyText"/>
             </w:pPr>
-            <w:bookmarkStart w:id="15" w:name="eq-breeders"/>
+            <w:bookmarkStart w:id="55" w:name="eq-breeders"/>
             <m:oMathPara>
               <m:oMathParaPr>
                 <m:jc m:val="center"/>
@@ -3243,9 +3370,11 @@
                   <m:accPr>
                     <m:chr m:val="‾"/>
                     <m:ctrlPr>
-                      <w:rPr>
-                        <w:rFonts w:ascii="Cambria Math" w:hAnsi="Cambria Math"/>
-                      </w:rPr>
+                      <w:ins w:id="56" w:author="Daniel Noble" w:date="2025-12-12T15:01:00Z" w16du:dateUtc="2025-12-12T04:01:00Z">
+                        <w:rPr>
+                          <w:rFonts w:ascii="Cambria Math" w:hAnsi="Cambria Math"/>
+                        </w:rPr>
+                      </w:ins>
                     </m:ctrlPr>
                   </m:accPr>
                   <m:e>
@@ -3305,9 +3434,11 @@
                 <m:d>
                   <m:dPr>
                     <m:ctrlPr>
-                      <w:rPr>
-                        <w:rFonts w:ascii="Cambria Math" w:hAnsi="Cambria Math"/>
-                      </w:rPr>
+                      <w:ins w:id="57" w:author="Daniel Noble" w:date="2025-12-12T15:01:00Z" w16du:dateUtc="2025-12-12T04:01:00Z">
+                        <w:rPr>
+                          <w:rFonts w:ascii="Cambria Math" w:hAnsi="Cambria Math"/>
+                        </w:rPr>
+                      </w:ins>
                     </m:ctrlPr>
                   </m:dPr>
                   <m:e>
@@ -3321,7 +3452,7 @@
                 </m:d>
               </m:oMath>
             </m:oMathPara>
-            <w:bookmarkEnd w:id="15"/>
+            <w:bookmarkEnd w:id="55"/>
           </w:p>
           <w:p>
             <w:pPr>
@@ -3342,9 +3473,11 @@
                 <m:accPr>
                   <m:chr m:val="‾"/>
                   <m:ctrlPr>
-                    <w:rPr>
-                      <w:rFonts w:ascii="Cambria Math" w:hAnsi="Cambria Math"/>
-                    </w:rPr>
+                    <w:ins w:id="58" w:author="Daniel Noble" w:date="2025-12-12T15:01:00Z" w16du:dateUtc="2025-12-12T04:01:00Z">
+                      <w:rPr>
+                        <w:rFonts w:ascii="Cambria Math" w:hAnsi="Cambria Math"/>
+                      </w:rPr>
+                    </w:ins>
                   </m:ctrlPr>
                 </m:accPr>
                 <m:e>
@@ -3431,9 +3564,11 @@
               <m:sSup>
                 <m:sSupPr>
                   <m:ctrlPr>
-                    <w:rPr>
-                      <w:rFonts w:ascii="Cambria Math" w:hAnsi="Cambria Math"/>
-                    </w:rPr>
+                    <w:ins w:id="59" w:author="Daniel Noble" w:date="2025-12-12T15:01:00Z" w16du:dateUtc="2025-12-12T04:01:00Z">
+                      <w:rPr>
+                        <w:rFonts w:ascii="Cambria Math" w:hAnsi="Cambria Math"/>
+                      </w:rPr>
+                    </w:ins>
                   </m:ctrlPr>
                 </m:sSupPr>
                 <m:e>
@@ -3497,7 +3632,7 @@
               </m:r>
             </m:oMath>
             <w:r>
-              <w:t>; [99]). Plasticity can be captured by mapping trait development to the environment and incorporating environmental variability into the breeders equation [see also, 100]. While the multivariate breeders equation can be useful for predicting short term evolutionary responses (i.e., one or a few generations) it likely has limited predictive power over longer timespans because of changes in heritability and selection through time, which is a future challenge [93,99].</w:t>
+              <w:t>; [101]). Plasticity can be captured by mapping trait development to the environment and incorporating environmental variability into the breeders equation [see also, 102]. While the multivariate breeders equation can be useful for predicting short-term evolutionary responses (i.e., one or a few generations) it likely has limited predictive power over longer timespans because of changes in heritability and selection through time, which is a future challenge [95,101].</w:t>
             </w:r>
           </w:p>
         </w:tc>
@@ -3574,7 +3709,7 @@
               </w:numPr>
             </w:pPr>
             <w:r>
-              <w:t>How can we capture rapid and longer-term evolutionary responses of interacting species to extreme heat in a systems-modelling framework?</w:t>
+              <w:t>How can we best capture rapid and longer-term evolutionary responses of interacting species to extreme heat in a systems-modelling framework?</w:t>
             </w:r>
           </w:p>
           <w:p>
@@ -3586,7 +3721,7 @@
               </w:numPr>
             </w:pPr>
             <w:r>
-              <w:t>Can we use thermal load sensitivity models to describe heat damage to plant tissues?</w:t>
+              <w:t>How can we capture multiple anthropogenic stressors in a systems-modelling framework to explore how they interact with extreme heat to affect organisms, populations and communities?</w:t>
             </w:r>
           </w:p>
           <w:p>
@@ -3598,7 +3733,7 @@
               </w:numPr>
             </w:pPr>
             <w:r>
-              <w:t>Can we build and couple dynamic energy budget models for plant species to predict how extreme heat will impact tissue and life cycle dynamics more accurately?</w:t>
+              <w:t>How will extreme heat affect species coexistence and functional trait diversity in natural and agricultural systems?</w:t>
             </w:r>
           </w:p>
           <w:p>
@@ -3610,7 +3745,7 @@
               </w:numPr>
             </w:pPr>
             <w:r>
-              <w:t>How do multiple stressors in anthropogenically modified environments interact with extreme heat to impact organisms, populations and communities?</w:t>
+              <w:t>How do we best the model lagged effects of extreme heat events on whole communities?</w:t>
             </w:r>
           </w:p>
           <w:p>
@@ -3622,43 +3757,7 @@
               </w:numPr>
             </w:pPr>
             <w:r>
-              <w:t>How will extreme heat impact species coexistence and functional trait diversity in natural and agricultural systems?</w:t>
-            </w:r>
-          </w:p>
-          <w:p>
-            <w:pPr>
-              <w:pStyle w:val="Compact"/>
-              <w:numPr>
-                <w:ilvl w:val="0"/>
-                <w:numId w:val="86"/>
-              </w:numPr>
-            </w:pPr>
-            <w:r>
-              <w:t>How can we quantify microhabitat complexity to robustly and accurately capture the heat responses of animal, plants and microbes and their interactions?</w:t>
-            </w:r>
-          </w:p>
-          <w:p>
-            <w:pPr>
-              <w:pStyle w:val="Compact"/>
-              <w:numPr>
-                <w:ilvl w:val="0"/>
-                <w:numId w:val="86"/>
-              </w:numPr>
-            </w:pPr>
-            <w:r>
-              <w:t>How do we model lagged impacts of extreme heat events on whole communities?</w:t>
-            </w:r>
-          </w:p>
-          <w:p>
-            <w:pPr>
-              <w:pStyle w:val="Compact"/>
-              <w:numPr>
-                <w:ilvl w:val="0"/>
-                <w:numId w:val="86"/>
-              </w:numPr>
-            </w:pPr>
-            <w:r>
-              <w:t>How will thermal stress to natural ecosystems and food production systems impact people?</w:t>
+              <w:t>How can we extend a systems modelling approach to understand how thermal stress to natural ecosystems and food production systems impact people?</w:t>
             </w:r>
           </w:p>
         </w:tc>
@@ -3668,8 +3767,8 @@
       <w:pPr>
         <w:pStyle w:val="Heading1"/>
       </w:pPr>
-      <w:bookmarkStart w:id="16" w:name="concluding-remarks"/>
-      <w:bookmarkEnd w:id="13"/>
+      <w:bookmarkStart w:id="60" w:name="concluding-remarks"/>
+      <w:bookmarkEnd w:id="53"/>
       <w:r>
         <w:t>Concluding Remarks</w:t>
       </w:r>
@@ -3689,7 +3788,7 @@
         <w:t>Outstanding Questions</w:t>
       </w:r>
       <w:r>
-        <w:t xml:space="preserve">). But, more than ever, we need mechanistic approaches that encapsulate key biological processes (physiology, behaviour, phenology, species interactions and eco-evolutionary dynamics - </w:t>
+        <w:t xml:space="preserve">). But, more than ever, we need mechanistic approaches that can capture key biological processes (physiology, behaviour, phenology, species interactions and eco-evolutionary dynamics - </w:t>
       </w:r>
       <w:r>
         <w:rPr>
@@ -3699,7 +3798,15 @@
         <w:t>Box 3</w:t>
       </w:r>
       <w:r>
-        <w:t>) to better predict biological responses to extreme heat [52,101]. Coupled mechanistic models within and across species are expected to have improved predictive power when projected to new environmental conditions and can better capture interacting processes [20,101]. Nonetheless, a systems modelling approach will require a solid foundation of species natural history, diverse modelling expertise, and a concerted effort to collect and collate trait and environmental data for model building and validation. There are exciting new tools and data that are helping to overcome these challenges [25], and careful consideration of the key processes important to a system can help alleviate these challenges [20]. For example, large databases of physiological traits for both plants and animals now exist [e.g., 102,103] and advanced missing data approaches can help estimate likely parameters for data deficient species [68,72,104]. Ever more sophisticated and powerful computational pipelines (e.g. </w:t>
+        <w:t>) to better predict biological responses to extreme heat [54,103]. Coupled mechanistic models within and across species are expected to have improved predictive power when projected to new environmental conditions and will better capture interacting processes [21,103]. Nonetheless, application of a systems modelling approach will require a solid foundation of species natural history, diverse modelling expertise, and a concerted effort to collect and collate trait and environmental data for model building and validation.</w:t>
+      </w:r>
+    </w:p>
+    <w:p>
+      <w:pPr>
+        <w:pStyle w:val="BodyText"/>
+      </w:pPr>
+      <w:r>
+        <w:t>There are exciting new tools and data that are helping to overcome these challenges [26], and careful consideration of the key processes important to a system can help alleviate these challenges [21]. For example, large databases of physiological traits for both plants and animals now exist [e.g., 104,105] and advanced missing data approaches can help estimate likely parameters for data deficient species [70,74,106]. Ever more sophisticated and powerful computational pipelines (e.g. </w:t>
       </w:r>
       <w:r>
         <w:rPr>
@@ -3739,15 +3846,15 @@
         <w:t>terra</w:t>
       </w:r>
       <w:r>
-        <w:t xml:space="preserve"> in R) make it easier to implement and connect models. Model selection and validation are important steps in any modelling process and will be more complicated when applied to entire systems. However, starting with a simple model, validating predictions with empirical data, and then adding complexity as needed can make building systems models more tractable [20]. Even simple models that compare counterfactual scenarios may provide important quantitative insights into the impacts of extreme heat on organisms, populations and communities [105–107]. Such insights can form the basis for prediction-driven solutions to mitigate the impacts of extreme heat on biodiversity. By working collaboratively and integratively we can develop a more quantitative and predictive understanding of the impacts that extreme heat will have on organisms, populations, and communities, and decide how to mitigate these impacts to preserve diverse systems now and into the future.</w:t>
+        <w:t xml:space="preserve"> in R) make it easier to implement and connect models. Model selection and validation are important steps in any modelling process and will be more complicated when applied to entire systems; however, starting with a simple model, validating predictions with empirical data, and then adding complexity as needed can make building systems models more tractable [21]. Even simple models that compare counterfactual scenarios may provide important quantitative insights into the impacts of extreme heat on organisms, populations and communities [107–109]. Such insights can form the basis for prediction-driven solutions to mitigate the impacts of extreme heat on biodiversity. By working collaboratively we can develop a more quantitative and predictive understanding of the impacts that extreme heat will have on organisms, populations, and communities, and decide how to mitigate these impacts to preserve diverse systems now and into the future.</w:t>
       </w:r>
     </w:p>
     <w:p>
       <w:pPr>
         <w:pStyle w:val="Heading1"/>
       </w:pPr>
-      <w:bookmarkStart w:id="17" w:name="acknowledgements"/>
-      <w:bookmarkEnd w:id="16"/>
+      <w:bookmarkStart w:id="61" w:name="acknowledgements"/>
+      <w:bookmarkEnd w:id="60"/>
       <w:r>
         <w:t>Acknowledgements</w:t>
       </w:r>
@@ -3757,52 +3864,49 @@
         <w:pStyle w:val="FirstParagraph"/>
       </w:pPr>
       <w:r>
-        <w:t xml:space="preserve">We would like to thank Pieter Arnold, Joel Treutlein and Patrice Pottier for helpful comments on previous versions of this manuscript. We would also like to thank the Editor and three anonymous reviewers who provided very constructive feedback on earlier versions of our manuscript. DWAN and S.J.L. are supported </w:t>
-      </w:r>
+        <w:t>We would like to thank Pieter Arnold, Joel Treutlein and Patrice Pottier for helpful comments on previous versions of this manuscript. We would also like to thank the Editor and three anonymous reviewers who provided very constructive feedback on earlier versions of our manuscript. DWAN, SJL and DW are supported by an ARC Future Fellowship (FT220100276 to DWAN, FT200100381 to SJL and FT230100193 to DW), and MRK by an ARC Laureate Fellowship (FL240100088). We would also like to thank The Australian National University, the University of Melbourne and Western Sydney University for funding to support workshops that helped develop this manuscript.</w:t>
+      </w:r>
+    </w:p>
+    <w:p>
+      <w:pPr>
+        <w:pStyle w:val="Heading1"/>
+      </w:pPr>
+      <w:bookmarkStart w:id="62" w:name="code"/>
+      <w:bookmarkEnd w:id="61"/>
       <w:r>
         <w:lastRenderedPageBreak/>
-        <w:t>by an ARC Future Fellowship (FT220100276 to DWAN and FT200100381 to S.J.L.), and M.R.K by an ARC Laureate Fellowship (FL240100088). We would also like to thank The Australian National University, the University of Melbourne and Western Sydney University for funding to support workshops that helped develop this manuscript.</w:t>
+        <w:t>Code</w:t>
+      </w:r>
+    </w:p>
+    <w:p>
+      <w:pPr>
+        <w:pStyle w:val="FirstParagraph"/>
+      </w:pPr>
+      <w:r>
+        <w:t>Link to the code used to for examples in Box 1 and 2, as well as Figure 2, can be found at: https://daniel1noble.github.io/thermal_tol_interactions/ with the full set of files being located on our GitHub repository at https://github.com/daniel1noble/thermal_tol_interactions.</w:t>
       </w:r>
     </w:p>
     <w:p>
       <w:pPr>
         <w:pStyle w:val="Heading1"/>
       </w:pPr>
-      <w:bookmarkStart w:id="18" w:name="code"/>
-      <w:bookmarkEnd w:id="17"/>
-      <w:r>
-        <w:t>Code</w:t>
+      <w:bookmarkStart w:id="63" w:name="references"/>
+      <w:bookmarkEnd w:id="62"/>
+      <w:r>
+        <w:t>References</w:t>
       </w:r>
     </w:p>
     <w:p>
       <w:pPr>
         <w:pStyle w:val="FirstParagraph"/>
       </w:pPr>
-      <w:r>
-        <w:t>Link to the code used to for examples in Box 1 and 2 can be found here: https://daniel1noble.github.io/thermal_tol_interactions/ with the full set of files being located on our GitHub repository at https://github.com/daniel1noble/thermal_tol_interactions.</w:t>
-      </w:r>
-    </w:p>
-    <w:p>
-      <w:pPr>
-        <w:pStyle w:val="Heading1"/>
-      </w:pPr>
-      <w:bookmarkStart w:id="19" w:name="references"/>
-      <w:bookmarkEnd w:id="18"/>
-      <w:r>
-        <w:t>References</w:t>
-      </w:r>
-    </w:p>
-    <w:p>
-      <w:pPr>
-        <w:pStyle w:val="FirstParagraph"/>
-      </w:pPr>
-    </w:p>
-    <w:p>
-      <w:pPr>
-        <w:pStyle w:val="Bibliography"/>
-      </w:pPr>
-      <w:bookmarkStart w:id="20" w:name="ref-Barriopedro2023"/>
-      <w:bookmarkStart w:id="21" w:name="refs"/>
+    </w:p>
+    <w:p>
+      <w:pPr>
+        <w:pStyle w:val="Bibliography"/>
+      </w:pPr>
+      <w:bookmarkStart w:id="64" w:name="ref-Barriopedro2023"/>
+      <w:bookmarkStart w:id="65" w:name="refs"/>
       <w:r>
         <w:t xml:space="preserve">1. </w:t>
       </w:r>
@@ -3835,8 +3939,8 @@
       <w:pPr>
         <w:pStyle w:val="Bibliography"/>
       </w:pPr>
-      <w:bookmarkStart w:id="22" w:name="ref-Perkins-Kirkpatrick2020"/>
-      <w:bookmarkEnd w:id="20"/>
+      <w:bookmarkStart w:id="66" w:name="ref-Perkins-Kirkpatrick2020"/>
+      <w:bookmarkEnd w:id="64"/>
       <w:r>
         <w:t xml:space="preserve">2. </w:t>
       </w:r>
@@ -3870,8 +3974,8 @@
       <w:pPr>
         <w:pStyle w:val="Bibliography"/>
       </w:pPr>
-      <w:bookmarkStart w:id="23" w:name="ref-Evans2025"/>
-      <w:bookmarkEnd w:id="22"/>
+      <w:bookmarkStart w:id="67" w:name="ref-Evans2025"/>
+      <w:bookmarkEnd w:id="66"/>
       <w:r>
         <w:t xml:space="preserve">3. </w:t>
       </w:r>
@@ -3915,8 +4019,8 @@
       <w:pPr>
         <w:pStyle w:val="Bibliography"/>
       </w:pPr>
-      <w:bookmarkStart w:id="24" w:name="ref-Margalef-Marrase2020"/>
-      <w:bookmarkEnd w:id="23"/>
+      <w:bookmarkStart w:id="68" w:name="ref-Margalef-Marrase2020"/>
+      <w:bookmarkEnd w:id="67"/>
       <w:r>
         <w:t xml:space="preserve">4. </w:t>
       </w:r>
@@ -3949,8 +4053,8 @@
       <w:pPr>
         <w:pStyle w:val="Bibliography"/>
       </w:pPr>
-      <w:bookmarkStart w:id="25" w:name="ref-Kazenel2024"/>
-      <w:bookmarkEnd w:id="24"/>
+      <w:bookmarkStart w:id="69" w:name="ref-Kazenel2024"/>
+      <w:bookmarkEnd w:id="68"/>
       <w:r>
         <w:t xml:space="preserve">5. </w:t>
       </w:r>
@@ -3983,8 +4087,8 @@
       <w:pPr>
         <w:pStyle w:val="Bibliography"/>
       </w:pPr>
-      <w:bookmarkStart w:id="26" w:name="ref-Zhao2017"/>
-      <w:bookmarkEnd w:id="25"/>
+      <w:bookmarkStart w:id="70" w:name="ref-Zhao2017"/>
+      <w:bookmarkEnd w:id="69"/>
       <w:r>
         <w:t xml:space="preserve">6. </w:t>
       </w:r>
@@ -4017,8 +4121,8 @@
       <w:pPr>
         <w:pStyle w:val="Bibliography"/>
       </w:pPr>
-      <w:bookmarkStart w:id="27" w:name="ref-Tito2018"/>
-      <w:bookmarkEnd w:id="26"/>
+      <w:bookmarkStart w:id="71" w:name="ref-Tito2018"/>
+      <w:bookmarkEnd w:id="70"/>
       <w:r>
         <w:t xml:space="preserve">7. </w:t>
       </w:r>
@@ -4051,8 +4155,8 @@
       <w:pPr>
         <w:pStyle w:val="Bibliography"/>
       </w:pPr>
-      <w:bookmarkStart w:id="28" w:name="ref-Bernacchi2025"/>
-      <w:bookmarkEnd w:id="27"/>
+      <w:bookmarkStart w:id="72" w:name="ref-Bernacchi2025"/>
+      <w:bookmarkEnd w:id="71"/>
       <w:r>
         <w:t xml:space="preserve">8. </w:t>
       </w:r>
@@ -4096,8 +4200,8 @@
       <w:pPr>
         <w:pStyle w:val="Bibliography"/>
       </w:pPr>
-      <w:bookmarkStart w:id="29" w:name="ref-Martinez2023"/>
-      <w:bookmarkEnd w:id="28"/>
+      <w:bookmarkStart w:id="73" w:name="ref-Martinez2023"/>
+      <w:bookmarkEnd w:id="72"/>
       <w:r>
         <w:t xml:space="preserve">9. </w:t>
       </w:r>
@@ -4141,8 +4245,8 @@
       <w:pPr>
         <w:pStyle w:val="Bibliography"/>
       </w:pPr>
-      <w:bookmarkStart w:id="30" w:name="ref-Rezende2020"/>
-      <w:bookmarkEnd w:id="29"/>
+      <w:bookmarkStart w:id="74" w:name="ref-Rezende2020"/>
+      <w:bookmarkEnd w:id="73"/>
       <w:r>
         <w:t xml:space="preserve">10. </w:t>
       </w:r>
@@ -4186,8 +4290,8 @@
       <w:pPr>
         <w:pStyle w:val="Bibliography"/>
       </w:pPr>
-      <w:bookmarkStart w:id="31" w:name="ref-Orsted2024"/>
-      <w:bookmarkEnd w:id="30"/>
+      <w:bookmarkStart w:id="75" w:name="ref-Orsted2024"/>
+      <w:bookmarkEnd w:id="74"/>
       <w:r>
         <w:t xml:space="preserve">11. </w:t>
       </w:r>
@@ -4220,8 +4324,8 @@
       <w:pPr>
         <w:pStyle w:val="Bibliography"/>
       </w:pPr>
-      <w:bookmarkStart w:id="32" w:name="ref-Lopez-Goldar2024"/>
-      <w:bookmarkEnd w:id="31"/>
+      <w:bookmarkStart w:id="76" w:name="ref-Lopez-Goldar2024"/>
+      <w:bookmarkEnd w:id="75"/>
       <w:r>
         <w:t xml:space="preserve">12. </w:t>
       </w:r>
@@ -4265,8 +4369,8 @@
       <w:pPr>
         <w:pStyle w:val="Bibliography"/>
       </w:pPr>
-      <w:bookmarkStart w:id="33" w:name="ref-Arnold2025a"/>
-      <w:bookmarkEnd w:id="32"/>
+      <w:bookmarkStart w:id="77" w:name="ref-Arnold2025a"/>
+      <w:bookmarkEnd w:id="76"/>
       <w:r>
         <w:t xml:space="preserve">13. </w:t>
       </w:r>
@@ -4310,10 +4414,9 @@
       <w:pPr>
         <w:pStyle w:val="Bibliography"/>
       </w:pPr>
-      <w:bookmarkStart w:id="34" w:name="ref-Trivedi2022"/>
-      <w:bookmarkEnd w:id="33"/>
-      <w:r>
-        <w:lastRenderedPageBreak/>
+      <w:bookmarkStart w:id="78" w:name="ref-Trivedi2022"/>
+      <w:bookmarkEnd w:id="77"/>
+      <w:r>
         <w:t xml:space="preserve">14. </w:t>
       </w:r>
       <w:r>
@@ -4345,8 +4448,8 @@
       <w:pPr>
         <w:pStyle w:val="Bibliography"/>
       </w:pPr>
-      <w:bookmarkStart w:id="35" w:name="ref-Bimler2024"/>
-      <w:bookmarkEnd w:id="34"/>
+      <w:bookmarkStart w:id="79" w:name="ref-Bimler2024"/>
+      <w:bookmarkEnd w:id="78"/>
       <w:r>
         <w:t xml:space="preserve">15. </w:t>
       </w:r>
@@ -4390,9 +4493,10 @@
       <w:pPr>
         <w:pStyle w:val="Bibliography"/>
       </w:pPr>
-      <w:bookmarkStart w:id="36" w:name="ref-Chesson2000"/>
-      <w:bookmarkEnd w:id="35"/>
-      <w:r>
+      <w:bookmarkStart w:id="80" w:name="ref-Chesson2000"/>
+      <w:bookmarkEnd w:id="79"/>
+      <w:r>
+        <w:lastRenderedPageBreak/>
         <w:t xml:space="preserve">16. </w:t>
       </w:r>
       <w:r>
@@ -4425,13 +4529,58 @@
       <w:pPr>
         <w:pStyle w:val="Bibliography"/>
       </w:pPr>
-      <w:bookmarkStart w:id="37" w:name="ref-Kooijman2010"/>
-      <w:bookmarkEnd w:id="36"/>
+      <w:bookmarkStart w:id="81" w:name="ref-Dicks2021"/>
+      <w:bookmarkEnd w:id="80"/>
       <w:r>
         <w:t xml:space="preserve">17. </w:t>
       </w:r>
       <w:r>
         <w:tab/>
+        <w:t xml:space="preserve">Dicks, L.V. </w:t>
+      </w:r>
+      <w:r>
+        <w:rPr>
+          <w:i/>
+          <w:iCs/>
+        </w:rPr>
+        <w:t>et al.</w:t>
+      </w:r>
+      <w:r>
+        <w:t xml:space="preserve"> (2021) </w:t>
+      </w:r>
+      <w:hyperlink r:id="rId19">
+        <w:r>
+          <w:rPr>
+            <w:rStyle w:val="Hyperlink"/>
+          </w:rPr>
+          <w:t>A global-scale expert assessment of drivers and risks associated with pollinator decline</w:t>
+        </w:r>
+      </w:hyperlink>
+      <w:r>
+        <w:t xml:space="preserve">. </w:t>
+      </w:r>
+      <w:r>
+        <w:rPr>
+          <w:i/>
+          <w:iCs/>
+        </w:rPr>
+        <w:t>Nat. Ecol. Evol.</w:t>
+      </w:r>
+      <w:r>
+        <w:t xml:space="preserve"> 5, 1453–1461</w:t>
+      </w:r>
+    </w:p>
+    <w:p>
+      <w:pPr>
+        <w:pStyle w:val="Bibliography"/>
+      </w:pPr>
+      <w:bookmarkStart w:id="82" w:name="ref-Kooijman2010"/>
+      <w:bookmarkEnd w:id="81"/>
+      <w:r>
+        <w:t xml:space="preserve">18. </w:t>
+      </w:r>
+      <w:r>
+        <w:tab/>
         <w:t xml:space="preserve">Kooijman, S.A.L.M. (2010) </w:t>
       </w:r>
       <w:r>
@@ -4449,10 +4598,10 @@
       <w:pPr>
         <w:pStyle w:val="Bibliography"/>
       </w:pPr>
-      <w:bookmarkStart w:id="38" w:name="ref-Kearney2009b"/>
-      <w:bookmarkEnd w:id="37"/>
-      <w:r>
-        <w:t xml:space="preserve">18. </w:t>
+      <w:bookmarkStart w:id="83" w:name="ref-Kearney2009b"/>
+      <w:bookmarkEnd w:id="82"/>
+      <w:r>
+        <w:t xml:space="preserve">19. </w:t>
       </w:r>
       <w:r>
         <w:tab/>
@@ -4473,16 +4622,16 @@
       <w:pPr>
         <w:pStyle w:val="Bibliography"/>
       </w:pPr>
-      <w:bookmarkStart w:id="39" w:name="ref-Kearney2024"/>
-      <w:bookmarkEnd w:id="38"/>
-      <w:r>
-        <w:t xml:space="preserve">19. </w:t>
+      <w:bookmarkStart w:id="84" w:name="ref-Kearney2024"/>
+      <w:bookmarkEnd w:id="83"/>
+      <w:r>
+        <w:t xml:space="preserve">20. </w:t>
       </w:r>
       <w:r>
         <w:tab/>
         <w:t xml:space="preserve">Kearney, M.R. and Leigh, A. (2024) </w:t>
       </w:r>
-      <w:hyperlink r:id="rId19">
+      <w:hyperlink r:id="rId20">
         <w:r>
           <w:rPr>
             <w:rStyle w:val="Hyperlink"/>
@@ -4508,10 +4657,10 @@
       <w:pPr>
         <w:pStyle w:val="Bibliography"/>
       </w:pPr>
-      <w:bookmarkStart w:id="40" w:name="ref-Briscoe2023"/>
-      <w:bookmarkEnd w:id="39"/>
-      <w:r>
-        <w:t xml:space="preserve">20. </w:t>
+      <w:bookmarkStart w:id="85" w:name="ref-Briscoe2023"/>
+      <w:bookmarkEnd w:id="84"/>
+      <w:r>
+        <w:t xml:space="preserve">21. </w:t>
       </w:r>
       <w:r>
         <w:tab/>
@@ -4542,10 +4691,10 @@
       <w:pPr>
         <w:pStyle w:val="Bibliography"/>
       </w:pPr>
-      <w:bookmarkStart w:id="41" w:name="ref-Rezende2014"/>
-      <w:bookmarkEnd w:id="40"/>
-      <w:r>
-        <w:t xml:space="preserve">21. </w:t>
+      <w:bookmarkStart w:id="86" w:name="ref-Rezende2014"/>
+      <w:bookmarkEnd w:id="85"/>
+      <w:r>
+        <w:t xml:space="preserve">22. </w:t>
       </w:r>
       <w:r>
         <w:tab/>
@@ -4561,7 +4710,7 @@
       <w:r>
         <w:t xml:space="preserve"> (2014) </w:t>
       </w:r>
-      <w:hyperlink r:id="rId20">
+      <w:hyperlink r:id="rId21">
         <w:r>
           <w:rPr>
             <w:rStyle w:val="Hyperlink"/>
@@ -4587,10 +4736,10 @@
       <w:pPr>
         <w:pStyle w:val="Bibliography"/>
       </w:pPr>
-      <w:bookmarkStart w:id="42" w:name="ref-Bimler2018"/>
-      <w:bookmarkEnd w:id="41"/>
-      <w:r>
-        <w:t xml:space="preserve">22. </w:t>
+      <w:bookmarkStart w:id="87" w:name="ref-Bimler2018"/>
+      <w:bookmarkEnd w:id="86"/>
+      <w:r>
+        <w:t xml:space="preserve">23. </w:t>
       </w:r>
       <w:r>
         <w:tab/>
@@ -4606,7 +4755,7 @@
       <w:r>
         <w:t xml:space="preserve"> (2018) </w:t>
       </w:r>
-      <w:hyperlink r:id="rId21">
+      <w:hyperlink r:id="rId22">
         <w:r>
           <w:rPr>
             <w:rStyle w:val="Hyperlink"/>
@@ -4632,10 +4781,10 @@
       <w:pPr>
         <w:pStyle w:val="Bibliography"/>
       </w:pPr>
-      <w:bookmarkStart w:id="43" w:name="ref-Bowler2022"/>
-      <w:bookmarkEnd w:id="42"/>
-      <w:r>
-        <w:t xml:space="preserve">23. </w:t>
+      <w:bookmarkStart w:id="88" w:name="ref-Bowler2022"/>
+      <w:bookmarkEnd w:id="87"/>
+      <w:r>
+        <w:t xml:space="preserve">24. </w:t>
       </w:r>
       <w:r>
         <w:tab/>
@@ -4651,7 +4800,7 @@
       <w:r>
         <w:t xml:space="preserve"> (2022) </w:t>
       </w:r>
-      <w:hyperlink r:id="rId22">
+      <w:hyperlink r:id="rId23">
         <w:r>
           <w:rPr>
             <w:rStyle w:val="Hyperlink"/>
@@ -4677,16 +4826,16 @@
       <w:pPr>
         <w:pStyle w:val="Bibliography"/>
       </w:pPr>
-      <w:bookmarkStart w:id="44" w:name="ref-Kearney2017"/>
-      <w:bookmarkEnd w:id="43"/>
-      <w:r>
-        <w:t xml:space="preserve">24. </w:t>
+      <w:bookmarkStart w:id="89" w:name="ref-Kearney2017"/>
+      <w:bookmarkEnd w:id="88"/>
+      <w:r>
+        <w:t xml:space="preserve">25. </w:t>
       </w:r>
       <w:r>
         <w:tab/>
         <w:t xml:space="preserve">Kearney, M.R. and Porter, W.P. (2017) </w:t>
       </w:r>
-      <w:hyperlink r:id="rId23">
+      <w:hyperlink r:id="rId24">
         <w:r>
           <w:rPr>
             <w:rStyle w:val="Hyperlink"/>
@@ -4712,10 +4861,10 @@
       <w:pPr>
         <w:pStyle w:val="Bibliography"/>
       </w:pPr>
-      <w:bookmarkStart w:id="45" w:name="ref-Maclean2019"/>
-      <w:bookmarkEnd w:id="44"/>
-      <w:r>
-        <w:t xml:space="preserve">25. </w:t>
+      <w:bookmarkStart w:id="90" w:name="ref-Maclean2019"/>
+      <w:bookmarkEnd w:id="89"/>
+      <w:r>
+        <w:t xml:space="preserve">26. </w:t>
       </w:r>
       <w:r>
         <w:tab/>
@@ -4731,7 +4880,7 @@
       <w:r>
         <w:t xml:space="preserve"> (2019) </w:t>
       </w:r>
-      <w:hyperlink r:id="rId24">
+      <w:hyperlink r:id="rId25">
         <w:r>
           <w:rPr>
             <w:rStyle w:val="Hyperlink"/>
@@ -4757,10 +4906,10 @@
       <w:pPr>
         <w:pStyle w:val="Bibliography"/>
       </w:pPr>
-      <w:bookmarkStart w:id="46" w:name="ref-Kearney2020"/>
-      <w:bookmarkEnd w:id="45"/>
-      <w:r>
-        <w:t xml:space="preserve">26. </w:t>
+      <w:bookmarkStart w:id="91" w:name="ref-Kearney2020"/>
+      <w:bookmarkEnd w:id="90"/>
+      <w:r>
+        <w:t xml:space="preserve">27. </w:t>
       </w:r>
       <w:r>
         <w:tab/>
@@ -4776,7 +4925,7 @@
       <w:r>
         <w:t xml:space="preserve"> (2020) </w:t>
       </w:r>
-      <w:hyperlink r:id="rId25">
+      <w:hyperlink r:id="rId26">
         <w:r>
           <w:rPr>
             <w:rStyle w:val="Hyperlink"/>
@@ -4802,10 +4951,10 @@
       <w:pPr>
         <w:pStyle w:val="Bibliography"/>
       </w:pPr>
-      <w:bookmarkStart w:id="47" w:name="ref-Maclean2021"/>
-      <w:bookmarkEnd w:id="46"/>
-      <w:r>
-        <w:t xml:space="preserve">27. </w:t>
+      <w:bookmarkStart w:id="92" w:name="ref-Maclean2021"/>
+      <w:bookmarkEnd w:id="91"/>
+      <w:r>
+        <w:t xml:space="preserve">28. </w:t>
       </w:r>
       <w:r>
         <w:tab/>
@@ -4821,7 +4970,7 @@
       <w:r>
         <w:t xml:space="preserve"> (2021) </w:t>
       </w:r>
-      <w:hyperlink r:id="rId26">
+      <w:hyperlink r:id="rId27">
         <w:r>
           <w:rPr>
             <w:rStyle w:val="Hyperlink"/>
@@ -4847,10 +4996,10 @@
       <w:pPr>
         <w:pStyle w:val="Bibliography"/>
       </w:pPr>
-      <w:bookmarkStart w:id="48" w:name="ref-Buckley2023"/>
-      <w:bookmarkEnd w:id="47"/>
-      <w:r>
-        <w:t xml:space="preserve">28. </w:t>
+      <w:bookmarkStart w:id="93" w:name="ref-Buckley2023"/>
+      <w:bookmarkEnd w:id="92"/>
+      <w:r>
+        <w:t xml:space="preserve">29. </w:t>
       </w:r>
       <w:r>
         <w:tab/>
@@ -4866,7 +5015,7 @@
       <w:r>
         <w:t xml:space="preserve"> (2023) </w:t>
       </w:r>
-      <w:hyperlink r:id="rId27">
+      <w:hyperlink r:id="rId28">
         <w:r>
           <w:rPr>
             <w:rStyle w:val="Hyperlink"/>
@@ -4892,10 +5041,10 @@
       <w:pPr>
         <w:pStyle w:val="Bibliography"/>
       </w:pPr>
-      <w:bookmarkStart w:id="49" w:name="ref-Bramer2018"/>
-      <w:bookmarkEnd w:id="48"/>
-      <w:r>
-        <w:t xml:space="preserve">29. </w:t>
+      <w:bookmarkStart w:id="94" w:name="ref-Bramer2018"/>
+      <w:bookmarkEnd w:id="93"/>
+      <w:r>
+        <w:t xml:space="preserve">30. </w:t>
       </w:r>
       <w:r>
         <w:tab/>
@@ -4926,10 +5075,10 @@
       <w:pPr>
         <w:pStyle w:val="Bibliography"/>
       </w:pPr>
-      <w:bookmarkStart w:id="50" w:name="ref-Levy2016"/>
-      <w:bookmarkEnd w:id="49"/>
-      <w:r>
-        <w:t xml:space="preserve">30. </w:t>
+      <w:bookmarkStart w:id="95" w:name="ref-Levy2016"/>
+      <w:bookmarkEnd w:id="94"/>
+      <w:r>
+        <w:t xml:space="preserve">31. </w:t>
       </w:r>
       <w:r>
         <w:tab/>
@@ -4945,7 +5094,7 @@
       <w:r>
         <w:t xml:space="preserve"> (2016) </w:t>
       </w:r>
-      <w:hyperlink r:id="rId28">
+      <w:hyperlink r:id="rId29">
         <w:r>
           <w:rPr>
             <w:rStyle w:val="Hyperlink"/>
@@ -4971,10 +5120,10 @@
       <w:pPr>
         <w:pStyle w:val="Bibliography"/>
       </w:pPr>
-      <w:bookmarkStart w:id="51" w:name="ref-Choi2019"/>
-      <w:bookmarkEnd w:id="50"/>
-      <w:r>
-        <w:t xml:space="preserve">31. </w:t>
+      <w:bookmarkStart w:id="96" w:name="ref-Choi2019"/>
+      <w:bookmarkEnd w:id="95"/>
+      <w:r>
+        <w:t xml:space="preserve">32. </w:t>
       </w:r>
       <w:r>
         <w:tab/>
@@ -4990,7 +5139,7 @@
       <w:r>
         <w:t xml:space="preserve"> (2019) </w:t>
       </w:r>
-      <w:hyperlink r:id="rId29">
+      <w:hyperlink r:id="rId30">
         <w:r>
           <w:rPr>
             <w:rStyle w:val="Hyperlink"/>
@@ -5016,10 +5165,10 @@
       <w:pPr>
         <w:pStyle w:val="Bibliography"/>
       </w:pPr>
-      <w:bookmarkStart w:id="52" w:name="ref-Lorenz2010"/>
-      <w:bookmarkEnd w:id="51"/>
-      <w:r>
-        <w:t xml:space="preserve">32. </w:t>
+      <w:bookmarkStart w:id="97" w:name="ref-Lorenz2010"/>
+      <w:bookmarkEnd w:id="96"/>
+      <w:r>
+        <w:t xml:space="preserve">33. </w:t>
       </w:r>
       <w:r>
         <w:tab/>
@@ -5035,7 +5184,7 @@
       <w:r>
         <w:t xml:space="preserve"> (2010) </w:t>
       </w:r>
-      <w:hyperlink r:id="rId30">
+      <w:hyperlink r:id="rId31">
         <w:r>
           <w:rPr>
             <w:rStyle w:val="Hyperlink"/>
@@ -5061,11 +5210,10 @@
       <w:pPr>
         <w:pStyle w:val="Bibliography"/>
       </w:pPr>
-      <w:bookmarkStart w:id="53" w:name="ref-De_Frenne2024"/>
-      <w:bookmarkEnd w:id="52"/>
-      <w:r>
-        <w:lastRenderedPageBreak/>
-        <w:t xml:space="preserve">33. </w:t>
+      <w:bookmarkStart w:id="98" w:name="ref-De_Frenne2024"/>
+      <w:bookmarkEnd w:id="97"/>
+      <w:r>
+        <w:t xml:space="preserve">34. </w:t>
       </w:r>
       <w:r>
         <w:tab/>
@@ -5091,7 +5239,7 @@
       <w:r>
         <w:t xml:space="preserve"> DOI: </w:t>
       </w:r>
-      <w:hyperlink r:id="rId31">
+      <w:hyperlink r:id="rId32">
         <w:r>
           <w:rPr>
             <w:rStyle w:val="Hyperlink"/>
@@ -5104,10 +5252,11 @@
       <w:pPr>
         <w:pStyle w:val="Bibliography"/>
       </w:pPr>
-      <w:bookmarkStart w:id="54" w:name="ref-Meyer2023"/>
-      <w:bookmarkEnd w:id="53"/>
-      <w:r>
-        <w:t xml:space="preserve">34. </w:t>
+      <w:bookmarkStart w:id="99" w:name="ref-Meyer2023"/>
+      <w:bookmarkEnd w:id="98"/>
+      <w:r>
+        <w:lastRenderedPageBreak/>
+        <w:t xml:space="preserve">35. </w:t>
       </w:r>
       <w:r>
         <w:tab/>
@@ -5123,7 +5272,7 @@
       <w:r>
         <w:t xml:space="preserve"> (2023) </w:t>
       </w:r>
-      <w:hyperlink r:id="rId32">
+      <w:hyperlink r:id="rId33">
         <w:r>
           <w:rPr>
             <w:rStyle w:val="Hyperlink"/>
@@ -5149,10 +5298,10 @@
       <w:pPr>
         <w:pStyle w:val="Bibliography"/>
       </w:pPr>
-      <w:bookmarkStart w:id="55" w:name="ref-Klinges2025"/>
-      <w:bookmarkEnd w:id="54"/>
-      <w:r>
-        <w:t xml:space="preserve">35. </w:t>
+      <w:bookmarkStart w:id="100" w:name="ref-Klinges2025"/>
+      <w:bookmarkEnd w:id="99"/>
+      <w:r>
+        <w:t xml:space="preserve">36. </w:t>
       </w:r>
       <w:r>
         <w:tab/>
@@ -5183,10 +5332,55 @@
       <w:pPr>
         <w:pStyle w:val="Bibliography"/>
       </w:pPr>
-      <w:bookmarkStart w:id="56" w:name="ref-Drake2018"/>
-      <w:bookmarkEnd w:id="55"/>
-      <w:r>
-        <w:t xml:space="preserve">36. </w:t>
+      <w:bookmarkStart w:id="101" w:name="ref-Hirsch2019"/>
+      <w:bookmarkEnd w:id="100"/>
+      <w:r>
+        <w:t xml:space="preserve">37. </w:t>
+      </w:r>
+      <w:r>
+        <w:tab/>
+        <w:t xml:space="preserve">Hirsch, A.L. </w:t>
+      </w:r>
+      <w:r>
+        <w:rPr>
+          <w:i/>
+          <w:iCs/>
+        </w:rPr>
+        <w:t>et al.</w:t>
+      </w:r>
+      <w:r>
+        <w:t xml:space="preserve"> (2019) </w:t>
+      </w:r>
+      <w:hyperlink r:id="rId34">
+        <w:r>
+          <w:rPr>
+            <w:rStyle w:val="Hyperlink"/>
+          </w:rPr>
+          <w:t>Amplification of australian heatwaves via local land‐atmosphere coupling</w:t>
+        </w:r>
+      </w:hyperlink>
+      <w:r>
+        <w:t xml:space="preserve">. </w:t>
+      </w:r>
+      <w:r>
+        <w:rPr>
+          <w:i/>
+          <w:iCs/>
+        </w:rPr>
+        <w:t>J. Geophys. Res.</w:t>
+      </w:r>
+      <w:r>
+        <w:t xml:space="preserve"> 124, 13625–13647</w:t>
+      </w:r>
+    </w:p>
+    <w:p>
+      <w:pPr>
+        <w:pStyle w:val="Bibliography"/>
+      </w:pPr>
+      <w:bookmarkStart w:id="102" w:name="ref-Drake2018"/>
+      <w:bookmarkEnd w:id="101"/>
+      <w:r>
+        <w:t xml:space="preserve">38. </w:t>
       </w:r>
       <w:r>
         <w:tab/>
@@ -5202,7 +5396,7 @@
       <w:r>
         <w:t xml:space="preserve"> (2018) </w:t>
       </w:r>
-      <w:hyperlink r:id="rId33">
+      <w:hyperlink r:id="rId35">
         <w:r>
           <w:rPr>
             <w:rStyle w:val="Hyperlink"/>
@@ -5228,10 +5422,10 @@
       <w:pPr>
         <w:pStyle w:val="Bibliography"/>
       </w:pPr>
-      <w:bookmarkStart w:id="57" w:name="ref-Holzworth2018"/>
-      <w:bookmarkEnd w:id="56"/>
-      <w:r>
-        <w:t xml:space="preserve">37. </w:t>
+      <w:bookmarkStart w:id="103" w:name="ref-Holzworth2018"/>
+      <w:bookmarkEnd w:id="102"/>
+      <w:r>
+        <w:t xml:space="preserve">39. </w:t>
       </w:r>
       <w:r>
         <w:tab/>
@@ -5247,7 +5441,7 @@
       <w:r>
         <w:t xml:space="preserve"> (2018) </w:t>
       </w:r>
-      <w:hyperlink r:id="rId34">
+      <w:hyperlink r:id="rId36">
         <w:r>
           <w:rPr>
             <w:rStyle w:val="Hyperlink"/>
@@ -5273,10 +5467,10 @@
       <w:pPr>
         <w:pStyle w:val="Bibliography"/>
       </w:pPr>
-      <w:bookmarkStart w:id="58" w:name="ref-Medlyn2011"/>
-      <w:bookmarkEnd w:id="57"/>
-      <w:r>
-        <w:t xml:space="preserve">38. </w:t>
+      <w:bookmarkStart w:id="104" w:name="ref-Medlyn2011"/>
+      <w:bookmarkEnd w:id="103"/>
+      <w:r>
+        <w:t xml:space="preserve">40. </w:t>
       </w:r>
       <w:r>
         <w:tab/>
@@ -5292,7 +5486,7 @@
       <w:r>
         <w:t xml:space="preserve"> (2011) </w:t>
       </w:r>
-      <w:hyperlink r:id="rId35">
+      <w:hyperlink r:id="rId37">
         <w:r>
           <w:rPr>
             <w:rStyle w:val="Hyperlink"/>
@@ -5318,10 +5512,10 @@
       <w:pPr>
         <w:pStyle w:val="Bibliography"/>
       </w:pPr>
-      <w:bookmarkStart w:id="59" w:name="ref-Porter1973"/>
-      <w:bookmarkEnd w:id="58"/>
-      <w:r>
-        <w:t xml:space="preserve">39. </w:t>
+      <w:bookmarkStart w:id="105" w:name="ref-Porter1973"/>
+      <w:bookmarkEnd w:id="104"/>
+      <w:r>
+        <w:t xml:space="preserve">41. </w:t>
       </w:r>
       <w:r>
         <w:tab/>
@@ -5337,7 +5531,7 @@
       <w:r>
         <w:t xml:space="preserve"> (1973) </w:t>
       </w:r>
-      <w:hyperlink r:id="rId36">
+      <w:hyperlink r:id="rId38">
         <w:r>
           <w:rPr>
             <w:rStyle w:val="Hyperlink"/>
@@ -5363,16 +5557,16 @@
       <w:pPr>
         <w:pStyle w:val="Bibliography"/>
       </w:pPr>
-      <w:bookmarkStart w:id="60" w:name="ref-Porter1969"/>
-      <w:bookmarkEnd w:id="59"/>
-      <w:r>
-        <w:t xml:space="preserve">40. </w:t>
+      <w:bookmarkStart w:id="106" w:name="ref-Porter1969"/>
+      <w:bookmarkEnd w:id="105"/>
+      <w:r>
+        <w:t xml:space="preserve">42. </w:t>
       </w:r>
       <w:r>
         <w:tab/>
         <w:t xml:space="preserve">Porter, W.P. and Gates, D.M. (1969) </w:t>
       </w:r>
-      <w:hyperlink r:id="rId37">
+      <w:hyperlink r:id="rId39">
         <w:r>
           <w:rPr>
             <w:rStyle w:val="Hyperlink"/>
@@ -5398,10 +5592,10 @@
       <w:pPr>
         <w:pStyle w:val="Bibliography"/>
       </w:pPr>
-      <w:bookmarkStart w:id="61" w:name="ref-Riddell2017"/>
-      <w:bookmarkEnd w:id="60"/>
-      <w:r>
-        <w:t xml:space="preserve">41. </w:t>
+      <w:bookmarkStart w:id="107" w:name="ref-Riddell2017"/>
+      <w:bookmarkEnd w:id="106"/>
+      <w:r>
+        <w:t xml:space="preserve">43. </w:t>
       </w:r>
       <w:r>
         <w:tab/>
@@ -5417,7 +5611,7 @@
       <w:r>
         <w:t xml:space="preserve"> (2017) </w:t>
       </w:r>
-      <w:hyperlink r:id="rId38">
+      <w:hyperlink r:id="rId40">
         <w:r>
           <w:rPr>
             <w:rStyle w:val="Hyperlink"/>
@@ -5443,16 +5637,16 @@
       <w:pPr>
         <w:pStyle w:val="Bibliography"/>
       </w:pPr>
-      <w:bookmarkStart w:id="62" w:name="ref-Duursma2015"/>
-      <w:bookmarkEnd w:id="61"/>
-      <w:r>
-        <w:t xml:space="preserve">42. </w:t>
+      <w:bookmarkStart w:id="108" w:name="ref-Duursma2015"/>
+      <w:bookmarkEnd w:id="107"/>
+      <w:r>
+        <w:t xml:space="preserve">44. </w:t>
       </w:r>
       <w:r>
         <w:tab/>
         <w:t xml:space="preserve">Duursma, R.A. (2015) </w:t>
       </w:r>
-      <w:hyperlink r:id="rId39">
+      <w:hyperlink r:id="rId41">
         <w:r>
           <w:rPr>
             <w:rStyle w:val="Hyperlink"/>
@@ -5478,10 +5672,10 @@
       <w:pPr>
         <w:pStyle w:val="Bibliography"/>
       </w:pPr>
-      <w:bookmarkStart w:id="63" w:name="ref-Wild2025"/>
-      <w:bookmarkEnd w:id="62"/>
-      <w:r>
-        <w:t xml:space="preserve">43. </w:t>
+      <w:bookmarkStart w:id="109" w:name="ref-Wild2025"/>
+      <w:bookmarkEnd w:id="108"/>
+      <w:r>
+        <w:t xml:space="preserve">45. </w:t>
       </w:r>
       <w:r>
         <w:tab/>
@@ -5497,7 +5691,7 @@
       <w:r>
         <w:t xml:space="preserve"> (2025) </w:t>
       </w:r>
-      <w:hyperlink r:id="rId40">
+      <w:hyperlink r:id="rId42">
         <w:r>
           <w:rPr>
             <w:rStyle w:val="Hyperlink"/>
@@ -5523,10 +5717,10 @@
       <w:pPr>
         <w:pStyle w:val="Bibliography"/>
       </w:pPr>
-      <w:bookmarkStart w:id="64" w:name="ref-Briscoe2022"/>
-      <w:bookmarkEnd w:id="63"/>
-      <w:r>
-        <w:t xml:space="preserve">44. </w:t>
+      <w:bookmarkStart w:id="110" w:name="ref-Briscoe2022"/>
+      <w:bookmarkEnd w:id="109"/>
+      <w:r>
+        <w:t xml:space="preserve">46. </w:t>
       </w:r>
       <w:r>
         <w:tab/>
@@ -5542,7 +5736,7 @@
       <w:r>
         <w:t xml:space="preserve"> (2022) </w:t>
       </w:r>
-      <w:hyperlink r:id="rId41">
+      <w:hyperlink r:id="rId43">
         <w:r>
           <w:rPr>
             <w:rStyle w:val="Hyperlink"/>
@@ -5568,10 +5762,10 @@
       <w:pPr>
         <w:pStyle w:val="Bibliography"/>
       </w:pPr>
-      <w:bookmarkStart w:id="65" w:name="ref-Duursma2019"/>
-      <w:bookmarkEnd w:id="64"/>
-      <w:r>
-        <w:t xml:space="preserve">45. </w:t>
+      <w:bookmarkStart w:id="111" w:name="ref-Duursma2019"/>
+      <w:bookmarkEnd w:id="110"/>
+      <w:r>
+        <w:t xml:space="preserve">47. </w:t>
       </w:r>
       <w:r>
         <w:tab/>
@@ -5587,7 +5781,7 @@
       <w:r>
         <w:t xml:space="preserve"> (2019) </w:t>
       </w:r>
-      <w:hyperlink r:id="rId42">
+      <w:hyperlink r:id="rId44">
         <w:r>
           <w:rPr>
             <w:rStyle w:val="Hyperlink"/>
@@ -5613,16 +5807,16 @@
       <w:pPr>
         <w:pStyle w:val="Bibliography"/>
       </w:pPr>
-      <w:bookmarkStart w:id="66" w:name="ref-Loughran2020"/>
-      <w:bookmarkEnd w:id="65"/>
-      <w:r>
-        <w:t xml:space="preserve">46. </w:t>
+      <w:bookmarkStart w:id="112" w:name="ref-Loughran2020"/>
+      <w:bookmarkEnd w:id="111"/>
+      <w:r>
+        <w:t xml:space="preserve">48. </w:t>
       </w:r>
       <w:r>
         <w:tab/>
         <w:t xml:space="preserve">Loughran, C.L. and Wolf, B.O. (2020) </w:t>
       </w:r>
-      <w:hyperlink r:id="rId43">
+      <w:hyperlink r:id="rId45">
         <w:r>
           <w:rPr>
             <w:rStyle w:val="Hyperlink"/>
@@ -5648,10 +5842,10 @@
       <w:pPr>
         <w:pStyle w:val="Bibliography"/>
       </w:pPr>
-      <w:bookmarkStart w:id="67" w:name="ref-Sharpe2022"/>
-      <w:bookmarkEnd w:id="66"/>
-      <w:r>
-        <w:t xml:space="preserve">47. </w:t>
+      <w:bookmarkStart w:id="113" w:name="ref-Sharpe2022"/>
+      <w:bookmarkEnd w:id="112"/>
+      <w:r>
+        <w:t xml:space="preserve">49. </w:t>
       </w:r>
       <w:r>
         <w:tab/>
@@ -5667,7 +5861,7 @@
       <w:r>
         <w:t xml:space="preserve"> (2022) </w:t>
       </w:r>
-      <w:hyperlink r:id="rId44">
+      <w:hyperlink r:id="rId46">
         <w:r>
           <w:rPr>
             <w:rStyle w:val="Hyperlink"/>
@@ -5693,10 +5887,10 @@
       <w:pPr>
         <w:pStyle w:val="Bibliography"/>
       </w:pPr>
-      <w:bookmarkStart w:id="68" w:name="ref-Posch2024"/>
-      <w:bookmarkEnd w:id="67"/>
-      <w:r>
-        <w:t xml:space="preserve">48. </w:t>
+      <w:bookmarkStart w:id="114" w:name="ref-Posch2024"/>
+      <w:bookmarkEnd w:id="113"/>
+      <w:r>
+        <w:t xml:space="preserve">50. </w:t>
       </w:r>
       <w:r>
         <w:tab/>
@@ -5712,7 +5906,7 @@
       <w:r>
         <w:t xml:space="preserve"> (2024) </w:t>
       </w:r>
-      <w:hyperlink r:id="rId45">
+      <w:hyperlink r:id="rId47">
         <w:r>
           <w:rPr>
             <w:rStyle w:val="Hyperlink"/>
@@ -5738,10 +5932,10 @@
       <w:pPr>
         <w:pStyle w:val="Bibliography"/>
       </w:pPr>
-      <w:bookmarkStart w:id="69" w:name="ref-Orsted2022"/>
-      <w:bookmarkEnd w:id="68"/>
-      <w:r>
-        <w:t xml:space="preserve">49. </w:t>
+      <w:bookmarkStart w:id="115" w:name="ref-Orsted2022"/>
+      <w:bookmarkEnd w:id="114"/>
+      <w:r>
+        <w:t xml:space="preserve">51. </w:t>
       </w:r>
       <w:r>
         <w:tab/>
@@ -5772,10 +5966,10 @@
       <w:pPr>
         <w:pStyle w:val="Bibliography"/>
       </w:pPr>
-      <w:bookmarkStart w:id="70" w:name="ref-Jagadish2021"/>
-      <w:bookmarkEnd w:id="69"/>
-      <w:r>
-        <w:t xml:space="preserve">50. </w:t>
+      <w:bookmarkStart w:id="116" w:name="ref-Jagadish2021"/>
+      <w:bookmarkEnd w:id="115"/>
+      <w:r>
+        <w:t xml:space="preserve">52. </w:t>
       </w:r>
       <w:r>
         <w:tab/>
@@ -5791,7 +5985,7 @@
       <w:r>
         <w:t xml:space="preserve"> (2021) </w:t>
       </w:r>
-      <w:hyperlink r:id="rId46">
+      <w:hyperlink r:id="rId48">
         <w:r>
           <w:rPr>
             <w:rStyle w:val="Hyperlink"/>
@@ -5817,10 +6011,10 @@
       <w:pPr>
         <w:pStyle w:val="Bibliography"/>
       </w:pPr>
-      <w:bookmarkStart w:id="71" w:name="ref-Faber2024"/>
-      <w:bookmarkEnd w:id="70"/>
-      <w:r>
-        <w:t xml:space="preserve">51. </w:t>
+      <w:bookmarkStart w:id="117" w:name="ref-Faber2024"/>
+      <w:bookmarkEnd w:id="116"/>
+      <w:r>
+        <w:t xml:space="preserve">53. </w:t>
       </w:r>
       <w:r>
         <w:tab/>
@@ -5836,7 +6030,7 @@
       <w:r>
         <w:t xml:space="preserve"> (2024) </w:t>
       </w:r>
-      <w:hyperlink r:id="rId47">
+      <w:hyperlink r:id="rId49">
         <w:r>
           <w:rPr>
             <w:rStyle w:val="Hyperlink"/>
@@ -5862,11 +6056,11 @@
       <w:pPr>
         <w:pStyle w:val="Bibliography"/>
       </w:pPr>
-      <w:bookmarkStart w:id="72" w:name="ref-Martinez-De_Leon2024"/>
-      <w:bookmarkEnd w:id="71"/>
+      <w:bookmarkStart w:id="118" w:name="ref-Martinez-De_Leon2024"/>
+      <w:bookmarkEnd w:id="117"/>
       <w:r>
         <w:lastRenderedPageBreak/>
-        <w:t xml:space="preserve">52. </w:t>
+        <w:t xml:space="preserve">54. </w:t>
       </w:r>
       <w:r>
         <w:tab/>
@@ -5887,10 +6081,10 @@
       <w:pPr>
         <w:pStyle w:val="Bibliography"/>
       </w:pPr>
-      <w:bookmarkStart w:id="73" w:name="ref-Marchin2022"/>
-      <w:bookmarkEnd w:id="72"/>
-      <w:r>
-        <w:t xml:space="preserve">53. </w:t>
+      <w:bookmarkStart w:id="119" w:name="ref-Marchin2022"/>
+      <w:bookmarkEnd w:id="118"/>
+      <w:r>
+        <w:t xml:space="preserve">55. </w:t>
       </w:r>
       <w:r>
         <w:tab/>
@@ -5906,7 +6100,7 @@
       <w:r>
         <w:t xml:space="preserve"> (2022) </w:t>
       </w:r>
-      <w:hyperlink r:id="rId48">
+      <w:hyperlink r:id="rId50">
         <w:r>
           <w:rPr>
             <w:rStyle w:val="Hyperlink"/>
@@ -5932,10 +6126,10 @@
       <w:pPr>
         <w:pStyle w:val="Bibliography"/>
       </w:pPr>
-      <w:bookmarkStart w:id="74" w:name="ref-Youngblood2025"/>
-      <w:bookmarkEnd w:id="73"/>
-      <w:r>
-        <w:t xml:space="preserve">54. </w:t>
+      <w:bookmarkStart w:id="120" w:name="ref-Youngblood2025"/>
+      <w:bookmarkEnd w:id="119"/>
+      <w:r>
+        <w:t xml:space="preserve">56. </w:t>
       </w:r>
       <w:r>
         <w:tab/>
@@ -5961,7 +6155,7 @@
       <w:r>
         <w:t xml:space="preserve"> DOI: </w:t>
       </w:r>
-      <w:hyperlink r:id="rId49">
+      <w:hyperlink r:id="rId51">
         <w:r>
           <w:rPr>
             <w:rStyle w:val="Hyperlink"/>
@@ -5974,10 +6168,10 @@
       <w:pPr>
         <w:pStyle w:val="Bibliography"/>
       </w:pPr>
-      <w:bookmarkStart w:id="75" w:name="ref-Mengutay2013"/>
-      <w:bookmarkEnd w:id="74"/>
-      <w:r>
-        <w:t xml:space="preserve">55. </w:t>
+      <w:bookmarkStart w:id="121" w:name="ref-Mengutay2013"/>
+      <w:bookmarkEnd w:id="120"/>
+      <w:r>
+        <w:t xml:space="preserve">57. </w:t>
       </w:r>
       <w:r>
         <w:tab/>
@@ -5993,7 +6187,7 @@
       <w:r>
         <w:t xml:space="preserve"> (2013) </w:t>
       </w:r>
-      <w:hyperlink r:id="rId50">
+      <w:hyperlink r:id="rId52">
         <w:r>
           <w:rPr>
             <w:rStyle w:val="Hyperlink"/>
@@ -6019,10 +6213,10 @@
       <w:pPr>
         <w:pStyle w:val="Bibliography"/>
       </w:pPr>
-      <w:bookmarkStart w:id="76" w:name="ref-Andersen2010"/>
-      <w:bookmarkEnd w:id="75"/>
-      <w:r>
-        <w:t xml:space="preserve">56. </w:t>
+      <w:bookmarkStart w:id="122" w:name="ref-Andersen2010"/>
+      <w:bookmarkEnd w:id="121"/>
+      <w:r>
+        <w:t xml:space="preserve">58. </w:t>
       </w:r>
       <w:r>
         <w:tab/>
@@ -6038,7 +6232,7 @@
       <w:r>
         <w:t xml:space="preserve"> (2010) </w:t>
       </w:r>
-      <w:hyperlink r:id="rId51">
+      <w:hyperlink r:id="rId53">
         <w:r>
           <w:rPr>
             <w:rStyle w:val="Hyperlink"/>
@@ -6064,10 +6258,10 @@
       <w:pPr>
         <w:pStyle w:val="Bibliography"/>
       </w:pPr>
-      <w:bookmarkStart w:id="77" w:name="ref-Chouhan2023"/>
-      <w:bookmarkEnd w:id="76"/>
-      <w:r>
-        <w:t xml:space="preserve">57. </w:t>
+      <w:bookmarkStart w:id="123" w:name="ref-Chouhan2023"/>
+      <w:bookmarkEnd w:id="122"/>
+      <w:r>
+        <w:t xml:space="preserve">59. </w:t>
       </w:r>
       <w:r>
         <w:tab/>
@@ -6083,7 +6277,7 @@
       <w:r>
         <w:t xml:space="preserve"> (2023) </w:t>
       </w:r>
-      <w:hyperlink r:id="rId52">
+      <w:hyperlink r:id="rId54">
         <w:r>
           <w:rPr>
             <w:rStyle w:val="Hyperlink"/>
@@ -6109,10 +6303,10 @@
       <w:pPr>
         <w:pStyle w:val="Bibliography"/>
       </w:pPr>
-      <w:bookmarkStart w:id="78" w:name="ref-Marquez2007"/>
-      <w:bookmarkEnd w:id="77"/>
-      <w:r>
-        <w:t xml:space="preserve">58. </w:t>
+      <w:bookmarkStart w:id="124" w:name="ref-Marquez2007"/>
+      <w:bookmarkEnd w:id="123"/>
+      <w:r>
+        <w:t xml:space="preserve">60. </w:t>
       </w:r>
       <w:r>
         <w:tab/>
@@ -6143,10 +6337,10 @@
       <w:pPr>
         <w:pStyle w:val="Bibliography"/>
       </w:pPr>
-      <w:bookmarkStart w:id="79" w:name="ref-Hoang2019"/>
-      <w:bookmarkEnd w:id="78"/>
-      <w:r>
-        <w:t xml:space="preserve">59. </w:t>
+      <w:bookmarkStart w:id="125" w:name="ref-Hoang2019"/>
+      <w:bookmarkEnd w:id="124"/>
+      <w:r>
+        <w:t xml:space="preserve">61. </w:t>
       </w:r>
       <w:r>
         <w:tab/>
@@ -6162,7 +6356,7 @@
       <w:r>
         <w:t xml:space="preserve"> (2019) </w:t>
       </w:r>
-      <w:hyperlink r:id="rId53">
+      <w:hyperlink r:id="rId55">
         <w:r>
           <w:rPr>
             <w:rStyle w:val="Hyperlink"/>
@@ -6188,10 +6382,10 @@
       <w:pPr>
         <w:pStyle w:val="Bibliography"/>
       </w:pPr>
-      <w:bookmarkStart w:id="80" w:name="ref-Jeffrey2001"/>
-      <w:bookmarkEnd w:id="79"/>
-      <w:r>
-        <w:t xml:space="preserve">60. </w:t>
+      <w:bookmarkStart w:id="126" w:name="ref-Jeffrey2001"/>
+      <w:bookmarkEnd w:id="125"/>
+      <w:r>
+        <w:t xml:space="preserve">62. </w:t>
       </w:r>
       <w:r>
         <w:tab/>
@@ -6207,7 +6401,7 @@
       <w:r>
         <w:t xml:space="preserve"> (2001) </w:t>
       </w:r>
-      <w:hyperlink r:id="rId54">
+      <w:hyperlink r:id="rId56">
         <w:r>
           <w:rPr>
             <w:rStyle w:val="Hyperlink"/>
@@ -6233,16 +6427,16 @@
       <w:pPr>
         <w:pStyle w:val="Bibliography"/>
       </w:pPr>
-      <w:bookmarkStart w:id="81" w:name="ref-Kearney2020a"/>
-      <w:bookmarkEnd w:id="80"/>
-      <w:r>
-        <w:t xml:space="preserve">61. </w:t>
+      <w:bookmarkStart w:id="127" w:name="ref-Kearney2020a"/>
+      <w:bookmarkEnd w:id="126"/>
+      <w:r>
+        <w:t xml:space="preserve">63. </w:t>
       </w:r>
       <w:r>
         <w:tab/>
         <w:t xml:space="preserve">Kearney, M.R. and Porter, W.P. (2020) </w:t>
       </w:r>
-      <w:hyperlink r:id="rId55">
+      <w:hyperlink r:id="rId57">
         <w:r>
           <w:rPr>
             <w:rStyle w:val="Hyperlink"/>
@@ -6268,10 +6462,10 @@
       <w:pPr>
         <w:pStyle w:val="Bibliography"/>
       </w:pPr>
-      <w:bookmarkStart w:id="82" w:name="ref-Nisbet2000"/>
-      <w:bookmarkEnd w:id="81"/>
-      <w:r>
-        <w:t xml:space="preserve">62. </w:t>
+      <w:bookmarkStart w:id="128" w:name="ref-Nisbet2000"/>
+      <w:bookmarkEnd w:id="127"/>
+      <w:r>
+        <w:t xml:space="preserve">64. </w:t>
       </w:r>
       <w:r>
         <w:tab/>
@@ -6287,7 +6481,7 @@
       <w:r>
         <w:t xml:space="preserve"> (2000) </w:t>
       </w:r>
-      <w:hyperlink r:id="rId56">
+      <w:hyperlink r:id="rId58">
         <w:r>
           <w:rPr>
             <w:rStyle w:val="Hyperlink"/>
@@ -6313,16 +6507,16 @@
       <w:pPr>
         <w:pStyle w:val="Bibliography"/>
       </w:pPr>
-      <w:bookmarkStart w:id="83" w:name="ref-Jager2020"/>
-      <w:bookmarkEnd w:id="82"/>
-      <w:r>
-        <w:t xml:space="preserve">63. </w:t>
+      <w:bookmarkStart w:id="129" w:name="ref-Jager2020"/>
+      <w:bookmarkEnd w:id="128"/>
+      <w:r>
+        <w:t xml:space="preserve">65. </w:t>
       </w:r>
       <w:r>
         <w:tab/>
         <w:t xml:space="preserve">Jager, T. (2020) </w:t>
       </w:r>
-      <w:hyperlink r:id="rId57">
+      <w:hyperlink r:id="rId59">
         <w:r>
           <w:rPr>
             <w:rStyle w:val="Hyperlink"/>
@@ -6348,10 +6542,10 @@
       <w:pPr>
         <w:pStyle w:val="Bibliography"/>
       </w:pPr>
-      <w:bookmarkStart w:id="84" w:name="ref-Kearney2013"/>
-      <w:bookmarkEnd w:id="83"/>
-      <w:r>
-        <w:t xml:space="preserve">64. </w:t>
+      <w:bookmarkStart w:id="130" w:name="ref-Kearney2013"/>
+      <w:bookmarkEnd w:id="129"/>
+      <w:r>
+        <w:t xml:space="preserve">66. </w:t>
       </w:r>
       <w:r>
         <w:tab/>
@@ -6382,10 +6576,10 @@
       <w:pPr>
         <w:pStyle w:val="Bibliography"/>
       </w:pPr>
-      <w:bookmarkStart w:id="85" w:name="ref-Kearney2010"/>
-      <w:bookmarkEnd w:id="84"/>
-      <w:r>
-        <w:t xml:space="preserve">65. </w:t>
+      <w:bookmarkStart w:id="131" w:name="ref-Kearney2010"/>
+      <w:bookmarkEnd w:id="130"/>
+      <w:r>
+        <w:t xml:space="preserve">67. </w:t>
       </w:r>
       <w:r>
         <w:tab/>
@@ -6401,7 +6595,7 @@
       <w:r>
         <w:t xml:space="preserve"> (2010) </w:t>
       </w:r>
-      <w:hyperlink r:id="rId58">
+      <w:hyperlink r:id="rId60">
         <w:r>
           <w:rPr>
             <w:rStyle w:val="Hyperlink"/>
@@ -6427,10 +6621,10 @@
       <w:pPr>
         <w:pStyle w:val="Bibliography"/>
       </w:pPr>
-      <w:bookmarkStart w:id="86" w:name="ref-Marques2018"/>
-      <w:bookmarkEnd w:id="85"/>
-      <w:r>
-        <w:t xml:space="preserve">66. </w:t>
+      <w:bookmarkStart w:id="132" w:name="ref-Marques2018"/>
+      <w:bookmarkEnd w:id="131"/>
+      <w:r>
+        <w:t xml:space="preserve">68. </w:t>
       </w:r>
       <w:r>
         <w:tab/>
@@ -6446,7 +6640,7 @@
       <w:r>
         <w:t xml:space="preserve"> (2018) </w:t>
       </w:r>
-      <w:hyperlink r:id="rId59">
+      <w:hyperlink r:id="rId61">
         <w:r>
           <w:rPr>
             <w:rStyle w:val="Hyperlink"/>
@@ -6472,10 +6666,10 @@
       <w:pPr>
         <w:pStyle w:val="Bibliography"/>
       </w:pPr>
-      <w:bookmarkStart w:id="87" w:name="ref-Kooijman2021"/>
-      <w:bookmarkEnd w:id="86"/>
-      <w:r>
-        <w:t xml:space="preserve">67. </w:t>
+      <w:bookmarkStart w:id="133" w:name="ref-Kooijman2021"/>
+      <w:bookmarkEnd w:id="132"/>
+      <w:r>
+        <w:t xml:space="preserve">69. </w:t>
       </w:r>
       <w:r>
         <w:tab/>
@@ -6491,7 +6685,7 @@
       <w:r>
         <w:t xml:space="preserve"> (2021) </w:t>
       </w:r>
-      <w:hyperlink r:id="rId60">
+      <w:hyperlink r:id="rId62">
         <w:r>
           <w:rPr>
             <w:rStyle w:val="Hyperlink"/>
@@ -6517,10 +6711,10 @@
       <w:pPr>
         <w:pStyle w:val="Bibliography"/>
       </w:pPr>
-      <w:bookmarkStart w:id="88" w:name="ref-Bruggeman2009"/>
-      <w:bookmarkEnd w:id="87"/>
-      <w:r>
-        <w:t xml:space="preserve">68. </w:t>
+      <w:bookmarkStart w:id="134" w:name="ref-Bruggeman2009"/>
+      <w:bookmarkEnd w:id="133"/>
+      <w:r>
+        <w:t xml:space="preserve">70. </w:t>
       </w:r>
       <w:r>
         <w:tab/>
@@ -6536,7 +6730,7 @@
       <w:r>
         <w:t xml:space="preserve"> (2009) </w:t>
       </w:r>
-      <w:hyperlink r:id="rId61">
+      <w:hyperlink r:id="rId63">
         <w:r>
           <w:rPr>
             <w:rStyle w:val="Hyperlink"/>
@@ -6562,10 +6756,10 @@
       <w:pPr>
         <w:pStyle w:val="Bibliography"/>
       </w:pPr>
-      <w:bookmarkStart w:id="89" w:name="ref-Bonan2019"/>
-      <w:bookmarkEnd w:id="88"/>
-      <w:r>
-        <w:t xml:space="preserve">69. </w:t>
+      <w:bookmarkStart w:id="135" w:name="ref-Bonan2019"/>
+      <w:bookmarkEnd w:id="134"/>
+      <w:r>
+        <w:t xml:space="preserve">71. </w:t>
       </w:r>
       <w:r>
         <w:tab/>
@@ -6586,10 +6780,10 @@
       <w:pPr>
         <w:pStyle w:val="Bibliography"/>
       </w:pPr>
-      <w:bookmarkStart w:id="90" w:name="ref-Kumarathunge2019"/>
-      <w:bookmarkEnd w:id="89"/>
-      <w:r>
-        <w:t xml:space="preserve">70. </w:t>
+      <w:bookmarkStart w:id="136" w:name="ref-Kumarathunge2019"/>
+      <w:bookmarkEnd w:id="135"/>
+      <w:r>
+        <w:t xml:space="preserve">72. </w:t>
       </w:r>
       <w:r>
         <w:tab/>
@@ -6605,7 +6799,7 @@
       <w:r>
         <w:t xml:space="preserve"> (2019) </w:t>
       </w:r>
-      <w:hyperlink r:id="rId62">
+      <w:hyperlink r:id="rId64">
         <w:r>
           <w:rPr>
             <w:rStyle w:val="Hyperlink"/>
@@ -6631,11 +6825,11 @@
       <w:pPr>
         <w:pStyle w:val="Bibliography"/>
       </w:pPr>
-      <w:bookmarkStart w:id="91" w:name="ref-De_Kauwe2020"/>
-      <w:bookmarkEnd w:id="90"/>
+      <w:bookmarkStart w:id="137" w:name="ref-De_Kauwe2020"/>
+      <w:bookmarkEnd w:id="136"/>
       <w:r>
         <w:lastRenderedPageBreak/>
-        <w:t xml:space="preserve">71. </w:t>
+        <w:t xml:space="preserve">73. </w:t>
       </w:r>
       <w:r>
         <w:tab/>
@@ -6651,7 +6845,7 @@
       <w:r>
         <w:t xml:space="preserve"> (2020) </w:t>
       </w:r>
-      <w:hyperlink r:id="rId63">
+      <w:hyperlink r:id="rId65">
         <w:r>
           <w:rPr>
             <w:rStyle w:val="Hyperlink"/>
@@ -6677,10 +6871,10 @@
       <w:pPr>
         <w:pStyle w:val="Bibliography"/>
       </w:pPr>
-      <w:bookmarkStart w:id="92" w:name="ref-Bimler2023"/>
-      <w:bookmarkEnd w:id="91"/>
-      <w:r>
-        <w:t xml:space="preserve">72. </w:t>
+      <w:bookmarkStart w:id="138" w:name="ref-Bimler2023"/>
+      <w:bookmarkEnd w:id="137"/>
+      <w:r>
+        <w:t xml:space="preserve">74. </w:t>
       </w:r>
       <w:r>
         <w:tab/>
@@ -6696,7 +6890,7 @@
       <w:r>
         <w:t xml:space="preserve"> (2023) </w:t>
       </w:r>
-      <w:hyperlink r:id="rId64">
+      <w:hyperlink r:id="rId66">
         <w:r>
           <w:rPr>
             <w:rStyle w:val="Hyperlink"/>
@@ -6722,10 +6916,10 @@
       <w:pPr>
         <w:pStyle w:val="Bibliography"/>
       </w:pPr>
-      <w:bookmarkStart w:id="93" w:name="ref-Kraft2015"/>
-      <w:bookmarkEnd w:id="92"/>
-      <w:r>
-        <w:t xml:space="preserve">73. </w:t>
+      <w:bookmarkStart w:id="139" w:name="ref-Kraft2015"/>
+      <w:bookmarkEnd w:id="138"/>
+      <w:r>
+        <w:t xml:space="preserve">75. </w:t>
       </w:r>
       <w:r>
         <w:tab/>
@@ -6741,7 +6935,7 @@
       <w:r>
         <w:t xml:space="preserve"> (2015) </w:t>
       </w:r>
-      <w:hyperlink r:id="rId65">
+      <w:hyperlink r:id="rId67">
         <w:r>
           <w:rPr>
             <w:rStyle w:val="Hyperlink"/>
@@ -6767,10 +6961,10 @@
       <w:pPr>
         <w:pStyle w:val="Bibliography"/>
       </w:pPr>
-      <w:bookmarkStart w:id="94" w:name="ref-Buche2024"/>
-      <w:bookmarkEnd w:id="93"/>
-      <w:r>
-        <w:t xml:space="preserve">74. </w:t>
+      <w:bookmarkStart w:id="140" w:name="ref-Buche2024"/>
+      <w:bookmarkEnd w:id="139"/>
+      <w:r>
+        <w:t xml:space="preserve">76. </w:t>
       </w:r>
       <w:r>
         <w:tab/>
@@ -6786,7 +6980,7 @@
       <w:r>
         <w:t xml:space="preserve"> (2024) </w:t>
       </w:r>
-      <w:hyperlink r:id="rId66">
+      <w:hyperlink r:id="rId68">
         <w:r>
           <w:rPr>
             <w:rStyle w:val="Hyperlink"/>
@@ -6812,10 +7006,10 @@
       <w:pPr>
         <w:pStyle w:val="Bibliography"/>
       </w:pPr>
-      <w:bookmarkStart w:id="95" w:name="ref-Buche2025"/>
-      <w:bookmarkEnd w:id="94"/>
-      <w:r>
-        <w:t xml:space="preserve">75. </w:t>
+      <w:bookmarkStart w:id="141" w:name="ref-Buche2025"/>
+      <w:bookmarkEnd w:id="140"/>
+      <w:r>
+        <w:t xml:space="preserve">77. </w:t>
       </w:r>
       <w:r>
         <w:tab/>
@@ -6831,7 +7025,7 @@
       <w:r>
         <w:t xml:space="preserve"> (2025) </w:t>
       </w:r>
-      <w:hyperlink r:id="rId67">
+      <w:hyperlink r:id="rId69">
         <w:r>
           <w:rPr>
             <w:rStyle w:val="Hyperlink"/>
@@ -6857,16 +7051,16 @@
       <w:pPr>
         <w:pStyle w:val="Bibliography"/>
       </w:pPr>
-      <w:bookmarkStart w:id="96" w:name="ref-Ricker1954a"/>
-      <w:bookmarkEnd w:id="95"/>
-      <w:r>
-        <w:t xml:space="preserve">76. </w:t>
+      <w:bookmarkStart w:id="142" w:name="ref-Ricker1954a"/>
+      <w:bookmarkEnd w:id="141"/>
+      <w:r>
+        <w:t xml:space="preserve">78. </w:t>
       </w:r>
       <w:r>
         <w:tab/>
         <w:t xml:space="preserve">Ricker, W.E. (1954) </w:t>
       </w:r>
-      <w:hyperlink r:id="rId68">
+      <w:hyperlink r:id="rId70">
         <w:r>
           <w:rPr>
             <w:rStyle w:val="Hyperlink"/>
@@ -6892,16 +7086,16 @@
       <w:pPr>
         <w:pStyle w:val="Bibliography"/>
       </w:pPr>
-      <w:bookmarkStart w:id="97" w:name="ref-Beverton2012"/>
-      <w:bookmarkEnd w:id="96"/>
-      <w:r>
-        <w:t xml:space="preserve">77. </w:t>
+      <w:bookmarkStart w:id="143" w:name="ref-Beverton2012"/>
+      <w:bookmarkEnd w:id="142"/>
+      <w:r>
+        <w:t xml:space="preserve">79. </w:t>
       </w:r>
       <w:r>
         <w:tab/>
         <w:t xml:space="preserve">Beverton, R.J.H. and Holt, S. (2012) </w:t>
       </w:r>
-      <w:hyperlink r:id="rId69">
+      <w:hyperlink r:id="rId71">
         <w:r>
           <w:rPr>
             <w:rStyle w:val="Hyperlink"/>
@@ -6919,16 +7113,16 @@
       <w:pPr>
         <w:pStyle w:val="Bibliography"/>
       </w:pPr>
-      <w:bookmarkStart w:id="98" w:name="ref-Levine2009"/>
-      <w:bookmarkEnd w:id="97"/>
-      <w:r>
-        <w:t xml:space="preserve">78. </w:t>
+      <w:bookmarkStart w:id="144" w:name="ref-Levine2009"/>
+      <w:bookmarkEnd w:id="143"/>
+      <w:r>
+        <w:t xml:space="preserve">80. </w:t>
       </w:r>
       <w:r>
         <w:tab/>
         <w:t xml:space="preserve">Levine, J.M. and HilleRisLambers, J. (2009) </w:t>
       </w:r>
-      <w:hyperlink r:id="rId70">
+      <w:hyperlink r:id="rId72">
         <w:r>
           <w:rPr>
             <w:rStyle w:val="Hyperlink"/>
@@ -6954,10 +7148,10 @@
       <w:pPr>
         <w:pStyle w:val="Bibliography"/>
       </w:pPr>
-      <w:bookmarkStart w:id="99" w:name="ref-Wainwright2019"/>
-      <w:bookmarkEnd w:id="98"/>
-      <w:r>
-        <w:t xml:space="preserve">79. </w:t>
+      <w:bookmarkStart w:id="145" w:name="ref-Wainwright2019"/>
+      <w:bookmarkEnd w:id="144"/>
+      <w:r>
+        <w:t xml:space="preserve">81. </w:t>
       </w:r>
       <w:r>
         <w:tab/>
@@ -6973,7 +7167,7 @@
       <w:r>
         <w:t xml:space="preserve"> (2019) </w:t>
       </w:r>
-      <w:hyperlink r:id="rId71">
+      <w:hyperlink r:id="rId73">
         <w:r>
           <w:rPr>
             <w:rStyle w:val="Hyperlink"/>
@@ -6999,16 +7193,16 @@
       <w:pPr>
         <w:pStyle w:val="Bibliography"/>
       </w:pPr>
-      <w:bookmarkStart w:id="100" w:name="ref-Mayfield2017"/>
-      <w:bookmarkEnd w:id="99"/>
-      <w:r>
-        <w:t xml:space="preserve">80. </w:t>
+      <w:bookmarkStart w:id="146" w:name="ref-Mayfield2017"/>
+      <w:bookmarkEnd w:id="145"/>
+      <w:r>
+        <w:t xml:space="preserve">82. </w:t>
       </w:r>
       <w:r>
         <w:tab/>
         <w:t xml:space="preserve">Mayfield, M. and Stouffer, D.B. (2017) </w:t>
       </w:r>
-      <w:hyperlink r:id="rId72">
+      <w:hyperlink r:id="rId74">
         <w:r>
           <w:rPr>
             <w:rStyle w:val="Hyperlink"/>
@@ -7034,10 +7228,10 @@
       <w:pPr>
         <w:pStyle w:val="Bibliography"/>
       </w:pPr>
-      <w:bookmarkStart w:id="101" w:name="ref-Martyn2021"/>
-      <w:bookmarkEnd w:id="100"/>
-      <w:r>
-        <w:t xml:space="preserve">81. </w:t>
+      <w:bookmarkStart w:id="147" w:name="ref-Martyn2021"/>
+      <w:bookmarkEnd w:id="146"/>
+      <w:r>
+        <w:t xml:space="preserve">83. </w:t>
       </w:r>
       <w:r>
         <w:tab/>
@@ -7053,7 +7247,7 @@
       <w:r>
         <w:t xml:space="preserve"> (2021) </w:t>
       </w:r>
-      <w:hyperlink r:id="rId73">
+      <w:hyperlink r:id="rId75">
         <w:r>
           <w:rPr>
             <w:rStyle w:val="Hyperlink"/>
@@ -7079,10 +7273,10 @@
       <w:pPr>
         <w:pStyle w:val="Bibliography"/>
       </w:pPr>
-      <w:bookmarkStart w:id="102" w:name="ref-Llandres2015"/>
-      <w:bookmarkEnd w:id="101"/>
-      <w:r>
-        <w:t xml:space="preserve">82. </w:t>
+      <w:bookmarkStart w:id="148" w:name="ref-Llandres2015"/>
+      <w:bookmarkEnd w:id="147"/>
+      <w:r>
+        <w:t xml:space="preserve">84. </w:t>
       </w:r>
       <w:r>
         <w:tab/>
@@ -7098,7 +7292,7 @@
       <w:r>
         <w:t xml:space="preserve"> (2015) </w:t>
       </w:r>
-      <w:hyperlink r:id="rId74">
+      <w:hyperlink r:id="rId76">
         <w:r>
           <w:rPr>
             <w:rStyle w:val="Hyperlink"/>
@@ -7124,10 +7318,10 @@
       <w:pPr>
         <w:pStyle w:val="Bibliography"/>
       </w:pPr>
-      <w:bookmarkStart w:id="103" w:name="ref-Arnold2019a"/>
-      <w:bookmarkEnd w:id="102"/>
-      <w:r>
-        <w:t xml:space="preserve">83. </w:t>
+      <w:bookmarkStart w:id="149" w:name="ref-Arnold2019a"/>
+      <w:bookmarkEnd w:id="148"/>
+      <w:r>
+        <w:t xml:space="preserve">85. </w:t>
       </w:r>
       <w:r>
         <w:tab/>
@@ -7143,7 +7337,7 @@
       <w:r>
         <w:t xml:space="preserve"> (2019) </w:t>
       </w:r>
-      <w:hyperlink r:id="rId75">
+      <w:hyperlink r:id="rId77">
         <w:r>
           <w:rPr>
             <w:rStyle w:val="Hyperlink"/>
@@ -7169,10 +7363,10 @@
       <w:pPr>
         <w:pStyle w:val="Bibliography"/>
       </w:pPr>
-      <w:bookmarkStart w:id="104" w:name="ref-Shekhawat2022"/>
-      <w:bookmarkEnd w:id="103"/>
-      <w:r>
-        <w:t xml:space="preserve">84. </w:t>
+      <w:bookmarkStart w:id="150" w:name="ref-Shekhawat2022"/>
+      <w:bookmarkEnd w:id="149"/>
+      <w:r>
+        <w:t xml:space="preserve">86. </w:t>
       </w:r>
       <w:r>
         <w:tab/>
@@ -7188,7 +7382,7 @@
       <w:r>
         <w:t xml:space="preserve"> (2022) </w:t>
       </w:r>
-      <w:hyperlink r:id="rId76">
+      <w:hyperlink r:id="rId78">
         <w:r>
           <w:rPr>
             <w:rStyle w:val="Hyperlink"/>
@@ -7214,10 +7408,10 @@
       <w:pPr>
         <w:pStyle w:val="Bibliography"/>
       </w:pPr>
-      <w:bookmarkStart w:id="105" w:name="ref-Dandy2019"/>
-      <w:bookmarkEnd w:id="104"/>
-      <w:r>
-        <w:t xml:space="preserve">85. </w:t>
+      <w:bookmarkStart w:id="151" w:name="ref-Dandy2019"/>
+      <w:bookmarkEnd w:id="150"/>
+      <w:r>
+        <w:t xml:space="preserve">87. </w:t>
       </w:r>
       <w:r>
         <w:tab/>
@@ -7233,7 +7427,7 @@
       <w:r>
         <w:t xml:space="preserve"> (2019) </w:t>
       </w:r>
-      <w:hyperlink r:id="rId77">
+      <w:hyperlink r:id="rId79">
         <w:r>
           <w:rPr>
             <w:rStyle w:val="Hyperlink"/>
@@ -7259,10 +7453,10 @@
       <w:pPr>
         <w:pStyle w:val="Bibliography"/>
       </w:pPr>
-      <w:bookmarkStart w:id="106" w:name="ref-Leviston2018"/>
-      <w:bookmarkEnd w:id="105"/>
-      <w:r>
-        <w:t xml:space="preserve">86. </w:t>
+      <w:bookmarkStart w:id="152" w:name="ref-Leviston2018"/>
+      <w:bookmarkEnd w:id="151"/>
+      <w:r>
+        <w:t xml:space="preserve">88. </w:t>
       </w:r>
       <w:r>
         <w:tab/>
@@ -7278,7 +7472,7 @@
       <w:r>
         <w:t xml:space="preserve"> (2018) </w:t>
       </w:r>
-      <w:hyperlink r:id="rId78">
+      <w:hyperlink r:id="rId80">
         <w:r>
           <w:rPr>
             <w:rStyle w:val="Hyperlink"/>
@@ -7304,10 +7498,10 @@
       <w:pPr>
         <w:pStyle w:val="Bibliography"/>
       </w:pPr>
-      <w:bookmarkStart w:id="107" w:name="ref-Baeckens2025"/>
-      <w:bookmarkEnd w:id="106"/>
-      <w:r>
-        <w:t xml:space="preserve">87. </w:t>
+      <w:bookmarkStart w:id="153" w:name="ref-Baeckens2025"/>
+      <w:bookmarkEnd w:id="152"/>
+      <w:r>
+        <w:t xml:space="preserve">89. </w:t>
       </w:r>
       <w:r>
         <w:tab/>
@@ -7328,16 +7522,16 @@
       <w:pPr>
         <w:pStyle w:val="Bibliography"/>
       </w:pPr>
-      <w:bookmarkStart w:id="108" w:name="ref-Urban2024"/>
-      <w:bookmarkEnd w:id="107"/>
-      <w:r>
-        <w:t xml:space="preserve">88. </w:t>
+      <w:bookmarkStart w:id="154" w:name="ref-Urban2024"/>
+      <w:bookmarkEnd w:id="153"/>
+      <w:r>
+        <w:t xml:space="preserve">90. </w:t>
       </w:r>
       <w:r>
         <w:tab/>
         <w:t xml:space="preserve">Urban, M.C. (2024) </w:t>
       </w:r>
-      <w:hyperlink r:id="rId79">
+      <w:hyperlink r:id="rId81">
         <w:r>
           <w:rPr>
             <w:rStyle w:val="Hyperlink"/>
@@ -7363,10 +7557,10 @@
       <w:pPr>
         <w:pStyle w:val="Bibliography"/>
       </w:pPr>
-      <w:bookmarkStart w:id="109" w:name="ref-Munoz-Sabater2021"/>
-      <w:bookmarkEnd w:id="108"/>
-      <w:r>
-        <w:t xml:space="preserve">89. </w:t>
+      <w:bookmarkStart w:id="155" w:name="ref-Munoz-Sabater2021"/>
+      <w:bookmarkEnd w:id="154"/>
+      <w:r>
+        <w:t xml:space="preserve">91. </w:t>
       </w:r>
       <w:r>
         <w:tab/>
@@ -7397,10 +7591,10 @@
       <w:pPr>
         <w:pStyle w:val="Bibliography"/>
       </w:pPr>
-      <w:bookmarkStart w:id="110" w:name="ref-Eyring2016"/>
-      <w:bookmarkEnd w:id="109"/>
-      <w:r>
-        <w:t xml:space="preserve">90. </w:t>
+      <w:bookmarkStart w:id="156" w:name="ref-Eyring2016"/>
+      <w:bookmarkEnd w:id="155"/>
+      <w:r>
+        <w:t xml:space="preserve">92. </w:t>
       </w:r>
       <w:r>
         <w:tab/>
@@ -7416,7 +7610,7 @@
       <w:r>
         <w:t xml:space="preserve"> (2016) </w:t>
       </w:r>
-      <w:hyperlink r:id="rId80">
+      <w:hyperlink r:id="rId82">
         <w:r>
           <w:rPr>
             <w:rStyle w:val="Hyperlink"/>
@@ -7442,17 +7636,17 @@
       <w:pPr>
         <w:pStyle w:val="Bibliography"/>
       </w:pPr>
-      <w:bookmarkStart w:id="111" w:name="ref-Chevin2017"/>
-      <w:bookmarkEnd w:id="110"/>
+      <w:bookmarkStart w:id="157" w:name="ref-Chevin2017"/>
+      <w:bookmarkEnd w:id="156"/>
       <w:r>
         <w:lastRenderedPageBreak/>
-        <w:t xml:space="preserve">91. </w:t>
+        <w:t xml:space="preserve">93. </w:t>
       </w:r>
       <w:r>
         <w:tab/>
         <w:t xml:space="preserve">Chevin, L.-M. and Hoffmann, A.A. (2017) </w:t>
       </w:r>
-      <w:hyperlink r:id="rId81">
+      <w:hyperlink r:id="rId83">
         <w:r>
           <w:rPr>
             <w:rStyle w:val="Hyperlink"/>
@@ -7478,16 +7672,16 @@
       <w:pPr>
         <w:pStyle w:val="Bibliography"/>
       </w:pPr>
-      <w:bookmarkStart w:id="112" w:name="ref-Hoffmann2022"/>
-      <w:bookmarkEnd w:id="111"/>
-      <w:r>
-        <w:t xml:space="preserve">92. </w:t>
+      <w:bookmarkStart w:id="158" w:name="ref-Hoffmann2022"/>
+      <w:bookmarkEnd w:id="157"/>
+      <w:r>
+        <w:t xml:space="preserve">94. </w:t>
       </w:r>
       <w:r>
         <w:tab/>
         <w:t xml:space="preserve">Hoffmann, A.A. and Bridle, J. (2022) </w:t>
       </w:r>
-      <w:hyperlink r:id="rId82">
+      <w:hyperlink r:id="rId84">
         <w:r>
           <w:rPr>
             <w:rStyle w:val="Hyperlink"/>
@@ -7513,10 +7707,10 @@
       <w:pPr>
         <w:pStyle w:val="Bibliography"/>
       </w:pPr>
-      <w:bookmarkStart w:id="113" w:name="ref-Hoffmann2011"/>
-      <w:bookmarkEnd w:id="112"/>
-      <w:r>
-        <w:t xml:space="preserve">93. </w:t>
+      <w:bookmarkStart w:id="159" w:name="ref-Hoffmann2011"/>
+      <w:bookmarkEnd w:id="158"/>
+      <w:r>
+        <w:t xml:space="preserve">95. </w:t>
       </w:r>
       <w:r>
         <w:tab/>
@@ -7527,10 +7721,10 @@
       <w:pPr>
         <w:pStyle w:val="Bibliography"/>
       </w:pPr>
-      <w:bookmarkStart w:id="114" w:name="ref-Catullo2019"/>
-      <w:bookmarkEnd w:id="113"/>
-      <w:r>
-        <w:t xml:space="preserve">94. </w:t>
+      <w:bookmarkStart w:id="160" w:name="ref-Catullo2019"/>
+      <w:bookmarkEnd w:id="159"/>
+      <w:r>
+        <w:t xml:space="preserve">96. </w:t>
       </w:r>
       <w:r>
         <w:tab/>
@@ -7561,10 +7755,10 @@
       <w:pPr>
         <w:pStyle w:val="Bibliography"/>
       </w:pPr>
-      <w:bookmarkStart w:id="115" w:name="ref-Ghalambor2015"/>
-      <w:bookmarkEnd w:id="114"/>
-      <w:r>
-        <w:t xml:space="preserve">95. </w:t>
+      <w:bookmarkStart w:id="161" w:name="ref-Ghalambor2015"/>
+      <w:bookmarkEnd w:id="160"/>
+      <w:r>
+        <w:t xml:space="preserve">97. </w:t>
       </w:r>
       <w:r>
         <w:tab/>
@@ -7580,7 +7774,7 @@
       <w:r>
         <w:t xml:space="preserve"> (2015) </w:t>
       </w:r>
-      <w:hyperlink r:id="rId83">
+      <w:hyperlink r:id="rId85">
         <w:r>
           <w:rPr>
             <w:rStyle w:val="Hyperlink"/>
@@ -7606,10 +7800,10 @@
       <w:pPr>
         <w:pStyle w:val="Bibliography"/>
       </w:pPr>
-      <w:bookmarkStart w:id="116" w:name="ref-Sousa2010"/>
-      <w:bookmarkEnd w:id="115"/>
-      <w:r>
-        <w:t xml:space="preserve">96. </w:t>
+      <w:bookmarkStart w:id="162" w:name="ref-Sousa2010"/>
+      <w:bookmarkEnd w:id="161"/>
+      <w:r>
+        <w:t xml:space="preserve">98. </w:t>
       </w:r>
       <w:r>
         <w:tab/>
@@ -7625,7 +7819,7 @@
       <w:r>
         <w:t xml:space="preserve"> (2010) </w:t>
       </w:r>
-      <w:hyperlink r:id="rId84">
+      <w:hyperlink r:id="rId86">
         <w:r>
           <w:rPr>
             <w:rStyle w:val="Hyperlink"/>
@@ -7651,10 +7845,10 @@
       <w:pPr>
         <w:pStyle w:val="Bibliography"/>
       </w:pPr>
-      <w:bookmarkStart w:id="117" w:name="ref-Kearney2009a"/>
-      <w:bookmarkEnd w:id="116"/>
-      <w:r>
-        <w:t xml:space="preserve">97. </w:t>
+      <w:bookmarkStart w:id="163" w:name="ref-Kearney2009a"/>
+      <w:bookmarkEnd w:id="162"/>
+      <w:r>
+        <w:t xml:space="preserve">99. </w:t>
       </w:r>
       <w:r>
         <w:tab/>
@@ -7685,16 +7879,16 @@
       <w:pPr>
         <w:pStyle w:val="Bibliography"/>
       </w:pPr>
-      <w:bookmarkStart w:id="118" w:name="ref-Lande1979"/>
-      <w:bookmarkEnd w:id="117"/>
-      <w:r>
-        <w:t xml:space="preserve">98. </w:t>
+      <w:bookmarkStart w:id="164" w:name="ref-Lande1979"/>
+      <w:bookmarkEnd w:id="163"/>
+      <w:r>
+        <w:t xml:space="preserve">100. </w:t>
       </w:r>
       <w:r>
         <w:tab/>
         <w:t xml:space="preserve">Lande, R. (1979) </w:t>
       </w:r>
-      <w:hyperlink r:id="rId85">
+      <w:hyperlink r:id="rId87">
         <w:r>
           <w:rPr>
             <w:rStyle w:val="Hyperlink"/>
@@ -7720,16 +7914,16 @@
       <w:pPr>
         <w:pStyle w:val="Bibliography"/>
       </w:pPr>
-      <w:bookmarkStart w:id="119" w:name="ref-Walsh2018"/>
-      <w:bookmarkEnd w:id="118"/>
-      <w:r>
-        <w:t xml:space="preserve">99. </w:t>
+      <w:bookmarkStart w:id="165" w:name="ref-Walsh2018"/>
+      <w:bookmarkEnd w:id="164"/>
+      <w:r>
+        <w:t xml:space="preserve">101. </w:t>
       </w:r>
       <w:r>
         <w:tab/>
         <w:t xml:space="preserve">Walsh, B. and Lynch, M. (2018) </w:t>
       </w:r>
-      <w:hyperlink r:id="rId86">
+      <w:hyperlink r:id="rId88">
         <w:r>
           <w:rPr>
             <w:rStyle w:val="Hyperlink"/>
@@ -7747,16 +7941,16 @@
       <w:pPr>
         <w:pStyle w:val="Bibliography"/>
       </w:pPr>
-      <w:bookmarkStart w:id="120" w:name="ref-McGlothlin2014a"/>
-      <w:bookmarkEnd w:id="119"/>
-      <w:r>
-        <w:t xml:space="preserve">100. </w:t>
+      <w:bookmarkStart w:id="166" w:name="ref-McGlothlin2014a"/>
+      <w:bookmarkEnd w:id="165"/>
+      <w:r>
+        <w:t xml:space="preserve">102. </w:t>
       </w:r>
       <w:r>
         <w:tab/>
         <w:t xml:space="preserve">McGlothlin, J. and Galloway, L. (2014) </w:t>
       </w:r>
-      <w:hyperlink r:id="rId87">
+      <w:hyperlink r:id="rId89">
         <w:r>
           <w:rPr>
             <w:rStyle w:val="Hyperlink"/>
@@ -7782,10 +7976,10 @@
       <w:pPr>
         <w:pStyle w:val="Bibliography"/>
       </w:pPr>
-      <w:bookmarkStart w:id="121" w:name="ref-Urban2016"/>
-      <w:bookmarkEnd w:id="120"/>
-      <w:r>
-        <w:t xml:space="preserve">101. </w:t>
+      <w:bookmarkStart w:id="167" w:name="ref-Urban2016"/>
+      <w:bookmarkEnd w:id="166"/>
+      <w:r>
+        <w:t xml:space="preserve">103. </w:t>
       </w:r>
       <w:r>
         <w:tab/>
@@ -7801,7 +7995,7 @@
       <w:r>
         <w:t xml:space="preserve"> (2016) </w:t>
       </w:r>
-      <w:hyperlink r:id="rId88">
+      <w:hyperlink r:id="rId90">
         <w:r>
           <w:rPr>
             <w:rStyle w:val="Hyperlink"/>
@@ -7827,10 +8021,10 @@
       <w:pPr>
         <w:pStyle w:val="Bibliography"/>
       </w:pPr>
-      <w:bookmarkStart w:id="122" w:name="ref-Kattge2020"/>
-      <w:bookmarkEnd w:id="121"/>
-      <w:r>
-        <w:t xml:space="preserve">102. </w:t>
+      <w:bookmarkStart w:id="168" w:name="ref-Kattge2020"/>
+      <w:bookmarkEnd w:id="167"/>
+      <w:r>
+        <w:t xml:space="preserve">104. </w:t>
       </w:r>
       <w:r>
         <w:tab/>
@@ -7846,7 +8040,7 @@
       <w:r>
         <w:t xml:space="preserve"> (2020) </w:t>
       </w:r>
-      <w:hyperlink r:id="rId89">
+      <w:hyperlink r:id="rId91">
         <w:r>
           <w:rPr>
             <w:rStyle w:val="Hyperlink"/>
@@ -7872,10 +8066,10 @@
       <w:pPr>
         <w:pStyle w:val="Bibliography"/>
       </w:pPr>
-      <w:bookmarkStart w:id="123" w:name="ref-Leiva2025"/>
-      <w:bookmarkEnd w:id="122"/>
-      <w:r>
-        <w:t xml:space="preserve">103. </w:t>
+      <w:bookmarkStart w:id="169" w:name="ref-Leiva2025"/>
+      <w:bookmarkEnd w:id="168"/>
+      <w:r>
+        <w:t xml:space="preserve">105. </w:t>
       </w:r>
       <w:r>
         <w:tab/>
@@ -7901,7 +8095,7 @@
       <w:r>
         <w:t xml:space="preserve"> DOI: </w:t>
       </w:r>
-      <w:hyperlink r:id="rId90">
+      <w:hyperlink r:id="rId92">
         <w:r>
           <w:rPr>
             <w:rStyle w:val="Hyperlink"/>
@@ -7914,10 +8108,10 @@
       <w:pPr>
         <w:pStyle w:val="Bibliography"/>
       </w:pPr>
-      <w:bookmarkStart w:id="124" w:name="ref-Weiss-Lehman2022"/>
-      <w:bookmarkEnd w:id="123"/>
-      <w:r>
-        <w:t xml:space="preserve">104. </w:t>
+      <w:bookmarkStart w:id="170" w:name="ref-Weiss-Lehman2022"/>
+      <w:bookmarkEnd w:id="169"/>
+      <w:r>
+        <w:t xml:space="preserve">106. </w:t>
       </w:r>
       <w:r>
         <w:tab/>
@@ -7948,10 +8142,10 @@
       <w:pPr>
         <w:pStyle w:val="Bibliography"/>
       </w:pPr>
-      <w:bookmarkStart w:id="125" w:name="ref-Dudney2025"/>
-      <w:bookmarkEnd w:id="124"/>
-      <w:r>
-        <w:t xml:space="preserve">105. </w:t>
+      <w:bookmarkStart w:id="171" w:name="ref-Dudney2025"/>
+      <w:bookmarkEnd w:id="170"/>
+      <w:r>
+        <w:t xml:space="preserve">107. </w:t>
       </w:r>
       <w:r>
         <w:tab/>
@@ -7967,7 +8161,7 @@
       <w:r>
         <w:t xml:space="preserve"> (2025) </w:t>
       </w:r>
-      <w:hyperlink r:id="rId91">
+      <w:hyperlink r:id="rId93">
         <w:r>
           <w:rPr>
             <w:rStyle w:val="Hyperlink"/>
@@ -7993,10 +8187,10 @@
       <w:pPr>
         <w:pStyle w:val="Bibliography"/>
       </w:pPr>
-      <w:bookmarkStart w:id="126" w:name="ref-Carroll2023"/>
-      <w:bookmarkEnd w:id="125"/>
-      <w:r>
-        <w:t xml:space="preserve">106. </w:t>
+      <w:bookmarkStart w:id="172" w:name="ref-Carroll2023"/>
+      <w:bookmarkEnd w:id="171"/>
+      <w:r>
+        <w:t xml:space="preserve">108. </w:t>
       </w:r>
       <w:r>
         <w:tab/>
@@ -8012,7 +8206,7 @@
       <w:r>
         <w:t xml:space="preserve"> (2023) </w:t>
       </w:r>
-      <w:hyperlink r:id="rId92">
+      <w:hyperlink r:id="rId94">
         <w:r>
           <w:rPr>
             <w:rStyle w:val="Hyperlink"/>
@@ -8038,10 +8232,10 @@
       <w:pPr>
         <w:pStyle w:val="Bibliography"/>
       </w:pPr>
-      <w:bookmarkStart w:id="127" w:name="ref-Dornhaus2022"/>
-      <w:bookmarkEnd w:id="126"/>
-      <w:r>
-        <w:t xml:space="preserve">107. </w:t>
+      <w:bookmarkStart w:id="173" w:name="ref-Dornhaus2022"/>
+      <w:bookmarkEnd w:id="172"/>
+      <w:r>
+        <w:t xml:space="preserve">109. </w:t>
       </w:r>
       <w:r>
         <w:tab/>
@@ -8057,7 +8251,7 @@
       <w:r>
         <w:t xml:space="preserve"> (2022) </w:t>
       </w:r>
-      <w:hyperlink r:id="rId93">
+      <w:hyperlink r:id="rId95">
         <w:r>
           <w:rPr>
             <w:rStyle w:val="Hyperlink"/>
@@ -8079,9 +8273,9 @@
         <w:t xml:space="preserve"> 61, 2244–2254</w:t>
       </w:r>
     </w:p>
-    <w:bookmarkEnd w:id="19"/>
-    <w:bookmarkEnd w:id="21"/>
-    <w:bookmarkEnd w:id="127"/>
+    <w:bookmarkEnd w:id="63"/>
+    <w:bookmarkEnd w:id="65"/>
+    <w:bookmarkEnd w:id="173"/>
     <w:p>
       <w:pPr>
         <w:pStyle w:val="BodyText"/>
@@ -8468,7 +8662,7 @@
   <w:abstractNum w:abstractNumId="12" w15:restartNumberingAfterBreak="0">
     <w:nsid w:val="00A99411"/>
     <w:multiLevelType w:val="multilevel"/>
-    <w:tmpl w:val="2AFC626A"/>
+    <w:tmpl w:val="3C9CBEBC"/>
     <w:lvl w:ilvl="0">
       <w:start w:val="1"/>
       <w:numFmt w:val="decimal"/>
@@ -9011,10 +9205,10 @@
   <w:num w:numId="84" w16cid:durableId="565186891">
     <w:abstractNumId w:val="11"/>
   </w:num>
-  <w:num w:numId="85" w16cid:durableId="2125034160">
+  <w:num w:numId="85" w16cid:durableId="778330235">
     <w:abstractNumId w:val="10"/>
   </w:num>
-  <w:num w:numId="86" w16cid:durableId="83066156">
+  <w:num w:numId="86" w16cid:durableId="918713708">
     <w:abstractNumId w:val="12"/>
     <w:lvlOverride w:ilvl="0">
       <w:startOverride w:val="1"/>
@@ -9045,6 +9239,14 @@
     </w:lvlOverride>
   </w:num>
 </w:numbering>
+</file>
+
+<file path=word/people.xml><?xml version="1.0" encoding="utf-8"?>
+<w15:people xmlns:wpc="http://schemas.microsoft.com/office/word/2010/wordprocessingCanvas" xmlns:cx="http://schemas.microsoft.com/office/drawing/2014/chartex" xmlns:cx1="http://schemas.microsoft.com/office/drawing/2015/9/8/chartex" xmlns:cx2="http://schemas.microsoft.com/office/drawing/2015/10/21/chartex" xmlns:cx3="http://schemas.microsoft.com/office/drawing/2016/5/9/chartex" xmlns:cx4="http://schemas.microsoft.com/office/drawing/2016/5/10/chartex" xmlns:cx5="http://schemas.microsoft.com/office/drawing/2016/5/11/chartex" xmlns:cx6="http://schemas.microsoft.com/office/drawing/2016/5/12/chartex" xmlns:cx7="http://schemas.microsoft.com/office/drawing/2016/5/13/chartex" xmlns:cx8="http://schemas.microsoft.com/office/drawing/2016/5/14/chartex" xmlns:mc="http://schemas.openxmlformats.org/markup-compatibility/2006" xmlns:aink="http://schemas.microsoft.com/office/drawing/2016/ink" xmlns:am3d="http://schemas.microsoft.com/office/drawing/2017/model3d" xmlns:o="urn:schemas-microsoft-com:office:office" xmlns:oel="http://schemas.microsoft.com/office/2019/extlst" xmlns:r="http://schemas.openxmlformats.org/officeDocument/2006/relationships" xmlns:m="http://schemas.openxmlformats.org/officeDocument/2006/math" xmlns:v="urn:schemas-microsoft-com:vml" xmlns:wp14="http://schemas.microsoft.com/office/word/2010/wordprocessingDrawing" xmlns:wp="http://schemas.openxmlformats.org/drawingml/2006/wordprocessingDrawing" xmlns:w10="urn:schemas-microsoft-com:office:word" xmlns:w="http://schemas.openxmlformats.org/wordprocessingml/2006/main" xmlns:w14="http://schemas.microsoft.com/office/word/2010/wordml" xmlns:w15="http://schemas.microsoft.com/office/word/2012/wordml" xmlns:w16cex="http://schemas.microsoft.com/office/word/2018/wordml/cex" xmlns:w16cid="http://schemas.microsoft.com/office/word/2016/wordml/cid" xmlns:w16="http://schemas.microsoft.com/office/word/2018/wordml" xmlns:w16du="http://schemas.microsoft.com/office/word/2023/wordml/word16du" xmlns:w16sdtdh="http://schemas.microsoft.com/office/word/2020/wordml/sdtdatahash" xmlns:w16sdtfl="http://schemas.microsoft.com/office/word/2024/wordml/sdtformatlock" xmlns:w16se="http://schemas.microsoft.com/office/word/2015/wordml/symex" xmlns:wpg="http://schemas.microsoft.com/office/word/2010/wordprocessingGroup" xmlns:wpi="http://schemas.microsoft.com/office/word/2010/wordprocessingInk" xmlns:wne="http://schemas.microsoft.com/office/word/2006/wordml" xmlns:wps="http://schemas.microsoft.com/office/word/2010/wordprocessingShape" mc:Ignorable="w14 w15 w16se w16cid w16 w16cex w16sdtdh w16sdtfl w16du wp14">
+  <w15:person w15:author="Daniel Noble">
+    <w15:presenceInfo w15:providerId="AD" w15:userId="S::u5062688@anu.edu.au::cd1442c4-8911-414d-88db-662b5685b55e"/>
+  </w15:person>
+</w15:people>
 </file>
 
 <file path=word/styles.xml><?xml version="1.0" encoding="utf-8"?>
@@ -10251,6 +10453,15 @@
     <w:unhideWhenUsed/>
     <w:rsid w:val="006A2A8B"/>
   </w:style>
+  <w:style w:type="character" w:styleId="PlaceholderText">
+    <w:name w:val="Placeholder Text"/>
+    <w:basedOn w:val="DefaultParagraphFont"/>
+    <w:semiHidden/>
+    <w:rsid w:val="006B186C"/>
+    <w:rPr>
+      <w:color w:val="666666"/>
+    </w:rPr>
+  </w:style>
 </w:styles>
 </file>
 

</xml_diff>